<commit_message>
Add Chapter 8: fill-in GIS Analyst Documentation section (contacts, pipeline notes, republish checklist, data issues log)
</commit_message>
<xml_diff>
--- a/docs/LaGrange-Parking-Developer-Guide.docx
+++ b/docs/LaGrange-Parking-Developer-Guide.docx
@@ -236,7 +236,7 @@
         <w:spacing w:after="70"/>
         <w:jc w:val="center"/>
       </w:pPr>
-      <w:hyperlink w:history="1" r:id="rIdq50xsdmd8xrqsszzpcltw">
+      <w:hyperlink w:history="1" r:id="rIdkh1t4uq4kmzxjpoxyofxo">
         <w:r>
           <w:rPr>
             <w:rFonts w:ascii="Arial" w:cs="Arial" w:eastAsia="Arial" w:hAnsi="Arial"/>
@@ -254,7 +254,7 @@
         <w:spacing w:after="220"/>
         <w:jc w:val="center"/>
       </w:pPr>
-      <w:hyperlink w:history="1" r:id="rIdvpq6eh8mfr6em_oucit4h">
+      <w:hyperlink w:history="1" r:id="rIdz_aa5snuvh6j4l_yv5tnn">
         <w:r>
           <w:rPr>
             <w:rFonts w:ascii="Arial" w:cs="Arial" w:eastAsia="Arial" w:hAnsi="Arial"/>
@@ -2213,7 +2213,7 @@
             </w:tcMar>
           </w:tcPr>
           <w:p>
-            <w:hyperlink w:history="1" r:id="rId_o_9o3v_muaxag7qoziwp">
+            <w:hyperlink w:history="1" r:id="rIdctoikjfsgjztk1svqwmqj">
               <w:r>
                 <w:rPr>
                   <w:rFonts w:ascii="Arial" w:cs="Arial" w:eastAsia="Arial" w:hAnsi="Arial"/>
@@ -2334,7 +2334,7 @@
             </w:tcMar>
           </w:tcPr>
           <w:p>
-            <w:hyperlink w:history="1" r:id="rIdbeoolpzxw5rphd1zm1bt8">
+            <w:hyperlink w:history="1" r:id="rIdt-lnupnl0prvefitgxu8v">
               <w:r>
                 <w:rPr>
                   <w:rFonts w:ascii="Arial" w:cs="Arial" w:eastAsia="Arial" w:hAnsi="Arial"/>
@@ -8330,6 +8330,2844 @@
         </w:tc>
       </w:tr>
     </w:tbl>
+    <w:p>
+      <w:r>
+        <w:br w:type="page"/>
+      </w:r>
+    </w:p>
+    <w:tbl>
+      <w:tblPr>
+        <w:tblW w:type="pct" w:w="100%"/>
+        <w:tblBorders>
+          <w:top w:val="single" w:color="auto" w:sz="4"/>
+          <w:left w:val="single" w:color="auto" w:sz="4"/>
+          <w:bottom w:val="single" w:color="auto" w:sz="4"/>
+          <w:right w:val="single" w:color="auto" w:sz="4"/>
+          <w:insideH w:val="single" w:color="auto" w:sz="4"/>
+          <w:insideV w:val="single" w:color="auto" w:sz="4"/>
+        </w:tblBorders>
+      </w:tblPr>
+      <w:tblGrid>
+        <w:gridCol w:w="100"/>
+        <w:gridCol w:w="100"/>
+      </w:tblGrid>
+      <w:tr>
+        <w:tc>
+          <w:tcPr>
+            <w:tcW w:type="pct" w:w="9%"/>
+            <w:tcBorders>
+              <w:top w:val="none" w:color="FFFFFF" w:sz="0"/>
+              <w:left w:val="none" w:color="FFFFFF" w:sz="0"/>
+              <w:bottom w:val="none" w:color="FFFFFF" w:sz="0"/>
+              <w:right w:val="none" w:color="FFFFFF" w:sz="0"/>
+            </w:tcBorders>
+            <w:shd w:fill="095443" w:val="clear"/>
+            <w:tcMar>
+              <w:top w:type="dxa" w:w="120"/>
+              <w:left w:type="dxa" w:w="60"/>
+              <w:bottom w:type="dxa" w:w="120"/>
+              <w:right w:type="dxa" w:w="60"/>
+            </w:tcMar>
+            <w:vAlign w:val="center"/>
+          </w:tcPr>
+          <w:p>
+            <w:pPr>
+              <w:jc w:val="center"/>
+            </w:pPr>
+            <w:r>
+              <w:rPr>
+                <w:rFonts w:ascii="Arial" w:cs="Arial" w:eastAsia="Arial" w:hAnsi="Arial"/>
+                <w:b/>
+                <w:bCs/>
+                <w:color w:val="FFFFFF"/>
+                <w:sz w:val="40"/>
+                <w:szCs w:val="40"/>
+              </w:rPr>
+              <w:t xml:space="preserve">8</w:t>
+            </w:r>
+          </w:p>
+        </w:tc>
+        <w:tc>
+          <w:tcPr>
+            <w:tcW w:type="pct" w:w="91%"/>
+            <w:tcBorders>
+              <w:top w:val="none" w:color="FFFFFF" w:sz="0"/>
+              <w:left w:val="none" w:color="FFFFFF" w:sz="0"/>
+              <w:bottom w:val="none" w:color="FFFFFF" w:sz="0"/>
+              <w:right w:val="none" w:color="FFFFFF" w:sz="0"/>
+            </w:tcBorders>
+            <w:shd w:fill="0E7C66" w:val="clear"/>
+            <w:tcMar>
+              <w:top w:type="dxa" w:w="160"/>
+              <w:left w:type="dxa" w:w="240"/>
+              <w:bottom w:type="dxa" w:w="160"/>
+              <w:right w:type="dxa" w:w="240"/>
+            </w:tcMar>
+            <w:vAlign w:val="center"/>
+          </w:tcPr>
+          <w:p>
+            <w:r>
+              <w:rPr>
+                <w:rFonts w:ascii="Arial" w:cs="Arial" w:eastAsia="Arial" w:hAnsi="Arial"/>
+                <w:b/>
+                <w:bCs/>
+                <w:color w:val="FFFFFF"/>
+                <w:sz w:val="28"/>
+                <w:szCs w:val="28"/>
+              </w:rPr>
+              <w:t xml:space="preserve">GIS Analyst Documentation</w:t>
+            </w:r>
+          </w:p>
+        </w:tc>
+      </w:tr>
+    </w:tbl>
+    <w:p>
+      <w:pPr>
+        <w:spacing w:after="120"/>
+      </w:pPr>
+    </w:p>
+    <w:p>
+      <w:pPr>
+        <w:pStyle w:val="Heading1"/>
+        <w:spacing w:after="120" w:before="200"/>
+      </w:pPr>
+      <w:r>
+        <w:rPr>
+          <w:rFonts w:ascii="Arial" w:cs="Arial" w:eastAsia="Arial" w:hAnsi="Arial"/>
+          <w:b/>
+          <w:bCs/>
+          <w:color w:val="0E7C66"/>
+          <w:sz w:val="26"/>
+          <w:szCs w:val="26"/>
+        </w:rPr>
+        <w:t xml:space="preserve">8. GIS Analyst Documentation</w:t>
+      </w:r>
+    </w:p>
+    <w:p>
+      <w:pPr>
+        <w:spacing w:after="120"/>
+      </w:pPr>
+      <w:r>
+        <w:rPr>
+          <w:rFonts w:ascii="Arial" w:cs="Arial" w:eastAsia="Arial" w:hAnsi="Arial"/>
+          <w:color w:val="2B2B2B"/>
+          <w:sz w:val="21"/>
+          <w:szCs w:val="21"/>
+        </w:rPr>
+        <w:t xml:space="preserve">This chapter is </w:t>
+      </w:r>
+      <w:r>
+        <w:rPr>
+          <w:rFonts w:ascii="Arial" w:cs="Arial" w:eastAsia="Arial" w:hAnsi="Arial"/>
+          <w:b/>
+          <w:bCs/>
+          <w:color w:val="2B2B2B"/>
+          <w:sz w:val="21"/>
+          <w:szCs w:val="21"/>
+        </w:rPr>
+        <w:t xml:space="preserve">reserved for the GIS analyst</w:t>
+      </w:r>
+      <w:r>
+        <w:rPr>
+          <w:rFonts w:ascii="Arial" w:cs="Arial" w:eastAsia="Arial" w:hAnsi="Arial"/>
+          <w:color w:val="2B2B2B"/>
+          <w:sz w:val="21"/>
+          <w:szCs w:val="21"/>
+        </w:rPr>
+        <w:t xml:space="preserve"> who maintains the LGDM → FGDB → AGOL pipeline. Fill in the tables below and keep them current — the app developers depend on this page when data changes. Technical background: </w:t>
+      </w:r>
+      <w:r>
+        <w:rPr>
+          <w:rFonts w:ascii="Consolas" w:cs="Consolas" w:eastAsia="Consolas" w:hAnsi="Consolas"/>
+          <w:color w:val="2B2B2B"/>
+          <w:sz w:val="19"/>
+          <w:szCs w:val="19"/>
+        </w:rPr>
+        <w:t xml:space="preserve">docs/DATA.md</w:t>
+      </w:r>
+      <w:r>
+        <w:rPr>
+          <w:rFonts w:ascii="Arial" w:cs="Arial" w:eastAsia="Arial" w:hAnsi="Arial"/>
+          <w:color w:val="2B2B2B"/>
+          <w:sz w:val="21"/>
+          <w:szCs w:val="21"/>
+        </w:rPr>
+        <w:t xml:space="preserve"> and </w:t>
+      </w:r>
+      <w:r>
+        <w:rPr>
+          <w:rFonts w:ascii="Consolas" w:cs="Consolas" w:eastAsia="Consolas" w:hAnsi="Consolas"/>
+          <w:color w:val="2B2B2B"/>
+          <w:sz w:val="19"/>
+          <w:szCs w:val="19"/>
+        </w:rPr>
+        <w:t xml:space="preserve">docs/GIS-PUBLISH.md</w:t>
+      </w:r>
+      <w:r>
+        <w:rPr>
+          <w:rFonts w:ascii="Arial" w:cs="Arial" w:eastAsia="Arial" w:hAnsi="Arial"/>
+          <w:color w:val="2B2B2B"/>
+          <w:sz w:val="21"/>
+          <w:szCs w:val="21"/>
+        </w:rPr>
+        <w:t xml:space="preserve">.</w:t>
+      </w:r>
+    </w:p>
+    <w:p>
+      <w:pPr>
+        <w:pStyle w:val="Heading2"/>
+        <w:spacing w:after="100" w:before="280"/>
+      </w:pPr>
+      <w:r>
+        <w:rPr>
+          <w:rFonts w:ascii="Arial" w:cs="Arial" w:eastAsia="Arial" w:hAnsi="Arial"/>
+          <w:b/>
+          <w:bCs/>
+          <w:color w:val="0E7C66"/>
+          <w:sz w:val="23"/>
+          <w:szCs w:val="23"/>
+        </w:rPr>
+        <w:t xml:space="preserve">8.1 — Data ownership &amp; contacts</w:t>
+      </w:r>
+    </w:p>
+    <w:tbl>
+      <w:tblPr>
+        <w:tblW w:type="pct" w:w="100%"/>
+        <w:tblBorders>
+          <w:top w:val="single" w:color="auto" w:sz="4"/>
+          <w:left w:val="single" w:color="auto" w:sz="4"/>
+          <w:bottom w:val="single" w:color="auto" w:sz="4"/>
+          <w:right w:val="single" w:color="auto" w:sz="4"/>
+          <w:insideH w:val="single" w:color="auto" w:sz="4"/>
+          <w:insideV w:val="single" w:color="auto" w:sz="4"/>
+        </w:tblBorders>
+      </w:tblPr>
+      <w:tblGrid>
+        <w:gridCol w:w="100"/>
+        <w:gridCol w:w="100"/>
+        <w:gridCol w:w="100"/>
+        <w:gridCol w:w="100"/>
+        <w:gridCol w:w="100"/>
+      </w:tblGrid>
+      <w:tr>
+        <w:tc>
+          <w:tcPr>
+            <w:tcW w:type="pct" w:w="22%"/>
+            <w:tcBorders>
+              <w:top w:val="single" w:color="D9D9D9" w:sz="4"/>
+              <w:left w:val="single" w:color="D9D9D9" w:sz="4"/>
+              <w:bottom w:val="single" w:color="D9D9D9" w:sz="4"/>
+              <w:right w:val="single" w:color="D9D9D9" w:sz="4"/>
+            </w:tcBorders>
+            <w:shd w:fill="0E7C66" w:val="clear"/>
+            <w:tcMar>
+              <w:top w:type="dxa" w:w="80"/>
+              <w:left w:type="dxa" w:w="120"/>
+              <w:bottom w:type="dxa" w:w="80"/>
+              <w:right w:type="dxa" w:w="120"/>
+            </w:tcMar>
+          </w:tcPr>
+          <w:p>
+            <w:r>
+              <w:rPr>
+                <w:rFonts w:ascii="Arial" w:cs="Arial" w:eastAsia="Arial" w:hAnsi="Arial"/>
+                <w:b/>
+                <w:bCs/>
+                <w:color w:val="FFFFFF"/>
+                <w:sz w:val="20"/>
+                <w:szCs w:val="20"/>
+              </w:rPr>
+              <w:t xml:space="preserve">Role</w:t>
+            </w:r>
+          </w:p>
+        </w:tc>
+        <w:tc>
+          <w:tcPr>
+            <w:tcW w:type="pct" w:w="20%"/>
+            <w:tcBorders>
+              <w:top w:val="single" w:color="D9D9D9" w:sz="4"/>
+              <w:left w:val="single" w:color="D9D9D9" w:sz="4"/>
+              <w:bottom w:val="single" w:color="D9D9D9" w:sz="4"/>
+              <w:right w:val="single" w:color="D9D9D9" w:sz="4"/>
+            </w:tcBorders>
+            <w:shd w:fill="0E7C66" w:val="clear"/>
+            <w:tcMar>
+              <w:top w:type="dxa" w:w="80"/>
+              <w:left w:type="dxa" w:w="120"/>
+              <w:bottom w:type="dxa" w:w="80"/>
+              <w:right w:type="dxa" w:w="120"/>
+            </w:tcMar>
+          </w:tcPr>
+          <w:p>
+            <w:r>
+              <w:rPr>
+                <w:rFonts w:ascii="Arial" w:cs="Arial" w:eastAsia="Arial" w:hAnsi="Arial"/>
+                <w:b/>
+                <w:bCs/>
+                <w:color w:val="FFFFFF"/>
+                <w:sz w:val="20"/>
+                <w:szCs w:val="20"/>
+              </w:rPr>
+              <w:t xml:space="preserve">Name</w:t>
+            </w:r>
+          </w:p>
+        </w:tc>
+        <w:tc>
+          <w:tcPr>
+            <w:tcW w:type="pct" w:w="24%"/>
+            <w:tcBorders>
+              <w:top w:val="single" w:color="D9D9D9" w:sz="4"/>
+              <w:left w:val="single" w:color="D9D9D9" w:sz="4"/>
+              <w:bottom w:val="single" w:color="D9D9D9" w:sz="4"/>
+              <w:right w:val="single" w:color="D9D9D9" w:sz="4"/>
+            </w:tcBorders>
+            <w:shd w:fill="0E7C66" w:val="clear"/>
+            <w:tcMar>
+              <w:top w:type="dxa" w:w="80"/>
+              <w:left w:type="dxa" w:w="120"/>
+              <w:bottom w:type="dxa" w:w="80"/>
+              <w:right w:type="dxa" w:w="120"/>
+            </w:tcMar>
+          </w:tcPr>
+          <w:p>
+            <w:r>
+              <w:rPr>
+                <w:rFonts w:ascii="Arial" w:cs="Arial" w:eastAsia="Arial" w:hAnsi="Arial"/>
+                <w:b/>
+                <w:bCs/>
+                <w:color w:val="FFFFFF"/>
+                <w:sz w:val="20"/>
+                <w:szCs w:val="20"/>
+              </w:rPr>
+              <w:t xml:space="preserve">Organization / team</w:t>
+            </w:r>
+          </w:p>
+        </w:tc>
+        <w:tc>
+          <w:tcPr>
+            <w:tcW w:type="pct" w:w="22%"/>
+            <w:tcBorders>
+              <w:top w:val="single" w:color="D9D9D9" w:sz="4"/>
+              <w:left w:val="single" w:color="D9D9D9" w:sz="4"/>
+              <w:bottom w:val="single" w:color="D9D9D9" w:sz="4"/>
+              <w:right w:val="single" w:color="D9D9D9" w:sz="4"/>
+            </w:tcBorders>
+            <w:shd w:fill="0E7C66" w:val="clear"/>
+            <w:tcMar>
+              <w:top w:type="dxa" w:w="80"/>
+              <w:left w:type="dxa" w:w="120"/>
+              <w:bottom w:type="dxa" w:w="80"/>
+              <w:right w:type="dxa" w:w="120"/>
+            </w:tcMar>
+          </w:tcPr>
+          <w:p>
+            <w:r>
+              <w:rPr>
+                <w:rFonts w:ascii="Arial" w:cs="Arial" w:eastAsia="Arial" w:hAnsi="Arial"/>
+                <w:b/>
+                <w:bCs/>
+                <w:color w:val="FFFFFF"/>
+                <w:sz w:val="20"/>
+                <w:szCs w:val="20"/>
+              </w:rPr>
+              <w:t xml:space="preserve">Contact</w:t>
+            </w:r>
+          </w:p>
+        </w:tc>
+        <w:tc>
+          <w:tcPr>
+            <w:tcW w:type="pct" w:w="12%"/>
+            <w:tcBorders>
+              <w:top w:val="single" w:color="D9D9D9" w:sz="4"/>
+              <w:left w:val="single" w:color="D9D9D9" w:sz="4"/>
+              <w:bottom w:val="single" w:color="D9D9D9" w:sz="4"/>
+              <w:right w:val="single" w:color="D9D9D9" w:sz="4"/>
+            </w:tcBorders>
+            <w:shd w:fill="0E7C66" w:val="clear"/>
+            <w:tcMar>
+              <w:top w:type="dxa" w:w="80"/>
+              <w:left w:type="dxa" w:w="120"/>
+              <w:bottom w:type="dxa" w:w="80"/>
+              <w:right w:type="dxa" w:w="120"/>
+            </w:tcMar>
+          </w:tcPr>
+          <w:p>
+            <w:r>
+              <w:rPr>
+                <w:rFonts w:ascii="Arial" w:cs="Arial" w:eastAsia="Arial" w:hAnsi="Arial"/>
+                <w:b/>
+                <w:bCs/>
+                <w:color w:val="FFFFFF"/>
+                <w:sz w:val="20"/>
+                <w:szCs w:val="20"/>
+              </w:rPr>
+              <w:t xml:space="preserve">As of (date)</w:t>
+            </w:r>
+          </w:p>
+        </w:tc>
+      </w:tr>
+      <w:tr>
+        <w:tc>
+          <w:tcPr>
+            <w:tcW w:type="pct" w:w="22%"/>
+            <w:tcBorders>
+              <w:top w:val="single" w:color="D9D9D9" w:sz="4"/>
+              <w:left w:val="single" w:color="D9D9D9" w:sz="4"/>
+              <w:bottom w:val="single" w:color="D9D9D9" w:sz="4"/>
+              <w:right w:val="single" w:color="D9D9D9" w:sz="4"/>
+            </w:tcBorders>
+            <w:tcMar>
+              <w:top w:type="dxa" w:w="80"/>
+              <w:left w:type="dxa" w:w="120"/>
+              <w:bottom w:type="dxa" w:w="80"/>
+              <w:right w:type="dxa" w:w="120"/>
+            </w:tcMar>
+          </w:tcPr>
+          <w:p>
+            <w:r>
+              <w:rPr>
+                <w:rFonts w:ascii="Arial" w:cs="Arial" w:eastAsia="Arial" w:hAnsi="Arial"/>
+                <w:color w:val="2B2B2B"/>
+                <w:sz w:val="20"/>
+                <w:szCs w:val="20"/>
+              </w:rPr>
+              <w:t xml:space="preserve"> </w:t>
+            </w:r>
+          </w:p>
+        </w:tc>
+        <w:tc>
+          <w:tcPr>
+            <w:tcW w:type="pct" w:w="20%"/>
+            <w:tcBorders>
+              <w:top w:val="single" w:color="D9D9D9" w:sz="4"/>
+              <w:left w:val="single" w:color="D9D9D9" w:sz="4"/>
+              <w:bottom w:val="single" w:color="D9D9D9" w:sz="4"/>
+              <w:right w:val="single" w:color="D9D9D9" w:sz="4"/>
+            </w:tcBorders>
+            <w:tcMar>
+              <w:top w:type="dxa" w:w="80"/>
+              <w:left w:type="dxa" w:w="120"/>
+              <w:bottom w:type="dxa" w:w="80"/>
+              <w:right w:type="dxa" w:w="120"/>
+            </w:tcMar>
+          </w:tcPr>
+          <w:p>
+            <w:r>
+              <w:rPr>
+                <w:rFonts w:ascii="Arial" w:cs="Arial" w:eastAsia="Arial" w:hAnsi="Arial"/>
+                <w:color w:val="2B2B2B"/>
+                <w:sz w:val="20"/>
+                <w:szCs w:val="20"/>
+              </w:rPr>
+              <w:t xml:space="preserve"> </w:t>
+            </w:r>
+          </w:p>
+        </w:tc>
+        <w:tc>
+          <w:tcPr>
+            <w:tcW w:type="pct" w:w="24%"/>
+            <w:tcBorders>
+              <w:top w:val="single" w:color="D9D9D9" w:sz="4"/>
+              <w:left w:val="single" w:color="D9D9D9" w:sz="4"/>
+              <w:bottom w:val="single" w:color="D9D9D9" w:sz="4"/>
+              <w:right w:val="single" w:color="D9D9D9" w:sz="4"/>
+            </w:tcBorders>
+            <w:tcMar>
+              <w:top w:type="dxa" w:w="80"/>
+              <w:left w:type="dxa" w:w="120"/>
+              <w:bottom w:type="dxa" w:w="80"/>
+              <w:right w:type="dxa" w:w="120"/>
+            </w:tcMar>
+          </w:tcPr>
+          <w:p>
+            <w:r>
+              <w:rPr>
+                <w:rFonts w:ascii="Arial" w:cs="Arial" w:eastAsia="Arial" w:hAnsi="Arial"/>
+                <w:color w:val="2B2B2B"/>
+                <w:sz w:val="20"/>
+                <w:szCs w:val="20"/>
+              </w:rPr>
+              <w:t xml:space="preserve"> </w:t>
+            </w:r>
+          </w:p>
+        </w:tc>
+        <w:tc>
+          <w:tcPr>
+            <w:tcW w:type="pct" w:w="22%"/>
+            <w:tcBorders>
+              <w:top w:val="single" w:color="D9D9D9" w:sz="4"/>
+              <w:left w:val="single" w:color="D9D9D9" w:sz="4"/>
+              <w:bottom w:val="single" w:color="D9D9D9" w:sz="4"/>
+              <w:right w:val="single" w:color="D9D9D9" w:sz="4"/>
+            </w:tcBorders>
+            <w:tcMar>
+              <w:top w:type="dxa" w:w="80"/>
+              <w:left w:type="dxa" w:w="120"/>
+              <w:bottom w:type="dxa" w:w="80"/>
+              <w:right w:type="dxa" w:w="120"/>
+            </w:tcMar>
+          </w:tcPr>
+          <w:p>
+            <w:r>
+              <w:rPr>
+                <w:rFonts w:ascii="Arial" w:cs="Arial" w:eastAsia="Arial" w:hAnsi="Arial"/>
+                <w:color w:val="2B2B2B"/>
+                <w:sz w:val="20"/>
+                <w:szCs w:val="20"/>
+              </w:rPr>
+              <w:t xml:space="preserve"> </w:t>
+            </w:r>
+          </w:p>
+        </w:tc>
+        <w:tc>
+          <w:tcPr>
+            <w:tcW w:type="pct" w:w="12%"/>
+            <w:tcBorders>
+              <w:top w:val="single" w:color="D9D9D9" w:sz="4"/>
+              <w:left w:val="single" w:color="D9D9D9" w:sz="4"/>
+              <w:bottom w:val="single" w:color="D9D9D9" w:sz="4"/>
+              <w:right w:val="single" w:color="D9D9D9" w:sz="4"/>
+            </w:tcBorders>
+            <w:tcMar>
+              <w:top w:type="dxa" w:w="80"/>
+              <w:left w:type="dxa" w:w="120"/>
+              <w:bottom w:type="dxa" w:w="80"/>
+              <w:right w:type="dxa" w:w="120"/>
+            </w:tcMar>
+          </w:tcPr>
+          <w:p>
+            <w:r>
+              <w:rPr>
+                <w:rFonts w:ascii="Arial" w:cs="Arial" w:eastAsia="Arial" w:hAnsi="Arial"/>
+                <w:color w:val="2B2B2B"/>
+                <w:sz w:val="20"/>
+                <w:szCs w:val="20"/>
+              </w:rPr>
+              <w:t xml:space="preserve"> </w:t>
+            </w:r>
+          </w:p>
+        </w:tc>
+      </w:tr>
+      <w:tr>
+        <w:tc>
+          <w:tcPr>
+            <w:tcW w:type="pct" w:w="22%"/>
+            <w:tcBorders>
+              <w:top w:val="single" w:color="D9D9D9" w:sz="4"/>
+              <w:left w:val="single" w:color="D9D9D9" w:sz="4"/>
+              <w:bottom w:val="single" w:color="D9D9D9" w:sz="4"/>
+              <w:right w:val="single" w:color="D9D9D9" w:sz="4"/>
+            </w:tcBorders>
+            <w:shd w:fill="F2F7FB" w:val="clear"/>
+            <w:tcMar>
+              <w:top w:type="dxa" w:w="80"/>
+              <w:left w:type="dxa" w:w="120"/>
+              <w:bottom w:type="dxa" w:w="80"/>
+              <w:right w:type="dxa" w:w="120"/>
+            </w:tcMar>
+          </w:tcPr>
+          <w:p>
+            <w:r>
+              <w:rPr>
+                <w:rFonts w:ascii="Arial" w:cs="Arial" w:eastAsia="Arial" w:hAnsi="Arial"/>
+                <w:color w:val="2B2B2B"/>
+                <w:sz w:val="20"/>
+                <w:szCs w:val="20"/>
+              </w:rPr>
+              <w:t xml:space="preserve"> </w:t>
+            </w:r>
+          </w:p>
+        </w:tc>
+        <w:tc>
+          <w:tcPr>
+            <w:tcW w:type="pct" w:w="20%"/>
+            <w:tcBorders>
+              <w:top w:val="single" w:color="D9D9D9" w:sz="4"/>
+              <w:left w:val="single" w:color="D9D9D9" w:sz="4"/>
+              <w:bottom w:val="single" w:color="D9D9D9" w:sz="4"/>
+              <w:right w:val="single" w:color="D9D9D9" w:sz="4"/>
+            </w:tcBorders>
+            <w:shd w:fill="F2F7FB" w:val="clear"/>
+            <w:tcMar>
+              <w:top w:type="dxa" w:w="80"/>
+              <w:left w:type="dxa" w:w="120"/>
+              <w:bottom w:type="dxa" w:w="80"/>
+              <w:right w:type="dxa" w:w="120"/>
+            </w:tcMar>
+          </w:tcPr>
+          <w:p>
+            <w:r>
+              <w:rPr>
+                <w:rFonts w:ascii="Arial" w:cs="Arial" w:eastAsia="Arial" w:hAnsi="Arial"/>
+                <w:color w:val="2B2B2B"/>
+                <w:sz w:val="20"/>
+                <w:szCs w:val="20"/>
+              </w:rPr>
+              <w:t xml:space="preserve"> </w:t>
+            </w:r>
+          </w:p>
+        </w:tc>
+        <w:tc>
+          <w:tcPr>
+            <w:tcW w:type="pct" w:w="24%"/>
+            <w:tcBorders>
+              <w:top w:val="single" w:color="D9D9D9" w:sz="4"/>
+              <w:left w:val="single" w:color="D9D9D9" w:sz="4"/>
+              <w:bottom w:val="single" w:color="D9D9D9" w:sz="4"/>
+              <w:right w:val="single" w:color="D9D9D9" w:sz="4"/>
+            </w:tcBorders>
+            <w:shd w:fill="F2F7FB" w:val="clear"/>
+            <w:tcMar>
+              <w:top w:type="dxa" w:w="80"/>
+              <w:left w:type="dxa" w:w="120"/>
+              <w:bottom w:type="dxa" w:w="80"/>
+              <w:right w:type="dxa" w:w="120"/>
+            </w:tcMar>
+          </w:tcPr>
+          <w:p>
+            <w:r>
+              <w:rPr>
+                <w:rFonts w:ascii="Arial" w:cs="Arial" w:eastAsia="Arial" w:hAnsi="Arial"/>
+                <w:color w:val="2B2B2B"/>
+                <w:sz w:val="20"/>
+                <w:szCs w:val="20"/>
+              </w:rPr>
+              <w:t xml:space="preserve"> </w:t>
+            </w:r>
+          </w:p>
+        </w:tc>
+        <w:tc>
+          <w:tcPr>
+            <w:tcW w:type="pct" w:w="22%"/>
+            <w:tcBorders>
+              <w:top w:val="single" w:color="D9D9D9" w:sz="4"/>
+              <w:left w:val="single" w:color="D9D9D9" w:sz="4"/>
+              <w:bottom w:val="single" w:color="D9D9D9" w:sz="4"/>
+              <w:right w:val="single" w:color="D9D9D9" w:sz="4"/>
+            </w:tcBorders>
+            <w:shd w:fill="F2F7FB" w:val="clear"/>
+            <w:tcMar>
+              <w:top w:type="dxa" w:w="80"/>
+              <w:left w:type="dxa" w:w="120"/>
+              <w:bottom w:type="dxa" w:w="80"/>
+              <w:right w:type="dxa" w:w="120"/>
+            </w:tcMar>
+          </w:tcPr>
+          <w:p>
+            <w:r>
+              <w:rPr>
+                <w:rFonts w:ascii="Arial" w:cs="Arial" w:eastAsia="Arial" w:hAnsi="Arial"/>
+                <w:color w:val="2B2B2B"/>
+                <w:sz w:val="20"/>
+                <w:szCs w:val="20"/>
+              </w:rPr>
+              <w:t xml:space="preserve"> </w:t>
+            </w:r>
+          </w:p>
+        </w:tc>
+        <w:tc>
+          <w:tcPr>
+            <w:tcW w:type="pct" w:w="12%"/>
+            <w:tcBorders>
+              <w:top w:val="single" w:color="D9D9D9" w:sz="4"/>
+              <w:left w:val="single" w:color="D9D9D9" w:sz="4"/>
+              <w:bottom w:val="single" w:color="D9D9D9" w:sz="4"/>
+              <w:right w:val="single" w:color="D9D9D9" w:sz="4"/>
+            </w:tcBorders>
+            <w:shd w:fill="F2F7FB" w:val="clear"/>
+            <w:tcMar>
+              <w:top w:type="dxa" w:w="80"/>
+              <w:left w:type="dxa" w:w="120"/>
+              <w:bottom w:type="dxa" w:w="80"/>
+              <w:right w:type="dxa" w:w="120"/>
+            </w:tcMar>
+          </w:tcPr>
+          <w:p>
+            <w:r>
+              <w:rPr>
+                <w:rFonts w:ascii="Arial" w:cs="Arial" w:eastAsia="Arial" w:hAnsi="Arial"/>
+                <w:color w:val="2B2B2B"/>
+                <w:sz w:val="20"/>
+                <w:szCs w:val="20"/>
+              </w:rPr>
+              <w:t xml:space="preserve"> </w:t>
+            </w:r>
+          </w:p>
+        </w:tc>
+      </w:tr>
+      <w:tr>
+        <w:tc>
+          <w:tcPr>
+            <w:tcW w:type="pct" w:w="22%"/>
+            <w:tcBorders>
+              <w:top w:val="single" w:color="D9D9D9" w:sz="4"/>
+              <w:left w:val="single" w:color="D9D9D9" w:sz="4"/>
+              <w:bottom w:val="single" w:color="D9D9D9" w:sz="4"/>
+              <w:right w:val="single" w:color="D9D9D9" w:sz="4"/>
+            </w:tcBorders>
+            <w:tcMar>
+              <w:top w:type="dxa" w:w="80"/>
+              <w:left w:type="dxa" w:w="120"/>
+              <w:bottom w:type="dxa" w:w="80"/>
+              <w:right w:type="dxa" w:w="120"/>
+            </w:tcMar>
+          </w:tcPr>
+          <w:p>
+            <w:r>
+              <w:rPr>
+                <w:rFonts w:ascii="Arial" w:cs="Arial" w:eastAsia="Arial" w:hAnsi="Arial"/>
+                <w:color w:val="2B2B2B"/>
+                <w:sz w:val="20"/>
+                <w:szCs w:val="20"/>
+              </w:rPr>
+              <w:t xml:space="preserve"> </w:t>
+            </w:r>
+          </w:p>
+        </w:tc>
+        <w:tc>
+          <w:tcPr>
+            <w:tcW w:type="pct" w:w="20%"/>
+            <w:tcBorders>
+              <w:top w:val="single" w:color="D9D9D9" w:sz="4"/>
+              <w:left w:val="single" w:color="D9D9D9" w:sz="4"/>
+              <w:bottom w:val="single" w:color="D9D9D9" w:sz="4"/>
+              <w:right w:val="single" w:color="D9D9D9" w:sz="4"/>
+            </w:tcBorders>
+            <w:tcMar>
+              <w:top w:type="dxa" w:w="80"/>
+              <w:left w:type="dxa" w:w="120"/>
+              <w:bottom w:type="dxa" w:w="80"/>
+              <w:right w:type="dxa" w:w="120"/>
+            </w:tcMar>
+          </w:tcPr>
+          <w:p>
+            <w:r>
+              <w:rPr>
+                <w:rFonts w:ascii="Arial" w:cs="Arial" w:eastAsia="Arial" w:hAnsi="Arial"/>
+                <w:color w:val="2B2B2B"/>
+                <w:sz w:val="20"/>
+                <w:szCs w:val="20"/>
+              </w:rPr>
+              <w:t xml:space="preserve"> </w:t>
+            </w:r>
+          </w:p>
+        </w:tc>
+        <w:tc>
+          <w:tcPr>
+            <w:tcW w:type="pct" w:w="24%"/>
+            <w:tcBorders>
+              <w:top w:val="single" w:color="D9D9D9" w:sz="4"/>
+              <w:left w:val="single" w:color="D9D9D9" w:sz="4"/>
+              <w:bottom w:val="single" w:color="D9D9D9" w:sz="4"/>
+              <w:right w:val="single" w:color="D9D9D9" w:sz="4"/>
+            </w:tcBorders>
+            <w:tcMar>
+              <w:top w:type="dxa" w:w="80"/>
+              <w:left w:type="dxa" w:w="120"/>
+              <w:bottom w:type="dxa" w:w="80"/>
+              <w:right w:type="dxa" w:w="120"/>
+            </w:tcMar>
+          </w:tcPr>
+          <w:p>
+            <w:r>
+              <w:rPr>
+                <w:rFonts w:ascii="Arial" w:cs="Arial" w:eastAsia="Arial" w:hAnsi="Arial"/>
+                <w:color w:val="2B2B2B"/>
+                <w:sz w:val="20"/>
+                <w:szCs w:val="20"/>
+              </w:rPr>
+              <w:t xml:space="preserve"> </w:t>
+            </w:r>
+          </w:p>
+        </w:tc>
+        <w:tc>
+          <w:tcPr>
+            <w:tcW w:type="pct" w:w="22%"/>
+            <w:tcBorders>
+              <w:top w:val="single" w:color="D9D9D9" w:sz="4"/>
+              <w:left w:val="single" w:color="D9D9D9" w:sz="4"/>
+              <w:bottom w:val="single" w:color="D9D9D9" w:sz="4"/>
+              <w:right w:val="single" w:color="D9D9D9" w:sz="4"/>
+            </w:tcBorders>
+            <w:tcMar>
+              <w:top w:type="dxa" w:w="80"/>
+              <w:left w:type="dxa" w:w="120"/>
+              <w:bottom w:type="dxa" w:w="80"/>
+              <w:right w:type="dxa" w:w="120"/>
+            </w:tcMar>
+          </w:tcPr>
+          <w:p>
+            <w:r>
+              <w:rPr>
+                <w:rFonts w:ascii="Arial" w:cs="Arial" w:eastAsia="Arial" w:hAnsi="Arial"/>
+                <w:color w:val="2B2B2B"/>
+                <w:sz w:val="20"/>
+                <w:szCs w:val="20"/>
+              </w:rPr>
+              <w:t xml:space="preserve"> </w:t>
+            </w:r>
+          </w:p>
+        </w:tc>
+        <w:tc>
+          <w:tcPr>
+            <w:tcW w:type="pct" w:w="12%"/>
+            <w:tcBorders>
+              <w:top w:val="single" w:color="D9D9D9" w:sz="4"/>
+              <w:left w:val="single" w:color="D9D9D9" w:sz="4"/>
+              <w:bottom w:val="single" w:color="D9D9D9" w:sz="4"/>
+              <w:right w:val="single" w:color="D9D9D9" w:sz="4"/>
+            </w:tcBorders>
+            <w:tcMar>
+              <w:top w:type="dxa" w:w="80"/>
+              <w:left w:type="dxa" w:w="120"/>
+              <w:bottom w:type="dxa" w:w="80"/>
+              <w:right w:type="dxa" w:w="120"/>
+            </w:tcMar>
+          </w:tcPr>
+          <w:p>
+            <w:r>
+              <w:rPr>
+                <w:rFonts w:ascii="Arial" w:cs="Arial" w:eastAsia="Arial" w:hAnsi="Arial"/>
+                <w:color w:val="2B2B2B"/>
+                <w:sz w:val="20"/>
+                <w:szCs w:val="20"/>
+              </w:rPr>
+              <w:t xml:space="preserve"> </w:t>
+            </w:r>
+          </w:p>
+        </w:tc>
+      </w:tr>
+    </w:tbl>
+    <w:p>
+      <w:pPr>
+        <w:spacing w:after="120"/>
+      </w:pPr>
+    </w:p>
+    <w:p>
+      <w:pPr>
+        <w:pStyle w:val="Heading2"/>
+        <w:spacing w:after="100" w:before="280"/>
+      </w:pPr>
+      <w:r>
+        <w:rPr>
+          <w:rFonts w:ascii="Arial" w:cs="Arial" w:eastAsia="Arial" w:hAnsi="Arial"/>
+          <w:b/>
+          <w:bCs/>
+          <w:color w:val="0E7C66"/>
+          <w:sz w:val="23"/>
+          <w:szCs w:val="23"/>
+        </w:rPr>
+        <w:t xml:space="preserve">8.2 — Source data &amp; pipeline notes</w:t>
+      </w:r>
+    </w:p>
+    <w:p>
+      <w:pPr>
+        <w:spacing w:after="120"/>
+      </w:pPr>
+      <w:r>
+        <w:rPr>
+          <w:rFonts w:ascii="Arial" w:cs="Arial" w:eastAsia="Arial" w:hAnsi="Arial"/>
+          <w:color w:val="2B2B2B"/>
+          <w:sz w:val="21"/>
+          <w:szCs w:val="21"/>
+        </w:rPr>
+        <w:t xml:space="preserve">Where the authoritative source lives (LGDM feature classes, APRX, FGDB), how the AGOL service is produced, and anything a successor must know to reproduce a publish:</w:t>
+      </w:r>
+    </w:p>
+    <w:p>
+      <w:pPr>
+        <w:pBdr>
+          <w:bottom w:val="single" w:color="BFBFBF" w:sz="4"/>
+        </w:pBdr>
+        <w:spacing w:before="260"/>
+      </w:pPr>
+      <w:r>
+        <w:rPr>
+          <w:rFonts w:ascii="Arial" w:cs="Arial" w:eastAsia="Arial" w:hAnsi="Arial"/>
+          <w:sz w:val="21"/>
+          <w:szCs w:val="21"/>
+        </w:rPr>
+        <w:t xml:space="preserve"> </w:t>
+      </w:r>
+    </w:p>
+    <w:p>
+      <w:pPr>
+        <w:pBdr>
+          <w:bottom w:val="single" w:color="BFBFBF" w:sz="4"/>
+        </w:pBdr>
+        <w:spacing w:before="260"/>
+      </w:pPr>
+      <w:r>
+        <w:rPr>
+          <w:rFonts w:ascii="Arial" w:cs="Arial" w:eastAsia="Arial" w:hAnsi="Arial"/>
+          <w:sz w:val="21"/>
+          <w:szCs w:val="21"/>
+        </w:rPr>
+        <w:t xml:space="preserve"> </w:t>
+      </w:r>
+    </w:p>
+    <w:p>
+      <w:pPr>
+        <w:pBdr>
+          <w:bottom w:val="single" w:color="BFBFBF" w:sz="4"/>
+        </w:pBdr>
+        <w:spacing w:before="260"/>
+      </w:pPr>
+      <w:r>
+        <w:rPr>
+          <w:rFonts w:ascii="Arial" w:cs="Arial" w:eastAsia="Arial" w:hAnsi="Arial"/>
+          <w:sz w:val="21"/>
+          <w:szCs w:val="21"/>
+        </w:rPr>
+        <w:t xml:space="preserve"> </w:t>
+      </w:r>
+    </w:p>
+    <w:p>
+      <w:pPr>
+        <w:pBdr>
+          <w:bottom w:val="single" w:color="BFBFBF" w:sz="4"/>
+        </w:pBdr>
+        <w:spacing w:before="260"/>
+      </w:pPr>
+      <w:r>
+        <w:rPr>
+          <w:rFonts w:ascii="Arial" w:cs="Arial" w:eastAsia="Arial" w:hAnsi="Arial"/>
+          <w:sz w:val="21"/>
+          <w:szCs w:val="21"/>
+        </w:rPr>
+        <w:t xml:space="preserve"> </w:t>
+      </w:r>
+    </w:p>
+    <w:p>
+      <w:pPr>
+        <w:pBdr>
+          <w:bottom w:val="single" w:color="BFBFBF" w:sz="4"/>
+        </w:pBdr>
+        <w:spacing w:before="260"/>
+      </w:pPr>
+      <w:r>
+        <w:rPr>
+          <w:rFonts w:ascii="Arial" w:cs="Arial" w:eastAsia="Arial" w:hAnsi="Arial"/>
+          <w:sz w:val="21"/>
+          <w:szCs w:val="21"/>
+        </w:rPr>
+        <w:t xml:space="preserve"> </w:t>
+      </w:r>
+    </w:p>
+    <w:p>
+      <w:pPr>
+        <w:pBdr>
+          <w:bottom w:val="single" w:color="BFBFBF" w:sz="4"/>
+        </w:pBdr>
+        <w:spacing w:before="260"/>
+      </w:pPr>
+      <w:r>
+        <w:rPr>
+          <w:rFonts w:ascii="Arial" w:cs="Arial" w:eastAsia="Arial" w:hAnsi="Arial"/>
+          <w:sz w:val="21"/>
+          <w:szCs w:val="21"/>
+        </w:rPr>
+        <w:t xml:space="preserve"> </w:t>
+      </w:r>
+    </w:p>
+    <w:p>
+      <w:pPr>
+        <w:pBdr>
+          <w:bottom w:val="single" w:color="BFBFBF" w:sz="4"/>
+        </w:pBdr>
+        <w:spacing w:before="260"/>
+      </w:pPr>
+      <w:r>
+        <w:rPr>
+          <w:rFonts w:ascii="Arial" w:cs="Arial" w:eastAsia="Arial" w:hAnsi="Arial"/>
+          <w:sz w:val="21"/>
+          <w:szCs w:val="21"/>
+        </w:rPr>
+        <w:t xml:space="preserve"> </w:t>
+      </w:r>
+    </w:p>
+    <w:p>
+      <w:pPr>
+        <w:pBdr>
+          <w:bottom w:val="single" w:color="BFBFBF" w:sz="4"/>
+        </w:pBdr>
+        <w:spacing w:before="260"/>
+      </w:pPr>
+      <w:r>
+        <w:rPr>
+          <w:rFonts w:ascii="Arial" w:cs="Arial" w:eastAsia="Arial" w:hAnsi="Arial"/>
+          <w:sz w:val="21"/>
+          <w:szCs w:val="21"/>
+        </w:rPr>
+        <w:t xml:space="preserve"> </w:t>
+      </w:r>
+    </w:p>
+    <w:p>
+      <w:pPr>
+        <w:spacing w:after="120"/>
+      </w:pPr>
+    </w:p>
+    <w:p>
+      <w:pPr>
+        <w:pStyle w:val="Heading2"/>
+        <w:spacing w:after="100" w:before="280"/>
+      </w:pPr>
+      <w:r>
+        <w:rPr>
+          <w:rFonts w:ascii="Arial" w:cs="Arial" w:eastAsia="Arial" w:hAnsi="Arial"/>
+          <w:b/>
+          <w:bCs/>
+          <w:color w:val="0E7C66"/>
+          <w:sz w:val="23"/>
+          <w:szCs w:val="23"/>
+        </w:rPr>
+        <w:t xml:space="preserve">8.3 — Publish / republish checklist</w:t>
+      </w:r>
+    </w:p>
+    <w:p>
+      <w:pPr>
+        <w:spacing w:after="120"/>
+      </w:pPr>
+      <w:r>
+        <w:rPr>
+          <w:rFonts w:ascii="Arial" w:cs="Arial" w:eastAsia="Arial" w:hAnsi="Arial"/>
+          <w:color w:val="2B2B2B"/>
+          <w:sz w:val="21"/>
+          <w:szCs w:val="21"/>
+        </w:rPr>
+        <w:t xml:space="preserve">Complete one row every time the hosted service is overwritten or republished:</w:t>
+      </w:r>
+    </w:p>
+    <w:tbl>
+      <w:tblPr>
+        <w:tblW w:type="pct" w:w="100%"/>
+        <w:tblBorders>
+          <w:top w:val="single" w:color="auto" w:sz="4"/>
+          <w:left w:val="single" w:color="auto" w:sz="4"/>
+          <w:bottom w:val="single" w:color="auto" w:sz="4"/>
+          <w:right w:val="single" w:color="auto" w:sz="4"/>
+          <w:insideH w:val="single" w:color="auto" w:sz="4"/>
+          <w:insideV w:val="single" w:color="auto" w:sz="4"/>
+        </w:tblBorders>
+      </w:tblPr>
+      <w:tblGrid>
+        <w:gridCol w:w="100"/>
+        <w:gridCol w:w="100"/>
+        <w:gridCol w:w="100"/>
+        <w:gridCol w:w="100"/>
+        <w:gridCol w:w="100"/>
+      </w:tblGrid>
+      <w:tr>
+        <w:tc>
+          <w:tcPr>
+            <w:tcW w:type="pct" w:w="12%"/>
+            <w:tcBorders>
+              <w:top w:val="single" w:color="D9D9D9" w:sz="4"/>
+              <w:left w:val="single" w:color="D9D9D9" w:sz="4"/>
+              <w:bottom w:val="single" w:color="D9D9D9" w:sz="4"/>
+              <w:right w:val="single" w:color="D9D9D9" w:sz="4"/>
+            </w:tcBorders>
+            <w:shd w:fill="0E7C66" w:val="clear"/>
+            <w:tcMar>
+              <w:top w:type="dxa" w:w="80"/>
+              <w:left w:type="dxa" w:w="120"/>
+              <w:bottom w:type="dxa" w:w="80"/>
+              <w:right w:type="dxa" w:w="120"/>
+            </w:tcMar>
+          </w:tcPr>
+          <w:p>
+            <w:r>
+              <w:rPr>
+                <w:rFonts w:ascii="Arial" w:cs="Arial" w:eastAsia="Arial" w:hAnsi="Arial"/>
+                <w:b/>
+                <w:bCs/>
+                <w:color w:val="FFFFFF"/>
+                <w:sz w:val="20"/>
+                <w:szCs w:val="20"/>
+              </w:rPr>
+              <w:t xml:space="preserve">Date</w:t>
+            </w:r>
+          </w:p>
+        </w:tc>
+        <w:tc>
+          <w:tcPr>
+            <w:tcW w:type="pct" w:w="34%"/>
+            <w:tcBorders>
+              <w:top w:val="single" w:color="D9D9D9" w:sz="4"/>
+              <w:left w:val="single" w:color="D9D9D9" w:sz="4"/>
+              <w:bottom w:val="single" w:color="D9D9D9" w:sz="4"/>
+              <w:right w:val="single" w:color="D9D9D9" w:sz="4"/>
+            </w:tcBorders>
+            <w:shd w:fill="0E7C66" w:val="clear"/>
+            <w:tcMar>
+              <w:top w:type="dxa" w:w="80"/>
+              <w:left w:type="dxa" w:w="120"/>
+              <w:bottom w:type="dxa" w:w="80"/>
+              <w:right w:type="dxa" w:w="120"/>
+            </w:tcMar>
+          </w:tcPr>
+          <w:p>
+            <w:r>
+              <w:rPr>
+                <w:rFonts w:ascii="Arial" w:cs="Arial" w:eastAsia="Arial" w:hAnsi="Arial"/>
+                <w:b/>
+                <w:bCs/>
+                <w:color w:val="FFFFFF"/>
+                <w:sz w:val="20"/>
+                <w:szCs w:val="20"/>
+              </w:rPr>
+              <w:t xml:space="preserve">What changed</w:t>
+            </w:r>
+          </w:p>
+        </w:tc>
+        <w:tc>
+          <w:tcPr>
+            <w:tcW w:type="pct" w:w="18%"/>
+            <w:tcBorders>
+              <w:top w:val="single" w:color="D9D9D9" w:sz="4"/>
+              <w:left w:val="single" w:color="D9D9D9" w:sz="4"/>
+              <w:bottom w:val="single" w:color="D9D9D9" w:sz="4"/>
+              <w:right w:val="single" w:color="D9D9D9" w:sz="4"/>
+            </w:tcBorders>
+            <w:shd w:fill="0E7C66" w:val="clear"/>
+            <w:tcMar>
+              <w:top w:type="dxa" w:w="80"/>
+              <w:left w:type="dxa" w:w="120"/>
+              <w:bottom w:type="dxa" w:w="80"/>
+              <w:right w:type="dxa" w:w="120"/>
+            </w:tcMar>
+          </w:tcPr>
+          <w:p>
+            <w:r>
+              <w:rPr>
+                <w:rFonts w:ascii="Arial" w:cs="Arial" w:eastAsia="Arial" w:hAnsi="Arial"/>
+                <w:b/>
+                <w:bCs/>
+                <w:color w:val="FFFFFF"/>
+                <w:sz w:val="20"/>
+                <w:szCs w:val="20"/>
+              </w:rPr>
+              <w:t xml:space="preserve">Republished by</w:t>
+            </w:r>
+          </w:p>
+        </w:tc>
+        <w:tc>
+          <w:tcPr>
+            <w:tcW w:type="pct" w:w="18%"/>
+            <w:tcBorders>
+              <w:top w:val="single" w:color="D9D9D9" w:sz="4"/>
+              <w:left w:val="single" w:color="D9D9D9" w:sz="4"/>
+              <w:bottom w:val="single" w:color="D9D9D9" w:sz="4"/>
+              <w:right w:val="single" w:color="D9D9D9" w:sz="4"/>
+            </w:tcBorders>
+            <w:shd w:fill="0E7C66" w:val="clear"/>
+            <w:tcMar>
+              <w:top w:type="dxa" w:w="80"/>
+              <w:left w:type="dxa" w:w="120"/>
+              <w:bottom w:type="dxa" w:w="80"/>
+              <w:right w:type="dxa" w:w="120"/>
+            </w:tcMar>
+          </w:tcPr>
+          <w:p>
+            <w:r>
+              <w:rPr>
+                <w:rFonts w:ascii="Arial" w:cs="Arial" w:eastAsia="Arial" w:hAnsi="Arial"/>
+                <w:b/>
+                <w:bCs/>
+                <w:color w:val="FFFFFF"/>
+                <w:sz w:val="20"/>
+                <w:szCs w:val="20"/>
+              </w:rPr>
+              <w:t xml:space="preserve">Re-shared Public? (Y/N)</w:t>
+            </w:r>
+          </w:p>
+        </w:tc>
+        <w:tc>
+          <w:tcPr>
+            <w:tcW w:type="pct" w:w="18%"/>
+            <w:tcBorders>
+              <w:top w:val="single" w:color="D9D9D9" w:sz="4"/>
+              <w:left w:val="single" w:color="D9D9D9" w:sz="4"/>
+              <w:bottom w:val="single" w:color="D9D9D9" w:sz="4"/>
+              <w:right w:val="single" w:color="D9D9D9" w:sz="4"/>
+            </w:tcBorders>
+            <w:shd w:fill="0E7C66" w:val="clear"/>
+            <w:tcMar>
+              <w:top w:type="dxa" w:w="80"/>
+              <w:left w:type="dxa" w:w="120"/>
+              <w:bottom w:type="dxa" w:w="80"/>
+              <w:right w:type="dxa" w:w="120"/>
+            </w:tcMar>
+          </w:tcPr>
+          <w:p>
+            <w:r>
+              <w:rPr>
+                <w:rFonts w:ascii="Arial" w:cs="Arial" w:eastAsia="Arial" w:hAnsi="Arial"/>
+                <w:b/>
+                <w:bCs/>
+                <w:color w:val="FFFFFF"/>
+                <w:sz w:val="20"/>
+                <w:szCs w:val="20"/>
+              </w:rPr>
+              <w:t xml:space="preserve">Anonymous query verified? (Y/N)</w:t>
+            </w:r>
+          </w:p>
+        </w:tc>
+      </w:tr>
+      <w:tr>
+        <w:tc>
+          <w:tcPr>
+            <w:tcW w:type="pct" w:w="12%"/>
+            <w:tcBorders>
+              <w:top w:val="single" w:color="D9D9D9" w:sz="4"/>
+              <w:left w:val="single" w:color="D9D9D9" w:sz="4"/>
+              <w:bottom w:val="single" w:color="D9D9D9" w:sz="4"/>
+              <w:right w:val="single" w:color="D9D9D9" w:sz="4"/>
+            </w:tcBorders>
+            <w:tcMar>
+              <w:top w:type="dxa" w:w="80"/>
+              <w:left w:type="dxa" w:w="120"/>
+              <w:bottom w:type="dxa" w:w="80"/>
+              <w:right w:type="dxa" w:w="120"/>
+            </w:tcMar>
+          </w:tcPr>
+          <w:p>
+            <w:r>
+              <w:rPr>
+                <w:rFonts w:ascii="Arial" w:cs="Arial" w:eastAsia="Arial" w:hAnsi="Arial"/>
+                <w:color w:val="2B2B2B"/>
+                <w:sz w:val="20"/>
+                <w:szCs w:val="20"/>
+              </w:rPr>
+              <w:t xml:space="preserve"> </w:t>
+            </w:r>
+          </w:p>
+        </w:tc>
+        <w:tc>
+          <w:tcPr>
+            <w:tcW w:type="pct" w:w="34%"/>
+            <w:tcBorders>
+              <w:top w:val="single" w:color="D9D9D9" w:sz="4"/>
+              <w:left w:val="single" w:color="D9D9D9" w:sz="4"/>
+              <w:bottom w:val="single" w:color="D9D9D9" w:sz="4"/>
+              <w:right w:val="single" w:color="D9D9D9" w:sz="4"/>
+            </w:tcBorders>
+            <w:tcMar>
+              <w:top w:type="dxa" w:w="80"/>
+              <w:left w:type="dxa" w:w="120"/>
+              <w:bottom w:type="dxa" w:w="80"/>
+              <w:right w:type="dxa" w:w="120"/>
+            </w:tcMar>
+          </w:tcPr>
+          <w:p>
+            <w:r>
+              <w:rPr>
+                <w:rFonts w:ascii="Arial" w:cs="Arial" w:eastAsia="Arial" w:hAnsi="Arial"/>
+                <w:color w:val="2B2B2B"/>
+                <w:sz w:val="20"/>
+                <w:szCs w:val="20"/>
+              </w:rPr>
+              <w:t xml:space="preserve"> </w:t>
+            </w:r>
+          </w:p>
+        </w:tc>
+        <w:tc>
+          <w:tcPr>
+            <w:tcW w:type="pct" w:w="18%"/>
+            <w:tcBorders>
+              <w:top w:val="single" w:color="D9D9D9" w:sz="4"/>
+              <w:left w:val="single" w:color="D9D9D9" w:sz="4"/>
+              <w:bottom w:val="single" w:color="D9D9D9" w:sz="4"/>
+              <w:right w:val="single" w:color="D9D9D9" w:sz="4"/>
+            </w:tcBorders>
+            <w:tcMar>
+              <w:top w:type="dxa" w:w="80"/>
+              <w:left w:type="dxa" w:w="120"/>
+              <w:bottom w:type="dxa" w:w="80"/>
+              <w:right w:type="dxa" w:w="120"/>
+            </w:tcMar>
+          </w:tcPr>
+          <w:p>
+            <w:r>
+              <w:rPr>
+                <w:rFonts w:ascii="Arial" w:cs="Arial" w:eastAsia="Arial" w:hAnsi="Arial"/>
+                <w:color w:val="2B2B2B"/>
+                <w:sz w:val="20"/>
+                <w:szCs w:val="20"/>
+              </w:rPr>
+              <w:t xml:space="preserve"> </w:t>
+            </w:r>
+          </w:p>
+        </w:tc>
+        <w:tc>
+          <w:tcPr>
+            <w:tcW w:type="pct" w:w="18%"/>
+            <w:tcBorders>
+              <w:top w:val="single" w:color="D9D9D9" w:sz="4"/>
+              <w:left w:val="single" w:color="D9D9D9" w:sz="4"/>
+              <w:bottom w:val="single" w:color="D9D9D9" w:sz="4"/>
+              <w:right w:val="single" w:color="D9D9D9" w:sz="4"/>
+            </w:tcBorders>
+            <w:tcMar>
+              <w:top w:type="dxa" w:w="80"/>
+              <w:left w:type="dxa" w:w="120"/>
+              <w:bottom w:type="dxa" w:w="80"/>
+              <w:right w:type="dxa" w:w="120"/>
+            </w:tcMar>
+          </w:tcPr>
+          <w:p>
+            <w:r>
+              <w:rPr>
+                <w:rFonts w:ascii="Arial" w:cs="Arial" w:eastAsia="Arial" w:hAnsi="Arial"/>
+                <w:color w:val="2B2B2B"/>
+                <w:sz w:val="20"/>
+                <w:szCs w:val="20"/>
+              </w:rPr>
+              <w:t xml:space="preserve"> </w:t>
+            </w:r>
+          </w:p>
+        </w:tc>
+        <w:tc>
+          <w:tcPr>
+            <w:tcW w:type="pct" w:w="18%"/>
+            <w:tcBorders>
+              <w:top w:val="single" w:color="D9D9D9" w:sz="4"/>
+              <w:left w:val="single" w:color="D9D9D9" w:sz="4"/>
+              <w:bottom w:val="single" w:color="D9D9D9" w:sz="4"/>
+              <w:right w:val="single" w:color="D9D9D9" w:sz="4"/>
+            </w:tcBorders>
+            <w:tcMar>
+              <w:top w:type="dxa" w:w="80"/>
+              <w:left w:type="dxa" w:w="120"/>
+              <w:bottom w:type="dxa" w:w="80"/>
+              <w:right w:type="dxa" w:w="120"/>
+            </w:tcMar>
+          </w:tcPr>
+          <w:p>
+            <w:r>
+              <w:rPr>
+                <w:rFonts w:ascii="Arial" w:cs="Arial" w:eastAsia="Arial" w:hAnsi="Arial"/>
+                <w:color w:val="2B2B2B"/>
+                <w:sz w:val="20"/>
+                <w:szCs w:val="20"/>
+              </w:rPr>
+              <w:t xml:space="preserve"> </w:t>
+            </w:r>
+          </w:p>
+        </w:tc>
+      </w:tr>
+      <w:tr>
+        <w:tc>
+          <w:tcPr>
+            <w:tcW w:type="pct" w:w="12%"/>
+            <w:tcBorders>
+              <w:top w:val="single" w:color="D9D9D9" w:sz="4"/>
+              <w:left w:val="single" w:color="D9D9D9" w:sz="4"/>
+              <w:bottom w:val="single" w:color="D9D9D9" w:sz="4"/>
+              <w:right w:val="single" w:color="D9D9D9" w:sz="4"/>
+            </w:tcBorders>
+            <w:shd w:fill="F2F7FB" w:val="clear"/>
+            <w:tcMar>
+              <w:top w:type="dxa" w:w="80"/>
+              <w:left w:type="dxa" w:w="120"/>
+              <w:bottom w:type="dxa" w:w="80"/>
+              <w:right w:type="dxa" w:w="120"/>
+            </w:tcMar>
+          </w:tcPr>
+          <w:p>
+            <w:r>
+              <w:rPr>
+                <w:rFonts w:ascii="Arial" w:cs="Arial" w:eastAsia="Arial" w:hAnsi="Arial"/>
+                <w:color w:val="2B2B2B"/>
+                <w:sz w:val="20"/>
+                <w:szCs w:val="20"/>
+              </w:rPr>
+              <w:t xml:space="preserve"> </w:t>
+            </w:r>
+          </w:p>
+        </w:tc>
+        <w:tc>
+          <w:tcPr>
+            <w:tcW w:type="pct" w:w="34%"/>
+            <w:tcBorders>
+              <w:top w:val="single" w:color="D9D9D9" w:sz="4"/>
+              <w:left w:val="single" w:color="D9D9D9" w:sz="4"/>
+              <w:bottom w:val="single" w:color="D9D9D9" w:sz="4"/>
+              <w:right w:val="single" w:color="D9D9D9" w:sz="4"/>
+            </w:tcBorders>
+            <w:shd w:fill="F2F7FB" w:val="clear"/>
+            <w:tcMar>
+              <w:top w:type="dxa" w:w="80"/>
+              <w:left w:type="dxa" w:w="120"/>
+              <w:bottom w:type="dxa" w:w="80"/>
+              <w:right w:type="dxa" w:w="120"/>
+            </w:tcMar>
+          </w:tcPr>
+          <w:p>
+            <w:r>
+              <w:rPr>
+                <w:rFonts w:ascii="Arial" w:cs="Arial" w:eastAsia="Arial" w:hAnsi="Arial"/>
+                <w:color w:val="2B2B2B"/>
+                <w:sz w:val="20"/>
+                <w:szCs w:val="20"/>
+              </w:rPr>
+              <w:t xml:space="preserve"> </w:t>
+            </w:r>
+          </w:p>
+        </w:tc>
+        <w:tc>
+          <w:tcPr>
+            <w:tcW w:type="pct" w:w="18%"/>
+            <w:tcBorders>
+              <w:top w:val="single" w:color="D9D9D9" w:sz="4"/>
+              <w:left w:val="single" w:color="D9D9D9" w:sz="4"/>
+              <w:bottom w:val="single" w:color="D9D9D9" w:sz="4"/>
+              <w:right w:val="single" w:color="D9D9D9" w:sz="4"/>
+            </w:tcBorders>
+            <w:shd w:fill="F2F7FB" w:val="clear"/>
+            <w:tcMar>
+              <w:top w:type="dxa" w:w="80"/>
+              <w:left w:type="dxa" w:w="120"/>
+              <w:bottom w:type="dxa" w:w="80"/>
+              <w:right w:type="dxa" w:w="120"/>
+            </w:tcMar>
+          </w:tcPr>
+          <w:p>
+            <w:r>
+              <w:rPr>
+                <w:rFonts w:ascii="Arial" w:cs="Arial" w:eastAsia="Arial" w:hAnsi="Arial"/>
+                <w:color w:val="2B2B2B"/>
+                <w:sz w:val="20"/>
+                <w:szCs w:val="20"/>
+              </w:rPr>
+              <w:t xml:space="preserve"> </w:t>
+            </w:r>
+          </w:p>
+        </w:tc>
+        <w:tc>
+          <w:tcPr>
+            <w:tcW w:type="pct" w:w="18%"/>
+            <w:tcBorders>
+              <w:top w:val="single" w:color="D9D9D9" w:sz="4"/>
+              <w:left w:val="single" w:color="D9D9D9" w:sz="4"/>
+              <w:bottom w:val="single" w:color="D9D9D9" w:sz="4"/>
+              <w:right w:val="single" w:color="D9D9D9" w:sz="4"/>
+            </w:tcBorders>
+            <w:shd w:fill="F2F7FB" w:val="clear"/>
+            <w:tcMar>
+              <w:top w:type="dxa" w:w="80"/>
+              <w:left w:type="dxa" w:w="120"/>
+              <w:bottom w:type="dxa" w:w="80"/>
+              <w:right w:type="dxa" w:w="120"/>
+            </w:tcMar>
+          </w:tcPr>
+          <w:p>
+            <w:r>
+              <w:rPr>
+                <w:rFonts w:ascii="Arial" w:cs="Arial" w:eastAsia="Arial" w:hAnsi="Arial"/>
+                <w:color w:val="2B2B2B"/>
+                <w:sz w:val="20"/>
+                <w:szCs w:val="20"/>
+              </w:rPr>
+              <w:t xml:space="preserve"> </w:t>
+            </w:r>
+          </w:p>
+        </w:tc>
+        <w:tc>
+          <w:tcPr>
+            <w:tcW w:type="pct" w:w="18%"/>
+            <w:tcBorders>
+              <w:top w:val="single" w:color="D9D9D9" w:sz="4"/>
+              <w:left w:val="single" w:color="D9D9D9" w:sz="4"/>
+              <w:bottom w:val="single" w:color="D9D9D9" w:sz="4"/>
+              <w:right w:val="single" w:color="D9D9D9" w:sz="4"/>
+            </w:tcBorders>
+            <w:shd w:fill="F2F7FB" w:val="clear"/>
+            <w:tcMar>
+              <w:top w:type="dxa" w:w="80"/>
+              <w:left w:type="dxa" w:w="120"/>
+              <w:bottom w:type="dxa" w:w="80"/>
+              <w:right w:type="dxa" w:w="120"/>
+            </w:tcMar>
+          </w:tcPr>
+          <w:p>
+            <w:r>
+              <w:rPr>
+                <w:rFonts w:ascii="Arial" w:cs="Arial" w:eastAsia="Arial" w:hAnsi="Arial"/>
+                <w:color w:val="2B2B2B"/>
+                <w:sz w:val="20"/>
+                <w:szCs w:val="20"/>
+              </w:rPr>
+              <w:t xml:space="preserve"> </w:t>
+            </w:r>
+          </w:p>
+        </w:tc>
+      </w:tr>
+      <w:tr>
+        <w:tc>
+          <w:tcPr>
+            <w:tcW w:type="pct" w:w="12%"/>
+            <w:tcBorders>
+              <w:top w:val="single" w:color="D9D9D9" w:sz="4"/>
+              <w:left w:val="single" w:color="D9D9D9" w:sz="4"/>
+              <w:bottom w:val="single" w:color="D9D9D9" w:sz="4"/>
+              <w:right w:val="single" w:color="D9D9D9" w:sz="4"/>
+            </w:tcBorders>
+            <w:tcMar>
+              <w:top w:type="dxa" w:w="80"/>
+              <w:left w:type="dxa" w:w="120"/>
+              <w:bottom w:type="dxa" w:w="80"/>
+              <w:right w:type="dxa" w:w="120"/>
+            </w:tcMar>
+          </w:tcPr>
+          <w:p>
+            <w:r>
+              <w:rPr>
+                <w:rFonts w:ascii="Arial" w:cs="Arial" w:eastAsia="Arial" w:hAnsi="Arial"/>
+                <w:color w:val="2B2B2B"/>
+                <w:sz w:val="20"/>
+                <w:szCs w:val="20"/>
+              </w:rPr>
+              <w:t xml:space="preserve"> </w:t>
+            </w:r>
+          </w:p>
+        </w:tc>
+        <w:tc>
+          <w:tcPr>
+            <w:tcW w:type="pct" w:w="34%"/>
+            <w:tcBorders>
+              <w:top w:val="single" w:color="D9D9D9" w:sz="4"/>
+              <w:left w:val="single" w:color="D9D9D9" w:sz="4"/>
+              <w:bottom w:val="single" w:color="D9D9D9" w:sz="4"/>
+              <w:right w:val="single" w:color="D9D9D9" w:sz="4"/>
+            </w:tcBorders>
+            <w:tcMar>
+              <w:top w:type="dxa" w:w="80"/>
+              <w:left w:type="dxa" w:w="120"/>
+              <w:bottom w:type="dxa" w:w="80"/>
+              <w:right w:type="dxa" w:w="120"/>
+            </w:tcMar>
+          </w:tcPr>
+          <w:p>
+            <w:r>
+              <w:rPr>
+                <w:rFonts w:ascii="Arial" w:cs="Arial" w:eastAsia="Arial" w:hAnsi="Arial"/>
+                <w:color w:val="2B2B2B"/>
+                <w:sz w:val="20"/>
+                <w:szCs w:val="20"/>
+              </w:rPr>
+              <w:t xml:space="preserve"> </w:t>
+            </w:r>
+          </w:p>
+        </w:tc>
+        <w:tc>
+          <w:tcPr>
+            <w:tcW w:type="pct" w:w="18%"/>
+            <w:tcBorders>
+              <w:top w:val="single" w:color="D9D9D9" w:sz="4"/>
+              <w:left w:val="single" w:color="D9D9D9" w:sz="4"/>
+              <w:bottom w:val="single" w:color="D9D9D9" w:sz="4"/>
+              <w:right w:val="single" w:color="D9D9D9" w:sz="4"/>
+            </w:tcBorders>
+            <w:tcMar>
+              <w:top w:type="dxa" w:w="80"/>
+              <w:left w:type="dxa" w:w="120"/>
+              <w:bottom w:type="dxa" w:w="80"/>
+              <w:right w:type="dxa" w:w="120"/>
+            </w:tcMar>
+          </w:tcPr>
+          <w:p>
+            <w:r>
+              <w:rPr>
+                <w:rFonts w:ascii="Arial" w:cs="Arial" w:eastAsia="Arial" w:hAnsi="Arial"/>
+                <w:color w:val="2B2B2B"/>
+                <w:sz w:val="20"/>
+                <w:szCs w:val="20"/>
+              </w:rPr>
+              <w:t xml:space="preserve"> </w:t>
+            </w:r>
+          </w:p>
+        </w:tc>
+        <w:tc>
+          <w:tcPr>
+            <w:tcW w:type="pct" w:w="18%"/>
+            <w:tcBorders>
+              <w:top w:val="single" w:color="D9D9D9" w:sz="4"/>
+              <w:left w:val="single" w:color="D9D9D9" w:sz="4"/>
+              <w:bottom w:val="single" w:color="D9D9D9" w:sz="4"/>
+              <w:right w:val="single" w:color="D9D9D9" w:sz="4"/>
+            </w:tcBorders>
+            <w:tcMar>
+              <w:top w:type="dxa" w:w="80"/>
+              <w:left w:type="dxa" w:w="120"/>
+              <w:bottom w:type="dxa" w:w="80"/>
+              <w:right w:type="dxa" w:w="120"/>
+            </w:tcMar>
+          </w:tcPr>
+          <w:p>
+            <w:r>
+              <w:rPr>
+                <w:rFonts w:ascii="Arial" w:cs="Arial" w:eastAsia="Arial" w:hAnsi="Arial"/>
+                <w:color w:val="2B2B2B"/>
+                <w:sz w:val="20"/>
+                <w:szCs w:val="20"/>
+              </w:rPr>
+              <w:t xml:space="preserve"> </w:t>
+            </w:r>
+          </w:p>
+        </w:tc>
+        <w:tc>
+          <w:tcPr>
+            <w:tcW w:type="pct" w:w="18%"/>
+            <w:tcBorders>
+              <w:top w:val="single" w:color="D9D9D9" w:sz="4"/>
+              <w:left w:val="single" w:color="D9D9D9" w:sz="4"/>
+              <w:bottom w:val="single" w:color="D9D9D9" w:sz="4"/>
+              <w:right w:val="single" w:color="D9D9D9" w:sz="4"/>
+            </w:tcBorders>
+            <w:tcMar>
+              <w:top w:type="dxa" w:w="80"/>
+              <w:left w:type="dxa" w:w="120"/>
+              <w:bottom w:type="dxa" w:w="80"/>
+              <w:right w:type="dxa" w:w="120"/>
+            </w:tcMar>
+          </w:tcPr>
+          <w:p>
+            <w:r>
+              <w:rPr>
+                <w:rFonts w:ascii="Arial" w:cs="Arial" w:eastAsia="Arial" w:hAnsi="Arial"/>
+                <w:color w:val="2B2B2B"/>
+                <w:sz w:val="20"/>
+                <w:szCs w:val="20"/>
+              </w:rPr>
+              <w:t xml:space="preserve"> </w:t>
+            </w:r>
+          </w:p>
+        </w:tc>
+      </w:tr>
+      <w:tr>
+        <w:tc>
+          <w:tcPr>
+            <w:tcW w:type="pct" w:w="12%"/>
+            <w:tcBorders>
+              <w:top w:val="single" w:color="D9D9D9" w:sz="4"/>
+              <w:left w:val="single" w:color="D9D9D9" w:sz="4"/>
+              <w:bottom w:val="single" w:color="D9D9D9" w:sz="4"/>
+              <w:right w:val="single" w:color="D9D9D9" w:sz="4"/>
+            </w:tcBorders>
+            <w:shd w:fill="F2F7FB" w:val="clear"/>
+            <w:tcMar>
+              <w:top w:type="dxa" w:w="80"/>
+              <w:left w:type="dxa" w:w="120"/>
+              <w:bottom w:type="dxa" w:w="80"/>
+              <w:right w:type="dxa" w:w="120"/>
+            </w:tcMar>
+          </w:tcPr>
+          <w:p>
+            <w:r>
+              <w:rPr>
+                <w:rFonts w:ascii="Arial" w:cs="Arial" w:eastAsia="Arial" w:hAnsi="Arial"/>
+                <w:color w:val="2B2B2B"/>
+                <w:sz w:val="20"/>
+                <w:szCs w:val="20"/>
+              </w:rPr>
+              <w:t xml:space="preserve"> </w:t>
+            </w:r>
+          </w:p>
+        </w:tc>
+        <w:tc>
+          <w:tcPr>
+            <w:tcW w:type="pct" w:w="34%"/>
+            <w:tcBorders>
+              <w:top w:val="single" w:color="D9D9D9" w:sz="4"/>
+              <w:left w:val="single" w:color="D9D9D9" w:sz="4"/>
+              <w:bottom w:val="single" w:color="D9D9D9" w:sz="4"/>
+              <w:right w:val="single" w:color="D9D9D9" w:sz="4"/>
+            </w:tcBorders>
+            <w:shd w:fill="F2F7FB" w:val="clear"/>
+            <w:tcMar>
+              <w:top w:type="dxa" w:w="80"/>
+              <w:left w:type="dxa" w:w="120"/>
+              <w:bottom w:type="dxa" w:w="80"/>
+              <w:right w:type="dxa" w:w="120"/>
+            </w:tcMar>
+          </w:tcPr>
+          <w:p>
+            <w:r>
+              <w:rPr>
+                <w:rFonts w:ascii="Arial" w:cs="Arial" w:eastAsia="Arial" w:hAnsi="Arial"/>
+                <w:color w:val="2B2B2B"/>
+                <w:sz w:val="20"/>
+                <w:szCs w:val="20"/>
+              </w:rPr>
+              <w:t xml:space="preserve"> </w:t>
+            </w:r>
+          </w:p>
+        </w:tc>
+        <w:tc>
+          <w:tcPr>
+            <w:tcW w:type="pct" w:w="18%"/>
+            <w:tcBorders>
+              <w:top w:val="single" w:color="D9D9D9" w:sz="4"/>
+              <w:left w:val="single" w:color="D9D9D9" w:sz="4"/>
+              <w:bottom w:val="single" w:color="D9D9D9" w:sz="4"/>
+              <w:right w:val="single" w:color="D9D9D9" w:sz="4"/>
+            </w:tcBorders>
+            <w:shd w:fill="F2F7FB" w:val="clear"/>
+            <w:tcMar>
+              <w:top w:type="dxa" w:w="80"/>
+              <w:left w:type="dxa" w:w="120"/>
+              <w:bottom w:type="dxa" w:w="80"/>
+              <w:right w:type="dxa" w:w="120"/>
+            </w:tcMar>
+          </w:tcPr>
+          <w:p>
+            <w:r>
+              <w:rPr>
+                <w:rFonts w:ascii="Arial" w:cs="Arial" w:eastAsia="Arial" w:hAnsi="Arial"/>
+                <w:color w:val="2B2B2B"/>
+                <w:sz w:val="20"/>
+                <w:szCs w:val="20"/>
+              </w:rPr>
+              <w:t xml:space="preserve"> </w:t>
+            </w:r>
+          </w:p>
+        </w:tc>
+        <w:tc>
+          <w:tcPr>
+            <w:tcW w:type="pct" w:w="18%"/>
+            <w:tcBorders>
+              <w:top w:val="single" w:color="D9D9D9" w:sz="4"/>
+              <w:left w:val="single" w:color="D9D9D9" w:sz="4"/>
+              <w:bottom w:val="single" w:color="D9D9D9" w:sz="4"/>
+              <w:right w:val="single" w:color="D9D9D9" w:sz="4"/>
+            </w:tcBorders>
+            <w:shd w:fill="F2F7FB" w:val="clear"/>
+            <w:tcMar>
+              <w:top w:type="dxa" w:w="80"/>
+              <w:left w:type="dxa" w:w="120"/>
+              <w:bottom w:type="dxa" w:w="80"/>
+              <w:right w:type="dxa" w:w="120"/>
+            </w:tcMar>
+          </w:tcPr>
+          <w:p>
+            <w:r>
+              <w:rPr>
+                <w:rFonts w:ascii="Arial" w:cs="Arial" w:eastAsia="Arial" w:hAnsi="Arial"/>
+                <w:color w:val="2B2B2B"/>
+                <w:sz w:val="20"/>
+                <w:szCs w:val="20"/>
+              </w:rPr>
+              <w:t xml:space="preserve"> </w:t>
+            </w:r>
+          </w:p>
+        </w:tc>
+        <w:tc>
+          <w:tcPr>
+            <w:tcW w:type="pct" w:w="18%"/>
+            <w:tcBorders>
+              <w:top w:val="single" w:color="D9D9D9" w:sz="4"/>
+              <w:left w:val="single" w:color="D9D9D9" w:sz="4"/>
+              <w:bottom w:val="single" w:color="D9D9D9" w:sz="4"/>
+              <w:right w:val="single" w:color="D9D9D9" w:sz="4"/>
+            </w:tcBorders>
+            <w:shd w:fill="F2F7FB" w:val="clear"/>
+            <w:tcMar>
+              <w:top w:type="dxa" w:w="80"/>
+              <w:left w:type="dxa" w:w="120"/>
+              <w:bottom w:type="dxa" w:w="80"/>
+              <w:right w:type="dxa" w:w="120"/>
+            </w:tcMar>
+          </w:tcPr>
+          <w:p>
+            <w:r>
+              <w:rPr>
+                <w:rFonts w:ascii="Arial" w:cs="Arial" w:eastAsia="Arial" w:hAnsi="Arial"/>
+                <w:color w:val="2B2B2B"/>
+                <w:sz w:val="20"/>
+                <w:szCs w:val="20"/>
+              </w:rPr>
+              <w:t xml:space="preserve"> </w:t>
+            </w:r>
+          </w:p>
+        </w:tc>
+      </w:tr>
+      <w:tr>
+        <w:tc>
+          <w:tcPr>
+            <w:tcW w:type="pct" w:w="12%"/>
+            <w:tcBorders>
+              <w:top w:val="single" w:color="D9D9D9" w:sz="4"/>
+              <w:left w:val="single" w:color="D9D9D9" w:sz="4"/>
+              <w:bottom w:val="single" w:color="D9D9D9" w:sz="4"/>
+              <w:right w:val="single" w:color="D9D9D9" w:sz="4"/>
+            </w:tcBorders>
+            <w:tcMar>
+              <w:top w:type="dxa" w:w="80"/>
+              <w:left w:type="dxa" w:w="120"/>
+              <w:bottom w:type="dxa" w:w="80"/>
+              <w:right w:type="dxa" w:w="120"/>
+            </w:tcMar>
+          </w:tcPr>
+          <w:p>
+            <w:r>
+              <w:rPr>
+                <w:rFonts w:ascii="Arial" w:cs="Arial" w:eastAsia="Arial" w:hAnsi="Arial"/>
+                <w:color w:val="2B2B2B"/>
+                <w:sz w:val="20"/>
+                <w:szCs w:val="20"/>
+              </w:rPr>
+              <w:t xml:space="preserve"> </w:t>
+            </w:r>
+          </w:p>
+        </w:tc>
+        <w:tc>
+          <w:tcPr>
+            <w:tcW w:type="pct" w:w="34%"/>
+            <w:tcBorders>
+              <w:top w:val="single" w:color="D9D9D9" w:sz="4"/>
+              <w:left w:val="single" w:color="D9D9D9" w:sz="4"/>
+              <w:bottom w:val="single" w:color="D9D9D9" w:sz="4"/>
+              <w:right w:val="single" w:color="D9D9D9" w:sz="4"/>
+            </w:tcBorders>
+            <w:tcMar>
+              <w:top w:type="dxa" w:w="80"/>
+              <w:left w:type="dxa" w:w="120"/>
+              <w:bottom w:type="dxa" w:w="80"/>
+              <w:right w:type="dxa" w:w="120"/>
+            </w:tcMar>
+          </w:tcPr>
+          <w:p>
+            <w:r>
+              <w:rPr>
+                <w:rFonts w:ascii="Arial" w:cs="Arial" w:eastAsia="Arial" w:hAnsi="Arial"/>
+                <w:color w:val="2B2B2B"/>
+                <w:sz w:val="20"/>
+                <w:szCs w:val="20"/>
+              </w:rPr>
+              <w:t xml:space="preserve"> </w:t>
+            </w:r>
+          </w:p>
+        </w:tc>
+        <w:tc>
+          <w:tcPr>
+            <w:tcW w:type="pct" w:w="18%"/>
+            <w:tcBorders>
+              <w:top w:val="single" w:color="D9D9D9" w:sz="4"/>
+              <w:left w:val="single" w:color="D9D9D9" w:sz="4"/>
+              <w:bottom w:val="single" w:color="D9D9D9" w:sz="4"/>
+              <w:right w:val="single" w:color="D9D9D9" w:sz="4"/>
+            </w:tcBorders>
+            <w:tcMar>
+              <w:top w:type="dxa" w:w="80"/>
+              <w:left w:type="dxa" w:w="120"/>
+              <w:bottom w:type="dxa" w:w="80"/>
+              <w:right w:type="dxa" w:w="120"/>
+            </w:tcMar>
+          </w:tcPr>
+          <w:p>
+            <w:r>
+              <w:rPr>
+                <w:rFonts w:ascii="Arial" w:cs="Arial" w:eastAsia="Arial" w:hAnsi="Arial"/>
+                <w:color w:val="2B2B2B"/>
+                <w:sz w:val="20"/>
+                <w:szCs w:val="20"/>
+              </w:rPr>
+              <w:t xml:space="preserve"> </w:t>
+            </w:r>
+          </w:p>
+        </w:tc>
+        <w:tc>
+          <w:tcPr>
+            <w:tcW w:type="pct" w:w="18%"/>
+            <w:tcBorders>
+              <w:top w:val="single" w:color="D9D9D9" w:sz="4"/>
+              <w:left w:val="single" w:color="D9D9D9" w:sz="4"/>
+              <w:bottom w:val="single" w:color="D9D9D9" w:sz="4"/>
+              <w:right w:val="single" w:color="D9D9D9" w:sz="4"/>
+            </w:tcBorders>
+            <w:tcMar>
+              <w:top w:type="dxa" w:w="80"/>
+              <w:left w:type="dxa" w:w="120"/>
+              <w:bottom w:type="dxa" w:w="80"/>
+              <w:right w:type="dxa" w:w="120"/>
+            </w:tcMar>
+          </w:tcPr>
+          <w:p>
+            <w:r>
+              <w:rPr>
+                <w:rFonts w:ascii="Arial" w:cs="Arial" w:eastAsia="Arial" w:hAnsi="Arial"/>
+                <w:color w:val="2B2B2B"/>
+                <w:sz w:val="20"/>
+                <w:szCs w:val="20"/>
+              </w:rPr>
+              <w:t xml:space="preserve"> </w:t>
+            </w:r>
+          </w:p>
+        </w:tc>
+        <w:tc>
+          <w:tcPr>
+            <w:tcW w:type="pct" w:w="18%"/>
+            <w:tcBorders>
+              <w:top w:val="single" w:color="D9D9D9" w:sz="4"/>
+              <w:left w:val="single" w:color="D9D9D9" w:sz="4"/>
+              <w:bottom w:val="single" w:color="D9D9D9" w:sz="4"/>
+              <w:right w:val="single" w:color="D9D9D9" w:sz="4"/>
+            </w:tcBorders>
+            <w:tcMar>
+              <w:top w:type="dxa" w:w="80"/>
+              <w:left w:type="dxa" w:w="120"/>
+              <w:bottom w:type="dxa" w:w="80"/>
+              <w:right w:type="dxa" w:w="120"/>
+            </w:tcMar>
+          </w:tcPr>
+          <w:p>
+            <w:r>
+              <w:rPr>
+                <w:rFonts w:ascii="Arial" w:cs="Arial" w:eastAsia="Arial" w:hAnsi="Arial"/>
+                <w:color w:val="2B2B2B"/>
+                <w:sz w:val="20"/>
+                <w:szCs w:val="20"/>
+              </w:rPr>
+              <w:t xml:space="preserve"> </w:t>
+            </w:r>
+          </w:p>
+        </w:tc>
+      </w:tr>
+    </w:tbl>
+    <w:p>
+      <w:pPr>
+        <w:spacing w:after="60"/>
+      </w:pPr>
+    </w:p>
+    <w:tbl>
+      <w:tblPr>
+        <w:tblW w:type="pct" w:w="100%"/>
+        <w:tblBorders>
+          <w:top w:val="single" w:color="auto" w:sz="4"/>
+          <w:left w:val="single" w:color="auto" w:sz="4"/>
+          <w:bottom w:val="single" w:color="auto" w:sz="4"/>
+          <w:right w:val="single" w:color="auto" w:sz="4"/>
+          <w:insideH w:val="single" w:color="auto" w:sz="4"/>
+          <w:insideV w:val="single" w:color="auto" w:sz="4"/>
+        </w:tblBorders>
+      </w:tblPr>
+      <w:tblGrid>
+        <w:gridCol w:w="100"/>
+      </w:tblGrid>
+      <w:tr>
+        <w:tc>
+          <w:tcPr>
+            <w:tcBorders>
+              <w:top w:val="single" w:color="B45309" w:sz="6"/>
+              <w:left w:val="single" w:color="B45309" w:sz="24"/>
+              <w:bottom w:val="single" w:color="B45309" w:sz="6"/>
+              <w:right w:val="single" w:color="B45309" w:sz="6"/>
+            </w:tcBorders>
+            <w:shd w:fill="FFF3DC" w:val="clear"/>
+            <w:tcMar>
+              <w:top w:type="dxa" w:w="140"/>
+              <w:left w:type="dxa" w:w="240"/>
+              <w:bottom w:type="dxa" w:w="140"/>
+              <w:right w:type="dxa" w:w="240"/>
+            </w:tcMar>
+          </w:tcPr>
+          <w:p>
+            <w:pPr>
+              <w:spacing w:after="80"/>
+            </w:pPr>
+            <w:r>
+              <w:rPr>
+                <w:rFonts w:ascii="Arial" w:cs="Arial" w:eastAsia="Arial" w:hAnsi="Arial"/>
+                <w:b/>
+                <w:bCs/>
+                <w:color w:val="B45309"/>
+                <w:sz w:val="21"/>
+                <w:szCs w:val="21"/>
+              </w:rPr>
+              <w:t xml:space="preserve">⚠  Reminder — republishing resets sharing</w:t>
+            </w:r>
+          </w:p>
+          <w:p>
+            <w:pPr>
+              <w:spacing w:after="120"/>
+            </w:pPr>
+            <w:r>
+              <w:rPr>
+                <w:rFonts w:ascii="Arial" w:cs="Arial" w:eastAsia="Arial" w:hAnsi="Arial"/>
+                <w:color w:val="2B2B2B"/>
+                <w:sz w:val="21"/>
+                <w:szCs w:val="21"/>
+              </w:rPr>
+              <w:t xml:space="preserve">After every republish the service returns to org-only and both apps break with </w:t>
+            </w:r>
+            <w:r>
+              <w:rPr>
+                <w:rFonts w:ascii="Consolas" w:cs="Consolas" w:eastAsia="Consolas" w:hAnsi="Consolas"/>
+                <w:color w:val="2B2B2B"/>
+                <w:sz w:val="19"/>
+                <w:szCs w:val="19"/>
+              </w:rPr>
+              <w:t xml:space="preserve">{"code":499}</w:t>
+            </w:r>
+            <w:r>
+              <w:rPr>
+                <w:rFonts w:ascii="Arial" w:cs="Arial" w:eastAsia="Arial" w:hAnsi="Arial"/>
+                <w:color w:val="2B2B2B"/>
+                <w:sz w:val="21"/>
+                <w:szCs w:val="21"/>
+              </w:rPr>
+              <w:t xml:space="preserve"> until it is re-shared Public. The verification query is in Chapter 4.</w:t>
+            </w:r>
+          </w:p>
+        </w:tc>
+      </w:tr>
+    </w:tbl>
+    <w:p>
+      <w:pPr>
+        <w:spacing w:after="120"/>
+      </w:pPr>
+    </w:p>
+    <w:p>
+      <w:pPr>
+        <w:pStyle w:val="Heading2"/>
+        <w:spacing w:after="100" w:before="280"/>
+      </w:pPr>
+      <w:r>
+        <w:rPr>
+          <w:rFonts w:ascii="Arial" w:cs="Arial" w:eastAsia="Arial" w:hAnsi="Arial"/>
+          <w:b/>
+          <w:bCs/>
+          <w:color w:val="0E7C66"/>
+          <w:sz w:val="23"/>
+          <w:szCs w:val="23"/>
+        </w:rPr>
+        <w:t xml:space="preserve">8.4 — Known data issues &amp; decisions</w:t>
+      </w:r>
+    </w:p>
+    <w:p>
+      <w:pPr>
+        <w:spacing w:after="120"/>
+      </w:pPr>
+      <w:r>
+        <w:rPr>
+          <w:rFonts w:ascii="Arial" w:cs="Arial" w:eastAsia="Arial" w:hAnsi="Arial"/>
+          <w:color w:val="2B2B2B"/>
+          <w:sz w:val="21"/>
+          <w:szCs w:val="21"/>
+        </w:rPr>
+        <w:t xml:space="preserve">Log upstream data defects here as they are found (mirror them into </w:t>
+      </w:r>
+      <w:r>
+        <w:rPr>
+          <w:rFonts w:ascii="Consolas" w:cs="Consolas" w:eastAsia="Consolas" w:hAnsi="Consolas"/>
+          <w:color w:val="2B2B2B"/>
+          <w:sz w:val="19"/>
+          <w:szCs w:val="19"/>
+        </w:rPr>
+        <w:t xml:space="preserve">docs/BACKLOG.md</w:t>
+      </w:r>
+      <w:r>
+        <w:rPr>
+          <w:rFonts w:ascii="Arial" w:cs="Arial" w:eastAsia="Arial" w:hAnsi="Arial"/>
+          <w:color w:val="2B2B2B"/>
+          <w:sz w:val="21"/>
+          <w:szCs w:val="21"/>
+        </w:rPr>
+        <w:t xml:space="preserve"> with the decision taken):</w:t>
+      </w:r>
+    </w:p>
+    <w:tbl>
+      <w:tblPr>
+        <w:tblW w:type="pct" w:w="100%"/>
+        <w:tblBorders>
+          <w:top w:val="single" w:color="auto" w:sz="4"/>
+          <w:left w:val="single" w:color="auto" w:sz="4"/>
+          <w:bottom w:val="single" w:color="auto" w:sz="4"/>
+          <w:right w:val="single" w:color="auto" w:sz="4"/>
+          <w:insideH w:val="single" w:color="auto" w:sz="4"/>
+          <w:insideV w:val="single" w:color="auto" w:sz="4"/>
+        </w:tblBorders>
+      </w:tblPr>
+      <w:tblGrid>
+        <w:gridCol w:w="100"/>
+        <w:gridCol w:w="100"/>
+        <w:gridCol w:w="100"/>
+        <w:gridCol w:w="100"/>
+      </w:tblGrid>
+      <w:tr>
+        <w:tc>
+          <w:tcPr>
+            <w:tcW w:type="pct" w:w="14%"/>
+            <w:tcBorders>
+              <w:top w:val="single" w:color="D9D9D9" w:sz="4"/>
+              <w:left w:val="single" w:color="D9D9D9" w:sz="4"/>
+              <w:bottom w:val="single" w:color="D9D9D9" w:sz="4"/>
+              <w:right w:val="single" w:color="D9D9D9" w:sz="4"/>
+            </w:tcBorders>
+            <w:shd w:fill="0E7C66" w:val="clear"/>
+            <w:tcMar>
+              <w:top w:type="dxa" w:w="80"/>
+              <w:left w:type="dxa" w:w="120"/>
+              <w:bottom w:type="dxa" w:w="80"/>
+              <w:right w:type="dxa" w:w="120"/>
+            </w:tcMar>
+          </w:tcPr>
+          <w:p>
+            <w:r>
+              <w:rPr>
+                <w:rFonts w:ascii="Arial" w:cs="Arial" w:eastAsia="Arial" w:hAnsi="Arial"/>
+                <w:b/>
+                <w:bCs/>
+                <w:color w:val="FFFFFF"/>
+                <w:sz w:val="20"/>
+                <w:szCs w:val="20"/>
+              </w:rPr>
+              <w:t xml:space="preserve">Date found</w:t>
+            </w:r>
+          </w:p>
+        </w:tc>
+        <w:tc>
+          <w:tcPr>
+            <w:tcW w:type="pct" w:w="24%"/>
+            <w:tcBorders>
+              <w:top w:val="single" w:color="D9D9D9" w:sz="4"/>
+              <w:left w:val="single" w:color="D9D9D9" w:sz="4"/>
+              <w:bottom w:val="single" w:color="D9D9D9" w:sz="4"/>
+              <w:right w:val="single" w:color="D9D9D9" w:sz="4"/>
+            </w:tcBorders>
+            <w:shd w:fill="0E7C66" w:val="clear"/>
+            <w:tcMar>
+              <w:top w:type="dxa" w:w="80"/>
+              <w:left w:type="dxa" w:w="120"/>
+              <w:bottom w:type="dxa" w:w="80"/>
+              <w:right w:type="dxa" w:w="120"/>
+            </w:tcMar>
+          </w:tcPr>
+          <w:p>
+            <w:r>
+              <w:rPr>
+                <w:rFonts w:ascii="Arial" w:cs="Arial" w:eastAsia="Arial" w:hAnsi="Arial"/>
+                <w:b/>
+                <w:bCs/>
+                <w:color w:val="FFFFFF"/>
+                <w:sz w:val="20"/>
+                <w:szCs w:val="20"/>
+              </w:rPr>
+              <w:t xml:space="preserve">Layer / field</w:t>
+            </w:r>
+          </w:p>
+        </w:tc>
+        <w:tc>
+          <w:tcPr>
+            <w:tcW w:type="pct" w:w="32%"/>
+            <w:tcBorders>
+              <w:top w:val="single" w:color="D9D9D9" w:sz="4"/>
+              <w:left w:val="single" w:color="D9D9D9" w:sz="4"/>
+              <w:bottom w:val="single" w:color="D9D9D9" w:sz="4"/>
+              <w:right w:val="single" w:color="D9D9D9" w:sz="4"/>
+            </w:tcBorders>
+            <w:shd w:fill="0E7C66" w:val="clear"/>
+            <w:tcMar>
+              <w:top w:type="dxa" w:w="80"/>
+              <w:left w:type="dxa" w:w="120"/>
+              <w:bottom w:type="dxa" w:w="80"/>
+              <w:right w:type="dxa" w:w="120"/>
+            </w:tcMar>
+          </w:tcPr>
+          <w:p>
+            <w:r>
+              <w:rPr>
+                <w:rFonts w:ascii="Arial" w:cs="Arial" w:eastAsia="Arial" w:hAnsi="Arial"/>
+                <w:b/>
+                <w:bCs/>
+                <w:color w:val="FFFFFF"/>
+                <w:sz w:val="20"/>
+                <w:szCs w:val="20"/>
+              </w:rPr>
+              <w:t xml:space="preserve">Issue</w:t>
+            </w:r>
+          </w:p>
+        </w:tc>
+        <w:tc>
+          <w:tcPr>
+            <w:tcW w:type="pct" w:w="30%"/>
+            <w:tcBorders>
+              <w:top w:val="single" w:color="D9D9D9" w:sz="4"/>
+              <w:left w:val="single" w:color="D9D9D9" w:sz="4"/>
+              <w:bottom w:val="single" w:color="D9D9D9" w:sz="4"/>
+              <w:right w:val="single" w:color="D9D9D9" w:sz="4"/>
+            </w:tcBorders>
+            <w:shd w:fill="0E7C66" w:val="clear"/>
+            <w:tcMar>
+              <w:top w:type="dxa" w:w="80"/>
+              <w:left w:type="dxa" w:w="120"/>
+              <w:bottom w:type="dxa" w:w="80"/>
+              <w:right w:type="dxa" w:w="120"/>
+            </w:tcMar>
+          </w:tcPr>
+          <w:p>
+            <w:r>
+              <w:rPr>
+                <w:rFonts w:ascii="Arial" w:cs="Arial" w:eastAsia="Arial" w:hAnsi="Arial"/>
+                <w:b/>
+                <w:bCs/>
+                <w:color w:val="FFFFFF"/>
+                <w:sz w:val="20"/>
+                <w:szCs w:val="20"/>
+              </w:rPr>
+              <w:t xml:space="preserve">Decision / workaround</w:t>
+            </w:r>
+          </w:p>
+        </w:tc>
+      </w:tr>
+      <w:tr>
+        <w:tc>
+          <w:tcPr>
+            <w:tcW w:type="pct" w:w="14%"/>
+            <w:tcBorders>
+              <w:top w:val="single" w:color="D9D9D9" w:sz="4"/>
+              <w:left w:val="single" w:color="D9D9D9" w:sz="4"/>
+              <w:bottom w:val="single" w:color="D9D9D9" w:sz="4"/>
+              <w:right w:val="single" w:color="D9D9D9" w:sz="4"/>
+            </w:tcBorders>
+            <w:tcMar>
+              <w:top w:type="dxa" w:w="80"/>
+              <w:left w:type="dxa" w:w="120"/>
+              <w:bottom w:type="dxa" w:w="80"/>
+              <w:right w:type="dxa" w:w="120"/>
+            </w:tcMar>
+          </w:tcPr>
+          <w:p>
+            <w:r>
+              <w:rPr>
+                <w:rFonts w:ascii="Arial" w:cs="Arial" w:eastAsia="Arial" w:hAnsi="Arial"/>
+                <w:color w:val="2B2B2B"/>
+                <w:sz w:val="20"/>
+                <w:szCs w:val="20"/>
+              </w:rPr>
+              <w:t xml:space="preserve"> </w:t>
+            </w:r>
+          </w:p>
+        </w:tc>
+        <w:tc>
+          <w:tcPr>
+            <w:tcW w:type="pct" w:w="24%"/>
+            <w:tcBorders>
+              <w:top w:val="single" w:color="D9D9D9" w:sz="4"/>
+              <w:left w:val="single" w:color="D9D9D9" w:sz="4"/>
+              <w:bottom w:val="single" w:color="D9D9D9" w:sz="4"/>
+              <w:right w:val="single" w:color="D9D9D9" w:sz="4"/>
+            </w:tcBorders>
+            <w:tcMar>
+              <w:top w:type="dxa" w:w="80"/>
+              <w:left w:type="dxa" w:w="120"/>
+              <w:bottom w:type="dxa" w:w="80"/>
+              <w:right w:type="dxa" w:w="120"/>
+            </w:tcMar>
+          </w:tcPr>
+          <w:p>
+            <w:r>
+              <w:rPr>
+                <w:rFonts w:ascii="Arial" w:cs="Arial" w:eastAsia="Arial" w:hAnsi="Arial"/>
+                <w:color w:val="2B2B2B"/>
+                <w:sz w:val="20"/>
+                <w:szCs w:val="20"/>
+              </w:rPr>
+              <w:t xml:space="preserve"> </w:t>
+            </w:r>
+          </w:p>
+        </w:tc>
+        <w:tc>
+          <w:tcPr>
+            <w:tcW w:type="pct" w:w="32%"/>
+            <w:tcBorders>
+              <w:top w:val="single" w:color="D9D9D9" w:sz="4"/>
+              <w:left w:val="single" w:color="D9D9D9" w:sz="4"/>
+              <w:bottom w:val="single" w:color="D9D9D9" w:sz="4"/>
+              <w:right w:val="single" w:color="D9D9D9" w:sz="4"/>
+            </w:tcBorders>
+            <w:tcMar>
+              <w:top w:type="dxa" w:w="80"/>
+              <w:left w:type="dxa" w:w="120"/>
+              <w:bottom w:type="dxa" w:w="80"/>
+              <w:right w:type="dxa" w:w="120"/>
+            </w:tcMar>
+          </w:tcPr>
+          <w:p>
+            <w:r>
+              <w:rPr>
+                <w:rFonts w:ascii="Arial" w:cs="Arial" w:eastAsia="Arial" w:hAnsi="Arial"/>
+                <w:color w:val="2B2B2B"/>
+                <w:sz w:val="20"/>
+                <w:szCs w:val="20"/>
+              </w:rPr>
+              <w:t xml:space="preserve"> </w:t>
+            </w:r>
+          </w:p>
+        </w:tc>
+        <w:tc>
+          <w:tcPr>
+            <w:tcW w:type="pct" w:w="30%"/>
+            <w:tcBorders>
+              <w:top w:val="single" w:color="D9D9D9" w:sz="4"/>
+              <w:left w:val="single" w:color="D9D9D9" w:sz="4"/>
+              <w:bottom w:val="single" w:color="D9D9D9" w:sz="4"/>
+              <w:right w:val="single" w:color="D9D9D9" w:sz="4"/>
+            </w:tcBorders>
+            <w:tcMar>
+              <w:top w:type="dxa" w:w="80"/>
+              <w:left w:type="dxa" w:w="120"/>
+              <w:bottom w:type="dxa" w:w="80"/>
+              <w:right w:type="dxa" w:w="120"/>
+            </w:tcMar>
+          </w:tcPr>
+          <w:p>
+            <w:r>
+              <w:rPr>
+                <w:rFonts w:ascii="Arial" w:cs="Arial" w:eastAsia="Arial" w:hAnsi="Arial"/>
+                <w:color w:val="2B2B2B"/>
+                <w:sz w:val="20"/>
+                <w:szCs w:val="20"/>
+              </w:rPr>
+              <w:t xml:space="preserve"> </w:t>
+            </w:r>
+          </w:p>
+        </w:tc>
+      </w:tr>
+      <w:tr>
+        <w:tc>
+          <w:tcPr>
+            <w:tcW w:type="pct" w:w="14%"/>
+            <w:tcBorders>
+              <w:top w:val="single" w:color="D9D9D9" w:sz="4"/>
+              <w:left w:val="single" w:color="D9D9D9" w:sz="4"/>
+              <w:bottom w:val="single" w:color="D9D9D9" w:sz="4"/>
+              <w:right w:val="single" w:color="D9D9D9" w:sz="4"/>
+            </w:tcBorders>
+            <w:shd w:fill="F2F7FB" w:val="clear"/>
+            <w:tcMar>
+              <w:top w:type="dxa" w:w="80"/>
+              <w:left w:type="dxa" w:w="120"/>
+              <w:bottom w:type="dxa" w:w="80"/>
+              <w:right w:type="dxa" w:w="120"/>
+            </w:tcMar>
+          </w:tcPr>
+          <w:p>
+            <w:r>
+              <w:rPr>
+                <w:rFonts w:ascii="Arial" w:cs="Arial" w:eastAsia="Arial" w:hAnsi="Arial"/>
+                <w:color w:val="2B2B2B"/>
+                <w:sz w:val="20"/>
+                <w:szCs w:val="20"/>
+              </w:rPr>
+              <w:t xml:space="preserve"> </w:t>
+            </w:r>
+          </w:p>
+        </w:tc>
+        <w:tc>
+          <w:tcPr>
+            <w:tcW w:type="pct" w:w="24%"/>
+            <w:tcBorders>
+              <w:top w:val="single" w:color="D9D9D9" w:sz="4"/>
+              <w:left w:val="single" w:color="D9D9D9" w:sz="4"/>
+              <w:bottom w:val="single" w:color="D9D9D9" w:sz="4"/>
+              <w:right w:val="single" w:color="D9D9D9" w:sz="4"/>
+            </w:tcBorders>
+            <w:shd w:fill="F2F7FB" w:val="clear"/>
+            <w:tcMar>
+              <w:top w:type="dxa" w:w="80"/>
+              <w:left w:type="dxa" w:w="120"/>
+              <w:bottom w:type="dxa" w:w="80"/>
+              <w:right w:type="dxa" w:w="120"/>
+            </w:tcMar>
+          </w:tcPr>
+          <w:p>
+            <w:r>
+              <w:rPr>
+                <w:rFonts w:ascii="Arial" w:cs="Arial" w:eastAsia="Arial" w:hAnsi="Arial"/>
+                <w:color w:val="2B2B2B"/>
+                <w:sz w:val="20"/>
+                <w:szCs w:val="20"/>
+              </w:rPr>
+              <w:t xml:space="preserve"> </w:t>
+            </w:r>
+          </w:p>
+        </w:tc>
+        <w:tc>
+          <w:tcPr>
+            <w:tcW w:type="pct" w:w="32%"/>
+            <w:tcBorders>
+              <w:top w:val="single" w:color="D9D9D9" w:sz="4"/>
+              <w:left w:val="single" w:color="D9D9D9" w:sz="4"/>
+              <w:bottom w:val="single" w:color="D9D9D9" w:sz="4"/>
+              <w:right w:val="single" w:color="D9D9D9" w:sz="4"/>
+            </w:tcBorders>
+            <w:shd w:fill="F2F7FB" w:val="clear"/>
+            <w:tcMar>
+              <w:top w:type="dxa" w:w="80"/>
+              <w:left w:type="dxa" w:w="120"/>
+              <w:bottom w:type="dxa" w:w="80"/>
+              <w:right w:type="dxa" w:w="120"/>
+            </w:tcMar>
+          </w:tcPr>
+          <w:p>
+            <w:r>
+              <w:rPr>
+                <w:rFonts w:ascii="Arial" w:cs="Arial" w:eastAsia="Arial" w:hAnsi="Arial"/>
+                <w:color w:val="2B2B2B"/>
+                <w:sz w:val="20"/>
+                <w:szCs w:val="20"/>
+              </w:rPr>
+              <w:t xml:space="preserve"> </w:t>
+            </w:r>
+          </w:p>
+        </w:tc>
+        <w:tc>
+          <w:tcPr>
+            <w:tcW w:type="pct" w:w="30%"/>
+            <w:tcBorders>
+              <w:top w:val="single" w:color="D9D9D9" w:sz="4"/>
+              <w:left w:val="single" w:color="D9D9D9" w:sz="4"/>
+              <w:bottom w:val="single" w:color="D9D9D9" w:sz="4"/>
+              <w:right w:val="single" w:color="D9D9D9" w:sz="4"/>
+            </w:tcBorders>
+            <w:shd w:fill="F2F7FB" w:val="clear"/>
+            <w:tcMar>
+              <w:top w:type="dxa" w:w="80"/>
+              <w:left w:type="dxa" w:w="120"/>
+              <w:bottom w:type="dxa" w:w="80"/>
+              <w:right w:type="dxa" w:w="120"/>
+            </w:tcMar>
+          </w:tcPr>
+          <w:p>
+            <w:r>
+              <w:rPr>
+                <w:rFonts w:ascii="Arial" w:cs="Arial" w:eastAsia="Arial" w:hAnsi="Arial"/>
+                <w:color w:val="2B2B2B"/>
+                <w:sz w:val="20"/>
+                <w:szCs w:val="20"/>
+              </w:rPr>
+              <w:t xml:space="preserve"> </w:t>
+            </w:r>
+          </w:p>
+        </w:tc>
+      </w:tr>
+      <w:tr>
+        <w:tc>
+          <w:tcPr>
+            <w:tcW w:type="pct" w:w="14%"/>
+            <w:tcBorders>
+              <w:top w:val="single" w:color="D9D9D9" w:sz="4"/>
+              <w:left w:val="single" w:color="D9D9D9" w:sz="4"/>
+              <w:bottom w:val="single" w:color="D9D9D9" w:sz="4"/>
+              <w:right w:val="single" w:color="D9D9D9" w:sz="4"/>
+            </w:tcBorders>
+            <w:tcMar>
+              <w:top w:type="dxa" w:w="80"/>
+              <w:left w:type="dxa" w:w="120"/>
+              <w:bottom w:type="dxa" w:w="80"/>
+              <w:right w:type="dxa" w:w="120"/>
+            </w:tcMar>
+          </w:tcPr>
+          <w:p>
+            <w:r>
+              <w:rPr>
+                <w:rFonts w:ascii="Arial" w:cs="Arial" w:eastAsia="Arial" w:hAnsi="Arial"/>
+                <w:color w:val="2B2B2B"/>
+                <w:sz w:val="20"/>
+                <w:szCs w:val="20"/>
+              </w:rPr>
+              <w:t xml:space="preserve"> </w:t>
+            </w:r>
+          </w:p>
+        </w:tc>
+        <w:tc>
+          <w:tcPr>
+            <w:tcW w:type="pct" w:w="24%"/>
+            <w:tcBorders>
+              <w:top w:val="single" w:color="D9D9D9" w:sz="4"/>
+              <w:left w:val="single" w:color="D9D9D9" w:sz="4"/>
+              <w:bottom w:val="single" w:color="D9D9D9" w:sz="4"/>
+              <w:right w:val="single" w:color="D9D9D9" w:sz="4"/>
+            </w:tcBorders>
+            <w:tcMar>
+              <w:top w:type="dxa" w:w="80"/>
+              <w:left w:type="dxa" w:w="120"/>
+              <w:bottom w:type="dxa" w:w="80"/>
+              <w:right w:type="dxa" w:w="120"/>
+            </w:tcMar>
+          </w:tcPr>
+          <w:p>
+            <w:r>
+              <w:rPr>
+                <w:rFonts w:ascii="Arial" w:cs="Arial" w:eastAsia="Arial" w:hAnsi="Arial"/>
+                <w:color w:val="2B2B2B"/>
+                <w:sz w:val="20"/>
+                <w:szCs w:val="20"/>
+              </w:rPr>
+              <w:t xml:space="preserve"> </w:t>
+            </w:r>
+          </w:p>
+        </w:tc>
+        <w:tc>
+          <w:tcPr>
+            <w:tcW w:type="pct" w:w="32%"/>
+            <w:tcBorders>
+              <w:top w:val="single" w:color="D9D9D9" w:sz="4"/>
+              <w:left w:val="single" w:color="D9D9D9" w:sz="4"/>
+              <w:bottom w:val="single" w:color="D9D9D9" w:sz="4"/>
+              <w:right w:val="single" w:color="D9D9D9" w:sz="4"/>
+            </w:tcBorders>
+            <w:tcMar>
+              <w:top w:type="dxa" w:w="80"/>
+              <w:left w:type="dxa" w:w="120"/>
+              <w:bottom w:type="dxa" w:w="80"/>
+              <w:right w:type="dxa" w:w="120"/>
+            </w:tcMar>
+          </w:tcPr>
+          <w:p>
+            <w:r>
+              <w:rPr>
+                <w:rFonts w:ascii="Arial" w:cs="Arial" w:eastAsia="Arial" w:hAnsi="Arial"/>
+                <w:color w:val="2B2B2B"/>
+                <w:sz w:val="20"/>
+                <w:szCs w:val="20"/>
+              </w:rPr>
+              <w:t xml:space="preserve"> </w:t>
+            </w:r>
+          </w:p>
+        </w:tc>
+        <w:tc>
+          <w:tcPr>
+            <w:tcW w:type="pct" w:w="30%"/>
+            <w:tcBorders>
+              <w:top w:val="single" w:color="D9D9D9" w:sz="4"/>
+              <w:left w:val="single" w:color="D9D9D9" w:sz="4"/>
+              <w:bottom w:val="single" w:color="D9D9D9" w:sz="4"/>
+              <w:right w:val="single" w:color="D9D9D9" w:sz="4"/>
+            </w:tcBorders>
+            <w:tcMar>
+              <w:top w:type="dxa" w:w="80"/>
+              <w:left w:type="dxa" w:w="120"/>
+              <w:bottom w:type="dxa" w:w="80"/>
+              <w:right w:type="dxa" w:w="120"/>
+            </w:tcMar>
+          </w:tcPr>
+          <w:p>
+            <w:r>
+              <w:rPr>
+                <w:rFonts w:ascii="Arial" w:cs="Arial" w:eastAsia="Arial" w:hAnsi="Arial"/>
+                <w:color w:val="2B2B2B"/>
+                <w:sz w:val="20"/>
+                <w:szCs w:val="20"/>
+              </w:rPr>
+              <w:t xml:space="preserve"> </w:t>
+            </w:r>
+          </w:p>
+        </w:tc>
+      </w:tr>
+      <w:tr>
+        <w:tc>
+          <w:tcPr>
+            <w:tcW w:type="pct" w:w="14%"/>
+            <w:tcBorders>
+              <w:top w:val="single" w:color="D9D9D9" w:sz="4"/>
+              <w:left w:val="single" w:color="D9D9D9" w:sz="4"/>
+              <w:bottom w:val="single" w:color="D9D9D9" w:sz="4"/>
+              <w:right w:val="single" w:color="D9D9D9" w:sz="4"/>
+            </w:tcBorders>
+            <w:shd w:fill="F2F7FB" w:val="clear"/>
+            <w:tcMar>
+              <w:top w:type="dxa" w:w="80"/>
+              <w:left w:type="dxa" w:w="120"/>
+              <w:bottom w:type="dxa" w:w="80"/>
+              <w:right w:type="dxa" w:w="120"/>
+            </w:tcMar>
+          </w:tcPr>
+          <w:p>
+            <w:r>
+              <w:rPr>
+                <w:rFonts w:ascii="Arial" w:cs="Arial" w:eastAsia="Arial" w:hAnsi="Arial"/>
+                <w:color w:val="2B2B2B"/>
+                <w:sz w:val="20"/>
+                <w:szCs w:val="20"/>
+              </w:rPr>
+              <w:t xml:space="preserve"> </w:t>
+            </w:r>
+          </w:p>
+        </w:tc>
+        <w:tc>
+          <w:tcPr>
+            <w:tcW w:type="pct" w:w="24%"/>
+            <w:tcBorders>
+              <w:top w:val="single" w:color="D9D9D9" w:sz="4"/>
+              <w:left w:val="single" w:color="D9D9D9" w:sz="4"/>
+              <w:bottom w:val="single" w:color="D9D9D9" w:sz="4"/>
+              <w:right w:val="single" w:color="D9D9D9" w:sz="4"/>
+            </w:tcBorders>
+            <w:shd w:fill="F2F7FB" w:val="clear"/>
+            <w:tcMar>
+              <w:top w:type="dxa" w:w="80"/>
+              <w:left w:type="dxa" w:w="120"/>
+              <w:bottom w:type="dxa" w:w="80"/>
+              <w:right w:type="dxa" w:w="120"/>
+            </w:tcMar>
+          </w:tcPr>
+          <w:p>
+            <w:r>
+              <w:rPr>
+                <w:rFonts w:ascii="Arial" w:cs="Arial" w:eastAsia="Arial" w:hAnsi="Arial"/>
+                <w:color w:val="2B2B2B"/>
+                <w:sz w:val="20"/>
+                <w:szCs w:val="20"/>
+              </w:rPr>
+              <w:t xml:space="preserve"> </w:t>
+            </w:r>
+          </w:p>
+        </w:tc>
+        <w:tc>
+          <w:tcPr>
+            <w:tcW w:type="pct" w:w="32%"/>
+            <w:tcBorders>
+              <w:top w:val="single" w:color="D9D9D9" w:sz="4"/>
+              <w:left w:val="single" w:color="D9D9D9" w:sz="4"/>
+              <w:bottom w:val="single" w:color="D9D9D9" w:sz="4"/>
+              <w:right w:val="single" w:color="D9D9D9" w:sz="4"/>
+            </w:tcBorders>
+            <w:shd w:fill="F2F7FB" w:val="clear"/>
+            <w:tcMar>
+              <w:top w:type="dxa" w:w="80"/>
+              <w:left w:type="dxa" w:w="120"/>
+              <w:bottom w:type="dxa" w:w="80"/>
+              <w:right w:type="dxa" w:w="120"/>
+            </w:tcMar>
+          </w:tcPr>
+          <w:p>
+            <w:r>
+              <w:rPr>
+                <w:rFonts w:ascii="Arial" w:cs="Arial" w:eastAsia="Arial" w:hAnsi="Arial"/>
+                <w:color w:val="2B2B2B"/>
+                <w:sz w:val="20"/>
+                <w:szCs w:val="20"/>
+              </w:rPr>
+              <w:t xml:space="preserve"> </w:t>
+            </w:r>
+          </w:p>
+        </w:tc>
+        <w:tc>
+          <w:tcPr>
+            <w:tcW w:type="pct" w:w="30%"/>
+            <w:tcBorders>
+              <w:top w:val="single" w:color="D9D9D9" w:sz="4"/>
+              <w:left w:val="single" w:color="D9D9D9" w:sz="4"/>
+              <w:bottom w:val="single" w:color="D9D9D9" w:sz="4"/>
+              <w:right w:val="single" w:color="D9D9D9" w:sz="4"/>
+            </w:tcBorders>
+            <w:shd w:fill="F2F7FB" w:val="clear"/>
+            <w:tcMar>
+              <w:top w:type="dxa" w:w="80"/>
+              <w:left w:type="dxa" w:w="120"/>
+              <w:bottom w:type="dxa" w:w="80"/>
+              <w:right w:type="dxa" w:w="120"/>
+            </w:tcMar>
+          </w:tcPr>
+          <w:p>
+            <w:r>
+              <w:rPr>
+                <w:rFonts w:ascii="Arial" w:cs="Arial" w:eastAsia="Arial" w:hAnsi="Arial"/>
+                <w:color w:val="2B2B2B"/>
+                <w:sz w:val="20"/>
+                <w:szCs w:val="20"/>
+              </w:rPr>
+              <w:t xml:space="preserve"> </w:t>
+            </w:r>
+          </w:p>
+        </w:tc>
+      </w:tr>
+    </w:tbl>
+    <w:p>
+      <w:pPr>
+        <w:spacing w:after="120"/>
+      </w:pPr>
+    </w:p>
+    <w:p>
+      <w:pPr>
+        <w:pStyle w:val="Heading2"/>
+        <w:spacing w:after="100" w:before="280"/>
+      </w:pPr>
+      <w:r>
+        <w:rPr>
+          <w:rFonts w:ascii="Arial" w:cs="Arial" w:eastAsia="Arial" w:hAnsi="Arial"/>
+          <w:b/>
+          <w:bCs/>
+          <w:color w:val="0E7C66"/>
+          <w:sz w:val="23"/>
+          <w:szCs w:val="23"/>
+        </w:rPr>
+        <w:t xml:space="preserve">8.5 — Free-form notes</w:t>
+      </w:r>
+    </w:p>
+    <w:p>
+      <w:pPr>
+        <w:pBdr>
+          <w:bottom w:val="single" w:color="BFBFBF" w:sz="4"/>
+        </w:pBdr>
+        <w:spacing w:before="260"/>
+      </w:pPr>
+      <w:r>
+        <w:rPr>
+          <w:rFonts w:ascii="Arial" w:cs="Arial" w:eastAsia="Arial" w:hAnsi="Arial"/>
+          <w:sz w:val="21"/>
+          <w:szCs w:val="21"/>
+        </w:rPr>
+        <w:t xml:space="preserve"> </w:t>
+      </w:r>
+    </w:p>
+    <w:p>
+      <w:pPr>
+        <w:pBdr>
+          <w:bottom w:val="single" w:color="BFBFBF" w:sz="4"/>
+        </w:pBdr>
+        <w:spacing w:before="260"/>
+      </w:pPr>
+      <w:r>
+        <w:rPr>
+          <w:rFonts w:ascii="Arial" w:cs="Arial" w:eastAsia="Arial" w:hAnsi="Arial"/>
+          <w:sz w:val="21"/>
+          <w:szCs w:val="21"/>
+        </w:rPr>
+        <w:t xml:space="preserve"> </w:t>
+      </w:r>
+    </w:p>
+    <w:p>
+      <w:pPr>
+        <w:pBdr>
+          <w:bottom w:val="single" w:color="BFBFBF" w:sz="4"/>
+        </w:pBdr>
+        <w:spacing w:before="260"/>
+      </w:pPr>
+      <w:r>
+        <w:rPr>
+          <w:rFonts w:ascii="Arial" w:cs="Arial" w:eastAsia="Arial" w:hAnsi="Arial"/>
+          <w:sz w:val="21"/>
+          <w:szCs w:val="21"/>
+        </w:rPr>
+        <w:t xml:space="preserve"> </w:t>
+      </w:r>
+    </w:p>
+    <w:p>
+      <w:pPr>
+        <w:pBdr>
+          <w:bottom w:val="single" w:color="BFBFBF" w:sz="4"/>
+        </w:pBdr>
+        <w:spacing w:before="260"/>
+      </w:pPr>
+      <w:r>
+        <w:rPr>
+          <w:rFonts w:ascii="Arial" w:cs="Arial" w:eastAsia="Arial" w:hAnsi="Arial"/>
+          <w:sz w:val="21"/>
+          <w:szCs w:val="21"/>
+        </w:rPr>
+        <w:t xml:space="preserve"> </w:t>
+      </w:r>
+    </w:p>
+    <w:p>
+      <w:pPr>
+        <w:pBdr>
+          <w:bottom w:val="single" w:color="BFBFBF" w:sz="4"/>
+        </w:pBdr>
+        <w:spacing w:before="260"/>
+      </w:pPr>
+      <w:r>
+        <w:rPr>
+          <w:rFonts w:ascii="Arial" w:cs="Arial" w:eastAsia="Arial" w:hAnsi="Arial"/>
+          <w:sz w:val="21"/>
+          <w:szCs w:val="21"/>
+        </w:rPr>
+        <w:t xml:space="preserve"> </w:t>
+      </w:r>
+    </w:p>
+    <w:p>
+      <w:pPr>
+        <w:pBdr>
+          <w:bottom w:val="single" w:color="BFBFBF" w:sz="4"/>
+        </w:pBdr>
+        <w:spacing w:before="260"/>
+      </w:pPr>
+      <w:r>
+        <w:rPr>
+          <w:rFonts w:ascii="Arial" w:cs="Arial" w:eastAsia="Arial" w:hAnsi="Arial"/>
+          <w:sz w:val="21"/>
+          <w:szCs w:val="21"/>
+        </w:rPr>
+        <w:t xml:space="preserve"> </w:t>
+      </w:r>
+    </w:p>
+    <w:p>
+      <w:pPr>
+        <w:pBdr>
+          <w:bottom w:val="single" w:color="BFBFBF" w:sz="4"/>
+        </w:pBdr>
+        <w:spacing w:before="260"/>
+      </w:pPr>
+      <w:r>
+        <w:rPr>
+          <w:rFonts w:ascii="Arial" w:cs="Arial" w:eastAsia="Arial" w:hAnsi="Arial"/>
+          <w:sz w:val="21"/>
+          <w:szCs w:val="21"/>
+        </w:rPr>
+        <w:t xml:space="preserve"> </w:t>
+      </w:r>
+    </w:p>
+    <w:p>
+      <w:pPr>
+        <w:pBdr>
+          <w:bottom w:val="single" w:color="BFBFBF" w:sz="4"/>
+        </w:pBdr>
+        <w:spacing w:before="260"/>
+      </w:pPr>
+      <w:r>
+        <w:rPr>
+          <w:rFonts w:ascii="Arial" w:cs="Arial" w:eastAsia="Arial" w:hAnsi="Arial"/>
+          <w:sz w:val="21"/>
+          <w:szCs w:val="21"/>
+        </w:rPr>
+        <w:t xml:space="preserve"> </w:t>
+      </w:r>
+    </w:p>
+    <w:p>
+      <w:pPr>
+        <w:pBdr>
+          <w:bottom w:val="single" w:color="BFBFBF" w:sz="4"/>
+        </w:pBdr>
+        <w:spacing w:before="260"/>
+      </w:pPr>
+      <w:r>
+        <w:rPr>
+          <w:rFonts w:ascii="Arial" w:cs="Arial" w:eastAsia="Arial" w:hAnsi="Arial"/>
+          <w:sz w:val="21"/>
+          <w:szCs w:val="21"/>
+        </w:rPr>
+        <w:t xml:space="preserve"> </w:t>
+      </w:r>
+    </w:p>
+    <w:p>
+      <w:pPr>
+        <w:pBdr>
+          <w:bottom w:val="single" w:color="BFBFBF" w:sz="4"/>
+        </w:pBdr>
+        <w:spacing w:before="260"/>
+      </w:pPr>
+      <w:r>
+        <w:rPr>
+          <w:rFonts w:ascii="Arial" w:cs="Arial" w:eastAsia="Arial" w:hAnsi="Arial"/>
+          <w:sz w:val="21"/>
+          <w:szCs w:val="21"/>
+        </w:rPr>
+        <w:t xml:space="preserve"> </w:t>
+      </w:r>
+    </w:p>
     <w:sectPr>
       <w:footerReference w:type="default" r:id="rId7"/>
       <w:pgSz w:w="11906" w:h="16838" w:orient="portrait"/>

</xml_diff>

<commit_message>
Chapter 8: bake in GIS analyst documentation (stakeholders, data lineage, resources, decisions)
</commit_message>
<xml_diff>
--- a/docs/LaGrange-Parking-Developer-Guide.docx
+++ b/docs/LaGrange-Parking-Developer-Guide.docx
@@ -236,7 +236,7 @@
         <w:spacing w:after="70"/>
         <w:jc w:val="center"/>
       </w:pPr>
-      <w:hyperlink w:history="1" r:id="rIdkh1t4uq4kmzxjpoxyofxo">
+      <w:hyperlink w:history="1" r:id="rIdwyplfmkdtama7-2ov21ny">
         <w:r>
           <w:rPr>
             <w:rFonts w:ascii="Arial" w:cs="Arial" w:eastAsia="Arial" w:hAnsi="Arial"/>
@@ -254,7 +254,7 @@
         <w:spacing w:after="220"/>
         <w:jc w:val="center"/>
       </w:pPr>
-      <w:hyperlink w:history="1" r:id="rIdz_aa5snuvh6j4l_yv5tnn">
+      <w:hyperlink w:history="1" r:id="rIdxsaeen9c8epfpk4gn_pkl">
         <w:r>
           <w:rPr>
             <w:rFonts w:ascii="Arial" w:cs="Arial" w:eastAsia="Arial" w:hAnsi="Arial"/>
@@ -2213,7 +2213,7 @@
             </w:tcMar>
           </w:tcPr>
           <w:p>
-            <w:hyperlink w:history="1" r:id="rIdctoikjfsgjztk1svqwmqj">
+            <w:hyperlink w:history="1" r:id="rIden_zktv4_lcrnkyquxjyo">
               <w:r>
                 <w:rPr>
                   <w:rFonts w:ascii="Arial" w:cs="Arial" w:eastAsia="Arial" w:hAnsi="Arial"/>
@@ -2334,7 +2334,7 @@
             </w:tcMar>
           </w:tcPr>
           <w:p>
-            <w:hyperlink w:history="1" r:id="rIdt-lnupnl0prvefitgxu8v">
+            <w:hyperlink w:history="1" r:id="rId7llmofgjygenhv0atbmeo">
               <w:r>
                 <w:rPr>
                   <w:rFonts w:ascii="Arial" w:cs="Arial" w:eastAsia="Arial" w:hAnsi="Arial"/>
@@ -8454,18 +8454,16 @@
           <w:sz w:val="21"/>
           <w:szCs w:val="21"/>
         </w:rPr>
-        <w:t xml:space="preserve">This chapter is </w:t>
+        <w:t xml:space="preserve">The GIS side of the project — who is involved, where every source lives, how data flows to the apps, and the decisions that shaped the deliverable. Maintained by the GIS analyst; the running log is </w:t>
       </w:r>
       <w:r>
         <w:rPr>
-          <w:rFonts w:ascii="Arial" w:cs="Arial" w:eastAsia="Arial" w:hAnsi="Arial"/>
-          <w:b/>
-          <w:bCs/>
+          <w:rFonts w:ascii="Consolas" w:cs="Consolas" w:eastAsia="Consolas" w:hAnsi="Consolas"/>
           <w:color w:val="2B2B2B"/>
-          <w:sz w:val="21"/>
-          <w:szCs w:val="21"/>
+          <w:sz w:val="19"/>
+          <w:szCs w:val="19"/>
         </w:rPr>
-        <w:t xml:space="preserve">reserved for the GIS analyst</w:t>
+        <w:t xml:space="preserve">PROJECTDOCUMENTATION.md</w:t>
       </w:r>
       <w:r>
         <w:rPr>
@@ -8474,43 +8472,7 @@
           <w:sz w:val="21"/>
           <w:szCs w:val="21"/>
         </w:rPr>
-        <w:t xml:space="preserve"> who maintains the LGDM → FGDB → AGOL pipeline. Fill in the tables below and keep them current — the app developers depend on this page when data changes. Technical background: </w:t>
-      </w:r>
-      <w:r>
-        <w:rPr>
-          <w:rFonts w:ascii="Consolas" w:cs="Consolas" w:eastAsia="Consolas" w:hAnsi="Consolas"/>
-          <w:color w:val="2B2B2B"/>
-          <w:sz w:val="19"/>
-          <w:szCs w:val="19"/>
-        </w:rPr>
-        <w:t xml:space="preserve">docs/DATA.md</w:t>
-      </w:r>
-      <w:r>
-        <w:rPr>
-          <w:rFonts w:ascii="Arial" w:cs="Arial" w:eastAsia="Arial" w:hAnsi="Arial"/>
-          <w:color w:val="2B2B2B"/>
-          <w:sz w:val="21"/>
-          <w:szCs w:val="21"/>
-        </w:rPr>
-        <w:t xml:space="preserve"> and </w:t>
-      </w:r>
-      <w:r>
-        <w:rPr>
-          <w:rFonts w:ascii="Consolas" w:cs="Consolas" w:eastAsia="Consolas" w:hAnsi="Consolas"/>
-          <w:color w:val="2B2B2B"/>
-          <w:sz w:val="19"/>
-          <w:szCs w:val="19"/>
-        </w:rPr>
-        <w:t xml:space="preserve">docs/GIS-PUBLISH.md</w:t>
-      </w:r>
-      <w:r>
-        <w:rPr>
-          <w:rFonts w:ascii="Arial" w:cs="Arial" w:eastAsia="Arial" w:hAnsi="Arial"/>
-          <w:color w:val="2B2B2B"/>
-          <w:sz w:val="21"/>
-          <w:szCs w:val="21"/>
-        </w:rPr>
-        <w:t xml:space="preserve">.</w:t>
+        <w:t xml:space="preserve"> on the X: drive.</w:t>
       </w:r>
     </w:p>
     <w:p>
@@ -8527,7 +8489,169 @@
           <w:sz w:val="23"/>
           <w:szCs w:val="23"/>
         </w:rPr>
-        <w:t xml:space="preserve">8.1 — Data ownership &amp; contacts</w:t>
+        <w:t xml:space="preserve">8.1 — Client outcome</w:t>
+      </w:r>
+    </w:p>
+    <w:tbl>
+      <w:tblPr>
+        <w:tblW w:type="pct" w:w="100%"/>
+        <w:tblBorders>
+          <w:top w:val="single" w:color="auto" w:sz="4"/>
+          <w:left w:val="single" w:color="auto" w:sz="4"/>
+          <w:bottom w:val="single" w:color="auto" w:sz="4"/>
+          <w:right w:val="single" w:color="auto" w:sz="4"/>
+          <w:insideH w:val="single" w:color="auto" w:sz="4"/>
+          <w:insideV w:val="single" w:color="auto" w:sz="4"/>
+        </w:tblBorders>
+      </w:tblPr>
+      <w:tblGrid>
+        <w:gridCol w:w="100"/>
+      </w:tblGrid>
+      <w:tr>
+        <w:tc>
+          <w:tcPr>
+            <w:tcBorders>
+              <w:top w:val="single" w:color="0E7C66" w:sz="6"/>
+              <w:left w:val="single" w:color="0E7C66" w:sz="24"/>
+              <w:bottom w:val="single" w:color="0E7C66" w:sz="6"/>
+              <w:right w:val="single" w:color="0E7C66" w:sz="6"/>
+            </w:tcBorders>
+            <w:shd w:fill="EAF3FA" w:val="clear"/>
+            <w:tcMar>
+              <w:top w:type="dxa" w:w="140"/>
+              <w:left w:type="dxa" w:w="240"/>
+              <w:bottom w:type="dxa" w:w="140"/>
+              <w:right w:type="dxa" w:w="240"/>
+            </w:tcMar>
+          </w:tcPr>
+          <w:p>
+            <w:pPr>
+              <w:spacing w:after="80"/>
+            </w:pPr>
+            <w:r>
+              <w:rPr>
+                <w:rFonts w:ascii="Arial" w:cs="Arial" w:eastAsia="Arial" w:hAnsi="Arial"/>
+                <w:b/>
+                <w:bCs/>
+                <w:color w:val="0E7C66"/>
+                <w:sz w:val="21"/>
+                <w:szCs w:val="21"/>
+              </w:rPr>
+              <w:t xml:space="preserve">◎  What the Village gets</w:t>
+            </w:r>
+          </w:p>
+          <w:p>
+            <w:pPr>
+              <w:spacing w:after="120"/>
+            </w:pPr>
+            <w:r>
+              <w:rPr>
+                <w:rFonts w:ascii="Arial" w:cs="Arial" w:eastAsia="Arial" w:hAnsi="Arial"/>
+                <w:color w:val="2B2B2B"/>
+                <w:sz w:val="21"/>
+                <w:szCs w:val="21"/>
+              </w:rPr>
+              <w:t xml:space="preserve">Village of La Grange stakeholders and the public have accurate, clear maps that show where each parking permit applies, who is eligible for it, and where visitors may park — supporting the Village’s parking management revamp and its move from "decals" to "permits."</w:t>
+            </w:r>
+          </w:p>
+        </w:tc>
+      </w:tr>
+    </w:tbl>
+    <w:p>
+      <w:pPr>
+        <w:spacing w:after="120"/>
+      </w:pPr>
+    </w:p>
+    <w:p>
+      <w:pPr>
+        <w:spacing w:after="120"/>
+      </w:pPr>
+      <w:r>
+        <w:rPr>
+          <w:rFonts w:ascii="Arial" w:cs="Arial" w:eastAsia="Arial" w:hAnsi="Arial"/>
+          <w:b/>
+          <w:bCs/>
+          <w:color w:val="2B2B2B"/>
+          <w:sz w:val="21"/>
+          <w:szCs w:val="21"/>
+        </w:rPr>
+        <w:t xml:space="preserve">Deliverable: </w:t>
+      </w:r>
+      <w:r>
+        <w:rPr>
+          <w:rFonts w:ascii="Arial" w:cs="Arial" w:eastAsia="Arial" w:hAnsi="Arial"/>
+          <w:color w:val="2B2B2B"/>
+          <w:sz w:val="21"/>
+          <w:szCs w:val="21"/>
+        </w:rPr>
+        <w:t xml:space="preserve">two public, mobile-friendly parking maps from one React codebase, deployed as separate Azure Static Web Apps, both reading one publicly shared ArcGIS Online feature service — no login. Supporting GIS work: the Village’s flat parking inventory restructured into a related area-and-rule model, published to the Village’s AGOL organization with the designated overnight-resident areas digitized from engineering drawings.</w:t>
+      </w:r>
+    </w:p>
+    <w:p>
+      <w:pPr>
+        <w:spacing w:after="120"/>
+      </w:pPr>
+      <w:r>
+        <w:rPr>
+          <w:rFonts w:ascii="Arial" w:cs="Arial" w:eastAsia="Arial" w:hAnsi="Arial"/>
+          <w:b/>
+          <w:bCs/>
+          <w:color w:val="2B2B2B"/>
+          <w:sz w:val="21"/>
+          <w:szCs w:val="21"/>
+        </w:rPr>
+        <w:t xml:space="preserve">Status (2026-08-05): </w:t>
+      </w:r>
+      <w:r>
+        <w:rPr>
+          <w:rFonts w:ascii="Arial" w:cs="Arial" w:eastAsia="Arial" w:hAnsi="Arial"/>
+          <w:color w:val="2B2B2B"/>
+          <w:sz w:val="21"/>
+          <w:szCs w:val="21"/>
+        </w:rPr>
+        <w:t xml:space="preserve">both apps live, in an iterate-on-feedback phase. Every item from the 2026-07-28 stakeholder meeting is complete. Open items wait on the Village — the real permit purchase URL, a landing-page cover photo, and the missing engineering sheet for the Village Hall garage.</w:t>
+      </w:r>
+    </w:p>
+    <w:p>
+      <w:pPr>
+        <w:spacing w:after="120"/>
+      </w:pPr>
+      <w:r>
+        <w:rPr>
+          <w:rFonts w:ascii="Arial" w:cs="Arial" w:eastAsia="Arial" w:hAnsi="Arial"/>
+          <w:b/>
+          <w:bCs/>
+          <w:color w:val="2B2B2B"/>
+          <w:sz w:val="21"/>
+          <w:szCs w:val="21"/>
+        </w:rPr>
+        <w:t xml:space="preserve">Timeline: </w:t>
+      </w:r>
+      <w:r>
+        <w:rPr>
+          <w:rFonts w:ascii="Arial" w:cs="Arial" w:eastAsia="Arial" w:hAnsi="Arial"/>
+          <w:color w:val="2B2B2B"/>
+          <w:sz w:val="21"/>
+          <w:szCs w:val="21"/>
+        </w:rPr>
+        <w:t xml:space="preserve">Village’s stated program go-live was end of June 2026; MGP follows Charity Jones’s lead on timing. MGP hours: TBD.</w:t>
+      </w:r>
+    </w:p>
+    <w:p>
+      <w:pPr>
+        <w:pStyle w:val="Heading2"/>
+        <w:spacing w:after="100" w:before="280"/>
+      </w:pPr>
+      <w:r>
+        <w:rPr>
+          <w:rFonts w:ascii="Arial" w:cs="Arial" w:eastAsia="Arial" w:hAnsi="Arial"/>
+          <w:b/>
+          <w:bCs/>
+          <w:color w:val="0E7C66"/>
+          <w:sz w:val="23"/>
+          <w:szCs w:val="23"/>
+        </w:rPr>
+        <w:t xml:space="preserve">8.2 — Stakeholders</w:t>
       </w:r>
     </w:p>
     <w:tbl>
@@ -8545,6 +8669,415 @@
       <w:tblGrid>
         <w:gridCol w:w="100"/>
         <w:gridCol w:w="100"/>
+      </w:tblGrid>
+      <w:tr>
+        <w:tc>
+          <w:tcPr>
+            <w:tcW w:type="pct" w:w="22%"/>
+            <w:tcBorders>
+              <w:top w:val="single" w:color="D9D9D9" w:sz="4"/>
+              <w:left w:val="single" w:color="D9D9D9" w:sz="4"/>
+              <w:bottom w:val="single" w:color="D9D9D9" w:sz="4"/>
+              <w:right w:val="single" w:color="D9D9D9" w:sz="4"/>
+            </w:tcBorders>
+            <w:shd w:fill="0E7C66" w:val="clear"/>
+            <w:tcMar>
+              <w:top w:type="dxa" w:w="80"/>
+              <w:left w:type="dxa" w:w="120"/>
+              <w:bottom w:type="dxa" w:w="80"/>
+              <w:right w:type="dxa" w:w="120"/>
+            </w:tcMar>
+          </w:tcPr>
+          <w:p>
+            <w:r>
+              <w:rPr>
+                <w:rFonts w:ascii="Arial" w:cs="Arial" w:eastAsia="Arial" w:hAnsi="Arial"/>
+                <w:b/>
+                <w:bCs/>
+                <w:color w:val="FFFFFF"/>
+                <w:sz w:val="20"/>
+                <w:szCs w:val="20"/>
+              </w:rPr>
+              <w:t xml:space="preserve">Who</w:t>
+            </w:r>
+          </w:p>
+        </w:tc>
+        <w:tc>
+          <w:tcPr>
+            <w:tcW w:type="pct" w:w="78%"/>
+            <w:tcBorders>
+              <w:top w:val="single" w:color="D9D9D9" w:sz="4"/>
+              <w:left w:val="single" w:color="D9D9D9" w:sz="4"/>
+              <w:bottom w:val="single" w:color="D9D9D9" w:sz="4"/>
+              <w:right w:val="single" w:color="D9D9D9" w:sz="4"/>
+            </w:tcBorders>
+            <w:shd w:fill="0E7C66" w:val="clear"/>
+            <w:tcMar>
+              <w:top w:type="dxa" w:w="80"/>
+              <w:left w:type="dxa" w:w="120"/>
+              <w:bottom w:type="dxa" w:w="80"/>
+              <w:right w:type="dxa" w:w="120"/>
+            </w:tcMar>
+          </w:tcPr>
+          <w:p>
+            <w:r>
+              <w:rPr>
+                <w:rFonts w:ascii="Arial" w:cs="Arial" w:eastAsia="Arial" w:hAnsi="Arial"/>
+                <w:b/>
+                <w:bCs/>
+                <w:color w:val="FFFFFF"/>
+                <w:sz w:val="20"/>
+                <w:szCs w:val="20"/>
+              </w:rPr>
+              <w:t xml:space="preserve">Role</w:t>
+            </w:r>
+          </w:p>
+        </w:tc>
+      </w:tr>
+      <w:tr>
+        <w:tc>
+          <w:tcPr>
+            <w:tcW w:type="pct" w:w="22%"/>
+            <w:tcBorders>
+              <w:top w:val="single" w:color="D9D9D9" w:sz="4"/>
+              <w:left w:val="single" w:color="D9D9D9" w:sz="4"/>
+              <w:bottom w:val="single" w:color="D9D9D9" w:sz="4"/>
+              <w:right w:val="single" w:color="D9D9D9" w:sz="4"/>
+            </w:tcBorders>
+            <w:tcMar>
+              <w:top w:type="dxa" w:w="80"/>
+              <w:left w:type="dxa" w:w="120"/>
+              <w:bottom w:type="dxa" w:w="80"/>
+              <w:right w:type="dxa" w:w="120"/>
+            </w:tcMar>
+          </w:tcPr>
+          <w:p>
+            <w:r>
+              <w:rPr>
+                <w:rFonts w:ascii="Arial" w:cs="Arial" w:eastAsia="Arial" w:hAnsi="Arial"/>
+                <w:b/>
+                <w:bCs/>
+                <w:color w:val="2B2B2B"/>
+                <w:sz w:val="21"/>
+                <w:szCs w:val="21"/>
+              </w:rPr>
+              <w:t xml:space="preserve">Charity Jones</w:t>
+            </w:r>
+          </w:p>
+        </w:tc>
+        <w:tc>
+          <w:tcPr>
+            <w:tcW w:type="pct" w:w="78%"/>
+            <w:tcBorders>
+              <w:top w:val="single" w:color="D9D9D9" w:sz="4"/>
+              <w:left w:val="single" w:color="D9D9D9" w:sz="4"/>
+              <w:bottom w:val="single" w:color="D9D9D9" w:sz="4"/>
+              <w:right w:val="single" w:color="D9D9D9" w:sz="4"/>
+            </w:tcBorders>
+            <w:tcMar>
+              <w:top w:type="dxa" w:w="80"/>
+              <w:left w:type="dxa" w:w="120"/>
+              <w:bottom w:type="dxa" w:w="80"/>
+              <w:right w:type="dxa" w:w="120"/>
+            </w:tcMar>
+          </w:tcPr>
+          <w:p>
+            <w:r>
+              <w:rPr>
+                <w:rFonts w:ascii="Arial" w:cs="Arial" w:eastAsia="Arial" w:hAnsi="Arial"/>
+                <w:color w:val="2B2B2B"/>
+                <w:sz w:val="20"/>
+                <w:szCs w:val="20"/>
+              </w:rPr>
+              <w:t xml:space="preserve">Village of La Grange, Assistant Village Manager — primary contact and reviewer; all design and content decisions route through her</w:t>
+            </w:r>
+          </w:p>
+        </w:tc>
+      </w:tr>
+      <w:tr>
+        <w:tc>
+          <w:tcPr>
+            <w:tcW w:type="pct" w:w="22%"/>
+            <w:tcBorders>
+              <w:top w:val="single" w:color="D9D9D9" w:sz="4"/>
+              <w:left w:val="single" w:color="D9D9D9" w:sz="4"/>
+              <w:bottom w:val="single" w:color="D9D9D9" w:sz="4"/>
+              <w:right w:val="single" w:color="D9D9D9" w:sz="4"/>
+            </w:tcBorders>
+            <w:shd w:fill="F2F7FB" w:val="clear"/>
+            <w:tcMar>
+              <w:top w:type="dxa" w:w="80"/>
+              <w:left w:type="dxa" w:w="120"/>
+              <w:bottom w:type="dxa" w:w="80"/>
+              <w:right w:type="dxa" w:w="120"/>
+            </w:tcMar>
+          </w:tcPr>
+          <w:p>
+            <w:r>
+              <w:rPr>
+                <w:rFonts w:ascii="Arial" w:cs="Arial" w:eastAsia="Arial" w:hAnsi="Arial"/>
+                <w:b/>
+                <w:bCs/>
+                <w:color w:val="2B2B2B"/>
+                <w:sz w:val="21"/>
+                <w:szCs w:val="21"/>
+              </w:rPr>
+              <w:t xml:space="preserve">Susan Mika</w:t>
+            </w:r>
+          </w:p>
+        </w:tc>
+        <w:tc>
+          <w:tcPr>
+            <w:tcW w:type="pct" w:w="78%"/>
+            <w:tcBorders>
+              <w:top w:val="single" w:color="D9D9D9" w:sz="4"/>
+              <w:left w:val="single" w:color="D9D9D9" w:sz="4"/>
+              <w:bottom w:val="single" w:color="D9D9D9" w:sz="4"/>
+              <w:right w:val="single" w:color="D9D9D9" w:sz="4"/>
+            </w:tcBorders>
+            <w:shd w:fill="F2F7FB" w:val="clear"/>
+            <w:tcMar>
+              <w:top w:type="dxa" w:w="80"/>
+              <w:left w:type="dxa" w:w="120"/>
+              <w:bottom w:type="dxa" w:w="80"/>
+              <w:right w:type="dxa" w:w="120"/>
+            </w:tcMar>
+          </w:tcPr>
+          <w:p>
+            <w:r>
+              <w:rPr>
+                <w:rFonts w:ascii="Arial" w:cs="Arial" w:eastAsia="Arial" w:hAnsi="Arial"/>
+                <w:color w:val="2B2B2B"/>
+                <w:sz w:val="20"/>
+                <w:szCs w:val="20"/>
+              </w:rPr>
+              <w:t xml:space="preserve">Village of La Grange — stakeholder</w:t>
+            </w:r>
+          </w:p>
+        </w:tc>
+      </w:tr>
+      <w:tr>
+        <w:tc>
+          <w:tcPr>
+            <w:tcW w:type="pct" w:w="22%"/>
+            <w:tcBorders>
+              <w:top w:val="single" w:color="D9D9D9" w:sz="4"/>
+              <w:left w:val="single" w:color="D9D9D9" w:sz="4"/>
+              <w:bottom w:val="single" w:color="D9D9D9" w:sz="4"/>
+              <w:right w:val="single" w:color="D9D9D9" w:sz="4"/>
+            </w:tcBorders>
+            <w:tcMar>
+              <w:top w:type="dxa" w:w="80"/>
+              <w:left w:type="dxa" w:w="120"/>
+              <w:bottom w:type="dxa" w:w="80"/>
+              <w:right w:type="dxa" w:w="120"/>
+            </w:tcMar>
+          </w:tcPr>
+          <w:p>
+            <w:r>
+              <w:rPr>
+                <w:rFonts w:ascii="Arial" w:cs="Arial" w:eastAsia="Arial" w:hAnsi="Arial"/>
+                <w:b/>
+                <w:bCs/>
+                <w:color w:val="2B2B2B"/>
+                <w:sz w:val="21"/>
+                <w:szCs w:val="21"/>
+              </w:rPr>
+              <w:t xml:space="preserve">Esri</w:t>
+            </w:r>
+          </w:p>
+        </w:tc>
+        <w:tc>
+          <w:tcPr>
+            <w:tcW w:type="pct" w:w="78%"/>
+            <w:tcBorders>
+              <w:top w:val="single" w:color="D9D9D9" w:sz="4"/>
+              <w:left w:val="single" w:color="D9D9D9" w:sz="4"/>
+              <w:bottom w:val="single" w:color="D9D9D9" w:sz="4"/>
+              <w:right w:val="single" w:color="D9D9D9" w:sz="4"/>
+            </w:tcBorders>
+            <w:tcMar>
+              <w:top w:type="dxa" w:w="80"/>
+              <w:left w:type="dxa" w:w="120"/>
+              <w:bottom w:type="dxa" w:w="80"/>
+              <w:right w:type="dxa" w:w="120"/>
+            </w:tcMar>
+          </w:tcPr>
+          <w:p>
+            <w:r>
+              <w:rPr>
+                <w:rFonts w:ascii="Arial" w:cs="Arial" w:eastAsia="Arial" w:hAnsi="Arial"/>
+                <w:color w:val="2B2B2B"/>
+                <w:sz w:val="20"/>
+                <w:szCs w:val="20"/>
+              </w:rPr>
+              <w:t xml:space="preserve">ArcGIS Pro · ArcGIS Online · ArcGIS Maps SDK for JavaScript</w:t>
+            </w:r>
+          </w:p>
+        </w:tc>
+      </w:tr>
+      <w:tr>
+        <w:tc>
+          <w:tcPr>
+            <w:tcW w:type="pct" w:w="22%"/>
+            <w:tcBorders>
+              <w:top w:val="single" w:color="D9D9D9" w:sz="4"/>
+              <w:left w:val="single" w:color="D9D9D9" w:sz="4"/>
+              <w:bottom w:val="single" w:color="D9D9D9" w:sz="4"/>
+              <w:right w:val="single" w:color="D9D9D9" w:sz="4"/>
+            </w:tcBorders>
+            <w:shd w:fill="F2F7FB" w:val="clear"/>
+            <w:tcMar>
+              <w:top w:type="dxa" w:w="80"/>
+              <w:left w:type="dxa" w:w="120"/>
+              <w:bottom w:type="dxa" w:w="80"/>
+              <w:right w:type="dxa" w:w="120"/>
+            </w:tcMar>
+          </w:tcPr>
+          <w:p>
+            <w:r>
+              <w:rPr>
+                <w:rFonts w:ascii="Arial" w:cs="Arial" w:eastAsia="Arial" w:hAnsi="Arial"/>
+                <w:b/>
+                <w:bCs/>
+                <w:color w:val="2B2B2B"/>
+                <w:sz w:val="21"/>
+                <w:szCs w:val="21"/>
+              </w:rPr>
+              <w:t xml:space="preserve">Passport</w:t>
+            </w:r>
+          </w:p>
+        </w:tc>
+        <w:tc>
+          <w:tcPr>
+            <w:tcW w:type="pct" w:w="78%"/>
+            <w:tcBorders>
+              <w:top w:val="single" w:color="D9D9D9" w:sz="4"/>
+              <w:left w:val="single" w:color="D9D9D9" w:sz="4"/>
+              <w:bottom w:val="single" w:color="D9D9D9" w:sz="4"/>
+              <w:right w:val="single" w:color="D9D9D9" w:sz="4"/>
+            </w:tcBorders>
+            <w:shd w:fill="F2F7FB" w:val="clear"/>
+            <w:tcMar>
+              <w:top w:type="dxa" w:w="80"/>
+              <w:left w:type="dxa" w:w="120"/>
+              <w:bottom w:type="dxa" w:w="80"/>
+              <w:right w:type="dxa" w:w="120"/>
+            </w:tcMar>
+          </w:tcPr>
+          <w:p>
+            <w:r>
+              <w:rPr>
+                <w:rFonts w:ascii="Arial" w:cs="Arial" w:eastAsia="Arial" w:hAnsi="Arial"/>
+                <w:color w:val="2B2B2B"/>
+                <w:sz w:val="20"/>
+                <w:szCs w:val="20"/>
+              </w:rPr>
+              <w:t xml:space="preserve">The Village’s parking permit system — source of the eligibility list</w:t>
+            </w:r>
+          </w:p>
+        </w:tc>
+      </w:tr>
+      <w:tr>
+        <w:tc>
+          <w:tcPr>
+            <w:tcW w:type="pct" w:w="22%"/>
+            <w:tcBorders>
+              <w:top w:val="single" w:color="D9D9D9" w:sz="4"/>
+              <w:left w:val="single" w:color="D9D9D9" w:sz="4"/>
+              <w:bottom w:val="single" w:color="D9D9D9" w:sz="4"/>
+              <w:right w:val="single" w:color="D9D9D9" w:sz="4"/>
+            </w:tcBorders>
+            <w:tcMar>
+              <w:top w:type="dxa" w:w="80"/>
+              <w:left w:type="dxa" w:w="120"/>
+              <w:bottom w:type="dxa" w:w="80"/>
+              <w:right w:type="dxa" w:w="120"/>
+            </w:tcMar>
+          </w:tcPr>
+          <w:p>
+            <w:r>
+              <w:rPr>
+                <w:rFonts w:ascii="Arial" w:cs="Arial" w:eastAsia="Arial" w:hAnsi="Arial"/>
+                <w:b/>
+                <w:bCs/>
+                <w:color w:val="2B2B2B"/>
+                <w:sz w:val="21"/>
+                <w:szCs w:val="21"/>
+              </w:rPr>
+              <w:t xml:space="preserve">Microsoft Azure</w:t>
+            </w:r>
+          </w:p>
+        </w:tc>
+        <w:tc>
+          <w:tcPr>
+            <w:tcW w:type="pct" w:w="78%"/>
+            <w:tcBorders>
+              <w:top w:val="single" w:color="D9D9D9" w:sz="4"/>
+              <w:left w:val="single" w:color="D9D9D9" w:sz="4"/>
+              <w:bottom w:val="single" w:color="D9D9D9" w:sz="4"/>
+              <w:right w:val="single" w:color="D9D9D9" w:sz="4"/>
+            </w:tcBorders>
+            <w:tcMar>
+              <w:top w:type="dxa" w:w="80"/>
+              <w:left w:type="dxa" w:w="120"/>
+              <w:bottom w:type="dxa" w:w="80"/>
+              <w:right w:type="dxa" w:w="120"/>
+            </w:tcMar>
+          </w:tcPr>
+          <w:p>
+            <w:r>
+              <w:rPr>
+                <w:rFonts w:ascii="Arial" w:cs="Arial" w:eastAsia="Arial" w:hAnsi="Arial"/>
+                <w:color w:val="2B2B2B"/>
+                <w:sz w:val="20"/>
+                <w:szCs w:val="20"/>
+              </w:rPr>
+              <w:t xml:space="preserve">Static Web Apps hosting for both applications</w:t>
+            </w:r>
+          </w:p>
+        </w:tc>
+      </w:tr>
+    </w:tbl>
+    <w:p>
+      <w:r>
+        <w:br w:type="page"/>
+      </w:r>
+    </w:p>
+    <w:p>
+      <w:pPr>
+        <w:pStyle w:val="Heading2"/>
+        <w:spacing w:after="100" w:before="280"/>
+      </w:pPr>
+      <w:r>
+        <w:rPr>
+          <w:rFonts w:ascii="Arial" w:cs="Arial" w:eastAsia="Arial" w:hAnsi="Arial"/>
+          <w:b/>
+          <w:bCs/>
+          <w:color w:val="0E7C66"/>
+          <w:sz w:val="23"/>
+          <w:szCs w:val="23"/>
+        </w:rPr>
+        <w:t xml:space="preserve">8.3 — Data lineage</w:t>
+      </w:r>
+    </w:p>
+    <w:tbl>
+      <w:tblPr>
+        <w:tblW w:type="pct" w:w="100%"/>
+        <w:tblBorders>
+          <w:top w:val="none" w:color="FFFFFF" w:sz="0"/>
+          <w:left w:val="none" w:color="FFFFFF" w:sz="0"/>
+          <w:bottom w:val="none" w:color="FFFFFF" w:sz="0"/>
+          <w:right w:val="none" w:color="FFFFFF" w:sz="0"/>
+          <w:insideH w:val="single" w:color="auto" w:sz="4"/>
+          <w:insideV w:val="single" w:color="auto" w:sz="4"/>
+        </w:tblBorders>
+      </w:tblPr>
+      <w:tblGrid>
+        <w:gridCol w:w="100"/>
+        <w:gridCol w:w="100"/>
+        <w:gridCol w:w="100"/>
+        <w:gridCol w:w="100"/>
         <w:gridCol w:w="100"/>
         <w:gridCol w:w="100"/>
         <w:gridCol w:w="100"/>
@@ -8552,35 +9085,437 @@
       <w:tr>
         <w:tc>
           <w:tcPr>
-            <w:tcW w:type="pct" w:w="22%"/>
-            <w:tcBorders>
-              <w:top w:val="single" w:color="D9D9D9" w:sz="4"/>
-              <w:left w:val="single" w:color="D9D9D9" w:sz="4"/>
-              <w:bottom w:val="single" w:color="D9D9D9" w:sz="4"/>
-              <w:right w:val="single" w:color="D9D9D9" w:sz="4"/>
+            <w:tcBorders>
+              <w:top w:val="none" w:color="FFFFFF" w:sz="0"/>
+              <w:left w:val="none" w:color="FFFFFF" w:sz="0"/>
+              <w:bottom w:val="none" w:color="FFFFFF" w:sz="0"/>
+              <w:right w:val="none" w:color="FFFFFF" w:sz="0"/>
+            </w:tcBorders>
+            <w:shd w:fill="095443" w:val="clear"/>
+            <w:tcMar>
+              <w:top w:type="dxa" w:w="110"/>
+              <w:left w:type="dxa" w:w="60"/>
+              <w:bottom w:type="dxa" w:w="110"/>
+              <w:right w:type="dxa" w:w="60"/>
+            </w:tcMar>
+            <w:vAlign w:val="center"/>
+          </w:tcPr>
+          <w:p>
+            <w:pPr>
+              <w:spacing w:after="10"/>
+              <w:jc w:val="center"/>
+            </w:pPr>
+            <w:r>
+              <w:rPr>
+                <w:rFonts w:ascii="Arial" w:cs="Arial" w:eastAsia="Arial" w:hAnsi="Arial"/>
+                <w:b/>
+                <w:bCs/>
+                <w:color w:val="FFFFFF"/>
+                <w:sz w:val="22"/>
+                <w:szCs w:val="22"/>
+              </w:rPr>
+              <w:t xml:space="preserve">LGDM</w:t>
+            </w:r>
+          </w:p>
+          <w:p>
+            <w:pPr>
+              <w:jc w:val="center"/>
+            </w:pPr>
+            <w:r>
+              <w:rPr>
+                <w:rFonts w:ascii="Consolas" w:cs="Consolas" w:eastAsia="Consolas" w:hAnsi="Consolas"/>
+                <w:color w:val="FFFFFF"/>
+                <w:sz w:val="16"/>
+                <w:szCs w:val="16"/>
+              </w:rPr>
+              <w:t xml:space="preserve">mgp-sql02 · Parking_Restriction_POLY</w:t>
+            </w:r>
+          </w:p>
+        </w:tc>
+        <w:tc>
+          <w:tcPr>
+            <w:tcW w:type="pct" w:w="4%"/>
+            <w:tcBorders>
+              <w:top w:val="none" w:color="FFFFFF" w:sz="0"/>
+              <w:left w:val="none" w:color="FFFFFF" w:sz="0"/>
+              <w:bottom w:val="none" w:color="FFFFFF" w:sz="0"/>
+              <w:right w:val="none" w:color="FFFFFF" w:sz="0"/>
+            </w:tcBorders>
+            <w:vAlign w:val="center"/>
+          </w:tcPr>
+          <w:p>
+            <w:pPr>
+              <w:jc w:val="center"/>
+            </w:pPr>
+            <w:r>
+              <w:rPr>
+                <w:rFonts w:ascii="Arial" w:cs="Arial" w:eastAsia="Arial" w:hAnsi="Arial"/>
+                <w:b/>
+                <w:bCs/>
+                <w:color w:val="808080"/>
+                <w:sz w:val="30"/>
+                <w:szCs w:val="30"/>
+              </w:rPr>
+              <w:t xml:space="preserve">→</w:t>
+            </w:r>
+          </w:p>
+        </w:tc>
+        <w:tc>
+          <w:tcPr>
+            <w:tcBorders>
+              <w:top w:val="none" w:color="FFFFFF" w:sz="0"/>
+              <w:left w:val="none" w:color="FFFFFF" w:sz="0"/>
+              <w:bottom w:val="none" w:color="FFFFFF" w:sz="0"/>
+              <w:right w:val="none" w:color="FFFFFF" w:sz="0"/>
             </w:tcBorders>
             <w:shd w:fill="0E7C66" w:val="clear"/>
             <w:tcMar>
-              <w:top w:type="dxa" w:w="80"/>
-              <w:left w:type="dxa" w:w="120"/>
-              <w:bottom w:type="dxa" w:w="80"/>
-              <w:right w:type="dxa" w:w="120"/>
-            </w:tcMar>
-          </w:tcPr>
-          <w:p>
+              <w:top w:type="dxa" w:w="110"/>
+              <w:left w:type="dxa" w:w="60"/>
+              <w:bottom w:type="dxa" w:w="110"/>
+              <w:right w:type="dxa" w:w="60"/>
+            </w:tcMar>
+            <w:vAlign w:val="center"/>
+          </w:tcPr>
+          <w:p>
+            <w:pPr>
+              <w:spacing w:after="10"/>
+              <w:jc w:val="center"/>
+            </w:pPr>
             <w:r>
               <w:rPr>
                 <w:rFonts w:ascii="Arial" w:cs="Arial" w:eastAsia="Arial" w:hAnsi="Arial"/>
                 <w:b/>
                 <w:bCs/>
                 <w:color w:val="FFFFFF"/>
-                <w:sz w:val="20"/>
-                <w:szCs w:val="20"/>
-              </w:rPr>
-              <w:t xml:space="preserve">Role</w:t>
-            </w:r>
-          </w:p>
-        </w:tc>
+                <w:sz w:val="22"/>
+                <w:szCs w:val="22"/>
+              </w:rPr>
+              <w:t xml:space="preserve">FILE GDB</w:t>
+            </w:r>
+          </w:p>
+          <w:p>
+            <w:pPr>
+              <w:jc w:val="center"/>
+            </w:pPr>
+            <w:r>
+              <w:rPr>
+                <w:rFonts w:ascii="Consolas" w:cs="Consolas" w:eastAsia="Consolas" w:hAnsi="Consolas"/>
+                <w:color w:val="FFFFFF"/>
+                <w:sz w:val="16"/>
+                <w:szCs w:val="16"/>
+              </w:rPr>
+              <w:t xml:space="preserve">lagrange_build_fgdb.py</w:t>
+            </w:r>
+          </w:p>
+        </w:tc>
+        <w:tc>
+          <w:tcPr>
+            <w:tcW w:type="pct" w:w="4%"/>
+            <w:tcBorders>
+              <w:top w:val="none" w:color="FFFFFF" w:sz="0"/>
+              <w:left w:val="none" w:color="FFFFFF" w:sz="0"/>
+              <w:bottom w:val="none" w:color="FFFFFF" w:sz="0"/>
+              <w:right w:val="none" w:color="FFFFFF" w:sz="0"/>
+            </w:tcBorders>
+            <w:vAlign w:val="center"/>
+          </w:tcPr>
+          <w:p>
+            <w:pPr>
+              <w:jc w:val="center"/>
+            </w:pPr>
+            <w:r>
+              <w:rPr>
+                <w:rFonts w:ascii="Arial" w:cs="Arial" w:eastAsia="Arial" w:hAnsi="Arial"/>
+                <w:b/>
+                <w:bCs/>
+                <w:color w:val="808080"/>
+                <w:sz w:val="30"/>
+                <w:szCs w:val="30"/>
+              </w:rPr>
+              <w:t xml:space="preserve">→</w:t>
+            </w:r>
+          </w:p>
+        </w:tc>
+        <w:tc>
+          <w:tcPr>
+            <w:tcBorders>
+              <w:top w:val="none" w:color="FFFFFF" w:sz="0"/>
+              <w:left w:val="none" w:color="FFFFFF" w:sz="0"/>
+              <w:bottom w:val="none" w:color="FFFFFF" w:sz="0"/>
+              <w:right w:val="none" w:color="FFFFFF" w:sz="0"/>
+            </w:tcBorders>
+            <w:shd w:fill="1F5C8B" w:val="clear"/>
+            <w:tcMar>
+              <w:top w:type="dxa" w:w="110"/>
+              <w:left w:type="dxa" w:w="60"/>
+              <w:bottom w:type="dxa" w:w="110"/>
+              <w:right w:type="dxa" w:w="60"/>
+            </w:tcMar>
+            <w:vAlign w:val="center"/>
+          </w:tcPr>
+          <w:p>
+            <w:pPr>
+              <w:spacing w:after="10"/>
+              <w:jc w:val="center"/>
+            </w:pPr>
+            <w:r>
+              <w:rPr>
+                <w:rFonts w:ascii="Arial" w:cs="Arial" w:eastAsia="Arial" w:hAnsi="Arial"/>
+                <w:b/>
+                <w:bCs/>
+                <w:color w:val="FFFFFF"/>
+                <w:sz w:val="22"/>
+                <w:szCs w:val="22"/>
+              </w:rPr>
+              <w:t xml:space="preserve">AGOL SERVICE</w:t>
+            </w:r>
+          </w:p>
+          <w:p>
+            <w:pPr>
+              <w:jc w:val="center"/>
+            </w:pPr>
+            <w:r>
+              <w:rPr>
+                <w:rFonts w:ascii="Consolas" w:cs="Consolas" w:eastAsia="Consolas" w:hAnsi="Consolas"/>
+                <w:color w:val="FFFFFF"/>
+                <w:sz w:val="16"/>
+                <w:szCs w:val="16"/>
+              </w:rPr>
+              <w:t xml:space="preserve">LaGrange_Parking_Permits</w:t>
+            </w:r>
+          </w:p>
+        </w:tc>
+        <w:tc>
+          <w:tcPr>
+            <w:tcW w:type="pct" w:w="4%"/>
+            <w:tcBorders>
+              <w:top w:val="none" w:color="FFFFFF" w:sz="0"/>
+              <w:left w:val="none" w:color="FFFFFF" w:sz="0"/>
+              <w:bottom w:val="none" w:color="FFFFFF" w:sz="0"/>
+              <w:right w:val="none" w:color="FFFFFF" w:sz="0"/>
+            </w:tcBorders>
+            <w:vAlign w:val="center"/>
+          </w:tcPr>
+          <w:p>
+            <w:pPr>
+              <w:jc w:val="center"/>
+            </w:pPr>
+            <w:r>
+              <w:rPr>
+                <w:rFonts w:ascii="Arial" w:cs="Arial" w:eastAsia="Arial" w:hAnsi="Arial"/>
+                <w:b/>
+                <w:bCs/>
+                <w:color w:val="808080"/>
+                <w:sz w:val="30"/>
+                <w:szCs w:val="30"/>
+              </w:rPr>
+              <w:t xml:space="preserve">→</w:t>
+            </w:r>
+          </w:p>
+        </w:tc>
+        <w:tc>
+          <w:tcPr>
+            <w:tcBorders>
+              <w:top w:val="none" w:color="FFFFFF" w:sz="0"/>
+              <w:left w:val="none" w:color="FFFFFF" w:sz="0"/>
+              <w:bottom w:val="none" w:color="FFFFFF" w:sz="0"/>
+              <w:right w:val="none" w:color="FFFFFF" w:sz="0"/>
+            </w:tcBorders>
+            <w:shd w:fill="0B7285" w:val="clear"/>
+            <w:tcMar>
+              <w:top w:type="dxa" w:w="110"/>
+              <w:left w:type="dxa" w:w="60"/>
+              <w:bottom w:type="dxa" w:w="110"/>
+              <w:right w:type="dxa" w:w="60"/>
+            </w:tcMar>
+            <w:vAlign w:val="center"/>
+          </w:tcPr>
+          <w:p>
+            <w:pPr>
+              <w:spacing w:after="10"/>
+              <w:jc w:val="center"/>
+            </w:pPr>
+            <w:r>
+              <w:rPr>
+                <w:rFonts w:ascii="Arial" w:cs="Arial" w:eastAsia="Arial" w:hAnsi="Arial"/>
+                <w:b/>
+                <w:bCs/>
+                <w:color w:val="FFFFFF"/>
+                <w:sz w:val="22"/>
+                <w:szCs w:val="22"/>
+              </w:rPr>
+              <w:t xml:space="preserve">APPS</w:t>
+            </w:r>
+          </w:p>
+          <w:p>
+            <w:pPr>
+              <w:jc w:val="center"/>
+            </w:pPr>
+            <w:r>
+              <w:rPr>
+                <w:rFonts w:ascii="Arial" w:cs="Arial" w:eastAsia="Arial" w:hAnsi="Arial"/>
+                <w:color w:val="FFFFFF"/>
+                <w:sz w:val="16"/>
+                <w:szCs w:val="16"/>
+              </w:rPr>
+              <w:t xml:space="preserve">permit + public</w:t>
+            </w:r>
+          </w:p>
+        </w:tc>
+      </w:tr>
+    </w:tbl>
+    <w:p>
+      <w:pPr>
+        <w:spacing w:after="120"/>
+      </w:pPr>
+    </w:p>
+    <w:tbl>
+      <w:tblPr>
+        <w:tblW w:type="pct" w:w="100%"/>
+        <w:tblBorders>
+          <w:top w:val="single" w:color="auto" w:sz="4"/>
+          <w:left w:val="single" w:color="auto" w:sz="4"/>
+          <w:bottom w:val="single" w:color="auto" w:sz="4"/>
+          <w:right w:val="single" w:color="auto" w:sz="4"/>
+          <w:insideH w:val="single" w:color="auto" w:sz="4"/>
+          <w:insideV w:val="single" w:color="auto" w:sz="4"/>
+        </w:tblBorders>
+      </w:tblPr>
+      <w:tblGrid>
+        <w:gridCol w:w="100"/>
+      </w:tblGrid>
+      <w:tr>
+        <w:tc>
+          <w:tcPr>
+            <w:tcBorders>
+              <w:top w:val="single" w:color="C00000" w:sz="6"/>
+              <w:left w:val="single" w:color="C00000" w:sz="24"/>
+              <w:bottom w:val="single" w:color="C00000" w:sz="6"/>
+              <w:right w:val="single" w:color="C00000" w:sz="6"/>
+            </w:tcBorders>
+            <w:shd w:fill="FBE4E4" w:val="clear"/>
+            <w:tcMar>
+              <w:top w:type="dxa" w:w="140"/>
+              <w:left w:type="dxa" w:w="240"/>
+              <w:bottom w:type="dxa" w:w="140"/>
+              <w:right w:type="dxa" w:w="240"/>
+            </w:tcMar>
+          </w:tcPr>
+          <w:p>
+            <w:pPr>
+              <w:spacing w:after="80"/>
+            </w:pPr>
+            <w:r>
+              <w:rPr>
+                <w:rFonts w:ascii="Arial" w:cs="Arial" w:eastAsia="Arial" w:hAnsi="Arial"/>
+                <w:b/>
+                <w:bCs/>
+                <w:color w:val="C00000"/>
+                <w:sz w:val="21"/>
+                <w:szCs w:val="21"/>
+              </w:rPr>
+              <w:t xml:space="preserve">⛔  The trap — edit the LGDM, not the geodatabase</w:t>
+            </w:r>
+          </w:p>
+          <w:p>
+            <w:pPr>
+              <w:spacing w:after="120"/>
+            </w:pPr>
+            <w:r>
+              <w:rPr>
+                <w:rFonts w:ascii="Arial" w:cs="Arial" w:eastAsia="Arial" w:hAnsi="Arial"/>
+                <w:color w:val="2B2B2B"/>
+                <w:sz w:val="21"/>
+                <w:szCs w:val="21"/>
+              </w:rPr>
+              <w:t xml:space="preserve">Editing the file geodatabase alone is </w:t>
+            </w:r>
+            <w:r>
+              <w:rPr>
+                <w:rFonts w:ascii="Arial" w:cs="Arial" w:eastAsia="Arial" w:hAnsi="Arial"/>
+                <w:b/>
+                <w:bCs/>
+                <w:color w:val="2B2B2B"/>
+                <w:sz w:val="21"/>
+                <w:szCs w:val="21"/>
+              </w:rPr>
+              <w:t xml:space="preserve">not durable</w:t>
+            </w:r>
+            <w:r>
+              <w:rPr>
+                <w:rFonts w:ascii="Arial" w:cs="Arial" w:eastAsia="Arial" w:hAnsi="Arial"/>
+                <w:color w:val="2B2B2B"/>
+                <w:sz w:val="21"/>
+                <w:szCs w:val="21"/>
+              </w:rPr>
+              <w:t xml:space="preserve">: </w:t>
+            </w:r>
+            <w:r>
+              <w:rPr>
+                <w:rFonts w:ascii="Consolas" w:cs="Consolas" w:eastAsia="Consolas" w:hAnsi="Consolas"/>
+                <w:color w:val="2B2B2B"/>
+                <w:sz w:val="19"/>
+                <w:szCs w:val="19"/>
+              </w:rPr>
+              <w:t xml:space="preserve">lagrange_build_fgdb.py</w:t>
+            </w:r>
+            <w:r>
+              <w:rPr>
+                <w:rFonts w:ascii="Arial" w:cs="Arial" w:eastAsia="Arial" w:hAnsi="Arial"/>
+                <w:color w:val="2B2B2B"/>
+                <w:sz w:val="21"/>
+                <w:szCs w:val="21"/>
+              </w:rPr>
+              <w:t xml:space="preserve"> rebuilds ParkingArea and ParkingRule from the LGDM, so anything added only to the geodatabase is lost on the next rebuild. </w:t>
+            </w:r>
+            <w:r>
+              <w:rPr>
+                <w:rFonts w:ascii="Arial" w:cs="Arial" w:eastAsia="Arial" w:hAnsi="Arial"/>
+                <w:b/>
+                <w:bCs/>
+                <w:color w:val="2B2B2B"/>
+                <w:sz w:val="21"/>
+                <w:szCs w:val="21"/>
+              </w:rPr>
+              <w:t xml:space="preserve">Lot 15 is in that state today.</w:t>
+            </w:r>
+            <w:r>
+              <w:rPr>
+                <w:rFonts w:ascii="Arial" w:cs="Arial" w:eastAsia="Arial" w:hAnsi="Arial"/>
+                <w:color w:val="2B2B2B"/>
+                <w:sz w:val="21"/>
+                <w:szCs w:val="21"/>
+              </w:rPr>
+              <w:t xml:space="preserve"> Real changes go into the LGDM first, then rebuild and republish.</w:t>
+            </w:r>
+          </w:p>
+        </w:tc>
+      </w:tr>
+    </w:tbl>
+    <w:p>
+      <w:pPr>
+        <w:spacing w:after="120"/>
+      </w:pPr>
+    </w:p>
+    <w:tbl>
+      <w:tblPr>
+        <w:tblW w:type="pct" w:w="100%"/>
+        <w:tblBorders>
+          <w:top w:val="single" w:color="auto" w:sz="4"/>
+          <w:left w:val="single" w:color="auto" w:sz="4"/>
+          <w:bottom w:val="single" w:color="auto" w:sz="4"/>
+          <w:right w:val="single" w:color="auto" w:sz="4"/>
+          <w:insideH w:val="single" w:color="auto" w:sz="4"/>
+          <w:insideV w:val="single" w:color="auto" w:sz="4"/>
+        </w:tblBorders>
+      </w:tblPr>
+      <w:tblGrid>
+        <w:gridCol w:w="100"/>
+        <w:gridCol w:w="100"/>
+        <w:gridCol w:w="100"/>
+      </w:tblGrid>
+      <w:tr>
         <w:tc>
           <w:tcPr>
             <w:tcW w:type="pct" w:w="20%"/>
@@ -8608,13 +9543,13 @@
                 <w:sz w:val="20"/>
                 <w:szCs w:val="20"/>
               </w:rPr>
-              <w:t xml:space="preserve">Name</w:t>
-            </w:r>
-          </w:p>
-        </w:tc>
-        <w:tc>
-          <w:tcPr>
-            <w:tcW w:type="pct" w:w="24%"/>
+              <w:t xml:space="preserve">Layer / resource</w:t>
+            </w:r>
+          </w:p>
+        </w:tc>
+        <w:tc>
+          <w:tcPr>
+            <w:tcW w:type="pct" w:w="40%"/>
             <w:tcBorders>
               <w:top w:val="single" w:color="D9D9D9" w:sz="4"/>
               <w:left w:val="single" w:color="D9D9D9" w:sz="4"/>
@@ -8639,13 +9574,13 @@
                 <w:sz w:val="20"/>
                 <w:szCs w:val="20"/>
               </w:rPr>
-              <w:t xml:space="preserve">Organization / team</w:t>
-            </w:r>
-          </w:p>
-        </w:tc>
-        <w:tc>
-          <w:tcPr>
-            <w:tcW w:type="pct" w:w="22%"/>
+              <w:t xml:space="preserve">Where</w:t>
+            </w:r>
+          </w:p>
+        </w:tc>
+        <w:tc>
+          <w:tcPr>
+            <w:tcW w:type="pct" w:w="40%"/>
             <w:tcBorders>
               <w:top w:val="single" w:color="D9D9D9" w:sz="4"/>
               <w:left w:val="single" w:color="D9D9D9" w:sz="4"/>
@@ -8670,38 +9605,7 @@
                 <w:sz w:val="20"/>
                 <w:szCs w:val="20"/>
               </w:rPr>
-              <w:t xml:space="preserve">Contact</w:t>
-            </w:r>
-          </w:p>
-        </w:tc>
-        <w:tc>
-          <w:tcPr>
-            <w:tcW w:type="pct" w:w="12%"/>
-            <w:tcBorders>
-              <w:top w:val="single" w:color="D9D9D9" w:sz="4"/>
-              <w:left w:val="single" w:color="D9D9D9" w:sz="4"/>
-              <w:bottom w:val="single" w:color="D9D9D9" w:sz="4"/>
-              <w:right w:val="single" w:color="D9D9D9" w:sz="4"/>
-            </w:tcBorders>
-            <w:shd w:fill="0E7C66" w:val="clear"/>
-            <w:tcMar>
-              <w:top w:type="dxa" w:w="80"/>
-              <w:left w:type="dxa" w:w="120"/>
-              <w:bottom w:type="dxa" w:w="80"/>
-              <w:right w:type="dxa" w:w="120"/>
-            </w:tcMar>
-          </w:tcPr>
-          <w:p>
-            <w:r>
-              <w:rPr>
-                <w:rFonts w:ascii="Arial" w:cs="Arial" w:eastAsia="Arial" w:hAnsi="Arial"/>
-                <w:b/>
-                <w:bCs/>
-                <w:color w:val="FFFFFF"/>
-                <w:sz w:val="20"/>
-                <w:szCs w:val="20"/>
-              </w:rPr>
-              <w:t xml:space="preserve">As of (date)</w:t>
+              <w:t xml:space="preserve">Notes</w:t>
             </w:r>
           </w:p>
         </w:tc>
@@ -8709,34 +9613,6 @@
       <w:tr>
         <w:tc>
           <w:tcPr>
-            <w:tcW w:type="pct" w:w="22%"/>
-            <w:tcBorders>
-              <w:top w:val="single" w:color="D9D9D9" w:sz="4"/>
-              <w:left w:val="single" w:color="D9D9D9" w:sz="4"/>
-              <w:bottom w:val="single" w:color="D9D9D9" w:sz="4"/>
-              <w:right w:val="single" w:color="D9D9D9" w:sz="4"/>
-            </w:tcBorders>
-            <w:tcMar>
-              <w:top w:type="dxa" w:w="80"/>
-              <w:left w:type="dxa" w:w="120"/>
-              <w:bottom w:type="dxa" w:w="80"/>
-              <w:right w:type="dxa" w:w="120"/>
-            </w:tcMar>
-          </w:tcPr>
-          <w:p>
-            <w:r>
-              <w:rPr>
-                <w:rFonts w:ascii="Arial" w:cs="Arial" w:eastAsia="Arial" w:hAnsi="Arial"/>
-                <w:color w:val="2B2B2B"/>
-                <w:sz w:val="20"/>
-                <w:szCs w:val="20"/>
-              </w:rPr>
-              <w:t xml:space="preserve"> </w:t>
-            </w:r>
-          </w:p>
-        </w:tc>
-        <w:tc>
-          <w:tcPr>
             <w:tcW w:type="pct" w:w="20%"/>
             <w:tcBorders>
               <w:top w:val="single" w:color="D9D9D9" w:sz="4"/>
@@ -8755,95 +9631,69 @@
             <w:r>
               <w:rPr>
                 <w:rFonts w:ascii="Arial" w:cs="Arial" w:eastAsia="Arial" w:hAnsi="Arial"/>
-                <w:color w:val="2B2B2B"/>
-                <w:sz w:val="20"/>
-                <w:szCs w:val="20"/>
-              </w:rPr>
-              <w:t xml:space="preserve"> </w:t>
-            </w:r>
-          </w:p>
-        </w:tc>
-        <w:tc>
-          <w:tcPr>
-            <w:tcW w:type="pct" w:w="24%"/>
-            <w:tcBorders>
-              <w:top w:val="single" w:color="D9D9D9" w:sz="4"/>
-              <w:left w:val="single" w:color="D9D9D9" w:sz="4"/>
-              <w:bottom w:val="single" w:color="D9D9D9" w:sz="4"/>
-              <w:right w:val="single" w:color="D9D9D9" w:sz="4"/>
-            </w:tcBorders>
-            <w:tcMar>
-              <w:top w:type="dxa" w:w="80"/>
-              <w:left w:type="dxa" w:w="120"/>
-              <w:bottom w:type="dxa" w:w="80"/>
-              <w:right w:type="dxa" w:w="120"/>
-            </w:tcMar>
-          </w:tcPr>
-          <w:p>
-            <w:r>
-              <w:rPr>
-                <w:rFonts w:ascii="Arial" w:cs="Arial" w:eastAsia="Arial" w:hAnsi="Arial"/>
-                <w:color w:val="2B2B2B"/>
-                <w:sz w:val="20"/>
-                <w:szCs w:val="20"/>
-              </w:rPr>
-              <w:t xml:space="preserve"> </w:t>
-            </w:r>
-          </w:p>
-        </w:tc>
-        <w:tc>
-          <w:tcPr>
-            <w:tcW w:type="pct" w:w="22%"/>
-            <w:tcBorders>
-              <w:top w:val="single" w:color="D9D9D9" w:sz="4"/>
-              <w:left w:val="single" w:color="D9D9D9" w:sz="4"/>
-              <w:bottom w:val="single" w:color="D9D9D9" w:sz="4"/>
-              <w:right w:val="single" w:color="D9D9D9" w:sz="4"/>
-            </w:tcBorders>
-            <w:tcMar>
-              <w:top w:type="dxa" w:w="80"/>
-              <w:left w:type="dxa" w:w="120"/>
-              <w:bottom w:type="dxa" w:w="80"/>
-              <w:right w:type="dxa" w:w="120"/>
-            </w:tcMar>
-          </w:tcPr>
-          <w:p>
-            <w:r>
-              <w:rPr>
-                <w:rFonts w:ascii="Arial" w:cs="Arial" w:eastAsia="Arial" w:hAnsi="Arial"/>
-                <w:color w:val="2B2B2B"/>
-                <w:sz w:val="20"/>
-                <w:szCs w:val="20"/>
-              </w:rPr>
-              <w:t xml:space="preserve"> </w:t>
-            </w:r>
-          </w:p>
-        </w:tc>
-        <w:tc>
-          <w:tcPr>
-            <w:tcW w:type="pct" w:w="12%"/>
-            <w:tcBorders>
-              <w:top w:val="single" w:color="D9D9D9" w:sz="4"/>
-              <w:left w:val="single" w:color="D9D9D9" w:sz="4"/>
-              <w:bottom w:val="single" w:color="D9D9D9" w:sz="4"/>
-              <w:right w:val="single" w:color="D9D9D9" w:sz="4"/>
-            </w:tcBorders>
-            <w:tcMar>
-              <w:top w:type="dxa" w:w="80"/>
-              <w:left w:type="dxa" w:w="120"/>
-              <w:bottom w:type="dxa" w:w="80"/>
-              <w:right w:type="dxa" w:w="120"/>
-            </w:tcMar>
-          </w:tcPr>
-          <w:p>
-            <w:r>
-              <w:rPr>
-                <w:rFonts w:ascii="Arial" w:cs="Arial" w:eastAsia="Arial" w:hAnsi="Arial"/>
-                <w:color w:val="2B2B2B"/>
-                <w:sz w:val="20"/>
-                <w:szCs w:val="20"/>
-              </w:rPr>
-              <w:t xml:space="preserve"> </w:t>
+                <w:b/>
+                <w:bCs/>
+                <w:color w:val="2B2B2B"/>
+                <w:sz w:val="21"/>
+                <w:szCs w:val="21"/>
+              </w:rPr>
+              <w:t xml:space="preserve">Source of record</w:t>
+            </w:r>
+          </w:p>
+        </w:tc>
+        <w:tc>
+          <w:tcPr>
+            <w:tcW w:type="pct" w:w="40%"/>
+            <w:tcBorders>
+              <w:top w:val="single" w:color="D9D9D9" w:sz="4"/>
+              <w:left w:val="single" w:color="D9D9D9" w:sz="4"/>
+              <w:bottom w:val="single" w:color="D9D9D9" w:sz="4"/>
+              <w:right w:val="single" w:color="D9D9D9" w:sz="4"/>
+            </w:tcBorders>
+            <w:tcMar>
+              <w:top w:type="dxa" w:w="80"/>
+              <w:left w:type="dxa" w:w="120"/>
+              <w:bottom w:type="dxa" w:w="80"/>
+              <w:right w:type="dxa" w:w="120"/>
+            </w:tcMar>
+          </w:tcPr>
+          <w:p>
+            <w:r>
+              <w:rPr>
+                <w:rFonts w:ascii="Consolas" w:cs="Consolas" w:eastAsia="Consolas" w:hAnsi="Consolas"/>
+                <w:color w:val="2B2B2B"/>
+                <w:sz w:val="19"/>
+                <w:szCs w:val="19"/>
+              </w:rPr>
+              <w:t xml:space="preserve">mgp-sql02 › GISC_PRODUCTION › DBO.Parking_Restriction_POLY</w:t>
+            </w:r>
+          </w:p>
+        </w:tc>
+        <w:tc>
+          <w:tcPr>
+            <w:tcW w:type="pct" w:w="40%"/>
+            <w:tcBorders>
+              <w:top w:val="single" w:color="D9D9D9" w:sz="4"/>
+              <w:left w:val="single" w:color="D9D9D9" w:sz="4"/>
+              <w:bottom w:val="single" w:color="D9D9D9" w:sz="4"/>
+              <w:right w:val="single" w:color="D9D9D9" w:sz="4"/>
+            </w:tcBorders>
+            <w:tcMar>
+              <w:top w:type="dxa" w:w="80"/>
+              <w:left w:type="dxa" w:w="120"/>
+              <w:bottom w:type="dxa" w:w="80"/>
+              <w:right w:type="dxa" w:w="120"/>
+            </w:tcMar>
+          </w:tcPr>
+          <w:p>
+            <w:r>
+              <w:rPr>
+                <w:rFonts w:ascii="Arial" w:cs="Arial" w:eastAsia="Arial" w:hAnsi="Arial"/>
+                <w:color w:val="2B2B2B"/>
+                <w:sz w:val="20"/>
+                <w:szCs w:val="20"/>
+              </w:rPr>
+              <w:t xml:space="preserve">GEODBID ‘024’. The Village’s authoritative parking inventory and the origin of everything below. Edited in ArcGIS Pro.</w:t>
             </w:r>
           </w:p>
         </w:tc>
@@ -8851,7 +9701,7 @@
       <w:tr>
         <w:tc>
           <w:tcPr>
-            <w:tcW w:type="pct" w:w="22%"/>
+            <w:tcW w:type="pct" w:w="20%"/>
             <w:tcBorders>
               <w:top w:val="single" w:color="D9D9D9" w:sz="4"/>
               <w:left w:val="single" w:color="D9D9D9" w:sz="4"/>
@@ -8870,17 +9720,19 @@
             <w:r>
               <w:rPr>
                 <w:rFonts w:ascii="Arial" w:cs="Arial" w:eastAsia="Arial" w:hAnsi="Arial"/>
-                <w:color w:val="2B2B2B"/>
-                <w:sz w:val="20"/>
-                <w:szCs w:val="20"/>
-              </w:rPr>
-              <w:t xml:space="preserve"> </w:t>
-            </w:r>
-          </w:p>
-        </w:tc>
-        <w:tc>
-          <w:tcPr>
-            <w:tcW w:type="pct" w:w="20%"/>
+                <w:b/>
+                <w:bCs/>
+                <w:color w:val="2B2B2B"/>
+                <w:sz w:val="21"/>
+                <w:szCs w:val="21"/>
+              </w:rPr>
+              <w:t xml:space="preserve">Working geodatabase</w:t>
+            </w:r>
+          </w:p>
+        </w:tc>
+        <w:tc>
+          <w:tcPr>
+            <w:tcW w:type="pct" w:w="40%"/>
             <w:tcBorders>
               <w:top w:val="single" w:color="D9D9D9" w:sz="4"/>
               <w:left w:val="single" w:color="D9D9D9" w:sz="4"/>
@@ -8898,18 +9750,18 @@
           <w:p>
             <w:r>
               <w:rPr>
-                <w:rFonts w:ascii="Arial" w:cs="Arial" w:eastAsia="Arial" w:hAnsi="Arial"/>
-                <w:color w:val="2B2B2B"/>
-                <w:sz w:val="20"/>
-                <w:szCs w:val="20"/>
-              </w:rPr>
-              <w:t xml:space="preserve"> </w:t>
-            </w:r>
-          </w:p>
-        </w:tc>
-        <w:tc>
-          <w:tcPr>
-            <w:tcW w:type="pct" w:w="24%"/>
+                <w:rFonts w:ascii="Consolas" w:cs="Consolas" w:eastAsia="Consolas" w:hAnsi="Consolas"/>
+                <w:color w:val="2B2B2B"/>
+                <w:sz w:val="19"/>
+                <w:szCs w:val="19"/>
+              </w:rPr>
+              <w:t xml:space="preserve">X:\GISC\Community\LaGrange\Project\20240829_ParkingPermitMaps\APRX\Parking_Permit_Restructure\ParkingPermits.gdb</w:t>
+            </w:r>
+          </w:p>
+        </w:tc>
+        <w:tc>
+          <w:tcPr>
+            <w:tcW w:type="pct" w:w="40%"/>
             <w:tcBorders>
               <w:top w:val="single" w:color="D9D9D9" w:sz="4"/>
               <w:left w:val="single" w:color="D9D9D9" w:sz="4"/>
@@ -8932,65 +9784,7 @@
                 <w:sz w:val="20"/>
                 <w:szCs w:val="20"/>
               </w:rPr>
-              <w:t xml:space="preserve"> </w:t>
-            </w:r>
-          </w:p>
-        </w:tc>
-        <w:tc>
-          <w:tcPr>
-            <w:tcW w:type="pct" w:w="22%"/>
-            <w:tcBorders>
-              <w:top w:val="single" w:color="D9D9D9" w:sz="4"/>
-              <w:left w:val="single" w:color="D9D9D9" w:sz="4"/>
-              <w:bottom w:val="single" w:color="D9D9D9" w:sz="4"/>
-              <w:right w:val="single" w:color="D9D9D9" w:sz="4"/>
-            </w:tcBorders>
-            <w:shd w:fill="F2F7FB" w:val="clear"/>
-            <w:tcMar>
-              <w:top w:type="dxa" w:w="80"/>
-              <w:left w:type="dxa" w:w="120"/>
-              <w:bottom w:type="dxa" w:w="80"/>
-              <w:right w:type="dxa" w:w="120"/>
-            </w:tcMar>
-          </w:tcPr>
-          <w:p>
-            <w:r>
-              <w:rPr>
-                <w:rFonts w:ascii="Arial" w:cs="Arial" w:eastAsia="Arial" w:hAnsi="Arial"/>
-                <w:color w:val="2B2B2B"/>
-                <w:sz w:val="20"/>
-                <w:szCs w:val="20"/>
-              </w:rPr>
-              <w:t xml:space="preserve"> </w:t>
-            </w:r>
-          </w:p>
-        </w:tc>
-        <w:tc>
-          <w:tcPr>
-            <w:tcW w:type="pct" w:w="12%"/>
-            <w:tcBorders>
-              <w:top w:val="single" w:color="D9D9D9" w:sz="4"/>
-              <w:left w:val="single" w:color="D9D9D9" w:sz="4"/>
-              <w:bottom w:val="single" w:color="D9D9D9" w:sz="4"/>
-              <w:right w:val="single" w:color="D9D9D9" w:sz="4"/>
-            </w:tcBorders>
-            <w:shd w:fill="F2F7FB" w:val="clear"/>
-            <w:tcMar>
-              <w:top w:type="dxa" w:w="80"/>
-              <w:left w:type="dxa" w:w="120"/>
-              <w:bottom w:type="dxa" w:w="80"/>
-              <w:right w:type="dxa" w:w="120"/>
-            </w:tcMar>
-          </w:tcPr>
-          <w:p>
-            <w:r>
-              <w:rPr>
-                <w:rFonts w:ascii="Arial" w:cs="Arial" w:eastAsia="Arial" w:hAnsi="Arial"/>
-                <w:color w:val="2B2B2B"/>
-                <w:sz w:val="20"/>
-                <w:szCs w:val="20"/>
-              </w:rPr>
-              <w:t xml:space="preserve"> </w:t>
+              <w:t xml:space="preserve">ParkingArea, ParkingRule, OvernightResidentSubzones, PermitEligibleAddress, StudyZone + domains. Rebuilt from the LGDM by lagrange_build_fgdb.py.</w:t>
             </w:r>
           </w:p>
         </w:tc>
@@ -8998,34 +9792,6 @@
       <w:tr>
         <w:tc>
           <w:tcPr>
-            <w:tcW w:type="pct" w:w="22%"/>
-            <w:tcBorders>
-              <w:top w:val="single" w:color="D9D9D9" w:sz="4"/>
-              <w:left w:val="single" w:color="D9D9D9" w:sz="4"/>
-              <w:bottom w:val="single" w:color="D9D9D9" w:sz="4"/>
-              <w:right w:val="single" w:color="D9D9D9" w:sz="4"/>
-            </w:tcBorders>
-            <w:tcMar>
-              <w:top w:type="dxa" w:w="80"/>
-              <w:left w:type="dxa" w:w="120"/>
-              <w:bottom w:type="dxa" w:w="80"/>
-              <w:right w:type="dxa" w:w="120"/>
-            </w:tcMar>
-          </w:tcPr>
-          <w:p>
-            <w:r>
-              <w:rPr>
-                <w:rFonts w:ascii="Arial" w:cs="Arial" w:eastAsia="Arial" w:hAnsi="Arial"/>
-                <w:color w:val="2B2B2B"/>
-                <w:sz w:val="20"/>
-                <w:szCs w:val="20"/>
-              </w:rPr>
-              <w:t xml:space="preserve"> </w:t>
-            </w:r>
-          </w:p>
-        </w:tc>
-        <w:tc>
-          <w:tcPr>
             <w:tcW w:type="pct" w:w="20%"/>
             <w:tcBorders>
               <w:top w:val="single" w:color="D9D9D9" w:sz="4"/>
@@ -9044,14 +9810,580 @@
             <w:r>
               <w:rPr>
                 <w:rFonts w:ascii="Arial" w:cs="Arial" w:eastAsia="Arial" w:hAnsi="Arial"/>
-                <w:color w:val="2B2B2B"/>
-                <w:sz w:val="20"/>
-                <w:szCs w:val="20"/>
-              </w:rPr>
-              <w:t xml:space="preserve"> </w:t>
-            </w:r>
-          </w:p>
-        </w:tc>
+                <w:b/>
+                <w:bCs/>
+                <w:color w:val="2B2B2B"/>
+                <w:sz w:val="21"/>
+                <w:szCs w:val="21"/>
+              </w:rPr>
+              <w:t xml:space="preserve">ArcGIS Pro project</w:t>
+            </w:r>
+          </w:p>
+        </w:tc>
+        <w:tc>
+          <w:tcPr>
+            <w:tcW w:type="pct" w:w="40%"/>
+            <w:tcBorders>
+              <w:top w:val="single" w:color="D9D9D9" w:sz="4"/>
+              <w:left w:val="single" w:color="D9D9D9" w:sz="4"/>
+              <w:bottom w:val="single" w:color="D9D9D9" w:sz="4"/>
+              <w:right w:val="single" w:color="D9D9D9" w:sz="4"/>
+            </w:tcBorders>
+            <w:tcMar>
+              <w:top w:type="dxa" w:w="80"/>
+              <w:left w:type="dxa" w:w="120"/>
+              <w:bottom w:type="dxa" w:w="80"/>
+              <w:right w:type="dxa" w:w="120"/>
+            </w:tcMar>
+          </w:tcPr>
+          <w:p>
+            <w:r>
+              <w:rPr>
+                <w:rFonts w:ascii="Consolas" w:cs="Consolas" w:eastAsia="Consolas" w:hAnsi="Consolas"/>
+                <w:color w:val="2B2B2B"/>
+                <w:sz w:val="19"/>
+                <w:szCs w:val="19"/>
+              </w:rPr>
+              <w:t xml:space="preserve">…\Parking_Permit_Restructure\Parking_Permit_Restructure.aprx</w:t>
+            </w:r>
+          </w:p>
+        </w:tc>
+        <w:tc>
+          <w:tcPr>
+            <w:tcW w:type="pct" w:w="40%"/>
+            <w:tcBorders>
+              <w:top w:val="single" w:color="D9D9D9" w:sz="4"/>
+              <w:left w:val="single" w:color="D9D9D9" w:sz="4"/>
+              <w:bottom w:val="single" w:color="D9D9D9" w:sz="4"/>
+              <w:right w:val="single" w:color="D9D9D9" w:sz="4"/>
+            </w:tcBorders>
+            <w:tcMar>
+              <w:top w:type="dxa" w:w="80"/>
+              <w:left w:type="dxa" w:w="120"/>
+              <w:bottom w:type="dxa" w:w="80"/>
+              <w:right w:type="dxa" w:w="120"/>
+            </w:tcMar>
+          </w:tcPr>
+          <w:p>
+            <w:r>
+              <w:rPr>
+                <w:rFonts w:ascii="Arial" w:cs="Arial" w:eastAsia="Arial" w:hAnsi="Arial"/>
+                <w:color w:val="2B2B2B"/>
+                <w:sz w:val="20"/>
+                <w:szCs w:val="20"/>
+              </w:rPr>
+              <w:t xml:space="preserve">Maps: Permit Parking, Visitor Parking, Permit-Eligible Addresses. Editing + QA only — the apps do not read it. Superseded original is in the adjacent "Parking Decal Maps" folder.</w:t>
+            </w:r>
+          </w:p>
+        </w:tc>
+      </w:tr>
+      <w:tr>
+        <w:tc>
+          <w:tcPr>
+            <w:tcW w:type="pct" w:w="20%"/>
+            <w:tcBorders>
+              <w:top w:val="single" w:color="D9D9D9" w:sz="4"/>
+              <w:left w:val="single" w:color="D9D9D9" w:sz="4"/>
+              <w:bottom w:val="single" w:color="D9D9D9" w:sz="4"/>
+              <w:right w:val="single" w:color="D9D9D9" w:sz="4"/>
+            </w:tcBorders>
+            <w:shd w:fill="F2F7FB" w:val="clear"/>
+            <w:tcMar>
+              <w:top w:type="dxa" w:w="80"/>
+              <w:left w:type="dxa" w:w="120"/>
+              <w:bottom w:type="dxa" w:w="80"/>
+              <w:right w:type="dxa" w:w="120"/>
+            </w:tcMar>
+          </w:tcPr>
+          <w:p>
+            <w:r>
+              <w:rPr>
+                <w:rFonts w:ascii="Arial" w:cs="Arial" w:eastAsia="Arial" w:hAnsi="Arial"/>
+                <w:b/>
+                <w:bCs/>
+                <w:color w:val="2B2B2B"/>
+                <w:sz w:val="21"/>
+                <w:szCs w:val="21"/>
+              </w:rPr>
+              <w:t xml:space="preserve">Live service (apps read this)</w:t>
+            </w:r>
+          </w:p>
+        </w:tc>
+        <w:tc>
+          <w:tcPr>
+            <w:tcW w:type="pct" w:w="40%"/>
+            <w:tcBorders>
+              <w:top w:val="single" w:color="D9D9D9" w:sz="4"/>
+              <w:left w:val="single" w:color="D9D9D9" w:sz="4"/>
+              <w:bottom w:val="single" w:color="D9D9D9" w:sz="4"/>
+              <w:right w:val="single" w:color="D9D9D9" w:sz="4"/>
+            </w:tcBorders>
+            <w:shd w:fill="F2F7FB" w:val="clear"/>
+            <w:tcMar>
+              <w:top w:type="dxa" w:w="80"/>
+              <w:left w:type="dxa" w:w="120"/>
+              <w:bottom w:type="dxa" w:w="80"/>
+              <w:right w:type="dxa" w:w="120"/>
+            </w:tcMar>
+          </w:tcPr>
+          <w:p>
+            <w:r>
+              <w:rPr>
+                <w:rFonts w:ascii="Consolas" w:cs="Consolas" w:eastAsia="Consolas" w:hAnsi="Consolas"/>
+                <w:color w:val="2B2B2B"/>
+                <w:sz w:val="19"/>
+                <w:szCs w:val="19"/>
+              </w:rPr>
+              <w:t xml:space="preserve">LaGrange_Parking_Permits</w:t>
+            </w:r>
+            <w:r>
+              <w:rPr>
+                <w:rFonts w:ascii="Arial" w:cs="Arial" w:eastAsia="Arial" w:hAnsi="Arial"/>
+                <w:color w:val="2B2B2B"/>
+                <w:sz w:val="21"/>
+                <w:szCs w:val="21"/>
+              </w:rPr>
+              <w:t xml:space="preserve"> on lagrangeil.maps.arcgis.com · item </w:t>
+            </w:r>
+            <w:r>
+              <w:rPr>
+                <w:rFonts w:ascii="Consolas" w:cs="Consolas" w:eastAsia="Consolas" w:hAnsi="Consolas"/>
+                <w:color w:val="2B2B2B"/>
+                <w:sz w:val="19"/>
+                <w:szCs w:val="19"/>
+              </w:rPr>
+              <w:t xml:space="preserve">f13e7fa3199141a2be6c2eea816de8d4</w:t>
+            </w:r>
+          </w:p>
+        </w:tc>
+        <w:tc>
+          <w:tcPr>
+            <w:tcW w:type="pct" w:w="40%"/>
+            <w:tcBorders>
+              <w:top w:val="single" w:color="D9D9D9" w:sz="4"/>
+              <w:left w:val="single" w:color="D9D9D9" w:sz="4"/>
+              <w:bottom w:val="single" w:color="D9D9D9" w:sz="4"/>
+              <w:right w:val="single" w:color="D9D9D9" w:sz="4"/>
+            </w:tcBorders>
+            <w:shd w:fill="F2F7FB" w:val="clear"/>
+            <w:tcMar>
+              <w:top w:type="dxa" w:w="80"/>
+              <w:left w:type="dxa" w:w="120"/>
+              <w:bottom w:type="dxa" w:w="80"/>
+              <w:right w:type="dxa" w:w="120"/>
+            </w:tcMar>
+          </w:tcPr>
+          <w:p>
+            <w:r>
+              <w:rPr>
+                <w:rFonts w:ascii="Arial" w:cs="Arial" w:eastAsia="Arial" w:hAnsi="Arial"/>
+                <w:color w:val="2B2B2B"/>
+                <w:sz w:val="20"/>
+                <w:szCs w:val="20"/>
+              </w:rPr>
+              <w:t xml:space="preserve">Sublayer /2 ParkingArea (144 polygons) · /3 ParkingRule (173 rows, 1:many on AREAID). Shared publicly.</w:t>
+            </w:r>
+          </w:p>
+        </w:tc>
+      </w:tr>
+      <w:tr>
+        <w:tc>
+          <w:tcPr>
+            <w:tcW w:type="pct" w:w="20%"/>
+            <w:tcBorders>
+              <w:top w:val="single" w:color="D9D9D9" w:sz="4"/>
+              <w:left w:val="single" w:color="D9D9D9" w:sz="4"/>
+              <w:bottom w:val="single" w:color="D9D9D9" w:sz="4"/>
+              <w:right w:val="single" w:color="D9D9D9" w:sz="4"/>
+            </w:tcBorders>
+            <w:tcMar>
+              <w:top w:type="dxa" w:w="80"/>
+              <w:left w:type="dxa" w:w="120"/>
+              <w:bottom w:type="dxa" w:w="80"/>
+              <w:right w:type="dxa" w:w="120"/>
+            </w:tcMar>
+          </w:tcPr>
+          <w:p>
+            <w:r>
+              <w:rPr>
+                <w:rFonts w:ascii="Arial" w:cs="Arial" w:eastAsia="Arial" w:hAnsi="Arial"/>
+                <w:b/>
+                <w:bCs/>
+                <w:color w:val="2B2B2B"/>
+                <w:sz w:val="21"/>
+                <w:szCs w:val="21"/>
+              </w:rPr>
+              <w:t xml:space="preserve">Designated overnight areas</w:t>
+            </w:r>
+          </w:p>
+        </w:tc>
+        <w:tc>
+          <w:tcPr>
+            <w:tcW w:type="pct" w:w="40%"/>
+            <w:tcBorders>
+              <w:top w:val="single" w:color="D9D9D9" w:sz="4"/>
+              <w:left w:val="single" w:color="D9D9D9" w:sz="4"/>
+              <w:bottom w:val="single" w:color="D9D9D9" w:sz="4"/>
+              <w:right w:val="single" w:color="D9D9D9" w:sz="4"/>
+            </w:tcBorders>
+            <w:tcMar>
+              <w:top w:type="dxa" w:w="80"/>
+              <w:left w:type="dxa" w:w="120"/>
+              <w:bottom w:type="dxa" w:w="80"/>
+              <w:right w:type="dxa" w:w="120"/>
+            </w:tcMar>
+          </w:tcPr>
+          <w:p>
+            <w:r>
+              <w:rPr>
+                <w:rFonts w:ascii="Consolas" w:cs="Consolas" w:eastAsia="Consolas" w:hAnsi="Consolas"/>
+                <w:color w:val="2B2B2B"/>
+                <w:sz w:val="19"/>
+                <w:szCs w:val="19"/>
+              </w:rPr>
+              <w:t xml:space="preserve">LaGrange_Overnight_Resident_Subzones</w:t>
+            </w:r>
+          </w:p>
+        </w:tc>
+        <w:tc>
+          <w:tcPr>
+            <w:tcW w:type="pct" w:w="40%"/>
+            <w:tcBorders>
+              <w:top w:val="single" w:color="D9D9D9" w:sz="4"/>
+              <w:left w:val="single" w:color="D9D9D9" w:sz="4"/>
+              <w:bottom w:val="single" w:color="D9D9D9" w:sz="4"/>
+              <w:right w:val="single" w:color="D9D9D9" w:sz="4"/>
+            </w:tcBorders>
+            <w:tcMar>
+              <w:top w:type="dxa" w:w="80"/>
+              <w:left w:type="dxa" w:w="120"/>
+              <w:bottom w:type="dxa" w:w="80"/>
+              <w:right w:type="dxa" w:w="120"/>
+            </w:tcMar>
+          </w:tcPr>
+          <w:p>
+            <w:r>
+              <w:rPr>
+                <w:rFonts w:ascii="Arial" w:cs="Arial" w:eastAsia="Arial" w:hAnsi="Arial"/>
+                <w:color w:val="2B2B2B"/>
+                <w:sz w:val="20"/>
+                <w:szCs w:val="20"/>
+              </w:rPr>
+              <w:t xml:space="preserve">8 polygons over Lots 2, 5, 11, 12, 13 — digitized from Heuer and Associates engineering drawings dated 12/30/2016. Deliberately its own service.</w:t>
+            </w:r>
+          </w:p>
+        </w:tc>
+      </w:tr>
+      <w:tr>
+        <w:tc>
+          <w:tcPr>
+            <w:tcW w:type="pct" w:w="20%"/>
+            <w:tcBorders>
+              <w:top w:val="single" w:color="D9D9D9" w:sz="4"/>
+              <w:left w:val="single" w:color="D9D9D9" w:sz="4"/>
+              <w:bottom w:val="single" w:color="D9D9D9" w:sz="4"/>
+              <w:right w:val="single" w:color="D9D9D9" w:sz="4"/>
+            </w:tcBorders>
+            <w:shd w:fill="F2F7FB" w:val="clear"/>
+            <w:tcMar>
+              <w:top w:type="dxa" w:w="80"/>
+              <w:left w:type="dxa" w:w="120"/>
+              <w:bottom w:type="dxa" w:w="80"/>
+              <w:right w:type="dxa" w:w="120"/>
+            </w:tcMar>
+          </w:tcPr>
+          <w:p>
+            <w:r>
+              <w:rPr>
+                <w:rFonts w:ascii="Arial" w:cs="Arial" w:eastAsia="Arial" w:hAnsi="Arial"/>
+                <w:b/>
+                <w:bCs/>
+                <w:color w:val="2B2B2B"/>
+                <w:sz w:val="21"/>
+                <w:szCs w:val="21"/>
+              </w:rPr>
+              <w:t xml:space="preserve">Context layer</w:t>
+            </w:r>
+          </w:p>
+        </w:tc>
+        <w:tc>
+          <w:tcPr>
+            <w:tcW w:type="pct" w:w="40%"/>
+            <w:tcBorders>
+              <w:top w:val="single" w:color="D9D9D9" w:sz="4"/>
+              <w:left w:val="single" w:color="D9D9D9" w:sz="4"/>
+              <w:bottom w:val="single" w:color="D9D9D9" w:sz="4"/>
+              <w:right w:val="single" w:color="D9D9D9" w:sz="4"/>
+            </w:tcBorders>
+            <w:shd w:fill="F2F7FB" w:val="clear"/>
+            <w:tcMar>
+              <w:top w:type="dxa" w:w="80"/>
+              <w:left w:type="dxa" w:w="120"/>
+              <w:bottom w:type="dxa" w:w="80"/>
+              <w:right w:type="dxa" w:w="120"/>
+            </w:tcMar>
+          </w:tcPr>
+          <w:p>
+            <w:r>
+              <w:rPr>
+                <w:rFonts w:ascii="Consolas" w:cs="Consolas" w:eastAsia="Consolas" w:hAnsi="Consolas"/>
+                <w:color w:val="2B2B2B"/>
+                <w:sz w:val="19"/>
+                <w:szCs w:val="19"/>
+              </w:rPr>
+              <w:t xml:space="preserve">LaGrangeImportantPlaces_ParkingContext_</w:t>
+            </w:r>
+          </w:p>
+        </w:tc>
+        <w:tc>
+          <w:tcPr>
+            <w:tcW w:type="pct" w:w="40%"/>
+            <w:tcBorders>
+              <w:top w:val="single" w:color="D9D9D9" w:sz="4"/>
+              <w:left w:val="single" w:color="D9D9D9" w:sz="4"/>
+              <w:bottom w:val="single" w:color="D9D9D9" w:sz="4"/>
+              <w:right w:val="single" w:color="D9D9D9" w:sz="4"/>
+            </w:tcBorders>
+            <w:shd w:fill="F2F7FB" w:val="clear"/>
+            <w:tcMar>
+              <w:top w:type="dxa" w:w="80"/>
+              <w:left w:type="dxa" w:w="120"/>
+              <w:bottom w:type="dxa" w:w="80"/>
+              <w:right w:type="dxa" w:w="120"/>
+            </w:tcMar>
+          </w:tcPr>
+          <w:p>
+            <w:r>
+              <w:rPr>
+                <w:rFonts w:ascii="Arial" w:cs="Arial" w:eastAsia="Arial" w:hAnsi="Arial"/>
+                <w:color w:val="2B2B2B"/>
+                <w:sz w:val="20"/>
+                <w:szCs w:val="20"/>
+              </w:rPr>
+              <w:t xml:space="preserve">23 civic, park, landmark and Metra features curated from GISC_PUBLISH_FGDB.gdb\Base\ImportantPlace_POLY. Map context only.</w:t>
+            </w:r>
+          </w:p>
+        </w:tc>
+      </w:tr>
+      <w:tr>
+        <w:tc>
+          <w:tcPr>
+            <w:tcW w:type="pct" w:w="20%"/>
+            <w:tcBorders>
+              <w:top w:val="single" w:color="D9D9D9" w:sz="4"/>
+              <w:left w:val="single" w:color="D9D9D9" w:sz="4"/>
+              <w:bottom w:val="single" w:color="D9D9D9" w:sz="4"/>
+              <w:right w:val="single" w:color="D9D9D9" w:sz="4"/>
+            </w:tcBorders>
+            <w:tcMar>
+              <w:top w:type="dxa" w:w="80"/>
+              <w:left w:type="dxa" w:w="120"/>
+              <w:bottom w:type="dxa" w:w="80"/>
+              <w:right w:type="dxa" w:w="120"/>
+            </w:tcMar>
+          </w:tcPr>
+          <w:p>
+            <w:r>
+              <w:rPr>
+                <w:rFonts w:ascii="Arial" w:cs="Arial" w:eastAsia="Arial" w:hAnsi="Arial"/>
+                <w:b/>
+                <w:bCs/>
+                <w:color w:val="2B2B2B"/>
+                <w:sz w:val="21"/>
+                <w:szCs w:val="21"/>
+              </w:rPr>
+              <w:t xml:space="preserve">Eligibility addresses</w:t>
+            </w:r>
+          </w:p>
+        </w:tc>
+        <w:tc>
+          <w:tcPr>
+            <w:tcW w:type="pct" w:w="40%"/>
+            <w:tcBorders>
+              <w:top w:val="single" w:color="D9D9D9" w:sz="4"/>
+              <w:left w:val="single" w:color="D9D9D9" w:sz="4"/>
+              <w:bottom w:val="single" w:color="D9D9D9" w:sz="4"/>
+              <w:right w:val="single" w:color="D9D9D9" w:sz="4"/>
+            </w:tcBorders>
+            <w:tcMar>
+              <w:top w:type="dxa" w:w="80"/>
+              <w:left w:type="dxa" w:w="120"/>
+              <w:bottom w:type="dxa" w:w="80"/>
+              <w:right w:type="dxa" w:w="120"/>
+            </w:tcMar>
+          </w:tcPr>
+          <w:p>
+            <w:r>
+              <w:rPr>
+                <w:rFonts w:ascii="Consolas" w:cs="Consolas" w:eastAsia="Consolas" w:hAnsi="Consolas"/>
+                <w:color w:val="2B2B2B"/>
+                <w:sz w:val="19"/>
+                <w:szCs w:val="19"/>
+              </w:rPr>
+              <w:t xml:space="preserve">…\20240829_ParkingPermitMaps\Data\</w:t>
+            </w:r>
+          </w:p>
+        </w:tc>
+        <w:tc>
+          <w:tcPr>
+            <w:tcW w:type="pct" w:w="40%"/>
+            <w:tcBorders>
+              <w:top w:val="single" w:color="D9D9D9" w:sz="4"/>
+              <w:left w:val="single" w:color="D9D9D9" w:sz="4"/>
+              <w:bottom w:val="single" w:color="D9D9D9" w:sz="4"/>
+              <w:right w:val="single" w:color="D9D9D9" w:sz="4"/>
+            </w:tcBorders>
+            <w:tcMar>
+              <w:top w:type="dxa" w:w="80"/>
+              <w:left w:type="dxa" w:w="120"/>
+              <w:bottom w:type="dxa" w:w="80"/>
+              <w:right w:type="dxa" w:w="120"/>
+            </w:tcMar>
+          </w:tcPr>
+          <w:p>
+            <w:r>
+              <w:rPr>
+                <w:rFonts w:ascii="Arial" w:cs="Arial" w:eastAsia="Arial" w:hAnsi="Arial"/>
+                <w:color w:val="2B2B2B"/>
+                <w:sz w:val="20"/>
+                <w:szCs w:val="20"/>
+              </w:rPr>
+              <w:t xml:space="preserve">Passport v2 permit-holder list ("Residential parking - address list for geocode.xlsx") + geocode outputs. Geocoded against X:\GISC\Publish\Geocoder, Esri World geocoder as fallback.</w:t>
+            </w:r>
+          </w:p>
+        </w:tc>
+      </w:tr>
+      <w:tr>
+        <w:tc>
+          <w:tcPr>
+            <w:tcW w:type="pct" w:w="20%"/>
+            <w:tcBorders>
+              <w:top w:val="single" w:color="D9D9D9" w:sz="4"/>
+              <w:left w:val="single" w:color="D9D9D9" w:sz="4"/>
+              <w:bottom w:val="single" w:color="D9D9D9" w:sz="4"/>
+              <w:right w:val="single" w:color="D9D9D9" w:sz="4"/>
+            </w:tcBorders>
+            <w:shd w:fill="F2F7FB" w:val="clear"/>
+            <w:tcMar>
+              <w:top w:type="dxa" w:w="80"/>
+              <w:left w:type="dxa" w:w="120"/>
+              <w:bottom w:type="dxa" w:w="80"/>
+              <w:right w:type="dxa" w:w="120"/>
+            </w:tcMar>
+          </w:tcPr>
+          <w:p>
+            <w:r>
+              <w:rPr>
+                <w:rFonts w:ascii="Arial" w:cs="Arial" w:eastAsia="Arial" w:hAnsi="Arial"/>
+                <w:b/>
+                <w:bCs/>
+                <w:color w:val="2B2B2B"/>
+                <w:sz w:val="21"/>
+                <w:szCs w:val="21"/>
+              </w:rPr>
+              <w:t xml:space="preserve">Village policy documents</w:t>
+            </w:r>
+          </w:p>
+        </w:tc>
+        <w:tc>
+          <w:tcPr>
+            <w:tcW w:type="pct" w:w="40%"/>
+            <w:tcBorders>
+              <w:top w:val="single" w:color="D9D9D9" w:sz="4"/>
+              <w:left w:val="single" w:color="D9D9D9" w:sz="4"/>
+              <w:bottom w:val="single" w:color="D9D9D9" w:sz="4"/>
+              <w:right w:val="single" w:color="D9D9D9" w:sz="4"/>
+            </w:tcBorders>
+            <w:shd w:fill="F2F7FB" w:val="clear"/>
+            <w:tcMar>
+              <w:top w:type="dxa" w:w="80"/>
+              <w:left w:type="dxa" w:w="120"/>
+              <w:bottom w:type="dxa" w:w="80"/>
+              <w:right w:type="dxa" w:w="120"/>
+            </w:tcMar>
+          </w:tcPr>
+          <w:p>
+            <w:r>
+              <w:rPr>
+                <w:rFonts w:ascii="Consolas" w:cs="Consolas" w:eastAsia="Consolas" w:hAnsi="Consolas"/>
+                <w:color w:val="2B2B2B"/>
+                <w:sz w:val="19"/>
+                <w:szCs w:val="19"/>
+              </w:rPr>
+              <w:t xml:space="preserve">…\Village Policies and Documentation\</w:t>
+            </w:r>
+          </w:p>
+        </w:tc>
+        <w:tc>
+          <w:tcPr>
+            <w:tcW w:type="pct" w:w="40%"/>
+            <w:tcBorders>
+              <w:top w:val="single" w:color="D9D9D9" w:sz="4"/>
+              <w:left w:val="single" w:color="D9D9D9" w:sz="4"/>
+              <w:bottom w:val="single" w:color="D9D9D9" w:sz="4"/>
+              <w:right w:val="single" w:color="D9D9D9" w:sz="4"/>
+            </w:tcBorders>
+            <w:shd w:fill="F2F7FB" w:val="clear"/>
+            <w:tcMar>
+              <w:top w:type="dxa" w:w="80"/>
+              <w:left w:type="dxa" w:w="120"/>
+              <w:bottom w:type="dxa" w:w="80"/>
+              <w:right w:type="dxa" w:w="120"/>
+            </w:tcMar>
+          </w:tcPr>
+          <w:p>
+            <w:r>
+              <w:rPr>
+                <w:rFonts w:ascii="Arial" w:cs="Arial" w:eastAsia="Arial" w:hAnsi="Arial"/>
+                <w:color w:val="2B2B2B"/>
+                <w:sz w:val="20"/>
+                <w:szCs w:val="20"/>
+              </w:rPr>
+              <w:t xml:space="preserve">Permit policy PDFs — supply the rule text absent from the GIS data. Finished exhibits in the adjacent Deliverables folder.</w:t>
+            </w:r>
+          </w:p>
+        </w:tc>
+      </w:tr>
+    </w:tbl>
+    <w:p>
+      <w:r>
+        <w:br w:type="page"/>
+      </w:r>
+    </w:p>
+    <w:p>
+      <w:pPr>
+        <w:pStyle w:val="Heading2"/>
+        <w:spacing w:after="100" w:before="280"/>
+      </w:pPr>
+      <w:r>
+        <w:rPr>
+          <w:rFonts w:ascii="Arial" w:cs="Arial" w:eastAsia="Arial" w:hAnsi="Arial"/>
+          <w:b/>
+          <w:bCs/>
+          <w:color w:val="0E7C66"/>
+          <w:sz w:val="23"/>
+          <w:szCs w:val="23"/>
+        </w:rPr>
+        <w:t xml:space="preserve">8.4 — Other resources</w:t>
+      </w:r>
+    </w:p>
+    <w:tbl>
+      <w:tblPr>
+        <w:tblW w:type="pct" w:w="100%"/>
+        <w:tblBorders>
+          <w:top w:val="single" w:color="auto" w:sz="4"/>
+          <w:left w:val="single" w:color="auto" w:sz="4"/>
+          <w:bottom w:val="single" w:color="auto" w:sz="4"/>
+          <w:right w:val="single" w:color="auto" w:sz="4"/>
+          <w:insideH w:val="single" w:color="auto" w:sz="4"/>
+          <w:insideV w:val="single" w:color="auto" w:sz="4"/>
+        </w:tblBorders>
+      </w:tblPr>
+      <w:tblGrid>
+        <w:gridCol w:w="100"/>
+        <w:gridCol w:w="100"/>
+      </w:tblGrid>
+      <w:tr>
         <w:tc>
           <w:tcPr>
             <w:tcW w:type="pct" w:w="24%"/>
@@ -9061,78 +10393,435 @@
               <w:bottom w:val="single" w:color="D9D9D9" w:sz="4"/>
               <w:right w:val="single" w:color="D9D9D9" w:sz="4"/>
             </w:tcBorders>
-            <w:tcMar>
-              <w:top w:type="dxa" w:w="80"/>
-              <w:left w:type="dxa" w:w="120"/>
-              <w:bottom w:type="dxa" w:w="80"/>
-              <w:right w:type="dxa" w:w="120"/>
-            </w:tcMar>
-          </w:tcPr>
-          <w:p>
-            <w:r>
-              <w:rPr>
-                <w:rFonts w:ascii="Arial" w:cs="Arial" w:eastAsia="Arial" w:hAnsi="Arial"/>
-                <w:color w:val="2B2B2B"/>
-                <w:sz w:val="20"/>
-                <w:szCs w:val="20"/>
-              </w:rPr>
-              <w:t xml:space="preserve"> </w:t>
-            </w:r>
-          </w:p>
-        </w:tc>
-        <w:tc>
-          <w:tcPr>
-            <w:tcW w:type="pct" w:w="22%"/>
-            <w:tcBorders>
-              <w:top w:val="single" w:color="D9D9D9" w:sz="4"/>
-              <w:left w:val="single" w:color="D9D9D9" w:sz="4"/>
-              <w:bottom w:val="single" w:color="D9D9D9" w:sz="4"/>
-              <w:right w:val="single" w:color="D9D9D9" w:sz="4"/>
-            </w:tcBorders>
-            <w:tcMar>
-              <w:top w:type="dxa" w:w="80"/>
-              <w:left w:type="dxa" w:w="120"/>
-              <w:bottom w:type="dxa" w:w="80"/>
-              <w:right w:type="dxa" w:w="120"/>
-            </w:tcMar>
-          </w:tcPr>
-          <w:p>
-            <w:r>
-              <w:rPr>
-                <w:rFonts w:ascii="Arial" w:cs="Arial" w:eastAsia="Arial" w:hAnsi="Arial"/>
-                <w:color w:val="2B2B2B"/>
-                <w:sz w:val="20"/>
-                <w:szCs w:val="20"/>
-              </w:rPr>
-              <w:t xml:space="preserve"> </w:t>
-            </w:r>
-          </w:p>
-        </w:tc>
-        <w:tc>
-          <w:tcPr>
-            <w:tcW w:type="pct" w:w="12%"/>
-            <w:tcBorders>
-              <w:top w:val="single" w:color="D9D9D9" w:sz="4"/>
-              <w:left w:val="single" w:color="D9D9D9" w:sz="4"/>
-              <w:bottom w:val="single" w:color="D9D9D9" w:sz="4"/>
-              <w:right w:val="single" w:color="D9D9D9" w:sz="4"/>
-            </w:tcBorders>
-            <w:tcMar>
-              <w:top w:type="dxa" w:w="80"/>
-              <w:left w:type="dxa" w:w="120"/>
-              <w:bottom w:type="dxa" w:w="80"/>
-              <w:right w:type="dxa" w:w="120"/>
-            </w:tcMar>
-          </w:tcPr>
-          <w:p>
-            <w:r>
-              <w:rPr>
-                <w:rFonts w:ascii="Arial" w:cs="Arial" w:eastAsia="Arial" w:hAnsi="Arial"/>
-                <w:color w:val="2B2B2B"/>
-                <w:sz w:val="20"/>
-                <w:szCs w:val="20"/>
-              </w:rPr>
-              <w:t xml:space="preserve"> </w:t>
+            <w:shd w:fill="0E7C66" w:val="clear"/>
+            <w:tcMar>
+              <w:top w:type="dxa" w:w="80"/>
+              <w:left w:type="dxa" w:w="120"/>
+              <w:bottom w:type="dxa" w:w="80"/>
+              <w:right w:type="dxa" w:w="120"/>
+            </w:tcMar>
+          </w:tcPr>
+          <w:p>
+            <w:r>
+              <w:rPr>
+                <w:rFonts w:ascii="Arial" w:cs="Arial" w:eastAsia="Arial" w:hAnsi="Arial"/>
+                <w:b/>
+                <w:bCs/>
+                <w:color w:val="FFFFFF"/>
+                <w:sz w:val="20"/>
+                <w:szCs w:val="20"/>
+              </w:rPr>
+              <w:t xml:space="preserve">Resource</w:t>
+            </w:r>
+          </w:p>
+        </w:tc>
+        <w:tc>
+          <w:tcPr>
+            <w:tcW w:type="pct" w:w="76%"/>
+            <w:tcBorders>
+              <w:top w:val="single" w:color="D9D9D9" w:sz="4"/>
+              <w:left w:val="single" w:color="D9D9D9" w:sz="4"/>
+              <w:bottom w:val="single" w:color="D9D9D9" w:sz="4"/>
+              <w:right w:val="single" w:color="D9D9D9" w:sz="4"/>
+            </w:tcBorders>
+            <w:shd w:fill="0E7C66" w:val="clear"/>
+            <w:tcMar>
+              <w:top w:type="dxa" w:w="80"/>
+              <w:left w:type="dxa" w:w="120"/>
+              <w:bottom w:type="dxa" w:w="80"/>
+              <w:right w:type="dxa" w:w="120"/>
+            </w:tcMar>
+          </w:tcPr>
+          <w:p>
+            <w:r>
+              <w:rPr>
+                <w:rFonts w:ascii="Arial" w:cs="Arial" w:eastAsia="Arial" w:hAnsi="Arial"/>
+                <w:b/>
+                <w:bCs/>
+                <w:color w:val="FFFFFF"/>
+                <w:sz w:val="20"/>
+                <w:szCs w:val="20"/>
+              </w:rPr>
+              <w:t xml:space="preserve">Location / detail</w:t>
+            </w:r>
+          </w:p>
+        </w:tc>
+      </w:tr>
+      <w:tr>
+        <w:tc>
+          <w:tcPr>
+            <w:tcW w:type="pct" w:w="24%"/>
+            <w:tcBorders>
+              <w:top w:val="single" w:color="D9D9D9" w:sz="4"/>
+              <w:left w:val="single" w:color="D9D9D9" w:sz="4"/>
+              <w:bottom w:val="single" w:color="D9D9D9" w:sz="4"/>
+              <w:right w:val="single" w:color="D9D9D9" w:sz="4"/>
+            </w:tcBorders>
+            <w:tcMar>
+              <w:top w:type="dxa" w:w="80"/>
+              <w:left w:type="dxa" w:w="120"/>
+              <w:bottom w:type="dxa" w:w="80"/>
+              <w:right w:type="dxa" w:w="120"/>
+            </w:tcMar>
+          </w:tcPr>
+          <w:p>
+            <w:r>
+              <w:rPr>
+                <w:rFonts w:ascii="Arial" w:cs="Arial" w:eastAsia="Arial" w:hAnsi="Arial"/>
+                <w:b/>
+                <w:bCs/>
+                <w:color w:val="2B2B2B"/>
+                <w:sz w:val="21"/>
+                <w:szCs w:val="21"/>
+              </w:rPr>
+              <w:t xml:space="preserve">Application repository</w:t>
+            </w:r>
+          </w:p>
+        </w:tc>
+        <w:tc>
+          <w:tcPr>
+            <w:tcW w:type="pct" w:w="76%"/>
+            <w:tcBorders>
+              <w:top w:val="single" w:color="D9D9D9" w:sz="4"/>
+              <w:left w:val="single" w:color="D9D9D9" w:sz="4"/>
+              <w:bottom w:val="single" w:color="D9D9D9" w:sz="4"/>
+              <w:right w:val="single" w:color="D9D9D9" w:sz="4"/>
+            </w:tcBorders>
+            <w:tcMar>
+              <w:top w:type="dxa" w:w="80"/>
+              <w:left w:type="dxa" w:w="120"/>
+              <w:bottom w:type="dxa" w:w="80"/>
+              <w:right w:type="dxa" w:w="120"/>
+            </w:tcMar>
+          </w:tcPr>
+          <w:p>
+            <w:hyperlink w:history="1" r:id="rIdvxnoy9rf31kkcof6p3upz">
+              <w:r>
+                <w:rPr>
+                  <w:rFonts w:ascii="Arial" w:cs="Arial" w:eastAsia="Arial" w:hAnsi="Arial"/>
+                  <w:color w:val="2E74B5"/>
+                  <w:sz w:val="20"/>
+                  <w:szCs w:val="20"/>
+                  <w:u w:val="single"/>
+                </w:rPr>
+                <w:t xml:space="preserve">github.com/mgp-inc/lagrange-parking</w:t>
+              </w:r>
+            </w:hyperlink>
+            <w:r>
+              <w:rPr>
+                <w:rFonts w:ascii="Arial" w:cs="Arial" w:eastAsia="Arial" w:hAnsi="Arial"/>
+                <w:color w:val="2B2B2B"/>
+                <w:sz w:val="21"/>
+                <w:szCs w:val="21"/>
+              </w:rPr>
+              <w:t xml:space="preserve"> — self-contained and portable; docs/ carries app-side context, data notes, backlog. Working copy: </w:t>
+            </w:r>
+            <w:r>
+              <w:rPr>
+                <w:rFonts w:ascii="Consolas" w:cs="Consolas" w:eastAsia="Consolas" w:hAnsi="Consolas"/>
+                <w:color w:val="2B2B2B"/>
+                <w:sz w:val="19"/>
+                <w:szCs w:val="19"/>
+              </w:rPr>
+              <w:t xml:space="preserve">E:\lagrange-parking</w:t>
+            </w:r>
+          </w:p>
+        </w:tc>
+      </w:tr>
+      <w:tr>
+        <w:tc>
+          <w:tcPr>
+            <w:tcW w:type="pct" w:w="24%"/>
+            <w:tcBorders>
+              <w:top w:val="single" w:color="D9D9D9" w:sz="4"/>
+              <w:left w:val="single" w:color="D9D9D9" w:sz="4"/>
+              <w:bottom w:val="single" w:color="D9D9D9" w:sz="4"/>
+              <w:right w:val="single" w:color="D9D9D9" w:sz="4"/>
+            </w:tcBorders>
+            <w:shd w:fill="F2F7FB" w:val="clear"/>
+            <w:tcMar>
+              <w:top w:type="dxa" w:w="80"/>
+              <w:left w:type="dxa" w:w="120"/>
+              <w:bottom w:type="dxa" w:w="80"/>
+              <w:right w:type="dxa" w:w="120"/>
+            </w:tcMar>
+          </w:tcPr>
+          <w:p>
+            <w:r>
+              <w:rPr>
+                <w:rFonts w:ascii="Arial" w:cs="Arial" w:eastAsia="Arial" w:hAnsi="Arial"/>
+                <w:b/>
+                <w:bCs/>
+                <w:color w:val="2B2B2B"/>
+                <w:sz w:val="21"/>
+                <w:szCs w:val="21"/>
+              </w:rPr>
+              <w:t xml:space="preserve">Running project log</w:t>
+            </w:r>
+          </w:p>
+        </w:tc>
+        <w:tc>
+          <w:tcPr>
+            <w:tcW w:type="pct" w:w="76%"/>
+            <w:tcBorders>
+              <w:top w:val="single" w:color="D9D9D9" w:sz="4"/>
+              <w:left w:val="single" w:color="D9D9D9" w:sz="4"/>
+              <w:bottom w:val="single" w:color="D9D9D9" w:sz="4"/>
+              <w:right w:val="single" w:color="D9D9D9" w:sz="4"/>
+            </w:tcBorders>
+            <w:shd w:fill="F2F7FB" w:val="clear"/>
+            <w:tcMar>
+              <w:top w:type="dxa" w:w="80"/>
+              <w:left w:type="dxa" w:w="120"/>
+              <w:bottom w:type="dxa" w:w="80"/>
+              <w:right w:type="dxa" w:w="120"/>
+            </w:tcMar>
+          </w:tcPr>
+          <w:p>
+            <w:r>
+              <w:rPr>
+                <w:rFonts w:ascii="Consolas" w:cs="Consolas" w:eastAsia="Consolas" w:hAnsi="Consolas"/>
+                <w:color w:val="2B2B2B"/>
+                <w:sz w:val="19"/>
+                <w:szCs w:val="19"/>
+              </w:rPr>
+              <w:t xml:space="preserve">X:\GISC\Community\LaGrange\Project\20240829_ParkingPermitMaps\PROJECTDOCUMENTATION.md</w:t>
+            </w:r>
+            <w:r>
+              <w:rPr>
+                <w:rFonts w:ascii="Arial" w:cs="Arial" w:eastAsia="Arial" w:hAnsi="Arial"/>
+                <w:color w:val="2B2B2B"/>
+                <w:sz w:val="21"/>
+                <w:szCs w:val="21"/>
+              </w:rPr>
+              <w:t xml:space="preserve"> — full decision and progress history for the GIS side</w:t>
+            </w:r>
+          </w:p>
+        </w:tc>
+      </w:tr>
+      <w:tr>
+        <w:tc>
+          <w:tcPr>
+            <w:tcW w:type="pct" w:w="24%"/>
+            <w:tcBorders>
+              <w:top w:val="single" w:color="D9D9D9" w:sz="4"/>
+              <w:left w:val="single" w:color="D9D9D9" w:sz="4"/>
+              <w:bottom w:val="single" w:color="D9D9D9" w:sz="4"/>
+              <w:right w:val="single" w:color="D9D9D9" w:sz="4"/>
+            </w:tcBorders>
+            <w:tcMar>
+              <w:top w:type="dxa" w:w="80"/>
+              <w:left w:type="dxa" w:w="120"/>
+              <w:bottom w:type="dxa" w:w="80"/>
+              <w:right w:type="dxa" w:w="120"/>
+            </w:tcMar>
+          </w:tcPr>
+          <w:p>
+            <w:r>
+              <w:rPr>
+                <w:rFonts w:ascii="Arial" w:cs="Arial" w:eastAsia="Arial" w:hAnsi="Arial"/>
+                <w:b/>
+                <w:bCs/>
+                <w:color w:val="2B2B2B"/>
+                <w:sz w:val="21"/>
+                <w:szCs w:val="21"/>
+              </w:rPr>
+              <w:t xml:space="preserve">Hosting</w:t>
+            </w:r>
+          </w:p>
+        </w:tc>
+        <w:tc>
+          <w:tcPr>
+            <w:tcW w:type="pct" w:w="76%"/>
+            <w:tcBorders>
+              <w:top w:val="single" w:color="D9D9D9" w:sz="4"/>
+              <w:left w:val="single" w:color="D9D9D9" w:sz="4"/>
+              <w:bottom w:val="single" w:color="D9D9D9" w:sz="4"/>
+              <w:right w:val="single" w:color="D9D9D9" w:sz="4"/>
+            </w:tcBorders>
+            <w:tcMar>
+              <w:top w:type="dxa" w:w="80"/>
+              <w:left w:type="dxa" w:w="120"/>
+              <w:bottom w:type="dxa" w:w="80"/>
+              <w:right w:type="dxa" w:w="120"/>
+            </w:tcMar>
+          </w:tcPr>
+          <w:p>
+            <w:r>
+              <w:rPr>
+                <w:rFonts w:ascii="Arial" w:cs="Arial" w:eastAsia="Arial" w:hAnsi="Arial"/>
+                <w:color w:val="2B2B2B"/>
+                <w:sz w:val="21"/>
+                <w:szCs w:val="21"/>
+              </w:rPr>
+              <w:t xml:space="preserve">Azure tenant </w:t>
+            </w:r>
+            <w:r>
+              <w:rPr>
+                <w:rFonts w:ascii="Consolas" w:cs="Consolas" w:eastAsia="Consolas" w:hAnsi="Consolas"/>
+                <w:color w:val="2B2B2B"/>
+                <w:sz w:val="19"/>
+                <w:szCs w:val="19"/>
+              </w:rPr>
+              <w:t xml:space="preserve">Community-Essentials.com</w:t>
+            </w:r>
+            <w:r>
+              <w:rPr>
+                <w:rFonts w:ascii="Arial" w:cs="Arial" w:eastAsia="Arial" w:hAnsi="Arial"/>
+                <w:color w:val="2B2B2B"/>
+                <w:sz w:val="21"/>
+                <w:szCs w:val="21"/>
+              </w:rPr>
+              <w:t xml:space="preserve"> · resource group </w:t>
+            </w:r>
+            <w:r>
+              <w:rPr>
+                <w:rFonts w:ascii="Consolas" w:cs="Consolas" w:eastAsia="Consolas" w:hAnsi="Consolas"/>
+                <w:color w:val="2B2B2B"/>
+                <w:sz w:val="19"/>
+                <w:szCs w:val="19"/>
+              </w:rPr>
+              <w:t xml:space="preserve">rg-lagrange-parking</w:t>
+            </w:r>
+            <w:r>
+              <w:rPr>
+                <w:rFonts w:ascii="Arial" w:cs="Arial" w:eastAsia="Arial" w:hAnsi="Arial"/>
+                <w:color w:val="2B2B2B"/>
+                <w:sz w:val="21"/>
+                <w:szCs w:val="21"/>
+              </w:rPr>
+              <w:t xml:space="preserve"> (centralus) · two Static Web Apps, Free plan · steps in </w:t>
+            </w:r>
+            <w:r>
+              <w:rPr>
+                <w:rFonts w:ascii="Consolas" w:cs="Consolas" w:eastAsia="Consolas" w:hAnsi="Consolas"/>
+                <w:color w:val="2B2B2B"/>
+                <w:sz w:val="19"/>
+                <w:szCs w:val="19"/>
+              </w:rPr>
+              <w:t xml:space="preserve">DEPLOY.md</w:t>
+            </w:r>
+          </w:p>
+        </w:tc>
+      </w:tr>
+      <w:tr>
+        <w:tc>
+          <w:tcPr>
+            <w:tcW w:type="pct" w:w="24%"/>
+            <w:tcBorders>
+              <w:top w:val="single" w:color="D9D9D9" w:sz="4"/>
+              <w:left w:val="single" w:color="D9D9D9" w:sz="4"/>
+              <w:bottom w:val="single" w:color="D9D9D9" w:sz="4"/>
+              <w:right w:val="single" w:color="D9D9D9" w:sz="4"/>
+            </w:tcBorders>
+            <w:shd w:fill="F2F7FB" w:val="clear"/>
+            <w:tcMar>
+              <w:top w:type="dxa" w:w="80"/>
+              <w:left w:type="dxa" w:w="120"/>
+              <w:bottom w:type="dxa" w:w="80"/>
+              <w:right w:type="dxa" w:w="120"/>
+            </w:tcMar>
+          </w:tcPr>
+          <w:p>
+            <w:r>
+              <w:rPr>
+                <w:rFonts w:ascii="Arial" w:cs="Arial" w:eastAsia="Arial" w:hAnsi="Arial"/>
+                <w:b/>
+                <w:bCs/>
+                <w:color w:val="2B2B2B"/>
+                <w:sz w:val="21"/>
+                <w:szCs w:val="21"/>
+              </w:rPr>
+              <w:t xml:space="preserve">Branding</w:t>
+            </w:r>
+          </w:p>
+        </w:tc>
+        <w:tc>
+          <w:tcPr>
+            <w:tcW w:type="pct" w:w="76%"/>
+            <w:tcBorders>
+              <w:top w:val="single" w:color="D9D9D9" w:sz="4"/>
+              <w:left w:val="single" w:color="D9D9D9" w:sz="4"/>
+              <w:bottom w:val="single" w:color="D9D9D9" w:sz="4"/>
+              <w:right w:val="single" w:color="D9D9D9" w:sz="4"/>
+            </w:tcBorders>
+            <w:shd w:fill="F2F7FB" w:val="clear"/>
+            <w:tcMar>
+              <w:top w:type="dxa" w:w="80"/>
+              <w:left w:type="dxa" w:w="120"/>
+              <w:bottom w:type="dxa" w:w="80"/>
+              <w:right w:type="dxa" w:w="120"/>
+            </w:tcMar>
+          </w:tcPr>
+          <w:p>
+            <w:r>
+              <w:rPr>
+                <w:rFonts w:ascii="Arial" w:cs="Arial" w:eastAsia="Arial" w:hAnsi="Arial"/>
+                <w:color w:val="2B2B2B"/>
+                <w:sz w:val="20"/>
+                <w:szCs w:val="20"/>
+              </w:rPr>
+              <w:t xml:space="preserve">Village of La Grange Brand Guidelines (0719) — Dark Blue #00306C · La Grange Blue #126BB5 · Green #43B749 · Nunito Sans + Oswald</w:t>
+            </w:r>
+          </w:p>
+        </w:tc>
+      </w:tr>
+      <w:tr>
+        <w:tc>
+          <w:tcPr>
+            <w:tcW w:type="pct" w:w="24%"/>
+            <w:tcBorders>
+              <w:top w:val="single" w:color="D9D9D9" w:sz="4"/>
+              <w:left w:val="single" w:color="D9D9D9" w:sz="4"/>
+              <w:bottom w:val="single" w:color="D9D9D9" w:sz="4"/>
+              <w:right w:val="single" w:color="D9D9D9" w:sz="4"/>
+            </w:tcBorders>
+            <w:tcMar>
+              <w:top w:type="dxa" w:w="80"/>
+              <w:left w:type="dxa" w:w="120"/>
+              <w:bottom w:type="dxa" w:w="80"/>
+              <w:right w:type="dxa" w:w="120"/>
+            </w:tcMar>
+          </w:tcPr>
+          <w:p>
+            <w:r>
+              <w:rPr>
+                <w:rFonts w:ascii="Arial" w:cs="Arial" w:eastAsia="Arial" w:hAnsi="Arial"/>
+                <w:b/>
+                <w:bCs/>
+                <w:color w:val="2B2B2B"/>
+                <w:sz w:val="21"/>
+                <w:szCs w:val="21"/>
+              </w:rPr>
+              <w:t xml:space="preserve">Basemap</w:t>
+            </w:r>
+          </w:p>
+        </w:tc>
+        <w:tc>
+          <w:tcPr>
+            <w:tcW w:type="pct" w:w="76%"/>
+            <w:tcBorders>
+              <w:top w:val="single" w:color="D9D9D9" w:sz="4"/>
+              <w:left w:val="single" w:color="D9D9D9" w:sz="4"/>
+              <w:bottom w:val="single" w:color="D9D9D9" w:sz="4"/>
+              <w:right w:val="single" w:color="D9D9D9" w:sz="4"/>
+            </w:tcBorders>
+            <w:tcMar>
+              <w:top w:type="dxa" w:w="80"/>
+              <w:left w:type="dxa" w:w="120"/>
+              <w:bottom w:type="dxa" w:w="80"/>
+              <w:right w:type="dxa" w:w="120"/>
+            </w:tcMar>
+          </w:tcPr>
+          <w:p>
+            <w:r>
+              <w:rPr>
+                <w:rFonts w:ascii="Arial" w:cs="Arial" w:eastAsia="Arial" w:hAnsi="Arial"/>
+                <w:color w:val="2B2B2B"/>
+                <w:sz w:val="20"/>
+                <w:szCs w:val="20"/>
+              </w:rPr>
+              <w:t xml:space="preserve">GISC Light Canvas — in both the apps and the ArcGIS Pro maps</w:t>
             </w:r>
           </w:p>
         </w:tc>
@@ -9157,8 +10846,552 @@
           <w:sz w:val="23"/>
           <w:szCs w:val="23"/>
         </w:rPr>
-        <w:t xml:space="preserve">8.2 — Source data &amp; pipeline notes</w:t>
+        <w:t xml:space="preserve">8.5 — Decisions that shaped the deliverable</w:t>
       </w:r>
+    </w:p>
+    <w:tbl>
+      <w:tblPr>
+        <w:tblW w:type="pct" w:w="100%"/>
+        <w:tblBorders>
+          <w:top w:val="single" w:color="auto" w:sz="4"/>
+          <w:left w:val="single" w:color="auto" w:sz="4"/>
+          <w:bottom w:val="single" w:color="auto" w:sz="4"/>
+          <w:right w:val="single" w:color="auto" w:sz="4"/>
+          <w:insideH w:val="single" w:color="auto" w:sz="4"/>
+          <w:insideV w:val="single" w:color="auto" w:sz="4"/>
+        </w:tblBorders>
+      </w:tblPr>
+      <w:tblGrid>
+        <w:gridCol w:w="100"/>
+        <w:gridCol w:w="100"/>
+      </w:tblGrid>
+      <w:tr>
+        <w:tc>
+          <w:tcPr>
+            <w:tcW w:type="pct" w:w="30%"/>
+            <w:tcBorders>
+              <w:top w:val="single" w:color="D9D9D9" w:sz="4"/>
+              <w:left w:val="single" w:color="D9D9D9" w:sz="4"/>
+              <w:bottom w:val="single" w:color="D9D9D9" w:sz="4"/>
+              <w:right w:val="single" w:color="D9D9D9" w:sz="4"/>
+            </w:tcBorders>
+            <w:shd w:fill="0E7C66" w:val="clear"/>
+            <w:tcMar>
+              <w:top w:type="dxa" w:w="80"/>
+              <w:left w:type="dxa" w:w="120"/>
+              <w:bottom w:type="dxa" w:w="80"/>
+              <w:right w:type="dxa" w:w="120"/>
+            </w:tcMar>
+          </w:tcPr>
+          <w:p>
+            <w:r>
+              <w:rPr>
+                <w:rFonts w:ascii="Arial" w:cs="Arial" w:eastAsia="Arial" w:hAnsi="Arial"/>
+                <w:b/>
+                <w:bCs/>
+                <w:color w:val="FFFFFF"/>
+                <w:sz w:val="20"/>
+                <w:szCs w:val="20"/>
+              </w:rPr>
+              <w:t xml:space="preserve">Decision</w:t>
+            </w:r>
+          </w:p>
+        </w:tc>
+        <w:tc>
+          <w:tcPr>
+            <w:tcW w:type="pct" w:w="70%"/>
+            <w:tcBorders>
+              <w:top w:val="single" w:color="D9D9D9" w:sz="4"/>
+              <w:left w:val="single" w:color="D9D9D9" w:sz="4"/>
+              <w:bottom w:val="single" w:color="D9D9D9" w:sz="4"/>
+              <w:right w:val="single" w:color="D9D9D9" w:sz="4"/>
+            </w:tcBorders>
+            <w:shd w:fill="0E7C66" w:val="clear"/>
+            <w:tcMar>
+              <w:top w:type="dxa" w:w="80"/>
+              <w:left w:type="dxa" w:w="120"/>
+              <w:bottom w:type="dxa" w:w="80"/>
+              <w:right w:type="dxa" w:w="120"/>
+            </w:tcMar>
+          </w:tcPr>
+          <w:p>
+            <w:r>
+              <w:rPr>
+                <w:rFonts w:ascii="Arial" w:cs="Arial" w:eastAsia="Arial" w:hAnsi="Arial"/>
+                <w:b/>
+                <w:bCs/>
+                <w:color w:val="FFFFFF"/>
+                <w:sz w:val="20"/>
+                <w:szCs w:val="20"/>
+              </w:rPr>
+              <w:t xml:space="preserve">Why it matters</w:t>
+            </w:r>
+          </w:p>
+        </w:tc>
+      </w:tr>
+      <w:tr>
+        <w:tc>
+          <w:tcPr>
+            <w:tcW w:type="pct" w:w="30%"/>
+            <w:tcBorders>
+              <w:top w:val="single" w:color="D9D9D9" w:sz="4"/>
+              <w:left w:val="single" w:color="D9D9D9" w:sz="4"/>
+              <w:bottom w:val="single" w:color="D9D9D9" w:sz="4"/>
+              <w:right w:val="single" w:color="D9D9D9" w:sz="4"/>
+            </w:tcBorders>
+            <w:tcMar>
+              <w:top w:type="dxa" w:w="80"/>
+              <w:left w:type="dxa" w:w="120"/>
+              <w:bottom w:type="dxa" w:w="80"/>
+              <w:right w:type="dxa" w:w="120"/>
+            </w:tcMar>
+          </w:tcPr>
+          <w:p>
+            <w:r>
+              <w:rPr>
+                <w:rFonts w:ascii="Arial" w:cs="Arial" w:eastAsia="Arial" w:hAnsi="Arial"/>
+                <w:b/>
+                <w:bCs/>
+                <w:color w:val="2B2B2B"/>
+                <w:sz w:val="21"/>
+                <w:szCs w:val="21"/>
+              </w:rPr>
+              <w:t xml:space="preserve">Two apps, not StoryMaps</w:t>
+            </w:r>
+          </w:p>
+        </w:tc>
+        <w:tc>
+          <w:tcPr>
+            <w:tcW w:type="pct" w:w="70%"/>
+            <w:tcBorders>
+              <w:top w:val="single" w:color="D9D9D9" w:sz="4"/>
+              <w:left w:val="single" w:color="D9D9D9" w:sz="4"/>
+              <w:bottom w:val="single" w:color="D9D9D9" w:sz="4"/>
+              <w:right w:val="single" w:color="D9D9D9" w:sz="4"/>
+            </w:tcBorders>
+            <w:tcMar>
+              <w:top w:type="dxa" w:w="80"/>
+              <w:left w:type="dxa" w:w="120"/>
+              <w:bottom w:type="dxa" w:w="80"/>
+              <w:right w:type="dxa" w:w="120"/>
+            </w:tcMar>
+          </w:tcPr>
+          <w:p>
+            <w:r>
+              <w:rPr>
+                <w:rFonts w:ascii="Arial" w:cs="Arial" w:eastAsia="Arial" w:hAnsi="Arial"/>
+                <w:color w:val="2B2B2B"/>
+                <w:sz w:val="20"/>
+                <w:szCs w:val="20"/>
+              </w:rPr>
+              <w:t xml:space="preserve">Charity ended the single all-in-one map on 2026-06-18. Two audience-targeted apps replaced it; the StoryMaps in the original scope were dropped. The June AGOL web maps still exist but are QA aids only.</w:t>
+            </w:r>
+          </w:p>
+        </w:tc>
+      </w:tr>
+      <w:tr>
+        <w:tc>
+          <w:tcPr>
+            <w:tcW w:type="pct" w:w="30%"/>
+            <w:tcBorders>
+              <w:top w:val="single" w:color="D9D9D9" w:sz="4"/>
+              <w:left w:val="single" w:color="D9D9D9" w:sz="4"/>
+              <w:bottom w:val="single" w:color="D9D9D9" w:sz="4"/>
+              <w:right w:val="single" w:color="D9D9D9" w:sz="4"/>
+            </w:tcBorders>
+            <w:shd w:fill="F2F7FB" w:val="clear"/>
+            <w:tcMar>
+              <w:top w:type="dxa" w:w="80"/>
+              <w:left w:type="dxa" w:w="120"/>
+              <w:bottom w:type="dxa" w:w="80"/>
+              <w:right w:type="dxa" w:w="120"/>
+            </w:tcMar>
+          </w:tcPr>
+          <w:p>
+            <w:r>
+              <w:rPr>
+                <w:rFonts w:ascii="Arial" w:cs="Arial" w:eastAsia="Arial" w:hAnsi="Arial"/>
+                <w:b/>
+                <w:bCs/>
+                <w:color w:val="2B2B2B"/>
+                <w:sz w:val="21"/>
+                <w:szCs w:val="21"/>
+              </w:rPr>
+              <w:t xml:space="preserve">The parking data was de-fragmented</w:t>
+            </w:r>
+          </w:p>
+        </w:tc>
+        <w:tc>
+          <w:tcPr>
+            <w:tcW w:type="pct" w:w="70%"/>
+            <w:tcBorders>
+              <w:top w:val="single" w:color="D9D9D9" w:sz="4"/>
+              <w:left w:val="single" w:color="D9D9D9" w:sz="4"/>
+              <w:bottom w:val="single" w:color="D9D9D9" w:sz="4"/>
+              <w:right w:val="single" w:color="D9D9D9" w:sz="4"/>
+            </w:tcBorders>
+            <w:shd w:fill="F2F7FB" w:val="clear"/>
+            <w:tcMar>
+              <w:top w:type="dxa" w:w="80"/>
+              <w:left w:type="dxa" w:w="120"/>
+              <w:bottom w:type="dxa" w:w="80"/>
+              <w:right w:type="dxa" w:w="120"/>
+            </w:tcMar>
+          </w:tcPr>
+          <w:p>
+            <w:r>
+              <w:rPr>
+                <w:rFonts w:ascii="Arial" w:cs="Arial" w:eastAsia="Arial" w:hAnsi="Arial"/>
+                <w:color w:val="2B2B2B"/>
+                <w:sz w:val="20"/>
+                <w:szCs w:val="20"/>
+              </w:rPr>
+              <w:t xml:space="preserve">One physical lot arrived as several overlapping polygons, one per restriction type. Dissolved into one area per lot with its rules in a related table — this is what makes the data answerable.</w:t>
+            </w:r>
+          </w:p>
+        </w:tc>
+      </w:tr>
+      <w:tr>
+        <w:tc>
+          <w:tcPr>
+            <w:tcW w:type="pct" w:w="30%"/>
+            <w:tcBorders>
+              <w:top w:val="single" w:color="D9D9D9" w:sz="4"/>
+              <w:left w:val="single" w:color="D9D9D9" w:sz="4"/>
+              <w:bottom w:val="single" w:color="D9D9D9" w:sz="4"/>
+              <w:right w:val="single" w:color="D9D9D9" w:sz="4"/>
+            </w:tcBorders>
+            <w:tcMar>
+              <w:top w:type="dxa" w:w="80"/>
+              <w:left w:type="dxa" w:w="120"/>
+              <w:bottom w:type="dxa" w:w="80"/>
+              <w:right w:type="dxa" w:w="120"/>
+            </w:tcMar>
+          </w:tcPr>
+          <w:p>
+            <w:r>
+              <w:rPr>
+                <w:rFonts w:ascii="Arial" w:cs="Arial" w:eastAsia="Arial" w:hAnsi="Arial"/>
+                <w:b/>
+                <w:bCs/>
+                <w:color w:val="2B2B2B"/>
+                <w:sz w:val="21"/>
+                <w:szCs w:val="21"/>
+              </w:rPr>
+              <w:t xml:space="preserve">Lot lists and content are the Village’s</w:t>
+            </w:r>
+          </w:p>
+        </w:tc>
+        <w:tc>
+          <w:tcPr>
+            <w:tcW w:type="pct" w:w="70%"/>
+            <w:tcBorders>
+              <w:top w:val="single" w:color="D9D9D9" w:sz="4"/>
+              <w:left w:val="single" w:color="D9D9D9" w:sz="4"/>
+              <w:bottom w:val="single" w:color="D9D9D9" w:sz="4"/>
+              <w:right w:val="single" w:color="D9D9D9" w:sz="4"/>
+            </w:tcBorders>
+            <w:tcMar>
+              <w:top w:type="dxa" w:w="80"/>
+              <w:left w:type="dxa" w:w="120"/>
+              <w:bottom w:type="dxa" w:w="80"/>
+              <w:right w:type="dxa" w:w="120"/>
+            </w:tcMar>
+          </w:tcPr>
+          <w:p>
+            <w:r>
+              <w:rPr>
+                <w:rFonts w:ascii="Arial" w:cs="Arial" w:eastAsia="Arial" w:hAnsi="Arial"/>
+                <w:color w:val="2B2B2B"/>
+                <w:sz w:val="20"/>
+                <w:szCs w:val="20"/>
+              </w:rPr>
+              <w:t xml:space="preserve">Lots on each permit page come from the Village’s verbatim list, not a data-derived guess. Rates exist in the data but are never displayed; "decal" appears in no public text.</w:t>
+            </w:r>
+          </w:p>
+        </w:tc>
+      </w:tr>
+      <w:tr>
+        <w:tc>
+          <w:tcPr>
+            <w:tcW w:type="pct" w:w="30%"/>
+            <w:tcBorders>
+              <w:top w:val="single" w:color="D9D9D9" w:sz="4"/>
+              <w:left w:val="single" w:color="D9D9D9" w:sz="4"/>
+              <w:bottom w:val="single" w:color="D9D9D9" w:sz="4"/>
+              <w:right w:val="single" w:color="D9D9D9" w:sz="4"/>
+            </w:tcBorders>
+            <w:shd w:fill="F2F7FB" w:val="clear"/>
+            <w:tcMar>
+              <w:top w:type="dxa" w:w="80"/>
+              <w:left w:type="dxa" w:w="120"/>
+              <w:bottom w:type="dxa" w:w="80"/>
+              <w:right w:type="dxa" w:w="120"/>
+            </w:tcMar>
+          </w:tcPr>
+          <w:p>
+            <w:r>
+              <w:rPr>
+                <w:rFonts w:ascii="Arial" w:cs="Arial" w:eastAsia="Arial" w:hAnsi="Arial"/>
+                <w:b/>
+                <w:bCs/>
+                <w:color w:val="2B2B2B"/>
+                <w:sz w:val="21"/>
+                <w:szCs w:val="21"/>
+              </w:rPr>
+              <w:t xml:space="preserve">Designated overnight areas are GIS features</w:t>
+            </w:r>
+          </w:p>
+        </w:tc>
+        <w:tc>
+          <w:tcPr>
+            <w:tcW w:type="pct" w:w="70%"/>
+            <w:tcBorders>
+              <w:top w:val="single" w:color="D9D9D9" w:sz="4"/>
+              <w:left w:val="single" w:color="D9D9D9" w:sz="4"/>
+              <w:bottom w:val="single" w:color="D9D9D9" w:sz="4"/>
+              <w:right w:val="single" w:color="D9D9D9" w:sz="4"/>
+            </w:tcBorders>
+            <w:shd w:fill="F2F7FB" w:val="clear"/>
+            <w:tcMar>
+              <w:top w:type="dxa" w:w="80"/>
+              <w:left w:type="dxa" w:w="120"/>
+              <w:bottom w:type="dxa" w:w="80"/>
+              <w:right w:type="dxa" w:w="120"/>
+            </w:tcMar>
+          </w:tcPr>
+          <w:p>
+            <w:r>
+              <w:rPr>
+                <w:rFonts w:ascii="Arial" w:cs="Arial" w:eastAsia="Arial" w:hAnsi="Arial"/>
+                <w:color w:val="2B2B2B"/>
+                <w:sz w:val="20"/>
+                <w:szCs w:val="20"/>
+              </w:rPr>
+              <w:t xml:space="preserve">Only the permitted areas inside each lot were drawn, not the prohibited remainder — so the apps must state the rule in words. Scanned drawings were rejected in favor of real map features.</w:t>
+            </w:r>
+          </w:p>
+        </w:tc>
+      </w:tr>
+    </w:tbl>
+    <w:p>
+      <w:pPr>
+        <w:spacing w:after="120"/>
+      </w:pPr>
+    </w:p>
+    <w:tbl>
+      <w:tblPr>
+        <w:tblW w:type="pct" w:w="100%"/>
+        <w:tblBorders>
+          <w:top w:val="single" w:color="auto" w:sz="4"/>
+          <w:left w:val="single" w:color="auto" w:sz="4"/>
+          <w:bottom w:val="single" w:color="auto" w:sz="4"/>
+          <w:right w:val="single" w:color="auto" w:sz="4"/>
+          <w:insideH w:val="single" w:color="auto" w:sz="4"/>
+          <w:insideV w:val="single" w:color="auto" w:sz="4"/>
+        </w:tblBorders>
+      </w:tblPr>
+      <w:tblGrid>
+        <w:gridCol w:w="100"/>
+      </w:tblGrid>
+      <w:tr>
+        <w:tc>
+          <w:tcPr>
+            <w:tcBorders>
+              <w:top w:val="single" w:color="C00000" w:sz="6"/>
+              <w:left w:val="single" w:color="C00000" w:sz="24"/>
+              <w:bottom w:val="single" w:color="C00000" w:sz="6"/>
+              <w:right w:val="single" w:color="C00000" w:sz="6"/>
+            </w:tcBorders>
+            <w:shd w:fill="FBE4E4" w:val="clear"/>
+            <w:tcMar>
+              <w:top w:type="dxa" w:w="140"/>
+              <w:left w:type="dxa" w:w="240"/>
+              <w:bottom w:type="dxa" w:w="140"/>
+              <w:right w:type="dxa" w:w="240"/>
+            </w:tcMar>
+          </w:tcPr>
+          <w:p>
+            <w:pPr>
+              <w:spacing w:after="80"/>
+            </w:pPr>
+            <w:r>
+              <w:rPr>
+                <w:rFonts w:ascii="Arial" w:cs="Arial" w:eastAsia="Arial" w:hAnsi="Arial"/>
+                <w:b/>
+                <w:bCs/>
+                <w:color w:val="C00000"/>
+                <w:sz w:val="21"/>
+                <w:szCs w:val="21"/>
+              </w:rPr>
+              <w:t xml:space="preserve">⛔  The one that will bite you</w:t>
+            </w:r>
+          </w:p>
+          <w:p>
+            <w:pPr>
+              <w:spacing w:after="120"/>
+            </w:pPr>
+            <w:r>
+              <w:rPr>
+                <w:rFonts w:ascii="Arial" w:cs="Arial" w:eastAsia="Arial" w:hAnsi="Arial"/>
+                <w:color w:val="2B2B2B"/>
+                <w:sz w:val="21"/>
+                <w:szCs w:val="21"/>
+              </w:rPr>
+              <w:t xml:space="preserve">Republishing </w:t>
+            </w:r>
+            <w:r>
+              <w:rPr>
+                <w:rFonts w:ascii="Consolas" w:cs="Consolas" w:eastAsia="Consolas" w:hAnsi="Consolas"/>
+                <w:color w:val="2B2B2B"/>
+                <w:sz w:val="19"/>
+                <w:szCs w:val="19"/>
+              </w:rPr>
+              <w:t xml:space="preserve">LaGrange_Parking_Permits</w:t>
+            </w:r>
+            <w:r>
+              <w:rPr>
+                <w:rFonts w:ascii="Arial" w:cs="Arial" w:eastAsia="Arial" w:hAnsi="Arial"/>
+                <w:color w:val="2B2B2B"/>
+                <w:sz w:val="21"/>
+                <w:szCs w:val="21"/>
+              </w:rPr>
+              <w:t xml:space="preserve"> resets its sharing to organization-only, and both public apps immediately fail with "Token Required." Re-share it publicly and re-test anonymous access after </w:t>
+            </w:r>
+            <w:r>
+              <w:rPr>
+                <w:rFonts w:ascii="Arial" w:cs="Arial" w:eastAsia="Arial" w:hAnsi="Arial"/>
+                <w:b/>
+                <w:bCs/>
+                <w:color w:val="2B2B2B"/>
+                <w:sz w:val="21"/>
+                <w:szCs w:val="21"/>
+              </w:rPr>
+              <w:t xml:space="preserve">every</w:t>
+            </w:r>
+            <w:r>
+              <w:rPr>
+                <w:rFonts w:ascii="Arial" w:cs="Arial" w:eastAsia="Arial" w:hAnsi="Arial"/>
+                <w:color w:val="2B2B2B"/>
+                <w:sz w:val="21"/>
+                <w:szCs w:val="21"/>
+              </w:rPr>
+              <w:t xml:space="preserve"> republish.</w:t>
+            </w:r>
+          </w:p>
+        </w:tc>
+      </w:tr>
+    </w:tbl>
+    <w:p>
+      <w:pPr>
+        <w:spacing w:after="60"/>
+      </w:pPr>
+    </w:p>
+    <w:tbl>
+      <w:tblPr>
+        <w:tblW w:type="pct" w:w="100%"/>
+        <w:tblBorders>
+          <w:top w:val="single" w:color="auto" w:sz="4"/>
+          <w:left w:val="single" w:color="auto" w:sz="4"/>
+          <w:bottom w:val="single" w:color="auto" w:sz="4"/>
+          <w:right w:val="single" w:color="auto" w:sz="4"/>
+          <w:insideH w:val="single" w:color="auto" w:sz="4"/>
+          <w:insideV w:val="single" w:color="auto" w:sz="4"/>
+        </w:tblBorders>
+      </w:tblPr>
+      <w:tblGrid>
+        <w:gridCol w:w="100"/>
+      </w:tblGrid>
+      <w:tr>
+        <w:tc>
+          <w:tcPr>
+            <w:tcBorders>
+              <w:top w:val="single" w:color="B45309" w:sz="6"/>
+              <w:left w:val="single" w:color="B45309" w:sz="24"/>
+              <w:bottom w:val="single" w:color="B45309" w:sz="6"/>
+              <w:right w:val="single" w:color="B45309" w:sz="6"/>
+            </w:tcBorders>
+            <w:shd w:fill="FFF3DC" w:val="clear"/>
+            <w:tcMar>
+              <w:top w:type="dxa" w:w="140"/>
+              <w:left w:type="dxa" w:w="240"/>
+              <w:bottom w:type="dxa" w:w="140"/>
+              <w:right w:type="dxa" w:w="240"/>
+            </w:tcMar>
+          </w:tcPr>
+          <w:p>
+            <w:pPr>
+              <w:spacing w:after="80"/>
+            </w:pPr>
+            <w:r>
+              <w:rPr>
+                <w:rFonts w:ascii="Arial" w:cs="Arial" w:eastAsia="Arial" w:hAnsi="Arial"/>
+                <w:b/>
+                <w:bCs/>
+                <w:color w:val="B45309"/>
+                <w:sz w:val="21"/>
+                <w:szCs w:val="21"/>
+              </w:rPr>
+              <w:t xml:space="preserve">⚠  AREAID is the join key — spelling is everything</w:t>
+            </w:r>
+          </w:p>
+          <w:p>
+            <w:pPr>
+              <w:spacing w:after="120"/>
+            </w:pPr>
+            <w:r>
+              <w:rPr>
+                <w:rFonts w:ascii="Arial" w:cs="Arial" w:eastAsia="Arial" w:hAnsi="Arial"/>
+                <w:color w:val="2B2B2B"/>
+                <w:sz w:val="21"/>
+                <w:szCs w:val="21"/>
+              </w:rPr>
+              <w:t xml:space="preserve">AREAID is the lot name uppercased with non-alphanumerics stripped: "Lot 15" → </w:t>
+            </w:r>
+            <w:r>
+              <w:rPr>
+                <w:rFonts w:ascii="Consolas" w:cs="Consolas" w:eastAsia="Consolas" w:hAnsi="Consolas"/>
+                <w:color w:val="2B2B2B"/>
+                <w:sz w:val="19"/>
+                <w:szCs w:val="19"/>
+              </w:rPr>
+              <w:t xml:space="preserve">LOT15</w:t>
+            </w:r>
+            <w:r>
+              <w:rPr>
+                <w:rFonts w:ascii="Arial" w:cs="Arial" w:eastAsia="Arial" w:hAnsi="Arial"/>
+                <w:color w:val="2B2B2B"/>
+                <w:sz w:val="21"/>
+                <w:szCs w:val="21"/>
+              </w:rPr>
+              <w:t xml:space="preserve">. Any other spelling silently drops the lot from its page. Verify against the live services rather than trusting the configuration: </w:t>
+            </w:r>
+            <w:r>
+              <w:rPr>
+                <w:rFonts w:ascii="Consolas" w:cs="Consolas" w:eastAsia="Consolas" w:hAnsi="Consolas"/>
+                <w:color w:val="2B2B2B"/>
+                <w:sz w:val="19"/>
+                <w:szCs w:val="19"/>
+              </w:rPr>
+              <w:t xml:space="preserve">node scripts/verify-permit-pages.mjs</w:t>
+            </w:r>
+            <w:r>
+              <w:rPr>
+                <w:rFonts w:ascii="Arial" w:cs="Arial" w:eastAsia="Arial" w:hAnsi="Arial"/>
+                <w:color w:val="2B2B2B"/>
+                <w:sz w:val="21"/>
+                <w:szCs w:val="21"/>
+              </w:rPr>
+              <w:t xml:space="preserve"> confirms every listed lot resolves and returns rules.</w:t>
+            </w:r>
+          </w:p>
+        </w:tc>
+      </w:tr>
+    </w:tbl>
+    <w:p>
+      <w:pPr>
+        <w:spacing w:after="120"/>
+      </w:pPr>
     </w:p>
     <w:p>
       <w:pPr>
@@ -9171,141 +11404,26 @@
           <w:sz w:val="21"/>
           <w:szCs w:val="21"/>
         </w:rPr>
-        <w:t xml:space="preserve">Where the authoritative source lives (LGDM feature classes, APRX, FGDB), how the AGOL service is produced, and anything a successor must know to reproduce a publish:</w:t>
+        <w:t xml:space="preserve">Known upstream data defects are catalogued in </w:t>
       </w:r>
-    </w:p>
-    <w:p>
-      <w:pPr>
-        <w:pBdr>
-          <w:bottom w:val="single" w:color="BFBFBF" w:sz="4"/>
-        </w:pBdr>
-        <w:spacing w:before="260"/>
-      </w:pPr>
+      <w:r>
+        <w:rPr>
+          <w:rFonts w:ascii="Consolas" w:cs="Consolas" w:eastAsia="Consolas" w:hAnsi="Consolas"/>
+          <w:color w:val="2B2B2B"/>
+          <w:sz w:val="19"/>
+          <w:szCs w:val="19"/>
+        </w:rPr>
+        <w:t xml:space="preserve">docs/DATA.md</w:t>
+      </w:r>
       <w:r>
         <w:rPr>
           <w:rFonts w:ascii="Arial" w:cs="Arial" w:eastAsia="Arial" w:hAnsi="Arial"/>
+          <w:color w:val="2B2B2B"/>
           <w:sz w:val="21"/>
           <w:szCs w:val="21"/>
         </w:rPr>
-        <w:t xml:space="preserve"> </w:t>
+        <w:t xml:space="preserve"> — chiefly that RULETYPE is a heuristic label, which currently leaves three lots with an empty detail card.</w:t>
       </w:r>
-    </w:p>
-    <w:p>
-      <w:pPr>
-        <w:pBdr>
-          <w:bottom w:val="single" w:color="BFBFBF" w:sz="4"/>
-        </w:pBdr>
-        <w:spacing w:before="260"/>
-      </w:pPr>
-      <w:r>
-        <w:rPr>
-          <w:rFonts w:ascii="Arial" w:cs="Arial" w:eastAsia="Arial" w:hAnsi="Arial"/>
-          <w:sz w:val="21"/>
-          <w:szCs w:val="21"/>
-        </w:rPr>
-        <w:t xml:space="preserve"> </w:t>
-      </w:r>
-    </w:p>
-    <w:p>
-      <w:pPr>
-        <w:pBdr>
-          <w:bottom w:val="single" w:color="BFBFBF" w:sz="4"/>
-        </w:pBdr>
-        <w:spacing w:before="260"/>
-      </w:pPr>
-      <w:r>
-        <w:rPr>
-          <w:rFonts w:ascii="Arial" w:cs="Arial" w:eastAsia="Arial" w:hAnsi="Arial"/>
-          <w:sz w:val="21"/>
-          <w:szCs w:val="21"/>
-        </w:rPr>
-        <w:t xml:space="preserve"> </w:t>
-      </w:r>
-    </w:p>
-    <w:p>
-      <w:pPr>
-        <w:pBdr>
-          <w:bottom w:val="single" w:color="BFBFBF" w:sz="4"/>
-        </w:pBdr>
-        <w:spacing w:before="260"/>
-      </w:pPr>
-      <w:r>
-        <w:rPr>
-          <w:rFonts w:ascii="Arial" w:cs="Arial" w:eastAsia="Arial" w:hAnsi="Arial"/>
-          <w:sz w:val="21"/>
-          <w:szCs w:val="21"/>
-        </w:rPr>
-        <w:t xml:space="preserve"> </w:t>
-      </w:r>
-    </w:p>
-    <w:p>
-      <w:pPr>
-        <w:pBdr>
-          <w:bottom w:val="single" w:color="BFBFBF" w:sz="4"/>
-        </w:pBdr>
-        <w:spacing w:before="260"/>
-      </w:pPr>
-      <w:r>
-        <w:rPr>
-          <w:rFonts w:ascii="Arial" w:cs="Arial" w:eastAsia="Arial" w:hAnsi="Arial"/>
-          <w:sz w:val="21"/>
-          <w:szCs w:val="21"/>
-        </w:rPr>
-        <w:t xml:space="preserve"> </w:t>
-      </w:r>
-    </w:p>
-    <w:p>
-      <w:pPr>
-        <w:pBdr>
-          <w:bottom w:val="single" w:color="BFBFBF" w:sz="4"/>
-        </w:pBdr>
-        <w:spacing w:before="260"/>
-      </w:pPr>
-      <w:r>
-        <w:rPr>
-          <w:rFonts w:ascii="Arial" w:cs="Arial" w:eastAsia="Arial" w:hAnsi="Arial"/>
-          <w:sz w:val="21"/>
-          <w:szCs w:val="21"/>
-        </w:rPr>
-        <w:t xml:space="preserve"> </w:t>
-      </w:r>
-    </w:p>
-    <w:p>
-      <w:pPr>
-        <w:pBdr>
-          <w:bottom w:val="single" w:color="BFBFBF" w:sz="4"/>
-        </w:pBdr>
-        <w:spacing w:before="260"/>
-      </w:pPr>
-      <w:r>
-        <w:rPr>
-          <w:rFonts w:ascii="Arial" w:cs="Arial" w:eastAsia="Arial" w:hAnsi="Arial"/>
-          <w:sz w:val="21"/>
-          <w:szCs w:val="21"/>
-        </w:rPr>
-        <w:t xml:space="preserve"> </w:t>
-      </w:r>
-    </w:p>
-    <w:p>
-      <w:pPr>
-        <w:pBdr>
-          <w:bottom w:val="single" w:color="BFBFBF" w:sz="4"/>
-        </w:pBdr>
-        <w:spacing w:before="260"/>
-      </w:pPr>
-      <w:r>
-        <w:rPr>
-          <w:rFonts w:ascii="Arial" w:cs="Arial" w:eastAsia="Arial" w:hAnsi="Arial"/>
-          <w:sz w:val="21"/>
-          <w:szCs w:val="21"/>
-        </w:rPr>
-        <w:t xml:space="preserve"> </w:t>
-      </w:r>
-    </w:p>
-    <w:p>
-      <w:pPr>
-        <w:spacing w:after="120"/>
-      </w:pPr>
     </w:p>
     <w:p>
       <w:pPr>
@@ -9321,7 +11439,7 @@
           <w:sz w:val="23"/>
           <w:szCs w:val="23"/>
         </w:rPr>
-        <w:t xml:space="preserve">8.3 — Publish / republish checklist</w:t>
+        <w:t xml:space="preserve">8.6 — Publish / republish log</w:t>
       </w:r>
     </w:p>
     <w:p>
@@ -10235,939 +12353,6 @@
         </w:tc>
       </w:tr>
     </w:tbl>
-    <w:p>
-      <w:pPr>
-        <w:spacing w:after="60"/>
-      </w:pPr>
-    </w:p>
-    <w:tbl>
-      <w:tblPr>
-        <w:tblW w:type="pct" w:w="100%"/>
-        <w:tblBorders>
-          <w:top w:val="single" w:color="auto" w:sz="4"/>
-          <w:left w:val="single" w:color="auto" w:sz="4"/>
-          <w:bottom w:val="single" w:color="auto" w:sz="4"/>
-          <w:right w:val="single" w:color="auto" w:sz="4"/>
-          <w:insideH w:val="single" w:color="auto" w:sz="4"/>
-          <w:insideV w:val="single" w:color="auto" w:sz="4"/>
-        </w:tblBorders>
-      </w:tblPr>
-      <w:tblGrid>
-        <w:gridCol w:w="100"/>
-      </w:tblGrid>
-      <w:tr>
-        <w:tc>
-          <w:tcPr>
-            <w:tcBorders>
-              <w:top w:val="single" w:color="B45309" w:sz="6"/>
-              <w:left w:val="single" w:color="B45309" w:sz="24"/>
-              <w:bottom w:val="single" w:color="B45309" w:sz="6"/>
-              <w:right w:val="single" w:color="B45309" w:sz="6"/>
-            </w:tcBorders>
-            <w:shd w:fill="FFF3DC" w:val="clear"/>
-            <w:tcMar>
-              <w:top w:type="dxa" w:w="140"/>
-              <w:left w:type="dxa" w:w="240"/>
-              <w:bottom w:type="dxa" w:w="140"/>
-              <w:right w:type="dxa" w:w="240"/>
-            </w:tcMar>
-          </w:tcPr>
-          <w:p>
-            <w:pPr>
-              <w:spacing w:after="80"/>
-            </w:pPr>
-            <w:r>
-              <w:rPr>
-                <w:rFonts w:ascii="Arial" w:cs="Arial" w:eastAsia="Arial" w:hAnsi="Arial"/>
-                <w:b/>
-                <w:bCs/>
-                <w:color w:val="B45309"/>
-                <w:sz w:val="21"/>
-                <w:szCs w:val="21"/>
-              </w:rPr>
-              <w:t xml:space="preserve">⚠  Reminder — republishing resets sharing</w:t>
-            </w:r>
-          </w:p>
-          <w:p>
-            <w:pPr>
-              <w:spacing w:after="120"/>
-            </w:pPr>
-            <w:r>
-              <w:rPr>
-                <w:rFonts w:ascii="Arial" w:cs="Arial" w:eastAsia="Arial" w:hAnsi="Arial"/>
-                <w:color w:val="2B2B2B"/>
-                <w:sz w:val="21"/>
-                <w:szCs w:val="21"/>
-              </w:rPr>
-              <w:t xml:space="preserve">After every republish the service returns to org-only and both apps break with </w:t>
-            </w:r>
-            <w:r>
-              <w:rPr>
-                <w:rFonts w:ascii="Consolas" w:cs="Consolas" w:eastAsia="Consolas" w:hAnsi="Consolas"/>
-                <w:color w:val="2B2B2B"/>
-                <w:sz w:val="19"/>
-                <w:szCs w:val="19"/>
-              </w:rPr>
-              <w:t xml:space="preserve">{"code":499}</w:t>
-            </w:r>
-            <w:r>
-              <w:rPr>
-                <w:rFonts w:ascii="Arial" w:cs="Arial" w:eastAsia="Arial" w:hAnsi="Arial"/>
-                <w:color w:val="2B2B2B"/>
-                <w:sz w:val="21"/>
-                <w:szCs w:val="21"/>
-              </w:rPr>
-              <w:t xml:space="preserve"> until it is re-shared Public. The verification query is in Chapter 4.</w:t>
-            </w:r>
-          </w:p>
-        </w:tc>
-      </w:tr>
-    </w:tbl>
-    <w:p>
-      <w:pPr>
-        <w:spacing w:after="120"/>
-      </w:pPr>
-    </w:p>
-    <w:p>
-      <w:pPr>
-        <w:pStyle w:val="Heading2"/>
-        <w:spacing w:after="100" w:before="280"/>
-      </w:pPr>
-      <w:r>
-        <w:rPr>
-          <w:rFonts w:ascii="Arial" w:cs="Arial" w:eastAsia="Arial" w:hAnsi="Arial"/>
-          <w:b/>
-          <w:bCs/>
-          <w:color w:val="0E7C66"/>
-          <w:sz w:val="23"/>
-          <w:szCs w:val="23"/>
-        </w:rPr>
-        <w:t xml:space="preserve">8.4 — Known data issues &amp; decisions</w:t>
-      </w:r>
-    </w:p>
-    <w:p>
-      <w:pPr>
-        <w:spacing w:after="120"/>
-      </w:pPr>
-      <w:r>
-        <w:rPr>
-          <w:rFonts w:ascii="Arial" w:cs="Arial" w:eastAsia="Arial" w:hAnsi="Arial"/>
-          <w:color w:val="2B2B2B"/>
-          <w:sz w:val="21"/>
-          <w:szCs w:val="21"/>
-        </w:rPr>
-        <w:t xml:space="preserve">Log upstream data defects here as they are found (mirror them into </w:t>
-      </w:r>
-      <w:r>
-        <w:rPr>
-          <w:rFonts w:ascii="Consolas" w:cs="Consolas" w:eastAsia="Consolas" w:hAnsi="Consolas"/>
-          <w:color w:val="2B2B2B"/>
-          <w:sz w:val="19"/>
-          <w:szCs w:val="19"/>
-        </w:rPr>
-        <w:t xml:space="preserve">docs/BACKLOG.md</w:t>
-      </w:r>
-      <w:r>
-        <w:rPr>
-          <w:rFonts w:ascii="Arial" w:cs="Arial" w:eastAsia="Arial" w:hAnsi="Arial"/>
-          <w:color w:val="2B2B2B"/>
-          <w:sz w:val="21"/>
-          <w:szCs w:val="21"/>
-        </w:rPr>
-        <w:t xml:space="preserve"> with the decision taken):</w:t>
-      </w:r>
-    </w:p>
-    <w:tbl>
-      <w:tblPr>
-        <w:tblW w:type="pct" w:w="100%"/>
-        <w:tblBorders>
-          <w:top w:val="single" w:color="auto" w:sz="4"/>
-          <w:left w:val="single" w:color="auto" w:sz="4"/>
-          <w:bottom w:val="single" w:color="auto" w:sz="4"/>
-          <w:right w:val="single" w:color="auto" w:sz="4"/>
-          <w:insideH w:val="single" w:color="auto" w:sz="4"/>
-          <w:insideV w:val="single" w:color="auto" w:sz="4"/>
-        </w:tblBorders>
-      </w:tblPr>
-      <w:tblGrid>
-        <w:gridCol w:w="100"/>
-        <w:gridCol w:w="100"/>
-        <w:gridCol w:w="100"/>
-        <w:gridCol w:w="100"/>
-      </w:tblGrid>
-      <w:tr>
-        <w:tc>
-          <w:tcPr>
-            <w:tcW w:type="pct" w:w="14%"/>
-            <w:tcBorders>
-              <w:top w:val="single" w:color="D9D9D9" w:sz="4"/>
-              <w:left w:val="single" w:color="D9D9D9" w:sz="4"/>
-              <w:bottom w:val="single" w:color="D9D9D9" w:sz="4"/>
-              <w:right w:val="single" w:color="D9D9D9" w:sz="4"/>
-            </w:tcBorders>
-            <w:shd w:fill="0E7C66" w:val="clear"/>
-            <w:tcMar>
-              <w:top w:type="dxa" w:w="80"/>
-              <w:left w:type="dxa" w:w="120"/>
-              <w:bottom w:type="dxa" w:w="80"/>
-              <w:right w:type="dxa" w:w="120"/>
-            </w:tcMar>
-          </w:tcPr>
-          <w:p>
-            <w:r>
-              <w:rPr>
-                <w:rFonts w:ascii="Arial" w:cs="Arial" w:eastAsia="Arial" w:hAnsi="Arial"/>
-                <w:b/>
-                <w:bCs/>
-                <w:color w:val="FFFFFF"/>
-                <w:sz w:val="20"/>
-                <w:szCs w:val="20"/>
-              </w:rPr>
-              <w:t xml:space="preserve">Date found</w:t>
-            </w:r>
-          </w:p>
-        </w:tc>
-        <w:tc>
-          <w:tcPr>
-            <w:tcW w:type="pct" w:w="24%"/>
-            <w:tcBorders>
-              <w:top w:val="single" w:color="D9D9D9" w:sz="4"/>
-              <w:left w:val="single" w:color="D9D9D9" w:sz="4"/>
-              <w:bottom w:val="single" w:color="D9D9D9" w:sz="4"/>
-              <w:right w:val="single" w:color="D9D9D9" w:sz="4"/>
-            </w:tcBorders>
-            <w:shd w:fill="0E7C66" w:val="clear"/>
-            <w:tcMar>
-              <w:top w:type="dxa" w:w="80"/>
-              <w:left w:type="dxa" w:w="120"/>
-              <w:bottom w:type="dxa" w:w="80"/>
-              <w:right w:type="dxa" w:w="120"/>
-            </w:tcMar>
-          </w:tcPr>
-          <w:p>
-            <w:r>
-              <w:rPr>
-                <w:rFonts w:ascii="Arial" w:cs="Arial" w:eastAsia="Arial" w:hAnsi="Arial"/>
-                <w:b/>
-                <w:bCs/>
-                <w:color w:val="FFFFFF"/>
-                <w:sz w:val="20"/>
-                <w:szCs w:val="20"/>
-              </w:rPr>
-              <w:t xml:space="preserve">Layer / field</w:t>
-            </w:r>
-          </w:p>
-        </w:tc>
-        <w:tc>
-          <w:tcPr>
-            <w:tcW w:type="pct" w:w="32%"/>
-            <w:tcBorders>
-              <w:top w:val="single" w:color="D9D9D9" w:sz="4"/>
-              <w:left w:val="single" w:color="D9D9D9" w:sz="4"/>
-              <w:bottom w:val="single" w:color="D9D9D9" w:sz="4"/>
-              <w:right w:val="single" w:color="D9D9D9" w:sz="4"/>
-            </w:tcBorders>
-            <w:shd w:fill="0E7C66" w:val="clear"/>
-            <w:tcMar>
-              <w:top w:type="dxa" w:w="80"/>
-              <w:left w:type="dxa" w:w="120"/>
-              <w:bottom w:type="dxa" w:w="80"/>
-              <w:right w:type="dxa" w:w="120"/>
-            </w:tcMar>
-          </w:tcPr>
-          <w:p>
-            <w:r>
-              <w:rPr>
-                <w:rFonts w:ascii="Arial" w:cs="Arial" w:eastAsia="Arial" w:hAnsi="Arial"/>
-                <w:b/>
-                <w:bCs/>
-                <w:color w:val="FFFFFF"/>
-                <w:sz w:val="20"/>
-                <w:szCs w:val="20"/>
-              </w:rPr>
-              <w:t xml:space="preserve">Issue</w:t>
-            </w:r>
-          </w:p>
-        </w:tc>
-        <w:tc>
-          <w:tcPr>
-            <w:tcW w:type="pct" w:w="30%"/>
-            <w:tcBorders>
-              <w:top w:val="single" w:color="D9D9D9" w:sz="4"/>
-              <w:left w:val="single" w:color="D9D9D9" w:sz="4"/>
-              <w:bottom w:val="single" w:color="D9D9D9" w:sz="4"/>
-              <w:right w:val="single" w:color="D9D9D9" w:sz="4"/>
-            </w:tcBorders>
-            <w:shd w:fill="0E7C66" w:val="clear"/>
-            <w:tcMar>
-              <w:top w:type="dxa" w:w="80"/>
-              <w:left w:type="dxa" w:w="120"/>
-              <w:bottom w:type="dxa" w:w="80"/>
-              <w:right w:type="dxa" w:w="120"/>
-            </w:tcMar>
-          </w:tcPr>
-          <w:p>
-            <w:r>
-              <w:rPr>
-                <w:rFonts w:ascii="Arial" w:cs="Arial" w:eastAsia="Arial" w:hAnsi="Arial"/>
-                <w:b/>
-                <w:bCs/>
-                <w:color w:val="FFFFFF"/>
-                <w:sz w:val="20"/>
-                <w:szCs w:val="20"/>
-              </w:rPr>
-              <w:t xml:space="preserve">Decision / workaround</w:t>
-            </w:r>
-          </w:p>
-        </w:tc>
-      </w:tr>
-      <w:tr>
-        <w:tc>
-          <w:tcPr>
-            <w:tcW w:type="pct" w:w="14%"/>
-            <w:tcBorders>
-              <w:top w:val="single" w:color="D9D9D9" w:sz="4"/>
-              <w:left w:val="single" w:color="D9D9D9" w:sz="4"/>
-              <w:bottom w:val="single" w:color="D9D9D9" w:sz="4"/>
-              <w:right w:val="single" w:color="D9D9D9" w:sz="4"/>
-            </w:tcBorders>
-            <w:tcMar>
-              <w:top w:type="dxa" w:w="80"/>
-              <w:left w:type="dxa" w:w="120"/>
-              <w:bottom w:type="dxa" w:w="80"/>
-              <w:right w:type="dxa" w:w="120"/>
-            </w:tcMar>
-          </w:tcPr>
-          <w:p>
-            <w:r>
-              <w:rPr>
-                <w:rFonts w:ascii="Arial" w:cs="Arial" w:eastAsia="Arial" w:hAnsi="Arial"/>
-                <w:color w:val="2B2B2B"/>
-                <w:sz w:val="20"/>
-                <w:szCs w:val="20"/>
-              </w:rPr>
-              <w:t xml:space="preserve"> </w:t>
-            </w:r>
-          </w:p>
-        </w:tc>
-        <w:tc>
-          <w:tcPr>
-            <w:tcW w:type="pct" w:w="24%"/>
-            <w:tcBorders>
-              <w:top w:val="single" w:color="D9D9D9" w:sz="4"/>
-              <w:left w:val="single" w:color="D9D9D9" w:sz="4"/>
-              <w:bottom w:val="single" w:color="D9D9D9" w:sz="4"/>
-              <w:right w:val="single" w:color="D9D9D9" w:sz="4"/>
-            </w:tcBorders>
-            <w:tcMar>
-              <w:top w:type="dxa" w:w="80"/>
-              <w:left w:type="dxa" w:w="120"/>
-              <w:bottom w:type="dxa" w:w="80"/>
-              <w:right w:type="dxa" w:w="120"/>
-            </w:tcMar>
-          </w:tcPr>
-          <w:p>
-            <w:r>
-              <w:rPr>
-                <w:rFonts w:ascii="Arial" w:cs="Arial" w:eastAsia="Arial" w:hAnsi="Arial"/>
-                <w:color w:val="2B2B2B"/>
-                <w:sz w:val="20"/>
-                <w:szCs w:val="20"/>
-              </w:rPr>
-              <w:t xml:space="preserve"> </w:t>
-            </w:r>
-          </w:p>
-        </w:tc>
-        <w:tc>
-          <w:tcPr>
-            <w:tcW w:type="pct" w:w="32%"/>
-            <w:tcBorders>
-              <w:top w:val="single" w:color="D9D9D9" w:sz="4"/>
-              <w:left w:val="single" w:color="D9D9D9" w:sz="4"/>
-              <w:bottom w:val="single" w:color="D9D9D9" w:sz="4"/>
-              <w:right w:val="single" w:color="D9D9D9" w:sz="4"/>
-            </w:tcBorders>
-            <w:tcMar>
-              <w:top w:type="dxa" w:w="80"/>
-              <w:left w:type="dxa" w:w="120"/>
-              <w:bottom w:type="dxa" w:w="80"/>
-              <w:right w:type="dxa" w:w="120"/>
-            </w:tcMar>
-          </w:tcPr>
-          <w:p>
-            <w:r>
-              <w:rPr>
-                <w:rFonts w:ascii="Arial" w:cs="Arial" w:eastAsia="Arial" w:hAnsi="Arial"/>
-                <w:color w:val="2B2B2B"/>
-                <w:sz w:val="20"/>
-                <w:szCs w:val="20"/>
-              </w:rPr>
-              <w:t xml:space="preserve"> </w:t>
-            </w:r>
-          </w:p>
-        </w:tc>
-        <w:tc>
-          <w:tcPr>
-            <w:tcW w:type="pct" w:w="30%"/>
-            <w:tcBorders>
-              <w:top w:val="single" w:color="D9D9D9" w:sz="4"/>
-              <w:left w:val="single" w:color="D9D9D9" w:sz="4"/>
-              <w:bottom w:val="single" w:color="D9D9D9" w:sz="4"/>
-              <w:right w:val="single" w:color="D9D9D9" w:sz="4"/>
-            </w:tcBorders>
-            <w:tcMar>
-              <w:top w:type="dxa" w:w="80"/>
-              <w:left w:type="dxa" w:w="120"/>
-              <w:bottom w:type="dxa" w:w="80"/>
-              <w:right w:type="dxa" w:w="120"/>
-            </w:tcMar>
-          </w:tcPr>
-          <w:p>
-            <w:r>
-              <w:rPr>
-                <w:rFonts w:ascii="Arial" w:cs="Arial" w:eastAsia="Arial" w:hAnsi="Arial"/>
-                <w:color w:val="2B2B2B"/>
-                <w:sz w:val="20"/>
-                <w:szCs w:val="20"/>
-              </w:rPr>
-              <w:t xml:space="preserve"> </w:t>
-            </w:r>
-          </w:p>
-        </w:tc>
-      </w:tr>
-      <w:tr>
-        <w:tc>
-          <w:tcPr>
-            <w:tcW w:type="pct" w:w="14%"/>
-            <w:tcBorders>
-              <w:top w:val="single" w:color="D9D9D9" w:sz="4"/>
-              <w:left w:val="single" w:color="D9D9D9" w:sz="4"/>
-              <w:bottom w:val="single" w:color="D9D9D9" w:sz="4"/>
-              <w:right w:val="single" w:color="D9D9D9" w:sz="4"/>
-            </w:tcBorders>
-            <w:shd w:fill="F2F7FB" w:val="clear"/>
-            <w:tcMar>
-              <w:top w:type="dxa" w:w="80"/>
-              <w:left w:type="dxa" w:w="120"/>
-              <w:bottom w:type="dxa" w:w="80"/>
-              <w:right w:type="dxa" w:w="120"/>
-            </w:tcMar>
-          </w:tcPr>
-          <w:p>
-            <w:r>
-              <w:rPr>
-                <w:rFonts w:ascii="Arial" w:cs="Arial" w:eastAsia="Arial" w:hAnsi="Arial"/>
-                <w:color w:val="2B2B2B"/>
-                <w:sz w:val="20"/>
-                <w:szCs w:val="20"/>
-              </w:rPr>
-              <w:t xml:space="preserve"> </w:t>
-            </w:r>
-          </w:p>
-        </w:tc>
-        <w:tc>
-          <w:tcPr>
-            <w:tcW w:type="pct" w:w="24%"/>
-            <w:tcBorders>
-              <w:top w:val="single" w:color="D9D9D9" w:sz="4"/>
-              <w:left w:val="single" w:color="D9D9D9" w:sz="4"/>
-              <w:bottom w:val="single" w:color="D9D9D9" w:sz="4"/>
-              <w:right w:val="single" w:color="D9D9D9" w:sz="4"/>
-            </w:tcBorders>
-            <w:shd w:fill="F2F7FB" w:val="clear"/>
-            <w:tcMar>
-              <w:top w:type="dxa" w:w="80"/>
-              <w:left w:type="dxa" w:w="120"/>
-              <w:bottom w:type="dxa" w:w="80"/>
-              <w:right w:type="dxa" w:w="120"/>
-            </w:tcMar>
-          </w:tcPr>
-          <w:p>
-            <w:r>
-              <w:rPr>
-                <w:rFonts w:ascii="Arial" w:cs="Arial" w:eastAsia="Arial" w:hAnsi="Arial"/>
-                <w:color w:val="2B2B2B"/>
-                <w:sz w:val="20"/>
-                <w:szCs w:val="20"/>
-              </w:rPr>
-              <w:t xml:space="preserve"> </w:t>
-            </w:r>
-          </w:p>
-        </w:tc>
-        <w:tc>
-          <w:tcPr>
-            <w:tcW w:type="pct" w:w="32%"/>
-            <w:tcBorders>
-              <w:top w:val="single" w:color="D9D9D9" w:sz="4"/>
-              <w:left w:val="single" w:color="D9D9D9" w:sz="4"/>
-              <w:bottom w:val="single" w:color="D9D9D9" w:sz="4"/>
-              <w:right w:val="single" w:color="D9D9D9" w:sz="4"/>
-            </w:tcBorders>
-            <w:shd w:fill="F2F7FB" w:val="clear"/>
-            <w:tcMar>
-              <w:top w:type="dxa" w:w="80"/>
-              <w:left w:type="dxa" w:w="120"/>
-              <w:bottom w:type="dxa" w:w="80"/>
-              <w:right w:type="dxa" w:w="120"/>
-            </w:tcMar>
-          </w:tcPr>
-          <w:p>
-            <w:r>
-              <w:rPr>
-                <w:rFonts w:ascii="Arial" w:cs="Arial" w:eastAsia="Arial" w:hAnsi="Arial"/>
-                <w:color w:val="2B2B2B"/>
-                <w:sz w:val="20"/>
-                <w:szCs w:val="20"/>
-              </w:rPr>
-              <w:t xml:space="preserve"> </w:t>
-            </w:r>
-          </w:p>
-        </w:tc>
-        <w:tc>
-          <w:tcPr>
-            <w:tcW w:type="pct" w:w="30%"/>
-            <w:tcBorders>
-              <w:top w:val="single" w:color="D9D9D9" w:sz="4"/>
-              <w:left w:val="single" w:color="D9D9D9" w:sz="4"/>
-              <w:bottom w:val="single" w:color="D9D9D9" w:sz="4"/>
-              <w:right w:val="single" w:color="D9D9D9" w:sz="4"/>
-            </w:tcBorders>
-            <w:shd w:fill="F2F7FB" w:val="clear"/>
-            <w:tcMar>
-              <w:top w:type="dxa" w:w="80"/>
-              <w:left w:type="dxa" w:w="120"/>
-              <w:bottom w:type="dxa" w:w="80"/>
-              <w:right w:type="dxa" w:w="120"/>
-            </w:tcMar>
-          </w:tcPr>
-          <w:p>
-            <w:r>
-              <w:rPr>
-                <w:rFonts w:ascii="Arial" w:cs="Arial" w:eastAsia="Arial" w:hAnsi="Arial"/>
-                <w:color w:val="2B2B2B"/>
-                <w:sz w:val="20"/>
-                <w:szCs w:val="20"/>
-              </w:rPr>
-              <w:t xml:space="preserve"> </w:t>
-            </w:r>
-          </w:p>
-        </w:tc>
-      </w:tr>
-      <w:tr>
-        <w:tc>
-          <w:tcPr>
-            <w:tcW w:type="pct" w:w="14%"/>
-            <w:tcBorders>
-              <w:top w:val="single" w:color="D9D9D9" w:sz="4"/>
-              <w:left w:val="single" w:color="D9D9D9" w:sz="4"/>
-              <w:bottom w:val="single" w:color="D9D9D9" w:sz="4"/>
-              <w:right w:val="single" w:color="D9D9D9" w:sz="4"/>
-            </w:tcBorders>
-            <w:tcMar>
-              <w:top w:type="dxa" w:w="80"/>
-              <w:left w:type="dxa" w:w="120"/>
-              <w:bottom w:type="dxa" w:w="80"/>
-              <w:right w:type="dxa" w:w="120"/>
-            </w:tcMar>
-          </w:tcPr>
-          <w:p>
-            <w:r>
-              <w:rPr>
-                <w:rFonts w:ascii="Arial" w:cs="Arial" w:eastAsia="Arial" w:hAnsi="Arial"/>
-                <w:color w:val="2B2B2B"/>
-                <w:sz w:val="20"/>
-                <w:szCs w:val="20"/>
-              </w:rPr>
-              <w:t xml:space="preserve"> </w:t>
-            </w:r>
-          </w:p>
-        </w:tc>
-        <w:tc>
-          <w:tcPr>
-            <w:tcW w:type="pct" w:w="24%"/>
-            <w:tcBorders>
-              <w:top w:val="single" w:color="D9D9D9" w:sz="4"/>
-              <w:left w:val="single" w:color="D9D9D9" w:sz="4"/>
-              <w:bottom w:val="single" w:color="D9D9D9" w:sz="4"/>
-              <w:right w:val="single" w:color="D9D9D9" w:sz="4"/>
-            </w:tcBorders>
-            <w:tcMar>
-              <w:top w:type="dxa" w:w="80"/>
-              <w:left w:type="dxa" w:w="120"/>
-              <w:bottom w:type="dxa" w:w="80"/>
-              <w:right w:type="dxa" w:w="120"/>
-            </w:tcMar>
-          </w:tcPr>
-          <w:p>
-            <w:r>
-              <w:rPr>
-                <w:rFonts w:ascii="Arial" w:cs="Arial" w:eastAsia="Arial" w:hAnsi="Arial"/>
-                <w:color w:val="2B2B2B"/>
-                <w:sz w:val="20"/>
-                <w:szCs w:val="20"/>
-              </w:rPr>
-              <w:t xml:space="preserve"> </w:t>
-            </w:r>
-          </w:p>
-        </w:tc>
-        <w:tc>
-          <w:tcPr>
-            <w:tcW w:type="pct" w:w="32%"/>
-            <w:tcBorders>
-              <w:top w:val="single" w:color="D9D9D9" w:sz="4"/>
-              <w:left w:val="single" w:color="D9D9D9" w:sz="4"/>
-              <w:bottom w:val="single" w:color="D9D9D9" w:sz="4"/>
-              <w:right w:val="single" w:color="D9D9D9" w:sz="4"/>
-            </w:tcBorders>
-            <w:tcMar>
-              <w:top w:type="dxa" w:w="80"/>
-              <w:left w:type="dxa" w:w="120"/>
-              <w:bottom w:type="dxa" w:w="80"/>
-              <w:right w:type="dxa" w:w="120"/>
-            </w:tcMar>
-          </w:tcPr>
-          <w:p>
-            <w:r>
-              <w:rPr>
-                <w:rFonts w:ascii="Arial" w:cs="Arial" w:eastAsia="Arial" w:hAnsi="Arial"/>
-                <w:color w:val="2B2B2B"/>
-                <w:sz w:val="20"/>
-                <w:szCs w:val="20"/>
-              </w:rPr>
-              <w:t xml:space="preserve"> </w:t>
-            </w:r>
-          </w:p>
-        </w:tc>
-        <w:tc>
-          <w:tcPr>
-            <w:tcW w:type="pct" w:w="30%"/>
-            <w:tcBorders>
-              <w:top w:val="single" w:color="D9D9D9" w:sz="4"/>
-              <w:left w:val="single" w:color="D9D9D9" w:sz="4"/>
-              <w:bottom w:val="single" w:color="D9D9D9" w:sz="4"/>
-              <w:right w:val="single" w:color="D9D9D9" w:sz="4"/>
-            </w:tcBorders>
-            <w:tcMar>
-              <w:top w:type="dxa" w:w="80"/>
-              <w:left w:type="dxa" w:w="120"/>
-              <w:bottom w:type="dxa" w:w="80"/>
-              <w:right w:type="dxa" w:w="120"/>
-            </w:tcMar>
-          </w:tcPr>
-          <w:p>
-            <w:r>
-              <w:rPr>
-                <w:rFonts w:ascii="Arial" w:cs="Arial" w:eastAsia="Arial" w:hAnsi="Arial"/>
-                <w:color w:val="2B2B2B"/>
-                <w:sz w:val="20"/>
-                <w:szCs w:val="20"/>
-              </w:rPr>
-              <w:t xml:space="preserve"> </w:t>
-            </w:r>
-          </w:p>
-        </w:tc>
-      </w:tr>
-      <w:tr>
-        <w:tc>
-          <w:tcPr>
-            <w:tcW w:type="pct" w:w="14%"/>
-            <w:tcBorders>
-              <w:top w:val="single" w:color="D9D9D9" w:sz="4"/>
-              <w:left w:val="single" w:color="D9D9D9" w:sz="4"/>
-              <w:bottom w:val="single" w:color="D9D9D9" w:sz="4"/>
-              <w:right w:val="single" w:color="D9D9D9" w:sz="4"/>
-            </w:tcBorders>
-            <w:shd w:fill="F2F7FB" w:val="clear"/>
-            <w:tcMar>
-              <w:top w:type="dxa" w:w="80"/>
-              <w:left w:type="dxa" w:w="120"/>
-              <w:bottom w:type="dxa" w:w="80"/>
-              <w:right w:type="dxa" w:w="120"/>
-            </w:tcMar>
-          </w:tcPr>
-          <w:p>
-            <w:r>
-              <w:rPr>
-                <w:rFonts w:ascii="Arial" w:cs="Arial" w:eastAsia="Arial" w:hAnsi="Arial"/>
-                <w:color w:val="2B2B2B"/>
-                <w:sz w:val="20"/>
-                <w:szCs w:val="20"/>
-              </w:rPr>
-              <w:t xml:space="preserve"> </w:t>
-            </w:r>
-          </w:p>
-        </w:tc>
-        <w:tc>
-          <w:tcPr>
-            <w:tcW w:type="pct" w:w="24%"/>
-            <w:tcBorders>
-              <w:top w:val="single" w:color="D9D9D9" w:sz="4"/>
-              <w:left w:val="single" w:color="D9D9D9" w:sz="4"/>
-              <w:bottom w:val="single" w:color="D9D9D9" w:sz="4"/>
-              <w:right w:val="single" w:color="D9D9D9" w:sz="4"/>
-            </w:tcBorders>
-            <w:shd w:fill="F2F7FB" w:val="clear"/>
-            <w:tcMar>
-              <w:top w:type="dxa" w:w="80"/>
-              <w:left w:type="dxa" w:w="120"/>
-              <w:bottom w:type="dxa" w:w="80"/>
-              <w:right w:type="dxa" w:w="120"/>
-            </w:tcMar>
-          </w:tcPr>
-          <w:p>
-            <w:r>
-              <w:rPr>
-                <w:rFonts w:ascii="Arial" w:cs="Arial" w:eastAsia="Arial" w:hAnsi="Arial"/>
-                <w:color w:val="2B2B2B"/>
-                <w:sz w:val="20"/>
-                <w:szCs w:val="20"/>
-              </w:rPr>
-              <w:t xml:space="preserve"> </w:t>
-            </w:r>
-          </w:p>
-        </w:tc>
-        <w:tc>
-          <w:tcPr>
-            <w:tcW w:type="pct" w:w="32%"/>
-            <w:tcBorders>
-              <w:top w:val="single" w:color="D9D9D9" w:sz="4"/>
-              <w:left w:val="single" w:color="D9D9D9" w:sz="4"/>
-              <w:bottom w:val="single" w:color="D9D9D9" w:sz="4"/>
-              <w:right w:val="single" w:color="D9D9D9" w:sz="4"/>
-            </w:tcBorders>
-            <w:shd w:fill="F2F7FB" w:val="clear"/>
-            <w:tcMar>
-              <w:top w:type="dxa" w:w="80"/>
-              <w:left w:type="dxa" w:w="120"/>
-              <w:bottom w:type="dxa" w:w="80"/>
-              <w:right w:type="dxa" w:w="120"/>
-            </w:tcMar>
-          </w:tcPr>
-          <w:p>
-            <w:r>
-              <w:rPr>
-                <w:rFonts w:ascii="Arial" w:cs="Arial" w:eastAsia="Arial" w:hAnsi="Arial"/>
-                <w:color w:val="2B2B2B"/>
-                <w:sz w:val="20"/>
-                <w:szCs w:val="20"/>
-              </w:rPr>
-              <w:t xml:space="preserve"> </w:t>
-            </w:r>
-          </w:p>
-        </w:tc>
-        <w:tc>
-          <w:tcPr>
-            <w:tcW w:type="pct" w:w="30%"/>
-            <w:tcBorders>
-              <w:top w:val="single" w:color="D9D9D9" w:sz="4"/>
-              <w:left w:val="single" w:color="D9D9D9" w:sz="4"/>
-              <w:bottom w:val="single" w:color="D9D9D9" w:sz="4"/>
-              <w:right w:val="single" w:color="D9D9D9" w:sz="4"/>
-            </w:tcBorders>
-            <w:shd w:fill="F2F7FB" w:val="clear"/>
-            <w:tcMar>
-              <w:top w:type="dxa" w:w="80"/>
-              <w:left w:type="dxa" w:w="120"/>
-              <w:bottom w:type="dxa" w:w="80"/>
-              <w:right w:type="dxa" w:w="120"/>
-            </w:tcMar>
-          </w:tcPr>
-          <w:p>
-            <w:r>
-              <w:rPr>
-                <w:rFonts w:ascii="Arial" w:cs="Arial" w:eastAsia="Arial" w:hAnsi="Arial"/>
-                <w:color w:val="2B2B2B"/>
-                <w:sz w:val="20"/>
-                <w:szCs w:val="20"/>
-              </w:rPr>
-              <w:t xml:space="preserve"> </w:t>
-            </w:r>
-          </w:p>
-        </w:tc>
-      </w:tr>
-    </w:tbl>
-    <w:p>
-      <w:pPr>
-        <w:spacing w:after="120"/>
-      </w:pPr>
-    </w:p>
-    <w:p>
-      <w:pPr>
-        <w:pStyle w:val="Heading2"/>
-        <w:spacing w:after="100" w:before="280"/>
-      </w:pPr>
-      <w:r>
-        <w:rPr>
-          <w:rFonts w:ascii="Arial" w:cs="Arial" w:eastAsia="Arial" w:hAnsi="Arial"/>
-          <w:b/>
-          <w:bCs/>
-          <w:color w:val="0E7C66"/>
-          <w:sz w:val="23"/>
-          <w:szCs w:val="23"/>
-        </w:rPr>
-        <w:t xml:space="preserve">8.5 — Free-form notes</w:t>
-      </w:r>
-    </w:p>
-    <w:p>
-      <w:pPr>
-        <w:pBdr>
-          <w:bottom w:val="single" w:color="BFBFBF" w:sz="4"/>
-        </w:pBdr>
-        <w:spacing w:before="260"/>
-      </w:pPr>
-      <w:r>
-        <w:rPr>
-          <w:rFonts w:ascii="Arial" w:cs="Arial" w:eastAsia="Arial" w:hAnsi="Arial"/>
-          <w:sz w:val="21"/>
-          <w:szCs w:val="21"/>
-        </w:rPr>
-        <w:t xml:space="preserve"> </w:t>
-      </w:r>
-    </w:p>
-    <w:p>
-      <w:pPr>
-        <w:pBdr>
-          <w:bottom w:val="single" w:color="BFBFBF" w:sz="4"/>
-        </w:pBdr>
-        <w:spacing w:before="260"/>
-      </w:pPr>
-      <w:r>
-        <w:rPr>
-          <w:rFonts w:ascii="Arial" w:cs="Arial" w:eastAsia="Arial" w:hAnsi="Arial"/>
-          <w:sz w:val="21"/>
-          <w:szCs w:val="21"/>
-        </w:rPr>
-        <w:t xml:space="preserve"> </w:t>
-      </w:r>
-    </w:p>
-    <w:p>
-      <w:pPr>
-        <w:pBdr>
-          <w:bottom w:val="single" w:color="BFBFBF" w:sz="4"/>
-        </w:pBdr>
-        <w:spacing w:before="260"/>
-      </w:pPr>
-      <w:r>
-        <w:rPr>
-          <w:rFonts w:ascii="Arial" w:cs="Arial" w:eastAsia="Arial" w:hAnsi="Arial"/>
-          <w:sz w:val="21"/>
-          <w:szCs w:val="21"/>
-        </w:rPr>
-        <w:t xml:space="preserve"> </w:t>
-      </w:r>
-    </w:p>
-    <w:p>
-      <w:pPr>
-        <w:pBdr>
-          <w:bottom w:val="single" w:color="BFBFBF" w:sz="4"/>
-        </w:pBdr>
-        <w:spacing w:before="260"/>
-      </w:pPr>
-      <w:r>
-        <w:rPr>
-          <w:rFonts w:ascii="Arial" w:cs="Arial" w:eastAsia="Arial" w:hAnsi="Arial"/>
-          <w:sz w:val="21"/>
-          <w:szCs w:val="21"/>
-        </w:rPr>
-        <w:t xml:space="preserve"> </w:t>
-      </w:r>
-    </w:p>
-    <w:p>
-      <w:pPr>
-        <w:pBdr>
-          <w:bottom w:val="single" w:color="BFBFBF" w:sz="4"/>
-        </w:pBdr>
-        <w:spacing w:before="260"/>
-      </w:pPr>
-      <w:r>
-        <w:rPr>
-          <w:rFonts w:ascii="Arial" w:cs="Arial" w:eastAsia="Arial" w:hAnsi="Arial"/>
-          <w:sz w:val="21"/>
-          <w:szCs w:val="21"/>
-        </w:rPr>
-        <w:t xml:space="preserve"> </w:t>
-      </w:r>
-    </w:p>
-    <w:p>
-      <w:pPr>
-        <w:pBdr>
-          <w:bottom w:val="single" w:color="BFBFBF" w:sz="4"/>
-        </w:pBdr>
-        <w:spacing w:before="260"/>
-      </w:pPr>
-      <w:r>
-        <w:rPr>
-          <w:rFonts w:ascii="Arial" w:cs="Arial" w:eastAsia="Arial" w:hAnsi="Arial"/>
-          <w:sz w:val="21"/>
-          <w:szCs w:val="21"/>
-        </w:rPr>
-        <w:t xml:space="preserve"> </w:t>
-      </w:r>
-    </w:p>
-    <w:p>
-      <w:pPr>
-        <w:pBdr>
-          <w:bottom w:val="single" w:color="BFBFBF" w:sz="4"/>
-        </w:pBdr>
-        <w:spacing w:before="260"/>
-      </w:pPr>
-      <w:r>
-        <w:rPr>
-          <w:rFonts w:ascii="Arial" w:cs="Arial" w:eastAsia="Arial" w:hAnsi="Arial"/>
-          <w:sz w:val="21"/>
-          <w:szCs w:val="21"/>
-        </w:rPr>
-        <w:t xml:space="preserve"> </w:t>
-      </w:r>
-    </w:p>
-    <w:p>
-      <w:pPr>
-        <w:pBdr>
-          <w:bottom w:val="single" w:color="BFBFBF" w:sz="4"/>
-        </w:pBdr>
-        <w:spacing w:before="260"/>
-      </w:pPr>
-      <w:r>
-        <w:rPr>
-          <w:rFonts w:ascii="Arial" w:cs="Arial" w:eastAsia="Arial" w:hAnsi="Arial"/>
-          <w:sz w:val="21"/>
-          <w:szCs w:val="21"/>
-        </w:rPr>
-        <w:t xml:space="preserve"> </w:t>
-      </w:r>
-    </w:p>
-    <w:p>
-      <w:pPr>
-        <w:pBdr>
-          <w:bottom w:val="single" w:color="BFBFBF" w:sz="4"/>
-        </w:pBdr>
-        <w:spacing w:before="260"/>
-      </w:pPr>
-      <w:r>
-        <w:rPr>
-          <w:rFonts w:ascii="Arial" w:cs="Arial" w:eastAsia="Arial" w:hAnsi="Arial"/>
-          <w:sz w:val="21"/>
-          <w:szCs w:val="21"/>
-        </w:rPr>
-        <w:t xml:space="preserve"> </w:t>
-      </w:r>
-    </w:p>
-    <w:p>
-      <w:pPr>
-        <w:pBdr>
-          <w:bottom w:val="single" w:color="BFBFBF" w:sz="4"/>
-        </w:pBdr>
-        <w:spacing w:before="260"/>
-      </w:pPr>
-      <w:r>
-        <w:rPr>
-          <w:rFonts w:ascii="Arial" w:cs="Arial" w:eastAsia="Arial" w:hAnsi="Arial"/>
-          <w:sz w:val="21"/>
-          <w:szCs w:val="21"/>
-        </w:rPr>
-        <w:t xml:space="preserve"> </w:t>
-      </w:r>
-    </w:p>
     <w:sectPr>
       <w:footerReference w:type="default" r:id="rId7"/>
       <w:pgSz w:w="11906" w:h="16838" w:orient="portrait"/>

</xml_diff>

<commit_message>
Chapter 8: use the GIS analyst's verbatim wording
</commit_message>
<xml_diff>
--- a/docs/LaGrange-Parking-Developer-Guide.docx
+++ b/docs/LaGrange-Parking-Developer-Guide.docx
@@ -236,7 +236,7 @@
         <w:spacing w:after="70"/>
         <w:jc w:val="center"/>
       </w:pPr>
-      <w:hyperlink w:history="1" r:id="rIdwyplfmkdtama7-2ov21ny">
+      <w:hyperlink w:history="1" r:id="rId8hlw_oj9icpved9-4xerd">
         <w:r>
           <w:rPr>
             <w:rFonts w:ascii="Arial" w:cs="Arial" w:eastAsia="Arial" w:hAnsi="Arial"/>
@@ -254,7 +254,7 @@
         <w:spacing w:after="220"/>
         <w:jc w:val="center"/>
       </w:pPr>
-      <w:hyperlink w:history="1" r:id="rIdxsaeen9c8epfpk4gn_pkl">
+      <w:hyperlink w:history="1" r:id="rIdouoiiflkj0iqnnq3foad9">
         <w:r>
           <w:rPr>
             <w:rFonts w:ascii="Arial" w:cs="Arial" w:eastAsia="Arial" w:hAnsi="Arial"/>
@@ -2213,7 +2213,7 @@
             </w:tcMar>
           </w:tcPr>
           <w:p>
-            <w:hyperlink w:history="1" r:id="rIden_zktv4_lcrnkyquxjyo">
+            <w:hyperlink w:history="1" r:id="rId1tjas0cnfsv_vd484_ss9">
               <w:r>
                 <w:rPr>
                   <w:rFonts w:ascii="Arial" w:cs="Arial" w:eastAsia="Arial" w:hAnsi="Arial"/>
@@ -2334,7 +2334,7 @@
             </w:tcMar>
           </w:tcPr>
           <w:p>
-            <w:hyperlink w:history="1" r:id="rId7llmofgjygenhv0atbmeo">
+            <w:hyperlink w:history="1" r:id="rId1dvs0y1cr6qk-6ddpl4tp">
               <w:r>
                 <w:rPr>
                   <w:rFonts w:ascii="Arial" w:cs="Arial" w:eastAsia="Arial" w:hAnsi="Arial"/>
@@ -8454,7 +8454,7 @@
           <w:sz w:val="21"/>
           <w:szCs w:val="21"/>
         </w:rPr>
-        <w:t xml:space="preserve">The GIS side of the project — who is involved, where every source lives, how data flows to the apps, and the decisions that shaped the deliverable. Maintained by the GIS analyst; the running log is </w:t>
+        <w:t xml:space="preserve">The GIS side of the project, as documented by the GIS analyst. The running log is </w:t>
       </w:r>
       <w:r>
         <w:rPr>
@@ -8489,7 +8489,7 @@
           <w:sz w:val="23"/>
           <w:szCs w:val="23"/>
         </w:rPr>
-        <w:t xml:space="preserve">8.1 — Client outcome</w:t>
+        <w:t xml:space="preserve">8.1 — Project overview</w:t>
       </w:r>
     </w:p>
     <w:tbl>
@@ -8537,7 +8537,7 @@
                 <w:sz w:val="21"/>
                 <w:szCs w:val="21"/>
               </w:rPr>
-              <w:t xml:space="preserve">◎  What the Village gets</w:t>
+              <w:t xml:space="preserve">◎  Client outcome</w:t>
             </w:r>
           </w:p>
           <w:p>
@@ -8575,7 +8575,7 @@
           <w:sz w:val="21"/>
           <w:szCs w:val="21"/>
         </w:rPr>
-        <w:t xml:space="preserve">Deliverable: </w:t>
+        <w:t xml:space="preserve">Deliverable description. </w:t>
       </w:r>
       <w:r>
         <w:rPr>
@@ -8584,12 +8584,31 @@
           <w:sz w:val="21"/>
           <w:szCs w:val="21"/>
         </w:rPr>
-        <w:t xml:space="preserve">two public, mobile-friendly parking maps from one React codebase, deployed as separate Azure Static Web Apps, both reading one publicly shared ArcGIS Online feature service — no login. Supporting GIS work: the Village’s flat parking inventory restructured into a related area-and-rule model, published to the Village’s AGOL organization with the designated overnight-resident areas digitized from engineering drawings.</w:t>
+        <w:t xml:space="preserve">Two public, mobile-friendly parking map applications, built from one React codebase and deployed as separate Azure Static Web Apps. Both read a single publicly shared ArcGIS Online feature service; neither requires a login.</w:t>
       </w:r>
     </w:p>
     <w:p>
       <w:pPr>
         <w:spacing w:after="120"/>
+      </w:pPr>
+      <w:r>
+        <w:rPr>
+          <w:rFonts w:ascii="Arial" w:cs="Arial" w:eastAsia="Arial" w:hAnsi="Arial"/>
+          <w:color w:val="2B2B2B"/>
+          <w:sz w:val="21"/>
+          <w:szCs w:val="21"/>
+        </w:rPr>
+        <w:t xml:space="preserve">Supporting GIS work: the Village’s flat parking inventory restructured into a related area-and-rule model, published to the Village’s ArcGIS Online organization along with the designated overnight-resident parking areas digitized from Village engineering drawings.</w:t>
+      </w:r>
+    </w:p>
+    <w:p>
+      <w:pPr>
+        <w:pStyle w:val="ListParagraph"/>
+        <w:numPr>
+          <w:ilvl w:val="0"/>
+          <w:numId w:val="1"/>
+        </w:numPr>
+        <w:spacing w:after="60"/>
       </w:pPr>
       <w:r>
         <w:rPr>
@@ -8600,8 +8619,20 @@
           <w:sz w:val="21"/>
           <w:szCs w:val="21"/>
         </w:rPr>
-        <w:t xml:space="preserve">Status (2026-08-05): </w:t>
+        <w:t xml:space="preserve">Permit app — </w:t>
       </w:r>
+      <w:hyperlink w:history="1" r:id="rIdz6frf5doliqhure0c9es4">
+        <w:r>
+          <w:rPr>
+            <w:rFonts w:ascii="Arial" w:cs="Arial" w:eastAsia="Arial" w:hAnsi="Arial"/>
+            <w:color w:val="2E74B5"/>
+            <w:sz w:val="21"/>
+            <w:szCs w:val="21"/>
+            <w:u w:val="single"/>
+          </w:rPr>
+          <w:t xml:space="preserve">https://mango-cliff-087d26410.7.azurestaticapps.net</w:t>
+        </w:r>
+      </w:hyperlink>
       <w:r>
         <w:rPr>
           <w:rFonts w:ascii="Arial" w:cs="Arial" w:eastAsia="Arial" w:hAnsi="Arial"/>
@@ -8609,12 +8640,17 @@
           <w:sz w:val="21"/>
           <w:szCs w:val="21"/>
         </w:rPr>
-        <w:t xml:space="preserve">both apps live, in an iterate-on-feedback phase. Every item from the 2026-07-28 stakeholder meeting is complete. Open items wait on the Village — the real permit purchase URL, a landing-page cover photo, and the missing engineering sheet for the Village Hall garage.</w:t>
+        <w:t xml:space="preserve"> — four permit-type pages: Resident Overnight Only, Resident Day/Night (24 hr.), Commuter &amp; LTHS Students, Employees.</w:t>
       </w:r>
     </w:p>
     <w:p>
       <w:pPr>
-        <w:spacing w:after="120"/>
+        <w:pStyle w:val="ListParagraph"/>
+        <w:numPr>
+          <w:ilvl w:val="0"/>
+          <w:numId w:val="1"/>
+        </w:numPr>
+        <w:spacing w:after="60"/>
       </w:pPr>
       <w:r>
         <w:rPr>
@@ -8625,7 +8661,49 @@
           <w:sz w:val="21"/>
           <w:szCs w:val="21"/>
         </w:rPr>
-        <w:t xml:space="preserve">Timeline: </w:t>
+        <w:t xml:space="preserve">Public app — </w:t>
+      </w:r>
+      <w:hyperlink w:history="1" r:id="rIdcqq1-q7hd-c5ywumq-r-v">
+        <w:r>
+          <w:rPr>
+            <w:rFonts w:ascii="Arial" w:cs="Arial" w:eastAsia="Arial" w:hAnsi="Arial"/>
+            <w:color w:val="2E74B5"/>
+            <w:sz w:val="21"/>
+            <w:szCs w:val="21"/>
+            <w:u w:val="single"/>
+          </w:rPr>
+          <w:t xml:space="preserve">https://ashy-mud-0b906db10.7.azurestaticapps.net</w:t>
+        </w:r>
+      </w:hyperlink>
+      <w:r>
+        <w:rPr>
+          <w:rFonts w:ascii="Arial" w:cs="Arial" w:eastAsia="Arial" w:hAnsi="Arial"/>
+          <w:color w:val="2B2B2B"/>
+          <w:sz w:val="21"/>
+          <w:szCs w:val="21"/>
+        </w:rPr>
+        <w:t xml:space="preserve"> — visitor, shopper and diner parking colored by time limit. Contains no permit content.</w:t>
+      </w:r>
+    </w:p>
+    <w:p>
+      <w:pPr>
+        <w:spacing w:after="60"/>
+      </w:pPr>
+    </w:p>
+    <w:p>
+      <w:pPr>
+        <w:spacing w:after="120"/>
+      </w:pPr>
+      <w:r>
+        <w:rPr>
+          <w:rFonts w:ascii="Arial" w:cs="Arial" w:eastAsia="Arial" w:hAnsi="Arial"/>
+          <w:b/>
+          <w:bCs/>
+          <w:color w:val="2B2B2B"/>
+          <w:sz w:val="21"/>
+          <w:szCs w:val="21"/>
+        </w:rPr>
+        <w:t xml:space="preserve">Status as of 2026-08-05: </w:t>
       </w:r>
       <w:r>
         <w:rPr>
@@ -8634,7 +8712,32 @@
           <w:sz w:val="21"/>
           <w:szCs w:val="21"/>
         </w:rPr>
-        <w:t xml:space="preserve">Village’s stated program go-live was end of June 2026; MGP follows Charity Jones’s lead on timing. MGP hours: TBD.</w:t>
+        <w:t xml:space="preserve">both apps are live and in an iterate-on-feedback phase with the Village. Nothing is in flight. Every item from the 2026-07-28 stakeholder meeting is complete, including the designated overnight areas that went live 2026-07-29. Remaining open items are waiting on the Village — principally the real permit purchase URL (the apply button currently points at the Village homepage), a landing-page cover photo, and the missing engineering sheet for the Village Hall garage.</w:t>
+      </w:r>
+    </w:p>
+    <w:p>
+      <w:pPr>
+        <w:spacing w:after="120"/>
+      </w:pPr>
+      <w:r>
+        <w:rPr>
+          <w:rFonts w:ascii="Arial" w:cs="Arial" w:eastAsia="Arial" w:hAnsi="Arial"/>
+          <w:b/>
+          <w:bCs/>
+          <w:color w:val="2B2B2B"/>
+          <w:sz w:val="21"/>
+          <w:szCs w:val="21"/>
+        </w:rPr>
+        <w:t xml:space="preserve">Timeline. </w:t>
+      </w:r>
+      <w:r>
+        <w:rPr>
+          <w:rFonts w:ascii="Arial" w:cs="Arial" w:eastAsia="Arial" w:hAnsi="Arial"/>
+          <w:color w:val="2B2B2B"/>
+          <w:sz w:val="21"/>
+          <w:szCs w:val="21"/>
+        </w:rPr>
+        <w:t xml:space="preserve">Due Date: The Village’s originally stated parking program go-live was the end of June 2026; MGP is following Charity Jones’s lead on timing. MGP Hours: TBD.</w:t>
       </w:r>
     </w:p>
     <w:p>
@@ -8789,7 +8892,7 @@
                 <w:sz w:val="20"/>
                 <w:szCs w:val="20"/>
               </w:rPr>
-              <w:t xml:space="preserve">Village of La Grange, Assistant Village Manager — primary contact and reviewer; all design and content decisions route through her</w:t>
+              <w:t xml:space="preserve">Village of La Grange, Assistant Village Manager. Primary contact and reviewer; all design and content decisions route through her.</w:t>
             </w:r>
           </w:p>
         </w:tc>
@@ -8851,7 +8954,7 @@
                 <w:sz w:val="20"/>
                 <w:szCs w:val="20"/>
               </w:rPr>
-              <w:t xml:space="preserve">Village of La Grange — stakeholder</w:t>
+              <w:t xml:space="preserve">Village of La Grange, stakeholder.</w:t>
             </w:r>
           </w:p>
         </w:tc>
@@ -8911,7 +9014,7 @@
                 <w:sz w:val="20"/>
                 <w:szCs w:val="20"/>
               </w:rPr>
-              <w:t xml:space="preserve">ArcGIS Pro · ArcGIS Online · ArcGIS Maps SDK for JavaScript</w:t>
+              <w:t xml:space="preserve">ArcGIS Pro, ArcGIS Online, ArcGIS Maps SDK for JavaScript.</w:t>
             </w:r>
           </w:p>
         </w:tc>
@@ -8973,7 +9076,7 @@
                 <w:sz w:val="20"/>
                 <w:szCs w:val="20"/>
               </w:rPr>
-              <w:t xml:space="preserve">The Village’s parking permit system — source of the eligibility list</w:t>
+              <w:t xml:space="preserve">The Village’s parking permit system; source of the eligibility list.</w:t>
             </w:r>
           </w:p>
         </w:tc>
@@ -9033,7 +9136,7 @@
                 <w:sz w:val="20"/>
                 <w:szCs w:val="20"/>
               </w:rPr>
-              <w:t xml:space="preserve">Static Web Apps hosting for both applications</w:t>
+              <w:t xml:space="preserve">Static Web Apps hosting for both applications.</w:t>
             </w:r>
           </w:p>
         </w:tc>
@@ -9058,7 +9161,21 @@
           <w:sz w:val="23"/>
           <w:szCs w:val="23"/>
         </w:rPr>
-        <w:t xml:space="preserve">8.3 — Data lineage</w:t>
+        <w:t xml:space="preserve">8.3 — Changing the data, and the trap to avoid</w:t>
+      </w:r>
+    </w:p>
+    <w:p>
+      <w:pPr>
+        <w:spacing w:after="120"/>
+      </w:pPr>
+      <w:r>
+        <w:rPr>
+          <w:rFonts w:ascii="Arial" w:cs="Arial" w:eastAsia="Arial" w:hAnsi="Arial"/>
+          <w:color w:val="2B2B2B"/>
+          <w:sz w:val="21"/>
+          <w:szCs w:val="21"/>
+        </w:rPr>
+        <w:t xml:space="preserve">Data flows LGDM → file geodatabase → hosted service → apps.</w:t>
       </w:r>
     </w:p>
     <w:tbl>
@@ -9268,7 +9385,7 @@
                 <w:sz w:val="22"/>
                 <w:szCs w:val="22"/>
               </w:rPr>
-              <w:t xml:space="preserve">AGOL SERVICE</w:t>
+              <w:t xml:space="preserve">HOSTED SERVICE</w:t>
             </w:r>
           </w:p>
           <w:p>
@@ -9415,7 +9532,7 @@
                 <w:sz w:val="21"/>
                 <w:szCs w:val="21"/>
               </w:rPr>
-              <w:t xml:space="preserve">⛔  The trap — edit the LGDM, not the geodatabase</w:t>
+              <w:t xml:space="preserve">⛔  The trap to avoid</w:t>
             </w:r>
           </w:p>
           <w:p>
@@ -9429,1960 +9546,25 @@
                 <w:sz w:val="21"/>
                 <w:szCs w:val="21"/>
               </w:rPr>
-              <w:t xml:space="preserve">Editing the file geodatabase alone is </w:t>
-            </w:r>
-            <w:r>
-              <w:rPr>
-                <w:rFonts w:ascii="Arial" w:cs="Arial" w:eastAsia="Arial" w:hAnsi="Arial"/>
-                <w:b/>
-                <w:bCs/>
+              <w:t xml:space="preserve">Editing the geodatabase alone is not durable: </w:t>
+            </w:r>
+            <w:r>
+              <w:rPr>
+                <w:rFonts w:ascii="Consolas" w:cs="Consolas" w:eastAsia="Consolas" w:hAnsi="Consolas"/>
+                <w:color w:val="2B2B2B"/>
+                <w:sz w:val="19"/>
+                <w:szCs w:val="19"/>
+              </w:rPr>
+              <w:t xml:space="preserve">lagrange_build_fgdb.py</w:t>
+            </w:r>
+            <w:r>
+              <w:rPr>
+                <w:rFonts w:ascii="Arial" w:cs="Arial" w:eastAsia="Arial" w:hAnsi="Arial"/>
                 <w:color w:val="2B2B2B"/>
                 <w:sz w:val="21"/>
                 <w:szCs w:val="21"/>
               </w:rPr>
-              <w:t xml:space="preserve">not durable</w:t>
-            </w:r>
-            <w:r>
-              <w:rPr>
-                <w:rFonts w:ascii="Arial" w:cs="Arial" w:eastAsia="Arial" w:hAnsi="Arial"/>
-                <w:color w:val="2B2B2B"/>
-                <w:sz w:val="21"/>
-                <w:szCs w:val="21"/>
-              </w:rPr>
-              <w:t xml:space="preserve">: </w:t>
-            </w:r>
-            <w:r>
-              <w:rPr>
-                <w:rFonts w:ascii="Consolas" w:cs="Consolas" w:eastAsia="Consolas" w:hAnsi="Consolas"/>
-                <w:color w:val="2B2B2B"/>
-                <w:sz w:val="19"/>
-                <w:szCs w:val="19"/>
-              </w:rPr>
-              <w:t xml:space="preserve">lagrange_build_fgdb.py</w:t>
-            </w:r>
-            <w:r>
-              <w:rPr>
-                <w:rFonts w:ascii="Arial" w:cs="Arial" w:eastAsia="Arial" w:hAnsi="Arial"/>
-                <w:color w:val="2B2B2B"/>
-                <w:sz w:val="21"/>
-                <w:szCs w:val="21"/>
-              </w:rPr>
-              <w:t xml:space="preserve"> rebuilds ParkingArea and ParkingRule from the LGDM, so anything added only to the geodatabase is lost on the next rebuild. </w:t>
-            </w:r>
-            <w:r>
-              <w:rPr>
-                <w:rFonts w:ascii="Arial" w:cs="Arial" w:eastAsia="Arial" w:hAnsi="Arial"/>
-                <w:b/>
-                <w:bCs/>
-                <w:color w:val="2B2B2B"/>
-                <w:sz w:val="21"/>
-                <w:szCs w:val="21"/>
-              </w:rPr>
-              <w:t xml:space="preserve">Lot 15 is in that state today.</w:t>
-            </w:r>
-            <w:r>
-              <w:rPr>
-                <w:rFonts w:ascii="Arial" w:cs="Arial" w:eastAsia="Arial" w:hAnsi="Arial"/>
-                <w:color w:val="2B2B2B"/>
-                <w:sz w:val="21"/>
-                <w:szCs w:val="21"/>
-              </w:rPr>
-              <w:t xml:space="preserve"> Real changes go into the LGDM first, then rebuild and republish.</w:t>
-            </w:r>
-          </w:p>
-        </w:tc>
-      </w:tr>
-    </w:tbl>
-    <w:p>
-      <w:pPr>
-        <w:spacing w:after="120"/>
-      </w:pPr>
-    </w:p>
-    <w:tbl>
-      <w:tblPr>
-        <w:tblW w:type="pct" w:w="100%"/>
-        <w:tblBorders>
-          <w:top w:val="single" w:color="auto" w:sz="4"/>
-          <w:left w:val="single" w:color="auto" w:sz="4"/>
-          <w:bottom w:val="single" w:color="auto" w:sz="4"/>
-          <w:right w:val="single" w:color="auto" w:sz="4"/>
-          <w:insideH w:val="single" w:color="auto" w:sz="4"/>
-          <w:insideV w:val="single" w:color="auto" w:sz="4"/>
-        </w:tblBorders>
-      </w:tblPr>
-      <w:tblGrid>
-        <w:gridCol w:w="100"/>
-        <w:gridCol w:w="100"/>
-        <w:gridCol w:w="100"/>
-      </w:tblGrid>
-      <w:tr>
-        <w:tc>
-          <w:tcPr>
-            <w:tcW w:type="pct" w:w="20%"/>
-            <w:tcBorders>
-              <w:top w:val="single" w:color="D9D9D9" w:sz="4"/>
-              <w:left w:val="single" w:color="D9D9D9" w:sz="4"/>
-              <w:bottom w:val="single" w:color="D9D9D9" w:sz="4"/>
-              <w:right w:val="single" w:color="D9D9D9" w:sz="4"/>
-            </w:tcBorders>
-            <w:shd w:fill="0E7C66" w:val="clear"/>
-            <w:tcMar>
-              <w:top w:type="dxa" w:w="80"/>
-              <w:left w:type="dxa" w:w="120"/>
-              <w:bottom w:type="dxa" w:w="80"/>
-              <w:right w:type="dxa" w:w="120"/>
-            </w:tcMar>
-          </w:tcPr>
-          <w:p>
-            <w:r>
-              <w:rPr>
-                <w:rFonts w:ascii="Arial" w:cs="Arial" w:eastAsia="Arial" w:hAnsi="Arial"/>
-                <w:b/>
-                <w:bCs/>
-                <w:color w:val="FFFFFF"/>
-                <w:sz w:val="20"/>
-                <w:szCs w:val="20"/>
-              </w:rPr>
-              <w:t xml:space="preserve">Layer / resource</w:t>
-            </w:r>
-          </w:p>
-        </w:tc>
-        <w:tc>
-          <w:tcPr>
-            <w:tcW w:type="pct" w:w="40%"/>
-            <w:tcBorders>
-              <w:top w:val="single" w:color="D9D9D9" w:sz="4"/>
-              <w:left w:val="single" w:color="D9D9D9" w:sz="4"/>
-              <w:bottom w:val="single" w:color="D9D9D9" w:sz="4"/>
-              <w:right w:val="single" w:color="D9D9D9" w:sz="4"/>
-            </w:tcBorders>
-            <w:shd w:fill="0E7C66" w:val="clear"/>
-            <w:tcMar>
-              <w:top w:type="dxa" w:w="80"/>
-              <w:left w:type="dxa" w:w="120"/>
-              <w:bottom w:type="dxa" w:w="80"/>
-              <w:right w:type="dxa" w:w="120"/>
-            </w:tcMar>
-          </w:tcPr>
-          <w:p>
-            <w:r>
-              <w:rPr>
-                <w:rFonts w:ascii="Arial" w:cs="Arial" w:eastAsia="Arial" w:hAnsi="Arial"/>
-                <w:b/>
-                <w:bCs/>
-                <w:color w:val="FFFFFF"/>
-                <w:sz w:val="20"/>
-                <w:szCs w:val="20"/>
-              </w:rPr>
-              <w:t xml:space="preserve">Where</w:t>
-            </w:r>
-          </w:p>
-        </w:tc>
-        <w:tc>
-          <w:tcPr>
-            <w:tcW w:type="pct" w:w="40%"/>
-            <w:tcBorders>
-              <w:top w:val="single" w:color="D9D9D9" w:sz="4"/>
-              <w:left w:val="single" w:color="D9D9D9" w:sz="4"/>
-              <w:bottom w:val="single" w:color="D9D9D9" w:sz="4"/>
-              <w:right w:val="single" w:color="D9D9D9" w:sz="4"/>
-            </w:tcBorders>
-            <w:shd w:fill="0E7C66" w:val="clear"/>
-            <w:tcMar>
-              <w:top w:type="dxa" w:w="80"/>
-              <w:left w:type="dxa" w:w="120"/>
-              <w:bottom w:type="dxa" w:w="80"/>
-              <w:right w:type="dxa" w:w="120"/>
-            </w:tcMar>
-          </w:tcPr>
-          <w:p>
-            <w:r>
-              <w:rPr>
-                <w:rFonts w:ascii="Arial" w:cs="Arial" w:eastAsia="Arial" w:hAnsi="Arial"/>
-                <w:b/>
-                <w:bCs/>
-                <w:color w:val="FFFFFF"/>
-                <w:sz w:val="20"/>
-                <w:szCs w:val="20"/>
-              </w:rPr>
-              <w:t xml:space="preserve">Notes</w:t>
-            </w:r>
-          </w:p>
-        </w:tc>
-      </w:tr>
-      <w:tr>
-        <w:tc>
-          <w:tcPr>
-            <w:tcW w:type="pct" w:w="20%"/>
-            <w:tcBorders>
-              <w:top w:val="single" w:color="D9D9D9" w:sz="4"/>
-              <w:left w:val="single" w:color="D9D9D9" w:sz="4"/>
-              <w:bottom w:val="single" w:color="D9D9D9" w:sz="4"/>
-              <w:right w:val="single" w:color="D9D9D9" w:sz="4"/>
-            </w:tcBorders>
-            <w:tcMar>
-              <w:top w:type="dxa" w:w="80"/>
-              <w:left w:type="dxa" w:w="120"/>
-              <w:bottom w:type="dxa" w:w="80"/>
-              <w:right w:type="dxa" w:w="120"/>
-            </w:tcMar>
-          </w:tcPr>
-          <w:p>
-            <w:r>
-              <w:rPr>
-                <w:rFonts w:ascii="Arial" w:cs="Arial" w:eastAsia="Arial" w:hAnsi="Arial"/>
-                <w:b/>
-                <w:bCs/>
-                <w:color w:val="2B2B2B"/>
-                <w:sz w:val="21"/>
-                <w:szCs w:val="21"/>
-              </w:rPr>
-              <w:t xml:space="preserve">Source of record</w:t>
-            </w:r>
-          </w:p>
-        </w:tc>
-        <w:tc>
-          <w:tcPr>
-            <w:tcW w:type="pct" w:w="40%"/>
-            <w:tcBorders>
-              <w:top w:val="single" w:color="D9D9D9" w:sz="4"/>
-              <w:left w:val="single" w:color="D9D9D9" w:sz="4"/>
-              <w:bottom w:val="single" w:color="D9D9D9" w:sz="4"/>
-              <w:right w:val="single" w:color="D9D9D9" w:sz="4"/>
-            </w:tcBorders>
-            <w:tcMar>
-              <w:top w:type="dxa" w:w="80"/>
-              <w:left w:type="dxa" w:w="120"/>
-              <w:bottom w:type="dxa" w:w="80"/>
-              <w:right w:type="dxa" w:w="120"/>
-            </w:tcMar>
-          </w:tcPr>
-          <w:p>
-            <w:r>
-              <w:rPr>
-                <w:rFonts w:ascii="Consolas" w:cs="Consolas" w:eastAsia="Consolas" w:hAnsi="Consolas"/>
-                <w:color w:val="2B2B2B"/>
-                <w:sz w:val="19"/>
-                <w:szCs w:val="19"/>
-              </w:rPr>
-              <w:t xml:space="preserve">mgp-sql02 › GISC_PRODUCTION › DBO.Parking_Restriction_POLY</w:t>
-            </w:r>
-          </w:p>
-        </w:tc>
-        <w:tc>
-          <w:tcPr>
-            <w:tcW w:type="pct" w:w="40%"/>
-            <w:tcBorders>
-              <w:top w:val="single" w:color="D9D9D9" w:sz="4"/>
-              <w:left w:val="single" w:color="D9D9D9" w:sz="4"/>
-              <w:bottom w:val="single" w:color="D9D9D9" w:sz="4"/>
-              <w:right w:val="single" w:color="D9D9D9" w:sz="4"/>
-            </w:tcBorders>
-            <w:tcMar>
-              <w:top w:type="dxa" w:w="80"/>
-              <w:left w:type="dxa" w:w="120"/>
-              <w:bottom w:type="dxa" w:w="80"/>
-              <w:right w:type="dxa" w:w="120"/>
-            </w:tcMar>
-          </w:tcPr>
-          <w:p>
-            <w:r>
-              <w:rPr>
-                <w:rFonts w:ascii="Arial" w:cs="Arial" w:eastAsia="Arial" w:hAnsi="Arial"/>
-                <w:color w:val="2B2B2B"/>
-                <w:sz w:val="20"/>
-                <w:szCs w:val="20"/>
-              </w:rPr>
-              <w:t xml:space="preserve">GEODBID ‘024’. The Village’s authoritative parking inventory and the origin of everything below. Edited in ArcGIS Pro.</w:t>
-            </w:r>
-          </w:p>
-        </w:tc>
-      </w:tr>
-      <w:tr>
-        <w:tc>
-          <w:tcPr>
-            <w:tcW w:type="pct" w:w="20%"/>
-            <w:tcBorders>
-              <w:top w:val="single" w:color="D9D9D9" w:sz="4"/>
-              <w:left w:val="single" w:color="D9D9D9" w:sz="4"/>
-              <w:bottom w:val="single" w:color="D9D9D9" w:sz="4"/>
-              <w:right w:val="single" w:color="D9D9D9" w:sz="4"/>
-            </w:tcBorders>
-            <w:shd w:fill="F2F7FB" w:val="clear"/>
-            <w:tcMar>
-              <w:top w:type="dxa" w:w="80"/>
-              <w:left w:type="dxa" w:w="120"/>
-              <w:bottom w:type="dxa" w:w="80"/>
-              <w:right w:type="dxa" w:w="120"/>
-            </w:tcMar>
-          </w:tcPr>
-          <w:p>
-            <w:r>
-              <w:rPr>
-                <w:rFonts w:ascii="Arial" w:cs="Arial" w:eastAsia="Arial" w:hAnsi="Arial"/>
-                <w:b/>
-                <w:bCs/>
-                <w:color w:val="2B2B2B"/>
-                <w:sz w:val="21"/>
-                <w:szCs w:val="21"/>
-              </w:rPr>
-              <w:t xml:space="preserve">Working geodatabase</w:t>
-            </w:r>
-          </w:p>
-        </w:tc>
-        <w:tc>
-          <w:tcPr>
-            <w:tcW w:type="pct" w:w="40%"/>
-            <w:tcBorders>
-              <w:top w:val="single" w:color="D9D9D9" w:sz="4"/>
-              <w:left w:val="single" w:color="D9D9D9" w:sz="4"/>
-              <w:bottom w:val="single" w:color="D9D9D9" w:sz="4"/>
-              <w:right w:val="single" w:color="D9D9D9" w:sz="4"/>
-            </w:tcBorders>
-            <w:shd w:fill="F2F7FB" w:val="clear"/>
-            <w:tcMar>
-              <w:top w:type="dxa" w:w="80"/>
-              <w:left w:type="dxa" w:w="120"/>
-              <w:bottom w:type="dxa" w:w="80"/>
-              <w:right w:type="dxa" w:w="120"/>
-            </w:tcMar>
-          </w:tcPr>
-          <w:p>
-            <w:r>
-              <w:rPr>
-                <w:rFonts w:ascii="Consolas" w:cs="Consolas" w:eastAsia="Consolas" w:hAnsi="Consolas"/>
-                <w:color w:val="2B2B2B"/>
-                <w:sz w:val="19"/>
-                <w:szCs w:val="19"/>
-              </w:rPr>
-              <w:t xml:space="preserve">X:\GISC\Community\LaGrange\Project\20240829_ParkingPermitMaps\APRX\Parking_Permit_Restructure\ParkingPermits.gdb</w:t>
-            </w:r>
-          </w:p>
-        </w:tc>
-        <w:tc>
-          <w:tcPr>
-            <w:tcW w:type="pct" w:w="40%"/>
-            <w:tcBorders>
-              <w:top w:val="single" w:color="D9D9D9" w:sz="4"/>
-              <w:left w:val="single" w:color="D9D9D9" w:sz="4"/>
-              <w:bottom w:val="single" w:color="D9D9D9" w:sz="4"/>
-              <w:right w:val="single" w:color="D9D9D9" w:sz="4"/>
-            </w:tcBorders>
-            <w:shd w:fill="F2F7FB" w:val="clear"/>
-            <w:tcMar>
-              <w:top w:type="dxa" w:w="80"/>
-              <w:left w:type="dxa" w:w="120"/>
-              <w:bottom w:type="dxa" w:w="80"/>
-              <w:right w:type="dxa" w:w="120"/>
-            </w:tcMar>
-          </w:tcPr>
-          <w:p>
-            <w:r>
-              <w:rPr>
-                <w:rFonts w:ascii="Arial" w:cs="Arial" w:eastAsia="Arial" w:hAnsi="Arial"/>
-                <w:color w:val="2B2B2B"/>
-                <w:sz w:val="20"/>
-                <w:szCs w:val="20"/>
-              </w:rPr>
-              <w:t xml:space="preserve">ParkingArea, ParkingRule, OvernightResidentSubzones, PermitEligibleAddress, StudyZone + domains. Rebuilt from the LGDM by lagrange_build_fgdb.py.</w:t>
-            </w:r>
-          </w:p>
-        </w:tc>
-      </w:tr>
-      <w:tr>
-        <w:tc>
-          <w:tcPr>
-            <w:tcW w:type="pct" w:w="20%"/>
-            <w:tcBorders>
-              <w:top w:val="single" w:color="D9D9D9" w:sz="4"/>
-              <w:left w:val="single" w:color="D9D9D9" w:sz="4"/>
-              <w:bottom w:val="single" w:color="D9D9D9" w:sz="4"/>
-              <w:right w:val="single" w:color="D9D9D9" w:sz="4"/>
-            </w:tcBorders>
-            <w:tcMar>
-              <w:top w:type="dxa" w:w="80"/>
-              <w:left w:type="dxa" w:w="120"/>
-              <w:bottom w:type="dxa" w:w="80"/>
-              <w:right w:type="dxa" w:w="120"/>
-            </w:tcMar>
-          </w:tcPr>
-          <w:p>
-            <w:r>
-              <w:rPr>
-                <w:rFonts w:ascii="Arial" w:cs="Arial" w:eastAsia="Arial" w:hAnsi="Arial"/>
-                <w:b/>
-                <w:bCs/>
-                <w:color w:val="2B2B2B"/>
-                <w:sz w:val="21"/>
-                <w:szCs w:val="21"/>
-              </w:rPr>
-              <w:t xml:space="preserve">ArcGIS Pro project</w:t>
-            </w:r>
-          </w:p>
-        </w:tc>
-        <w:tc>
-          <w:tcPr>
-            <w:tcW w:type="pct" w:w="40%"/>
-            <w:tcBorders>
-              <w:top w:val="single" w:color="D9D9D9" w:sz="4"/>
-              <w:left w:val="single" w:color="D9D9D9" w:sz="4"/>
-              <w:bottom w:val="single" w:color="D9D9D9" w:sz="4"/>
-              <w:right w:val="single" w:color="D9D9D9" w:sz="4"/>
-            </w:tcBorders>
-            <w:tcMar>
-              <w:top w:type="dxa" w:w="80"/>
-              <w:left w:type="dxa" w:w="120"/>
-              <w:bottom w:type="dxa" w:w="80"/>
-              <w:right w:type="dxa" w:w="120"/>
-            </w:tcMar>
-          </w:tcPr>
-          <w:p>
-            <w:r>
-              <w:rPr>
-                <w:rFonts w:ascii="Consolas" w:cs="Consolas" w:eastAsia="Consolas" w:hAnsi="Consolas"/>
-                <w:color w:val="2B2B2B"/>
-                <w:sz w:val="19"/>
-                <w:szCs w:val="19"/>
-              </w:rPr>
-              <w:t xml:space="preserve">…\Parking_Permit_Restructure\Parking_Permit_Restructure.aprx</w:t>
-            </w:r>
-          </w:p>
-        </w:tc>
-        <w:tc>
-          <w:tcPr>
-            <w:tcW w:type="pct" w:w="40%"/>
-            <w:tcBorders>
-              <w:top w:val="single" w:color="D9D9D9" w:sz="4"/>
-              <w:left w:val="single" w:color="D9D9D9" w:sz="4"/>
-              <w:bottom w:val="single" w:color="D9D9D9" w:sz="4"/>
-              <w:right w:val="single" w:color="D9D9D9" w:sz="4"/>
-            </w:tcBorders>
-            <w:tcMar>
-              <w:top w:type="dxa" w:w="80"/>
-              <w:left w:type="dxa" w:w="120"/>
-              <w:bottom w:type="dxa" w:w="80"/>
-              <w:right w:type="dxa" w:w="120"/>
-            </w:tcMar>
-          </w:tcPr>
-          <w:p>
-            <w:r>
-              <w:rPr>
-                <w:rFonts w:ascii="Arial" w:cs="Arial" w:eastAsia="Arial" w:hAnsi="Arial"/>
-                <w:color w:val="2B2B2B"/>
-                <w:sz w:val="20"/>
-                <w:szCs w:val="20"/>
-              </w:rPr>
-              <w:t xml:space="preserve">Maps: Permit Parking, Visitor Parking, Permit-Eligible Addresses. Editing + QA only — the apps do not read it. Superseded original is in the adjacent "Parking Decal Maps" folder.</w:t>
-            </w:r>
-          </w:p>
-        </w:tc>
-      </w:tr>
-      <w:tr>
-        <w:tc>
-          <w:tcPr>
-            <w:tcW w:type="pct" w:w="20%"/>
-            <w:tcBorders>
-              <w:top w:val="single" w:color="D9D9D9" w:sz="4"/>
-              <w:left w:val="single" w:color="D9D9D9" w:sz="4"/>
-              <w:bottom w:val="single" w:color="D9D9D9" w:sz="4"/>
-              <w:right w:val="single" w:color="D9D9D9" w:sz="4"/>
-            </w:tcBorders>
-            <w:shd w:fill="F2F7FB" w:val="clear"/>
-            <w:tcMar>
-              <w:top w:type="dxa" w:w="80"/>
-              <w:left w:type="dxa" w:w="120"/>
-              <w:bottom w:type="dxa" w:w="80"/>
-              <w:right w:type="dxa" w:w="120"/>
-            </w:tcMar>
-          </w:tcPr>
-          <w:p>
-            <w:r>
-              <w:rPr>
-                <w:rFonts w:ascii="Arial" w:cs="Arial" w:eastAsia="Arial" w:hAnsi="Arial"/>
-                <w:b/>
-                <w:bCs/>
-                <w:color w:val="2B2B2B"/>
-                <w:sz w:val="21"/>
-                <w:szCs w:val="21"/>
-              </w:rPr>
-              <w:t xml:space="preserve">Live service (apps read this)</w:t>
-            </w:r>
-          </w:p>
-        </w:tc>
-        <w:tc>
-          <w:tcPr>
-            <w:tcW w:type="pct" w:w="40%"/>
-            <w:tcBorders>
-              <w:top w:val="single" w:color="D9D9D9" w:sz="4"/>
-              <w:left w:val="single" w:color="D9D9D9" w:sz="4"/>
-              <w:bottom w:val="single" w:color="D9D9D9" w:sz="4"/>
-              <w:right w:val="single" w:color="D9D9D9" w:sz="4"/>
-            </w:tcBorders>
-            <w:shd w:fill="F2F7FB" w:val="clear"/>
-            <w:tcMar>
-              <w:top w:type="dxa" w:w="80"/>
-              <w:left w:type="dxa" w:w="120"/>
-              <w:bottom w:type="dxa" w:w="80"/>
-              <w:right w:type="dxa" w:w="120"/>
-            </w:tcMar>
-          </w:tcPr>
-          <w:p>
-            <w:r>
-              <w:rPr>
-                <w:rFonts w:ascii="Consolas" w:cs="Consolas" w:eastAsia="Consolas" w:hAnsi="Consolas"/>
-                <w:color w:val="2B2B2B"/>
-                <w:sz w:val="19"/>
-                <w:szCs w:val="19"/>
-              </w:rPr>
-              <w:t xml:space="preserve">LaGrange_Parking_Permits</w:t>
-            </w:r>
-            <w:r>
-              <w:rPr>
-                <w:rFonts w:ascii="Arial" w:cs="Arial" w:eastAsia="Arial" w:hAnsi="Arial"/>
-                <w:color w:val="2B2B2B"/>
-                <w:sz w:val="21"/>
-                <w:szCs w:val="21"/>
-              </w:rPr>
-              <w:t xml:space="preserve"> on lagrangeil.maps.arcgis.com · item </w:t>
-            </w:r>
-            <w:r>
-              <w:rPr>
-                <w:rFonts w:ascii="Consolas" w:cs="Consolas" w:eastAsia="Consolas" w:hAnsi="Consolas"/>
-                <w:color w:val="2B2B2B"/>
-                <w:sz w:val="19"/>
-                <w:szCs w:val="19"/>
-              </w:rPr>
-              <w:t xml:space="preserve">f13e7fa3199141a2be6c2eea816de8d4</w:t>
-            </w:r>
-          </w:p>
-        </w:tc>
-        <w:tc>
-          <w:tcPr>
-            <w:tcW w:type="pct" w:w="40%"/>
-            <w:tcBorders>
-              <w:top w:val="single" w:color="D9D9D9" w:sz="4"/>
-              <w:left w:val="single" w:color="D9D9D9" w:sz="4"/>
-              <w:bottom w:val="single" w:color="D9D9D9" w:sz="4"/>
-              <w:right w:val="single" w:color="D9D9D9" w:sz="4"/>
-            </w:tcBorders>
-            <w:shd w:fill="F2F7FB" w:val="clear"/>
-            <w:tcMar>
-              <w:top w:type="dxa" w:w="80"/>
-              <w:left w:type="dxa" w:w="120"/>
-              <w:bottom w:type="dxa" w:w="80"/>
-              <w:right w:type="dxa" w:w="120"/>
-            </w:tcMar>
-          </w:tcPr>
-          <w:p>
-            <w:r>
-              <w:rPr>
-                <w:rFonts w:ascii="Arial" w:cs="Arial" w:eastAsia="Arial" w:hAnsi="Arial"/>
-                <w:color w:val="2B2B2B"/>
-                <w:sz w:val="20"/>
-                <w:szCs w:val="20"/>
-              </w:rPr>
-              <w:t xml:space="preserve">Sublayer /2 ParkingArea (144 polygons) · /3 ParkingRule (173 rows, 1:many on AREAID). Shared publicly.</w:t>
-            </w:r>
-          </w:p>
-        </w:tc>
-      </w:tr>
-      <w:tr>
-        <w:tc>
-          <w:tcPr>
-            <w:tcW w:type="pct" w:w="20%"/>
-            <w:tcBorders>
-              <w:top w:val="single" w:color="D9D9D9" w:sz="4"/>
-              <w:left w:val="single" w:color="D9D9D9" w:sz="4"/>
-              <w:bottom w:val="single" w:color="D9D9D9" w:sz="4"/>
-              <w:right w:val="single" w:color="D9D9D9" w:sz="4"/>
-            </w:tcBorders>
-            <w:tcMar>
-              <w:top w:type="dxa" w:w="80"/>
-              <w:left w:type="dxa" w:w="120"/>
-              <w:bottom w:type="dxa" w:w="80"/>
-              <w:right w:type="dxa" w:w="120"/>
-            </w:tcMar>
-          </w:tcPr>
-          <w:p>
-            <w:r>
-              <w:rPr>
-                <w:rFonts w:ascii="Arial" w:cs="Arial" w:eastAsia="Arial" w:hAnsi="Arial"/>
-                <w:b/>
-                <w:bCs/>
-                <w:color w:val="2B2B2B"/>
-                <w:sz w:val="21"/>
-                <w:szCs w:val="21"/>
-              </w:rPr>
-              <w:t xml:space="preserve">Designated overnight areas</w:t>
-            </w:r>
-          </w:p>
-        </w:tc>
-        <w:tc>
-          <w:tcPr>
-            <w:tcW w:type="pct" w:w="40%"/>
-            <w:tcBorders>
-              <w:top w:val="single" w:color="D9D9D9" w:sz="4"/>
-              <w:left w:val="single" w:color="D9D9D9" w:sz="4"/>
-              <w:bottom w:val="single" w:color="D9D9D9" w:sz="4"/>
-              <w:right w:val="single" w:color="D9D9D9" w:sz="4"/>
-            </w:tcBorders>
-            <w:tcMar>
-              <w:top w:type="dxa" w:w="80"/>
-              <w:left w:type="dxa" w:w="120"/>
-              <w:bottom w:type="dxa" w:w="80"/>
-              <w:right w:type="dxa" w:w="120"/>
-            </w:tcMar>
-          </w:tcPr>
-          <w:p>
-            <w:r>
-              <w:rPr>
-                <w:rFonts w:ascii="Consolas" w:cs="Consolas" w:eastAsia="Consolas" w:hAnsi="Consolas"/>
-                <w:color w:val="2B2B2B"/>
-                <w:sz w:val="19"/>
-                <w:szCs w:val="19"/>
-              </w:rPr>
-              <w:t xml:space="preserve">LaGrange_Overnight_Resident_Subzones</w:t>
-            </w:r>
-          </w:p>
-        </w:tc>
-        <w:tc>
-          <w:tcPr>
-            <w:tcW w:type="pct" w:w="40%"/>
-            <w:tcBorders>
-              <w:top w:val="single" w:color="D9D9D9" w:sz="4"/>
-              <w:left w:val="single" w:color="D9D9D9" w:sz="4"/>
-              <w:bottom w:val="single" w:color="D9D9D9" w:sz="4"/>
-              <w:right w:val="single" w:color="D9D9D9" w:sz="4"/>
-            </w:tcBorders>
-            <w:tcMar>
-              <w:top w:type="dxa" w:w="80"/>
-              <w:left w:type="dxa" w:w="120"/>
-              <w:bottom w:type="dxa" w:w="80"/>
-              <w:right w:type="dxa" w:w="120"/>
-            </w:tcMar>
-          </w:tcPr>
-          <w:p>
-            <w:r>
-              <w:rPr>
-                <w:rFonts w:ascii="Arial" w:cs="Arial" w:eastAsia="Arial" w:hAnsi="Arial"/>
-                <w:color w:val="2B2B2B"/>
-                <w:sz w:val="20"/>
-                <w:szCs w:val="20"/>
-              </w:rPr>
-              <w:t xml:space="preserve">8 polygons over Lots 2, 5, 11, 12, 13 — digitized from Heuer and Associates engineering drawings dated 12/30/2016. Deliberately its own service.</w:t>
-            </w:r>
-          </w:p>
-        </w:tc>
-      </w:tr>
-      <w:tr>
-        <w:tc>
-          <w:tcPr>
-            <w:tcW w:type="pct" w:w="20%"/>
-            <w:tcBorders>
-              <w:top w:val="single" w:color="D9D9D9" w:sz="4"/>
-              <w:left w:val="single" w:color="D9D9D9" w:sz="4"/>
-              <w:bottom w:val="single" w:color="D9D9D9" w:sz="4"/>
-              <w:right w:val="single" w:color="D9D9D9" w:sz="4"/>
-            </w:tcBorders>
-            <w:shd w:fill="F2F7FB" w:val="clear"/>
-            <w:tcMar>
-              <w:top w:type="dxa" w:w="80"/>
-              <w:left w:type="dxa" w:w="120"/>
-              <w:bottom w:type="dxa" w:w="80"/>
-              <w:right w:type="dxa" w:w="120"/>
-            </w:tcMar>
-          </w:tcPr>
-          <w:p>
-            <w:r>
-              <w:rPr>
-                <w:rFonts w:ascii="Arial" w:cs="Arial" w:eastAsia="Arial" w:hAnsi="Arial"/>
-                <w:b/>
-                <w:bCs/>
-                <w:color w:val="2B2B2B"/>
-                <w:sz w:val="21"/>
-                <w:szCs w:val="21"/>
-              </w:rPr>
-              <w:t xml:space="preserve">Context layer</w:t>
-            </w:r>
-          </w:p>
-        </w:tc>
-        <w:tc>
-          <w:tcPr>
-            <w:tcW w:type="pct" w:w="40%"/>
-            <w:tcBorders>
-              <w:top w:val="single" w:color="D9D9D9" w:sz="4"/>
-              <w:left w:val="single" w:color="D9D9D9" w:sz="4"/>
-              <w:bottom w:val="single" w:color="D9D9D9" w:sz="4"/>
-              <w:right w:val="single" w:color="D9D9D9" w:sz="4"/>
-            </w:tcBorders>
-            <w:shd w:fill="F2F7FB" w:val="clear"/>
-            <w:tcMar>
-              <w:top w:type="dxa" w:w="80"/>
-              <w:left w:type="dxa" w:w="120"/>
-              <w:bottom w:type="dxa" w:w="80"/>
-              <w:right w:type="dxa" w:w="120"/>
-            </w:tcMar>
-          </w:tcPr>
-          <w:p>
-            <w:r>
-              <w:rPr>
-                <w:rFonts w:ascii="Consolas" w:cs="Consolas" w:eastAsia="Consolas" w:hAnsi="Consolas"/>
-                <w:color w:val="2B2B2B"/>
-                <w:sz w:val="19"/>
-                <w:szCs w:val="19"/>
-              </w:rPr>
-              <w:t xml:space="preserve">LaGrangeImportantPlaces_ParkingContext_</w:t>
-            </w:r>
-          </w:p>
-        </w:tc>
-        <w:tc>
-          <w:tcPr>
-            <w:tcW w:type="pct" w:w="40%"/>
-            <w:tcBorders>
-              <w:top w:val="single" w:color="D9D9D9" w:sz="4"/>
-              <w:left w:val="single" w:color="D9D9D9" w:sz="4"/>
-              <w:bottom w:val="single" w:color="D9D9D9" w:sz="4"/>
-              <w:right w:val="single" w:color="D9D9D9" w:sz="4"/>
-            </w:tcBorders>
-            <w:shd w:fill="F2F7FB" w:val="clear"/>
-            <w:tcMar>
-              <w:top w:type="dxa" w:w="80"/>
-              <w:left w:type="dxa" w:w="120"/>
-              <w:bottom w:type="dxa" w:w="80"/>
-              <w:right w:type="dxa" w:w="120"/>
-            </w:tcMar>
-          </w:tcPr>
-          <w:p>
-            <w:r>
-              <w:rPr>
-                <w:rFonts w:ascii="Arial" w:cs="Arial" w:eastAsia="Arial" w:hAnsi="Arial"/>
-                <w:color w:val="2B2B2B"/>
-                <w:sz w:val="20"/>
-                <w:szCs w:val="20"/>
-              </w:rPr>
-              <w:t xml:space="preserve">23 civic, park, landmark and Metra features curated from GISC_PUBLISH_FGDB.gdb\Base\ImportantPlace_POLY. Map context only.</w:t>
-            </w:r>
-          </w:p>
-        </w:tc>
-      </w:tr>
-      <w:tr>
-        <w:tc>
-          <w:tcPr>
-            <w:tcW w:type="pct" w:w="20%"/>
-            <w:tcBorders>
-              <w:top w:val="single" w:color="D9D9D9" w:sz="4"/>
-              <w:left w:val="single" w:color="D9D9D9" w:sz="4"/>
-              <w:bottom w:val="single" w:color="D9D9D9" w:sz="4"/>
-              <w:right w:val="single" w:color="D9D9D9" w:sz="4"/>
-            </w:tcBorders>
-            <w:tcMar>
-              <w:top w:type="dxa" w:w="80"/>
-              <w:left w:type="dxa" w:w="120"/>
-              <w:bottom w:type="dxa" w:w="80"/>
-              <w:right w:type="dxa" w:w="120"/>
-            </w:tcMar>
-          </w:tcPr>
-          <w:p>
-            <w:r>
-              <w:rPr>
-                <w:rFonts w:ascii="Arial" w:cs="Arial" w:eastAsia="Arial" w:hAnsi="Arial"/>
-                <w:b/>
-                <w:bCs/>
-                <w:color w:val="2B2B2B"/>
-                <w:sz w:val="21"/>
-                <w:szCs w:val="21"/>
-              </w:rPr>
-              <w:t xml:space="preserve">Eligibility addresses</w:t>
-            </w:r>
-          </w:p>
-        </w:tc>
-        <w:tc>
-          <w:tcPr>
-            <w:tcW w:type="pct" w:w="40%"/>
-            <w:tcBorders>
-              <w:top w:val="single" w:color="D9D9D9" w:sz="4"/>
-              <w:left w:val="single" w:color="D9D9D9" w:sz="4"/>
-              <w:bottom w:val="single" w:color="D9D9D9" w:sz="4"/>
-              <w:right w:val="single" w:color="D9D9D9" w:sz="4"/>
-            </w:tcBorders>
-            <w:tcMar>
-              <w:top w:type="dxa" w:w="80"/>
-              <w:left w:type="dxa" w:w="120"/>
-              <w:bottom w:type="dxa" w:w="80"/>
-              <w:right w:type="dxa" w:w="120"/>
-            </w:tcMar>
-          </w:tcPr>
-          <w:p>
-            <w:r>
-              <w:rPr>
-                <w:rFonts w:ascii="Consolas" w:cs="Consolas" w:eastAsia="Consolas" w:hAnsi="Consolas"/>
-                <w:color w:val="2B2B2B"/>
-                <w:sz w:val="19"/>
-                <w:szCs w:val="19"/>
-              </w:rPr>
-              <w:t xml:space="preserve">…\20240829_ParkingPermitMaps\Data\</w:t>
-            </w:r>
-          </w:p>
-        </w:tc>
-        <w:tc>
-          <w:tcPr>
-            <w:tcW w:type="pct" w:w="40%"/>
-            <w:tcBorders>
-              <w:top w:val="single" w:color="D9D9D9" w:sz="4"/>
-              <w:left w:val="single" w:color="D9D9D9" w:sz="4"/>
-              <w:bottom w:val="single" w:color="D9D9D9" w:sz="4"/>
-              <w:right w:val="single" w:color="D9D9D9" w:sz="4"/>
-            </w:tcBorders>
-            <w:tcMar>
-              <w:top w:type="dxa" w:w="80"/>
-              <w:left w:type="dxa" w:w="120"/>
-              <w:bottom w:type="dxa" w:w="80"/>
-              <w:right w:type="dxa" w:w="120"/>
-            </w:tcMar>
-          </w:tcPr>
-          <w:p>
-            <w:r>
-              <w:rPr>
-                <w:rFonts w:ascii="Arial" w:cs="Arial" w:eastAsia="Arial" w:hAnsi="Arial"/>
-                <w:color w:val="2B2B2B"/>
-                <w:sz w:val="20"/>
-                <w:szCs w:val="20"/>
-              </w:rPr>
-              <w:t xml:space="preserve">Passport v2 permit-holder list ("Residential parking - address list for geocode.xlsx") + geocode outputs. Geocoded against X:\GISC\Publish\Geocoder, Esri World geocoder as fallback.</w:t>
-            </w:r>
-          </w:p>
-        </w:tc>
-      </w:tr>
-      <w:tr>
-        <w:tc>
-          <w:tcPr>
-            <w:tcW w:type="pct" w:w="20%"/>
-            <w:tcBorders>
-              <w:top w:val="single" w:color="D9D9D9" w:sz="4"/>
-              <w:left w:val="single" w:color="D9D9D9" w:sz="4"/>
-              <w:bottom w:val="single" w:color="D9D9D9" w:sz="4"/>
-              <w:right w:val="single" w:color="D9D9D9" w:sz="4"/>
-            </w:tcBorders>
-            <w:shd w:fill="F2F7FB" w:val="clear"/>
-            <w:tcMar>
-              <w:top w:type="dxa" w:w="80"/>
-              <w:left w:type="dxa" w:w="120"/>
-              <w:bottom w:type="dxa" w:w="80"/>
-              <w:right w:type="dxa" w:w="120"/>
-            </w:tcMar>
-          </w:tcPr>
-          <w:p>
-            <w:r>
-              <w:rPr>
-                <w:rFonts w:ascii="Arial" w:cs="Arial" w:eastAsia="Arial" w:hAnsi="Arial"/>
-                <w:b/>
-                <w:bCs/>
-                <w:color w:val="2B2B2B"/>
-                <w:sz w:val="21"/>
-                <w:szCs w:val="21"/>
-              </w:rPr>
-              <w:t xml:space="preserve">Village policy documents</w:t>
-            </w:r>
-          </w:p>
-        </w:tc>
-        <w:tc>
-          <w:tcPr>
-            <w:tcW w:type="pct" w:w="40%"/>
-            <w:tcBorders>
-              <w:top w:val="single" w:color="D9D9D9" w:sz="4"/>
-              <w:left w:val="single" w:color="D9D9D9" w:sz="4"/>
-              <w:bottom w:val="single" w:color="D9D9D9" w:sz="4"/>
-              <w:right w:val="single" w:color="D9D9D9" w:sz="4"/>
-            </w:tcBorders>
-            <w:shd w:fill="F2F7FB" w:val="clear"/>
-            <w:tcMar>
-              <w:top w:type="dxa" w:w="80"/>
-              <w:left w:type="dxa" w:w="120"/>
-              <w:bottom w:type="dxa" w:w="80"/>
-              <w:right w:type="dxa" w:w="120"/>
-            </w:tcMar>
-          </w:tcPr>
-          <w:p>
-            <w:r>
-              <w:rPr>
-                <w:rFonts w:ascii="Consolas" w:cs="Consolas" w:eastAsia="Consolas" w:hAnsi="Consolas"/>
-                <w:color w:val="2B2B2B"/>
-                <w:sz w:val="19"/>
-                <w:szCs w:val="19"/>
-              </w:rPr>
-              <w:t xml:space="preserve">…\Village Policies and Documentation\</w:t>
-            </w:r>
-          </w:p>
-        </w:tc>
-        <w:tc>
-          <w:tcPr>
-            <w:tcW w:type="pct" w:w="40%"/>
-            <w:tcBorders>
-              <w:top w:val="single" w:color="D9D9D9" w:sz="4"/>
-              <w:left w:val="single" w:color="D9D9D9" w:sz="4"/>
-              <w:bottom w:val="single" w:color="D9D9D9" w:sz="4"/>
-              <w:right w:val="single" w:color="D9D9D9" w:sz="4"/>
-            </w:tcBorders>
-            <w:shd w:fill="F2F7FB" w:val="clear"/>
-            <w:tcMar>
-              <w:top w:type="dxa" w:w="80"/>
-              <w:left w:type="dxa" w:w="120"/>
-              <w:bottom w:type="dxa" w:w="80"/>
-              <w:right w:type="dxa" w:w="120"/>
-            </w:tcMar>
-          </w:tcPr>
-          <w:p>
-            <w:r>
-              <w:rPr>
-                <w:rFonts w:ascii="Arial" w:cs="Arial" w:eastAsia="Arial" w:hAnsi="Arial"/>
-                <w:color w:val="2B2B2B"/>
-                <w:sz w:val="20"/>
-                <w:szCs w:val="20"/>
-              </w:rPr>
-              <w:t xml:space="preserve">Permit policy PDFs — supply the rule text absent from the GIS data. Finished exhibits in the adjacent Deliverables folder.</w:t>
-            </w:r>
-          </w:p>
-        </w:tc>
-      </w:tr>
-    </w:tbl>
-    <w:p>
-      <w:r>
-        <w:br w:type="page"/>
-      </w:r>
-    </w:p>
-    <w:p>
-      <w:pPr>
-        <w:pStyle w:val="Heading2"/>
-        <w:spacing w:after="100" w:before="280"/>
-      </w:pPr>
-      <w:r>
-        <w:rPr>
-          <w:rFonts w:ascii="Arial" w:cs="Arial" w:eastAsia="Arial" w:hAnsi="Arial"/>
-          <w:b/>
-          <w:bCs/>
-          <w:color w:val="0E7C66"/>
-          <w:sz w:val="23"/>
-          <w:szCs w:val="23"/>
-        </w:rPr>
-        <w:t xml:space="preserve">8.4 — Other resources</w:t>
-      </w:r>
-    </w:p>
-    <w:tbl>
-      <w:tblPr>
-        <w:tblW w:type="pct" w:w="100%"/>
-        <w:tblBorders>
-          <w:top w:val="single" w:color="auto" w:sz="4"/>
-          <w:left w:val="single" w:color="auto" w:sz="4"/>
-          <w:bottom w:val="single" w:color="auto" w:sz="4"/>
-          <w:right w:val="single" w:color="auto" w:sz="4"/>
-          <w:insideH w:val="single" w:color="auto" w:sz="4"/>
-          <w:insideV w:val="single" w:color="auto" w:sz="4"/>
-        </w:tblBorders>
-      </w:tblPr>
-      <w:tblGrid>
-        <w:gridCol w:w="100"/>
-        <w:gridCol w:w="100"/>
-      </w:tblGrid>
-      <w:tr>
-        <w:tc>
-          <w:tcPr>
-            <w:tcW w:type="pct" w:w="24%"/>
-            <w:tcBorders>
-              <w:top w:val="single" w:color="D9D9D9" w:sz="4"/>
-              <w:left w:val="single" w:color="D9D9D9" w:sz="4"/>
-              <w:bottom w:val="single" w:color="D9D9D9" w:sz="4"/>
-              <w:right w:val="single" w:color="D9D9D9" w:sz="4"/>
-            </w:tcBorders>
-            <w:shd w:fill="0E7C66" w:val="clear"/>
-            <w:tcMar>
-              <w:top w:type="dxa" w:w="80"/>
-              <w:left w:type="dxa" w:w="120"/>
-              <w:bottom w:type="dxa" w:w="80"/>
-              <w:right w:type="dxa" w:w="120"/>
-            </w:tcMar>
-          </w:tcPr>
-          <w:p>
-            <w:r>
-              <w:rPr>
-                <w:rFonts w:ascii="Arial" w:cs="Arial" w:eastAsia="Arial" w:hAnsi="Arial"/>
-                <w:b/>
-                <w:bCs/>
-                <w:color w:val="FFFFFF"/>
-                <w:sz w:val="20"/>
-                <w:szCs w:val="20"/>
-              </w:rPr>
-              <w:t xml:space="preserve">Resource</w:t>
-            </w:r>
-          </w:p>
-        </w:tc>
-        <w:tc>
-          <w:tcPr>
-            <w:tcW w:type="pct" w:w="76%"/>
-            <w:tcBorders>
-              <w:top w:val="single" w:color="D9D9D9" w:sz="4"/>
-              <w:left w:val="single" w:color="D9D9D9" w:sz="4"/>
-              <w:bottom w:val="single" w:color="D9D9D9" w:sz="4"/>
-              <w:right w:val="single" w:color="D9D9D9" w:sz="4"/>
-            </w:tcBorders>
-            <w:shd w:fill="0E7C66" w:val="clear"/>
-            <w:tcMar>
-              <w:top w:type="dxa" w:w="80"/>
-              <w:left w:type="dxa" w:w="120"/>
-              <w:bottom w:type="dxa" w:w="80"/>
-              <w:right w:type="dxa" w:w="120"/>
-            </w:tcMar>
-          </w:tcPr>
-          <w:p>
-            <w:r>
-              <w:rPr>
-                <w:rFonts w:ascii="Arial" w:cs="Arial" w:eastAsia="Arial" w:hAnsi="Arial"/>
-                <w:b/>
-                <w:bCs/>
-                <w:color w:val="FFFFFF"/>
-                <w:sz w:val="20"/>
-                <w:szCs w:val="20"/>
-              </w:rPr>
-              <w:t xml:space="preserve">Location / detail</w:t>
-            </w:r>
-          </w:p>
-        </w:tc>
-      </w:tr>
-      <w:tr>
-        <w:tc>
-          <w:tcPr>
-            <w:tcW w:type="pct" w:w="24%"/>
-            <w:tcBorders>
-              <w:top w:val="single" w:color="D9D9D9" w:sz="4"/>
-              <w:left w:val="single" w:color="D9D9D9" w:sz="4"/>
-              <w:bottom w:val="single" w:color="D9D9D9" w:sz="4"/>
-              <w:right w:val="single" w:color="D9D9D9" w:sz="4"/>
-            </w:tcBorders>
-            <w:tcMar>
-              <w:top w:type="dxa" w:w="80"/>
-              <w:left w:type="dxa" w:w="120"/>
-              <w:bottom w:type="dxa" w:w="80"/>
-              <w:right w:type="dxa" w:w="120"/>
-            </w:tcMar>
-          </w:tcPr>
-          <w:p>
-            <w:r>
-              <w:rPr>
-                <w:rFonts w:ascii="Arial" w:cs="Arial" w:eastAsia="Arial" w:hAnsi="Arial"/>
-                <w:b/>
-                <w:bCs/>
-                <w:color w:val="2B2B2B"/>
-                <w:sz w:val="21"/>
-                <w:szCs w:val="21"/>
-              </w:rPr>
-              <w:t xml:space="preserve">Application repository</w:t>
-            </w:r>
-          </w:p>
-        </w:tc>
-        <w:tc>
-          <w:tcPr>
-            <w:tcW w:type="pct" w:w="76%"/>
-            <w:tcBorders>
-              <w:top w:val="single" w:color="D9D9D9" w:sz="4"/>
-              <w:left w:val="single" w:color="D9D9D9" w:sz="4"/>
-              <w:bottom w:val="single" w:color="D9D9D9" w:sz="4"/>
-              <w:right w:val="single" w:color="D9D9D9" w:sz="4"/>
-            </w:tcBorders>
-            <w:tcMar>
-              <w:top w:type="dxa" w:w="80"/>
-              <w:left w:type="dxa" w:w="120"/>
-              <w:bottom w:type="dxa" w:w="80"/>
-              <w:right w:type="dxa" w:w="120"/>
-            </w:tcMar>
-          </w:tcPr>
-          <w:p>
-            <w:hyperlink w:history="1" r:id="rIdvxnoy9rf31kkcof6p3upz">
-              <w:r>
-                <w:rPr>
-                  <w:rFonts w:ascii="Arial" w:cs="Arial" w:eastAsia="Arial" w:hAnsi="Arial"/>
-                  <w:color w:val="2E74B5"/>
-                  <w:sz w:val="20"/>
-                  <w:szCs w:val="20"/>
-                  <w:u w:val="single"/>
-                </w:rPr>
-                <w:t xml:space="preserve">github.com/mgp-inc/lagrange-parking</w:t>
-              </w:r>
-            </w:hyperlink>
-            <w:r>
-              <w:rPr>
-                <w:rFonts w:ascii="Arial" w:cs="Arial" w:eastAsia="Arial" w:hAnsi="Arial"/>
-                <w:color w:val="2B2B2B"/>
-                <w:sz w:val="21"/>
-                <w:szCs w:val="21"/>
-              </w:rPr>
-              <w:t xml:space="preserve"> — self-contained and portable; docs/ carries app-side context, data notes, backlog. Working copy: </w:t>
-            </w:r>
-            <w:r>
-              <w:rPr>
-                <w:rFonts w:ascii="Consolas" w:cs="Consolas" w:eastAsia="Consolas" w:hAnsi="Consolas"/>
-                <w:color w:val="2B2B2B"/>
-                <w:sz w:val="19"/>
-                <w:szCs w:val="19"/>
-              </w:rPr>
-              <w:t xml:space="preserve">E:\lagrange-parking</w:t>
-            </w:r>
-          </w:p>
-        </w:tc>
-      </w:tr>
-      <w:tr>
-        <w:tc>
-          <w:tcPr>
-            <w:tcW w:type="pct" w:w="24%"/>
-            <w:tcBorders>
-              <w:top w:val="single" w:color="D9D9D9" w:sz="4"/>
-              <w:left w:val="single" w:color="D9D9D9" w:sz="4"/>
-              <w:bottom w:val="single" w:color="D9D9D9" w:sz="4"/>
-              <w:right w:val="single" w:color="D9D9D9" w:sz="4"/>
-            </w:tcBorders>
-            <w:shd w:fill="F2F7FB" w:val="clear"/>
-            <w:tcMar>
-              <w:top w:type="dxa" w:w="80"/>
-              <w:left w:type="dxa" w:w="120"/>
-              <w:bottom w:type="dxa" w:w="80"/>
-              <w:right w:type="dxa" w:w="120"/>
-            </w:tcMar>
-          </w:tcPr>
-          <w:p>
-            <w:r>
-              <w:rPr>
-                <w:rFonts w:ascii="Arial" w:cs="Arial" w:eastAsia="Arial" w:hAnsi="Arial"/>
-                <w:b/>
-                <w:bCs/>
-                <w:color w:val="2B2B2B"/>
-                <w:sz w:val="21"/>
-                <w:szCs w:val="21"/>
-              </w:rPr>
-              <w:t xml:space="preserve">Running project log</w:t>
-            </w:r>
-          </w:p>
-        </w:tc>
-        <w:tc>
-          <w:tcPr>
-            <w:tcW w:type="pct" w:w="76%"/>
-            <w:tcBorders>
-              <w:top w:val="single" w:color="D9D9D9" w:sz="4"/>
-              <w:left w:val="single" w:color="D9D9D9" w:sz="4"/>
-              <w:bottom w:val="single" w:color="D9D9D9" w:sz="4"/>
-              <w:right w:val="single" w:color="D9D9D9" w:sz="4"/>
-            </w:tcBorders>
-            <w:shd w:fill="F2F7FB" w:val="clear"/>
-            <w:tcMar>
-              <w:top w:type="dxa" w:w="80"/>
-              <w:left w:type="dxa" w:w="120"/>
-              <w:bottom w:type="dxa" w:w="80"/>
-              <w:right w:type="dxa" w:w="120"/>
-            </w:tcMar>
-          </w:tcPr>
-          <w:p>
-            <w:r>
-              <w:rPr>
-                <w:rFonts w:ascii="Consolas" w:cs="Consolas" w:eastAsia="Consolas" w:hAnsi="Consolas"/>
-                <w:color w:val="2B2B2B"/>
-                <w:sz w:val="19"/>
-                <w:szCs w:val="19"/>
-              </w:rPr>
-              <w:t xml:space="preserve">X:\GISC\Community\LaGrange\Project\20240829_ParkingPermitMaps\PROJECTDOCUMENTATION.md</w:t>
-            </w:r>
-            <w:r>
-              <w:rPr>
-                <w:rFonts w:ascii="Arial" w:cs="Arial" w:eastAsia="Arial" w:hAnsi="Arial"/>
-                <w:color w:val="2B2B2B"/>
-                <w:sz w:val="21"/>
-                <w:szCs w:val="21"/>
-              </w:rPr>
-              <w:t xml:space="preserve"> — full decision and progress history for the GIS side</w:t>
-            </w:r>
-          </w:p>
-        </w:tc>
-      </w:tr>
-      <w:tr>
-        <w:tc>
-          <w:tcPr>
-            <w:tcW w:type="pct" w:w="24%"/>
-            <w:tcBorders>
-              <w:top w:val="single" w:color="D9D9D9" w:sz="4"/>
-              <w:left w:val="single" w:color="D9D9D9" w:sz="4"/>
-              <w:bottom w:val="single" w:color="D9D9D9" w:sz="4"/>
-              <w:right w:val="single" w:color="D9D9D9" w:sz="4"/>
-            </w:tcBorders>
-            <w:tcMar>
-              <w:top w:type="dxa" w:w="80"/>
-              <w:left w:type="dxa" w:w="120"/>
-              <w:bottom w:type="dxa" w:w="80"/>
-              <w:right w:type="dxa" w:w="120"/>
-            </w:tcMar>
-          </w:tcPr>
-          <w:p>
-            <w:r>
-              <w:rPr>
-                <w:rFonts w:ascii="Arial" w:cs="Arial" w:eastAsia="Arial" w:hAnsi="Arial"/>
-                <w:b/>
-                <w:bCs/>
-                <w:color w:val="2B2B2B"/>
-                <w:sz w:val="21"/>
-                <w:szCs w:val="21"/>
-              </w:rPr>
-              <w:t xml:space="preserve">Hosting</w:t>
-            </w:r>
-          </w:p>
-        </w:tc>
-        <w:tc>
-          <w:tcPr>
-            <w:tcW w:type="pct" w:w="76%"/>
-            <w:tcBorders>
-              <w:top w:val="single" w:color="D9D9D9" w:sz="4"/>
-              <w:left w:val="single" w:color="D9D9D9" w:sz="4"/>
-              <w:bottom w:val="single" w:color="D9D9D9" w:sz="4"/>
-              <w:right w:val="single" w:color="D9D9D9" w:sz="4"/>
-            </w:tcBorders>
-            <w:tcMar>
-              <w:top w:type="dxa" w:w="80"/>
-              <w:left w:type="dxa" w:w="120"/>
-              <w:bottom w:type="dxa" w:w="80"/>
-              <w:right w:type="dxa" w:w="120"/>
-            </w:tcMar>
-          </w:tcPr>
-          <w:p>
-            <w:r>
-              <w:rPr>
-                <w:rFonts w:ascii="Arial" w:cs="Arial" w:eastAsia="Arial" w:hAnsi="Arial"/>
-                <w:color w:val="2B2B2B"/>
-                <w:sz w:val="21"/>
-                <w:szCs w:val="21"/>
-              </w:rPr>
-              <w:t xml:space="preserve">Azure tenant </w:t>
-            </w:r>
-            <w:r>
-              <w:rPr>
-                <w:rFonts w:ascii="Consolas" w:cs="Consolas" w:eastAsia="Consolas" w:hAnsi="Consolas"/>
-                <w:color w:val="2B2B2B"/>
-                <w:sz w:val="19"/>
-                <w:szCs w:val="19"/>
-              </w:rPr>
-              <w:t xml:space="preserve">Community-Essentials.com</w:t>
-            </w:r>
-            <w:r>
-              <w:rPr>
-                <w:rFonts w:ascii="Arial" w:cs="Arial" w:eastAsia="Arial" w:hAnsi="Arial"/>
-                <w:color w:val="2B2B2B"/>
-                <w:sz w:val="21"/>
-                <w:szCs w:val="21"/>
-              </w:rPr>
-              <w:t xml:space="preserve"> · resource group </w:t>
-            </w:r>
-            <w:r>
-              <w:rPr>
-                <w:rFonts w:ascii="Consolas" w:cs="Consolas" w:eastAsia="Consolas" w:hAnsi="Consolas"/>
-                <w:color w:val="2B2B2B"/>
-                <w:sz w:val="19"/>
-                <w:szCs w:val="19"/>
-              </w:rPr>
-              <w:t xml:space="preserve">rg-lagrange-parking</w:t>
-            </w:r>
-            <w:r>
-              <w:rPr>
-                <w:rFonts w:ascii="Arial" w:cs="Arial" w:eastAsia="Arial" w:hAnsi="Arial"/>
-                <w:color w:val="2B2B2B"/>
-                <w:sz w:val="21"/>
-                <w:szCs w:val="21"/>
-              </w:rPr>
-              <w:t xml:space="preserve"> (centralus) · two Static Web Apps, Free plan · steps in </w:t>
-            </w:r>
-            <w:r>
-              <w:rPr>
-                <w:rFonts w:ascii="Consolas" w:cs="Consolas" w:eastAsia="Consolas" w:hAnsi="Consolas"/>
-                <w:color w:val="2B2B2B"/>
-                <w:sz w:val="19"/>
-                <w:szCs w:val="19"/>
-              </w:rPr>
-              <w:t xml:space="preserve">DEPLOY.md</w:t>
-            </w:r>
-          </w:p>
-        </w:tc>
-      </w:tr>
-      <w:tr>
-        <w:tc>
-          <w:tcPr>
-            <w:tcW w:type="pct" w:w="24%"/>
-            <w:tcBorders>
-              <w:top w:val="single" w:color="D9D9D9" w:sz="4"/>
-              <w:left w:val="single" w:color="D9D9D9" w:sz="4"/>
-              <w:bottom w:val="single" w:color="D9D9D9" w:sz="4"/>
-              <w:right w:val="single" w:color="D9D9D9" w:sz="4"/>
-            </w:tcBorders>
-            <w:shd w:fill="F2F7FB" w:val="clear"/>
-            <w:tcMar>
-              <w:top w:type="dxa" w:w="80"/>
-              <w:left w:type="dxa" w:w="120"/>
-              <w:bottom w:type="dxa" w:w="80"/>
-              <w:right w:type="dxa" w:w="120"/>
-            </w:tcMar>
-          </w:tcPr>
-          <w:p>
-            <w:r>
-              <w:rPr>
-                <w:rFonts w:ascii="Arial" w:cs="Arial" w:eastAsia="Arial" w:hAnsi="Arial"/>
-                <w:b/>
-                <w:bCs/>
-                <w:color w:val="2B2B2B"/>
-                <w:sz w:val="21"/>
-                <w:szCs w:val="21"/>
-              </w:rPr>
-              <w:t xml:space="preserve">Branding</w:t>
-            </w:r>
-          </w:p>
-        </w:tc>
-        <w:tc>
-          <w:tcPr>
-            <w:tcW w:type="pct" w:w="76%"/>
-            <w:tcBorders>
-              <w:top w:val="single" w:color="D9D9D9" w:sz="4"/>
-              <w:left w:val="single" w:color="D9D9D9" w:sz="4"/>
-              <w:bottom w:val="single" w:color="D9D9D9" w:sz="4"/>
-              <w:right w:val="single" w:color="D9D9D9" w:sz="4"/>
-            </w:tcBorders>
-            <w:shd w:fill="F2F7FB" w:val="clear"/>
-            <w:tcMar>
-              <w:top w:type="dxa" w:w="80"/>
-              <w:left w:type="dxa" w:w="120"/>
-              <w:bottom w:type="dxa" w:w="80"/>
-              <w:right w:type="dxa" w:w="120"/>
-            </w:tcMar>
-          </w:tcPr>
-          <w:p>
-            <w:r>
-              <w:rPr>
-                <w:rFonts w:ascii="Arial" w:cs="Arial" w:eastAsia="Arial" w:hAnsi="Arial"/>
-                <w:color w:val="2B2B2B"/>
-                <w:sz w:val="20"/>
-                <w:szCs w:val="20"/>
-              </w:rPr>
-              <w:t xml:space="preserve">Village of La Grange Brand Guidelines (0719) — Dark Blue #00306C · La Grange Blue #126BB5 · Green #43B749 · Nunito Sans + Oswald</w:t>
-            </w:r>
-          </w:p>
-        </w:tc>
-      </w:tr>
-      <w:tr>
-        <w:tc>
-          <w:tcPr>
-            <w:tcW w:type="pct" w:w="24%"/>
-            <w:tcBorders>
-              <w:top w:val="single" w:color="D9D9D9" w:sz="4"/>
-              <w:left w:val="single" w:color="D9D9D9" w:sz="4"/>
-              <w:bottom w:val="single" w:color="D9D9D9" w:sz="4"/>
-              <w:right w:val="single" w:color="D9D9D9" w:sz="4"/>
-            </w:tcBorders>
-            <w:tcMar>
-              <w:top w:type="dxa" w:w="80"/>
-              <w:left w:type="dxa" w:w="120"/>
-              <w:bottom w:type="dxa" w:w="80"/>
-              <w:right w:type="dxa" w:w="120"/>
-            </w:tcMar>
-          </w:tcPr>
-          <w:p>
-            <w:r>
-              <w:rPr>
-                <w:rFonts w:ascii="Arial" w:cs="Arial" w:eastAsia="Arial" w:hAnsi="Arial"/>
-                <w:b/>
-                <w:bCs/>
-                <w:color w:val="2B2B2B"/>
-                <w:sz w:val="21"/>
-                <w:szCs w:val="21"/>
-              </w:rPr>
-              <w:t xml:space="preserve">Basemap</w:t>
-            </w:r>
-          </w:p>
-        </w:tc>
-        <w:tc>
-          <w:tcPr>
-            <w:tcW w:type="pct" w:w="76%"/>
-            <w:tcBorders>
-              <w:top w:val="single" w:color="D9D9D9" w:sz="4"/>
-              <w:left w:val="single" w:color="D9D9D9" w:sz="4"/>
-              <w:bottom w:val="single" w:color="D9D9D9" w:sz="4"/>
-              <w:right w:val="single" w:color="D9D9D9" w:sz="4"/>
-            </w:tcBorders>
-            <w:tcMar>
-              <w:top w:type="dxa" w:w="80"/>
-              <w:left w:type="dxa" w:w="120"/>
-              <w:bottom w:type="dxa" w:w="80"/>
-              <w:right w:type="dxa" w:w="120"/>
-            </w:tcMar>
-          </w:tcPr>
-          <w:p>
-            <w:r>
-              <w:rPr>
-                <w:rFonts w:ascii="Arial" w:cs="Arial" w:eastAsia="Arial" w:hAnsi="Arial"/>
-                <w:color w:val="2B2B2B"/>
-                <w:sz w:val="20"/>
-                <w:szCs w:val="20"/>
-              </w:rPr>
-              <w:t xml:space="preserve">GISC Light Canvas — in both the apps and the ArcGIS Pro maps</w:t>
-            </w:r>
-          </w:p>
-        </w:tc>
-      </w:tr>
-    </w:tbl>
-    <w:p>
-      <w:pPr>
-        <w:spacing w:after="120"/>
-      </w:pPr>
-    </w:p>
-    <w:p>
-      <w:pPr>
-        <w:pStyle w:val="Heading2"/>
-        <w:spacing w:after="100" w:before="280"/>
-      </w:pPr>
-      <w:r>
-        <w:rPr>
-          <w:rFonts w:ascii="Arial" w:cs="Arial" w:eastAsia="Arial" w:hAnsi="Arial"/>
-          <w:b/>
-          <w:bCs/>
-          <w:color w:val="0E7C66"/>
-          <w:sz w:val="23"/>
-          <w:szCs w:val="23"/>
-        </w:rPr>
-        <w:t xml:space="preserve">8.5 — Decisions that shaped the deliverable</w:t>
-      </w:r>
-    </w:p>
-    <w:tbl>
-      <w:tblPr>
-        <w:tblW w:type="pct" w:w="100%"/>
-        <w:tblBorders>
-          <w:top w:val="single" w:color="auto" w:sz="4"/>
-          <w:left w:val="single" w:color="auto" w:sz="4"/>
-          <w:bottom w:val="single" w:color="auto" w:sz="4"/>
-          <w:right w:val="single" w:color="auto" w:sz="4"/>
-          <w:insideH w:val="single" w:color="auto" w:sz="4"/>
-          <w:insideV w:val="single" w:color="auto" w:sz="4"/>
-        </w:tblBorders>
-      </w:tblPr>
-      <w:tblGrid>
-        <w:gridCol w:w="100"/>
-        <w:gridCol w:w="100"/>
-      </w:tblGrid>
-      <w:tr>
-        <w:tc>
-          <w:tcPr>
-            <w:tcW w:type="pct" w:w="30%"/>
-            <w:tcBorders>
-              <w:top w:val="single" w:color="D9D9D9" w:sz="4"/>
-              <w:left w:val="single" w:color="D9D9D9" w:sz="4"/>
-              <w:bottom w:val="single" w:color="D9D9D9" w:sz="4"/>
-              <w:right w:val="single" w:color="D9D9D9" w:sz="4"/>
-            </w:tcBorders>
-            <w:shd w:fill="0E7C66" w:val="clear"/>
-            <w:tcMar>
-              <w:top w:type="dxa" w:w="80"/>
-              <w:left w:type="dxa" w:w="120"/>
-              <w:bottom w:type="dxa" w:w="80"/>
-              <w:right w:type="dxa" w:w="120"/>
-            </w:tcMar>
-          </w:tcPr>
-          <w:p>
-            <w:r>
-              <w:rPr>
-                <w:rFonts w:ascii="Arial" w:cs="Arial" w:eastAsia="Arial" w:hAnsi="Arial"/>
-                <w:b/>
-                <w:bCs/>
-                <w:color w:val="FFFFFF"/>
-                <w:sz w:val="20"/>
-                <w:szCs w:val="20"/>
-              </w:rPr>
-              <w:t xml:space="preserve">Decision</w:t>
-            </w:r>
-          </w:p>
-        </w:tc>
-        <w:tc>
-          <w:tcPr>
-            <w:tcW w:type="pct" w:w="70%"/>
-            <w:tcBorders>
-              <w:top w:val="single" w:color="D9D9D9" w:sz="4"/>
-              <w:left w:val="single" w:color="D9D9D9" w:sz="4"/>
-              <w:bottom w:val="single" w:color="D9D9D9" w:sz="4"/>
-              <w:right w:val="single" w:color="D9D9D9" w:sz="4"/>
-            </w:tcBorders>
-            <w:shd w:fill="0E7C66" w:val="clear"/>
-            <w:tcMar>
-              <w:top w:type="dxa" w:w="80"/>
-              <w:left w:type="dxa" w:w="120"/>
-              <w:bottom w:type="dxa" w:w="80"/>
-              <w:right w:type="dxa" w:w="120"/>
-            </w:tcMar>
-          </w:tcPr>
-          <w:p>
-            <w:r>
-              <w:rPr>
-                <w:rFonts w:ascii="Arial" w:cs="Arial" w:eastAsia="Arial" w:hAnsi="Arial"/>
-                <w:b/>
-                <w:bCs/>
-                <w:color w:val="FFFFFF"/>
-                <w:sz w:val="20"/>
-                <w:szCs w:val="20"/>
-              </w:rPr>
-              <w:t xml:space="preserve">Why it matters</w:t>
-            </w:r>
-          </w:p>
-        </w:tc>
-      </w:tr>
-      <w:tr>
-        <w:tc>
-          <w:tcPr>
-            <w:tcW w:type="pct" w:w="30%"/>
-            <w:tcBorders>
-              <w:top w:val="single" w:color="D9D9D9" w:sz="4"/>
-              <w:left w:val="single" w:color="D9D9D9" w:sz="4"/>
-              <w:bottom w:val="single" w:color="D9D9D9" w:sz="4"/>
-              <w:right w:val="single" w:color="D9D9D9" w:sz="4"/>
-            </w:tcBorders>
-            <w:tcMar>
-              <w:top w:type="dxa" w:w="80"/>
-              <w:left w:type="dxa" w:w="120"/>
-              <w:bottom w:type="dxa" w:w="80"/>
-              <w:right w:type="dxa" w:w="120"/>
-            </w:tcMar>
-          </w:tcPr>
-          <w:p>
-            <w:r>
-              <w:rPr>
-                <w:rFonts w:ascii="Arial" w:cs="Arial" w:eastAsia="Arial" w:hAnsi="Arial"/>
-                <w:b/>
-                <w:bCs/>
-                <w:color w:val="2B2B2B"/>
-                <w:sz w:val="21"/>
-                <w:szCs w:val="21"/>
-              </w:rPr>
-              <w:t xml:space="preserve">Two apps, not StoryMaps</w:t>
-            </w:r>
-          </w:p>
-        </w:tc>
-        <w:tc>
-          <w:tcPr>
-            <w:tcW w:type="pct" w:w="70%"/>
-            <w:tcBorders>
-              <w:top w:val="single" w:color="D9D9D9" w:sz="4"/>
-              <w:left w:val="single" w:color="D9D9D9" w:sz="4"/>
-              <w:bottom w:val="single" w:color="D9D9D9" w:sz="4"/>
-              <w:right w:val="single" w:color="D9D9D9" w:sz="4"/>
-            </w:tcBorders>
-            <w:tcMar>
-              <w:top w:type="dxa" w:w="80"/>
-              <w:left w:type="dxa" w:w="120"/>
-              <w:bottom w:type="dxa" w:w="80"/>
-              <w:right w:type="dxa" w:w="120"/>
-            </w:tcMar>
-          </w:tcPr>
-          <w:p>
-            <w:r>
-              <w:rPr>
-                <w:rFonts w:ascii="Arial" w:cs="Arial" w:eastAsia="Arial" w:hAnsi="Arial"/>
-                <w:color w:val="2B2B2B"/>
-                <w:sz w:val="20"/>
-                <w:szCs w:val="20"/>
-              </w:rPr>
-              <w:t xml:space="preserve">Charity ended the single all-in-one map on 2026-06-18. Two audience-targeted apps replaced it; the StoryMaps in the original scope were dropped. The June AGOL web maps still exist but are QA aids only.</w:t>
-            </w:r>
-          </w:p>
-        </w:tc>
-      </w:tr>
-      <w:tr>
-        <w:tc>
-          <w:tcPr>
-            <w:tcW w:type="pct" w:w="30%"/>
-            <w:tcBorders>
-              <w:top w:val="single" w:color="D9D9D9" w:sz="4"/>
-              <w:left w:val="single" w:color="D9D9D9" w:sz="4"/>
-              <w:bottom w:val="single" w:color="D9D9D9" w:sz="4"/>
-              <w:right w:val="single" w:color="D9D9D9" w:sz="4"/>
-            </w:tcBorders>
-            <w:shd w:fill="F2F7FB" w:val="clear"/>
-            <w:tcMar>
-              <w:top w:type="dxa" w:w="80"/>
-              <w:left w:type="dxa" w:w="120"/>
-              <w:bottom w:type="dxa" w:w="80"/>
-              <w:right w:type="dxa" w:w="120"/>
-            </w:tcMar>
-          </w:tcPr>
-          <w:p>
-            <w:r>
-              <w:rPr>
-                <w:rFonts w:ascii="Arial" w:cs="Arial" w:eastAsia="Arial" w:hAnsi="Arial"/>
-                <w:b/>
-                <w:bCs/>
-                <w:color w:val="2B2B2B"/>
-                <w:sz w:val="21"/>
-                <w:szCs w:val="21"/>
-              </w:rPr>
-              <w:t xml:space="preserve">The parking data was de-fragmented</w:t>
-            </w:r>
-          </w:p>
-        </w:tc>
-        <w:tc>
-          <w:tcPr>
-            <w:tcW w:type="pct" w:w="70%"/>
-            <w:tcBorders>
-              <w:top w:val="single" w:color="D9D9D9" w:sz="4"/>
-              <w:left w:val="single" w:color="D9D9D9" w:sz="4"/>
-              <w:bottom w:val="single" w:color="D9D9D9" w:sz="4"/>
-              <w:right w:val="single" w:color="D9D9D9" w:sz="4"/>
-            </w:tcBorders>
-            <w:shd w:fill="F2F7FB" w:val="clear"/>
-            <w:tcMar>
-              <w:top w:type="dxa" w:w="80"/>
-              <w:left w:type="dxa" w:w="120"/>
-              <w:bottom w:type="dxa" w:w="80"/>
-              <w:right w:type="dxa" w:w="120"/>
-            </w:tcMar>
-          </w:tcPr>
-          <w:p>
-            <w:r>
-              <w:rPr>
-                <w:rFonts w:ascii="Arial" w:cs="Arial" w:eastAsia="Arial" w:hAnsi="Arial"/>
-                <w:color w:val="2B2B2B"/>
-                <w:sz w:val="20"/>
-                <w:szCs w:val="20"/>
-              </w:rPr>
-              <w:t xml:space="preserve">One physical lot arrived as several overlapping polygons, one per restriction type. Dissolved into one area per lot with its rules in a related table — this is what makes the data answerable.</w:t>
-            </w:r>
-          </w:p>
-        </w:tc>
-      </w:tr>
-      <w:tr>
-        <w:tc>
-          <w:tcPr>
-            <w:tcW w:type="pct" w:w="30%"/>
-            <w:tcBorders>
-              <w:top w:val="single" w:color="D9D9D9" w:sz="4"/>
-              <w:left w:val="single" w:color="D9D9D9" w:sz="4"/>
-              <w:bottom w:val="single" w:color="D9D9D9" w:sz="4"/>
-              <w:right w:val="single" w:color="D9D9D9" w:sz="4"/>
-            </w:tcBorders>
-            <w:tcMar>
-              <w:top w:type="dxa" w:w="80"/>
-              <w:left w:type="dxa" w:w="120"/>
-              <w:bottom w:type="dxa" w:w="80"/>
-              <w:right w:type="dxa" w:w="120"/>
-            </w:tcMar>
-          </w:tcPr>
-          <w:p>
-            <w:r>
-              <w:rPr>
-                <w:rFonts w:ascii="Arial" w:cs="Arial" w:eastAsia="Arial" w:hAnsi="Arial"/>
-                <w:b/>
-                <w:bCs/>
-                <w:color w:val="2B2B2B"/>
-                <w:sz w:val="21"/>
-                <w:szCs w:val="21"/>
-              </w:rPr>
-              <w:t xml:space="preserve">Lot lists and content are the Village’s</w:t>
-            </w:r>
-          </w:p>
-        </w:tc>
-        <w:tc>
-          <w:tcPr>
-            <w:tcW w:type="pct" w:w="70%"/>
-            <w:tcBorders>
-              <w:top w:val="single" w:color="D9D9D9" w:sz="4"/>
-              <w:left w:val="single" w:color="D9D9D9" w:sz="4"/>
-              <w:bottom w:val="single" w:color="D9D9D9" w:sz="4"/>
-              <w:right w:val="single" w:color="D9D9D9" w:sz="4"/>
-            </w:tcBorders>
-            <w:tcMar>
-              <w:top w:type="dxa" w:w="80"/>
-              <w:left w:type="dxa" w:w="120"/>
-              <w:bottom w:type="dxa" w:w="80"/>
-              <w:right w:type="dxa" w:w="120"/>
-            </w:tcMar>
-          </w:tcPr>
-          <w:p>
-            <w:r>
-              <w:rPr>
-                <w:rFonts w:ascii="Arial" w:cs="Arial" w:eastAsia="Arial" w:hAnsi="Arial"/>
-                <w:color w:val="2B2B2B"/>
-                <w:sz w:val="20"/>
-                <w:szCs w:val="20"/>
-              </w:rPr>
-              <w:t xml:space="preserve">Lots on each permit page come from the Village’s verbatim list, not a data-derived guess. Rates exist in the data but are never displayed; "decal" appears in no public text.</w:t>
-            </w:r>
-          </w:p>
-        </w:tc>
-      </w:tr>
-      <w:tr>
-        <w:tc>
-          <w:tcPr>
-            <w:tcW w:type="pct" w:w="30%"/>
-            <w:tcBorders>
-              <w:top w:val="single" w:color="D9D9D9" w:sz="4"/>
-              <w:left w:val="single" w:color="D9D9D9" w:sz="4"/>
-              <w:bottom w:val="single" w:color="D9D9D9" w:sz="4"/>
-              <w:right w:val="single" w:color="D9D9D9" w:sz="4"/>
-            </w:tcBorders>
-            <w:shd w:fill="F2F7FB" w:val="clear"/>
-            <w:tcMar>
-              <w:top w:type="dxa" w:w="80"/>
-              <w:left w:type="dxa" w:w="120"/>
-              <w:bottom w:type="dxa" w:w="80"/>
-              <w:right w:type="dxa" w:w="120"/>
-            </w:tcMar>
-          </w:tcPr>
-          <w:p>
-            <w:r>
-              <w:rPr>
-                <w:rFonts w:ascii="Arial" w:cs="Arial" w:eastAsia="Arial" w:hAnsi="Arial"/>
-                <w:b/>
-                <w:bCs/>
-                <w:color w:val="2B2B2B"/>
-                <w:sz w:val="21"/>
-                <w:szCs w:val="21"/>
-              </w:rPr>
-              <w:t xml:space="preserve">Designated overnight areas are GIS features</w:t>
-            </w:r>
-          </w:p>
-        </w:tc>
-        <w:tc>
-          <w:tcPr>
-            <w:tcW w:type="pct" w:w="70%"/>
-            <w:tcBorders>
-              <w:top w:val="single" w:color="D9D9D9" w:sz="4"/>
-              <w:left w:val="single" w:color="D9D9D9" w:sz="4"/>
-              <w:bottom w:val="single" w:color="D9D9D9" w:sz="4"/>
-              <w:right w:val="single" w:color="D9D9D9" w:sz="4"/>
-            </w:tcBorders>
-            <w:shd w:fill="F2F7FB" w:val="clear"/>
-            <w:tcMar>
-              <w:top w:type="dxa" w:w="80"/>
-              <w:left w:type="dxa" w:w="120"/>
-              <w:bottom w:type="dxa" w:w="80"/>
-              <w:right w:type="dxa" w:w="120"/>
-            </w:tcMar>
-          </w:tcPr>
-          <w:p>
-            <w:r>
-              <w:rPr>
-                <w:rFonts w:ascii="Arial" w:cs="Arial" w:eastAsia="Arial" w:hAnsi="Arial"/>
-                <w:color w:val="2B2B2B"/>
-                <w:sz w:val="20"/>
-                <w:szCs w:val="20"/>
-              </w:rPr>
-              <w:t xml:space="preserve">Only the permitted areas inside each lot were drawn, not the prohibited remainder — so the apps must state the rule in words. Scanned drawings were rejected in favor of real map features.</w:t>
-            </w:r>
-          </w:p>
-        </w:tc>
-      </w:tr>
-    </w:tbl>
-    <w:p>
-      <w:pPr>
-        <w:spacing w:after="120"/>
-      </w:pPr>
-    </w:p>
-    <w:tbl>
-      <w:tblPr>
-        <w:tblW w:type="pct" w:w="100%"/>
-        <w:tblBorders>
-          <w:top w:val="single" w:color="auto" w:sz="4"/>
-          <w:left w:val="single" w:color="auto" w:sz="4"/>
-          <w:bottom w:val="single" w:color="auto" w:sz="4"/>
-          <w:right w:val="single" w:color="auto" w:sz="4"/>
-          <w:insideH w:val="single" w:color="auto" w:sz="4"/>
-          <w:insideV w:val="single" w:color="auto" w:sz="4"/>
-        </w:tblBorders>
-      </w:tblPr>
-      <w:tblGrid>
-        <w:gridCol w:w="100"/>
-      </w:tblGrid>
-      <w:tr>
-        <w:tc>
-          <w:tcPr>
-            <w:tcBorders>
-              <w:top w:val="single" w:color="C00000" w:sz="6"/>
-              <w:left w:val="single" w:color="C00000" w:sz="24"/>
-              <w:bottom w:val="single" w:color="C00000" w:sz="6"/>
-              <w:right w:val="single" w:color="C00000" w:sz="6"/>
-            </w:tcBorders>
-            <w:shd w:fill="FBE4E4" w:val="clear"/>
-            <w:tcMar>
-              <w:top w:type="dxa" w:w="140"/>
-              <w:left w:type="dxa" w:w="240"/>
-              <w:bottom w:type="dxa" w:w="140"/>
-              <w:right w:type="dxa" w:w="240"/>
-            </w:tcMar>
-          </w:tcPr>
-          <w:p>
-            <w:pPr>
-              <w:spacing w:after="80"/>
-            </w:pPr>
-            <w:r>
-              <w:rPr>
-                <w:rFonts w:ascii="Arial" w:cs="Arial" w:eastAsia="Arial" w:hAnsi="Arial"/>
-                <w:b/>
-                <w:bCs/>
-                <w:color w:val="C00000"/>
-                <w:sz w:val="21"/>
-                <w:szCs w:val="21"/>
-              </w:rPr>
-              <w:t xml:space="preserve">⛔  The one that will bite you</w:t>
-            </w:r>
-          </w:p>
-          <w:p>
-            <w:pPr>
-              <w:spacing w:after="120"/>
-            </w:pPr>
-            <w:r>
-              <w:rPr>
-                <w:rFonts w:ascii="Arial" w:cs="Arial" w:eastAsia="Arial" w:hAnsi="Arial"/>
-                <w:color w:val="2B2B2B"/>
-                <w:sz w:val="21"/>
-                <w:szCs w:val="21"/>
-              </w:rPr>
-              <w:t xml:space="preserve">Republishing </w:t>
-            </w:r>
-            <w:r>
-              <w:rPr>
-                <w:rFonts w:ascii="Consolas" w:cs="Consolas" w:eastAsia="Consolas" w:hAnsi="Consolas"/>
-                <w:color w:val="2B2B2B"/>
-                <w:sz w:val="19"/>
-                <w:szCs w:val="19"/>
-              </w:rPr>
-              <w:t xml:space="preserve">LaGrange_Parking_Permits</w:t>
-            </w:r>
-            <w:r>
-              <w:rPr>
-                <w:rFonts w:ascii="Arial" w:cs="Arial" w:eastAsia="Arial" w:hAnsi="Arial"/>
-                <w:color w:val="2B2B2B"/>
-                <w:sz w:val="21"/>
-                <w:szCs w:val="21"/>
-              </w:rPr>
-              <w:t xml:space="preserve"> resets its sharing to organization-only, and both public apps immediately fail with "Token Required." Re-share it publicly and re-test anonymous access after </w:t>
-            </w:r>
-            <w:r>
-              <w:rPr>
-                <w:rFonts w:ascii="Arial" w:cs="Arial" w:eastAsia="Arial" w:hAnsi="Arial"/>
-                <w:b/>
-                <w:bCs/>
-                <w:color w:val="2B2B2B"/>
-                <w:sz w:val="21"/>
-                <w:szCs w:val="21"/>
-              </w:rPr>
-              <w:t xml:space="preserve">every</w:t>
-            </w:r>
-            <w:r>
-              <w:rPr>
-                <w:rFonts w:ascii="Arial" w:cs="Arial" w:eastAsia="Arial" w:hAnsi="Arial"/>
-                <w:color w:val="2B2B2B"/>
-                <w:sz w:val="21"/>
-                <w:szCs w:val="21"/>
-              </w:rPr>
-              <w:t xml:space="preserve"> republish.</w:t>
-            </w:r>
-          </w:p>
-        </w:tc>
-      </w:tr>
-    </w:tbl>
-    <w:p>
-      <w:pPr>
-        <w:spacing w:after="60"/>
-      </w:pPr>
-    </w:p>
-    <w:tbl>
-      <w:tblPr>
-        <w:tblW w:type="pct" w:w="100%"/>
-        <w:tblBorders>
-          <w:top w:val="single" w:color="auto" w:sz="4"/>
-          <w:left w:val="single" w:color="auto" w:sz="4"/>
-          <w:bottom w:val="single" w:color="auto" w:sz="4"/>
-          <w:right w:val="single" w:color="auto" w:sz="4"/>
-          <w:insideH w:val="single" w:color="auto" w:sz="4"/>
-          <w:insideV w:val="single" w:color="auto" w:sz="4"/>
-        </w:tblBorders>
-      </w:tblPr>
-      <w:tblGrid>
-        <w:gridCol w:w="100"/>
-      </w:tblGrid>
-      <w:tr>
-        <w:tc>
-          <w:tcPr>
-            <w:tcBorders>
-              <w:top w:val="single" w:color="B45309" w:sz="6"/>
-              <w:left w:val="single" w:color="B45309" w:sz="24"/>
-              <w:bottom w:val="single" w:color="B45309" w:sz="6"/>
-              <w:right w:val="single" w:color="B45309" w:sz="6"/>
-            </w:tcBorders>
-            <w:shd w:fill="FFF3DC" w:val="clear"/>
-            <w:tcMar>
-              <w:top w:type="dxa" w:w="140"/>
-              <w:left w:type="dxa" w:w="240"/>
-              <w:bottom w:type="dxa" w:w="140"/>
-              <w:right w:type="dxa" w:w="240"/>
-            </w:tcMar>
-          </w:tcPr>
-          <w:p>
-            <w:pPr>
-              <w:spacing w:after="80"/>
-            </w:pPr>
-            <w:r>
-              <w:rPr>
-                <w:rFonts w:ascii="Arial" w:cs="Arial" w:eastAsia="Arial" w:hAnsi="Arial"/>
-                <w:b/>
-                <w:bCs/>
-                <w:color w:val="B45309"/>
-                <w:sz w:val="21"/>
-                <w:szCs w:val="21"/>
-              </w:rPr>
-              <w:t xml:space="preserve">⚠  AREAID is the join key — spelling is everything</w:t>
-            </w:r>
-          </w:p>
-          <w:p>
-            <w:pPr>
-              <w:spacing w:after="120"/>
-            </w:pPr>
-            <w:r>
-              <w:rPr>
-                <w:rFonts w:ascii="Arial" w:cs="Arial" w:eastAsia="Arial" w:hAnsi="Arial"/>
-                <w:color w:val="2B2B2B"/>
-                <w:sz w:val="21"/>
-                <w:szCs w:val="21"/>
-              </w:rPr>
-              <w:t xml:space="preserve">AREAID is the lot name uppercased with non-alphanumerics stripped: "Lot 15" → </w:t>
-            </w:r>
-            <w:r>
-              <w:rPr>
-                <w:rFonts w:ascii="Consolas" w:cs="Consolas" w:eastAsia="Consolas" w:hAnsi="Consolas"/>
-                <w:color w:val="2B2B2B"/>
-                <w:sz w:val="19"/>
-                <w:szCs w:val="19"/>
-              </w:rPr>
-              <w:t xml:space="preserve">LOT15</w:t>
-            </w:r>
-            <w:r>
-              <w:rPr>
-                <w:rFonts w:ascii="Arial" w:cs="Arial" w:eastAsia="Arial" w:hAnsi="Arial"/>
-                <w:color w:val="2B2B2B"/>
-                <w:sz w:val="21"/>
-                <w:szCs w:val="21"/>
-              </w:rPr>
-              <w:t xml:space="preserve">. Any other spelling silently drops the lot from its page. Verify against the live services rather than trusting the configuration: </w:t>
-            </w:r>
-            <w:r>
-              <w:rPr>
-                <w:rFonts w:ascii="Consolas" w:cs="Consolas" w:eastAsia="Consolas" w:hAnsi="Consolas"/>
-                <w:color w:val="2B2B2B"/>
-                <w:sz w:val="19"/>
-                <w:szCs w:val="19"/>
-              </w:rPr>
-              <w:t xml:space="preserve">node scripts/verify-permit-pages.mjs</w:t>
-            </w:r>
-            <w:r>
-              <w:rPr>
-                <w:rFonts w:ascii="Arial" w:cs="Arial" w:eastAsia="Arial" w:hAnsi="Arial"/>
-                <w:color w:val="2B2B2B"/>
-                <w:sz w:val="21"/>
-                <w:szCs w:val="21"/>
-              </w:rPr>
-              <w:t xml:space="preserve"> confirms every listed lot resolves and returns rules.</w:t>
+              <w:t xml:space="preserve"> rebuilds ParkingArea and ParkingRule from the LGDM, so anything added only to the geodatabase is lost on the next rebuild. Lot 15 is in that state today. Real changes go into the LGDM first, then rebuild and republish.</w:t>
             </w:r>
           </w:p>
         </w:tc>
@@ -11404,7 +9586,7 @@
           <w:sz w:val="21"/>
           <w:szCs w:val="21"/>
         </w:rPr>
-        <w:t xml:space="preserve">Known upstream data defects are catalogued in </w:t>
+        <w:t xml:space="preserve">Known upstream data defects are catalogued in the repository’s </w:t>
       </w:r>
       <w:r>
         <w:rPr>
@@ -11427,6 +9609,11 @@
     </w:p>
     <w:p>
       <w:pPr>
+        <w:spacing w:after="60"/>
+      </w:pPr>
+    </w:p>
+    <w:p>
+      <w:pPr>
         <w:pStyle w:val="Heading2"/>
         <w:spacing w:after="100" w:before="280"/>
       </w:pPr>
@@ -11439,7 +9626,1817 @@
           <w:sz w:val="23"/>
           <w:szCs w:val="23"/>
         </w:rPr>
-        <w:t xml:space="preserve">8.6 — Publish / republish log</w:t>
+        <w:t xml:space="preserve">8.4 — Data sources</w:t>
+      </w:r>
+    </w:p>
+    <w:tbl>
+      <w:tblPr>
+        <w:tblW w:type="pct" w:w="100%"/>
+        <w:tblBorders>
+          <w:top w:val="single" w:color="auto" w:sz="4"/>
+          <w:left w:val="single" w:color="auto" w:sz="4"/>
+          <w:bottom w:val="single" w:color="auto" w:sz="4"/>
+          <w:right w:val="single" w:color="auto" w:sz="4"/>
+          <w:insideH w:val="single" w:color="auto" w:sz="4"/>
+          <w:insideV w:val="single" w:color="auto" w:sz="4"/>
+        </w:tblBorders>
+      </w:tblPr>
+      <w:tblGrid>
+        <w:gridCol w:w="100"/>
+        <w:gridCol w:w="100"/>
+        <w:gridCol w:w="100"/>
+      </w:tblGrid>
+      <w:tr>
+        <w:tc>
+          <w:tcPr>
+            <w:tcW w:type="pct" w:w="20%"/>
+            <w:tcBorders>
+              <w:top w:val="single" w:color="D9D9D9" w:sz="4"/>
+              <w:left w:val="single" w:color="D9D9D9" w:sz="4"/>
+              <w:bottom w:val="single" w:color="D9D9D9" w:sz="4"/>
+              <w:right w:val="single" w:color="D9D9D9" w:sz="4"/>
+            </w:tcBorders>
+            <w:shd w:fill="0E7C66" w:val="clear"/>
+            <w:tcMar>
+              <w:top w:type="dxa" w:w="80"/>
+              <w:left w:type="dxa" w:w="120"/>
+              <w:bottom w:type="dxa" w:w="80"/>
+              <w:right w:type="dxa" w:w="120"/>
+            </w:tcMar>
+          </w:tcPr>
+          <w:p>
+            <w:r>
+              <w:rPr>
+                <w:rFonts w:ascii="Arial" w:cs="Arial" w:eastAsia="Arial" w:hAnsi="Arial"/>
+                <w:b/>
+                <w:bCs/>
+                <w:color w:val="FFFFFF"/>
+                <w:sz w:val="20"/>
+                <w:szCs w:val="20"/>
+              </w:rPr>
+              <w:t xml:space="preserve">Layer / resource</w:t>
+            </w:r>
+          </w:p>
+        </w:tc>
+        <w:tc>
+          <w:tcPr>
+            <w:tcW w:type="pct" w:w="40%"/>
+            <w:tcBorders>
+              <w:top w:val="single" w:color="D9D9D9" w:sz="4"/>
+              <w:left w:val="single" w:color="D9D9D9" w:sz="4"/>
+              <w:bottom w:val="single" w:color="D9D9D9" w:sz="4"/>
+              <w:right w:val="single" w:color="D9D9D9" w:sz="4"/>
+            </w:tcBorders>
+            <w:shd w:fill="0E7C66" w:val="clear"/>
+            <w:tcMar>
+              <w:top w:type="dxa" w:w="80"/>
+              <w:left w:type="dxa" w:w="120"/>
+              <w:bottom w:type="dxa" w:w="80"/>
+              <w:right w:type="dxa" w:w="120"/>
+            </w:tcMar>
+          </w:tcPr>
+          <w:p>
+            <w:r>
+              <w:rPr>
+                <w:rFonts w:ascii="Arial" w:cs="Arial" w:eastAsia="Arial" w:hAnsi="Arial"/>
+                <w:b/>
+                <w:bCs/>
+                <w:color w:val="FFFFFF"/>
+                <w:sz w:val="20"/>
+                <w:szCs w:val="20"/>
+              </w:rPr>
+              <w:t xml:space="preserve">Where</w:t>
+            </w:r>
+          </w:p>
+        </w:tc>
+        <w:tc>
+          <w:tcPr>
+            <w:tcW w:type="pct" w:w="40%"/>
+            <w:tcBorders>
+              <w:top w:val="single" w:color="D9D9D9" w:sz="4"/>
+              <w:left w:val="single" w:color="D9D9D9" w:sz="4"/>
+              <w:bottom w:val="single" w:color="D9D9D9" w:sz="4"/>
+              <w:right w:val="single" w:color="D9D9D9" w:sz="4"/>
+            </w:tcBorders>
+            <w:shd w:fill="0E7C66" w:val="clear"/>
+            <w:tcMar>
+              <w:top w:type="dxa" w:w="80"/>
+              <w:left w:type="dxa" w:w="120"/>
+              <w:bottom w:type="dxa" w:w="80"/>
+              <w:right w:type="dxa" w:w="120"/>
+            </w:tcMar>
+          </w:tcPr>
+          <w:p>
+            <w:r>
+              <w:rPr>
+                <w:rFonts w:ascii="Arial" w:cs="Arial" w:eastAsia="Arial" w:hAnsi="Arial"/>
+                <w:b/>
+                <w:bCs/>
+                <w:color w:val="FFFFFF"/>
+                <w:sz w:val="20"/>
+                <w:szCs w:val="20"/>
+              </w:rPr>
+              <w:t xml:space="preserve">Notes</w:t>
+            </w:r>
+          </w:p>
+        </w:tc>
+      </w:tr>
+      <w:tr>
+        <w:tc>
+          <w:tcPr>
+            <w:tcW w:type="pct" w:w="20%"/>
+            <w:tcBorders>
+              <w:top w:val="single" w:color="D9D9D9" w:sz="4"/>
+              <w:left w:val="single" w:color="D9D9D9" w:sz="4"/>
+              <w:bottom w:val="single" w:color="D9D9D9" w:sz="4"/>
+              <w:right w:val="single" w:color="D9D9D9" w:sz="4"/>
+            </w:tcBorders>
+            <w:tcMar>
+              <w:top w:type="dxa" w:w="80"/>
+              <w:left w:type="dxa" w:w="120"/>
+              <w:bottom w:type="dxa" w:w="80"/>
+              <w:right w:type="dxa" w:w="120"/>
+            </w:tcMar>
+          </w:tcPr>
+          <w:p>
+            <w:r>
+              <w:rPr>
+                <w:rFonts w:ascii="Arial" w:cs="Arial" w:eastAsia="Arial" w:hAnsi="Arial"/>
+                <w:b/>
+                <w:bCs/>
+                <w:color w:val="2B2B2B"/>
+                <w:sz w:val="21"/>
+                <w:szCs w:val="21"/>
+              </w:rPr>
+              <w:t xml:space="preserve">Source of record</w:t>
+            </w:r>
+          </w:p>
+        </w:tc>
+        <w:tc>
+          <w:tcPr>
+            <w:tcW w:type="pct" w:w="40%"/>
+            <w:tcBorders>
+              <w:top w:val="single" w:color="D9D9D9" w:sz="4"/>
+              <w:left w:val="single" w:color="D9D9D9" w:sz="4"/>
+              <w:bottom w:val="single" w:color="D9D9D9" w:sz="4"/>
+              <w:right w:val="single" w:color="D9D9D9" w:sz="4"/>
+            </w:tcBorders>
+            <w:tcMar>
+              <w:top w:type="dxa" w:w="80"/>
+              <w:left w:type="dxa" w:w="120"/>
+              <w:bottom w:type="dxa" w:w="80"/>
+              <w:right w:type="dxa" w:w="120"/>
+            </w:tcMar>
+          </w:tcPr>
+          <w:p>
+            <w:r>
+              <w:rPr>
+                <w:rFonts w:ascii="Consolas" w:cs="Consolas" w:eastAsia="Consolas" w:hAnsi="Consolas"/>
+                <w:color w:val="2B2B2B"/>
+                <w:sz w:val="19"/>
+                <w:szCs w:val="19"/>
+              </w:rPr>
+              <w:t xml:space="preserve">mgp-sql02 &gt; GISC_PRODUCTION &gt; DBO.Parking_Restriction_POLY</w:t>
+            </w:r>
+          </w:p>
+        </w:tc>
+        <w:tc>
+          <w:tcPr>
+            <w:tcW w:type="pct" w:w="40%"/>
+            <w:tcBorders>
+              <w:top w:val="single" w:color="D9D9D9" w:sz="4"/>
+              <w:left w:val="single" w:color="D9D9D9" w:sz="4"/>
+              <w:bottom w:val="single" w:color="D9D9D9" w:sz="4"/>
+              <w:right w:val="single" w:color="D9D9D9" w:sz="4"/>
+            </w:tcBorders>
+            <w:tcMar>
+              <w:top w:type="dxa" w:w="80"/>
+              <w:left w:type="dxa" w:w="120"/>
+              <w:bottom w:type="dxa" w:w="80"/>
+              <w:right w:type="dxa" w:w="120"/>
+            </w:tcMar>
+          </w:tcPr>
+          <w:p>
+            <w:r>
+              <w:rPr>
+                <w:rFonts w:ascii="Arial" w:cs="Arial" w:eastAsia="Arial" w:hAnsi="Arial"/>
+                <w:color w:val="2B2B2B"/>
+                <w:sz w:val="20"/>
+                <w:szCs w:val="20"/>
+              </w:rPr>
+              <w:t xml:space="preserve">(GEODBID ‘024’) — the Village’s authoritative parking inventory and the origin of everything below. Edited in ArcGIS Pro.</w:t>
+            </w:r>
+          </w:p>
+        </w:tc>
+      </w:tr>
+      <w:tr>
+        <w:tc>
+          <w:tcPr>
+            <w:tcW w:type="pct" w:w="20%"/>
+            <w:tcBorders>
+              <w:top w:val="single" w:color="D9D9D9" w:sz="4"/>
+              <w:left w:val="single" w:color="D9D9D9" w:sz="4"/>
+              <w:bottom w:val="single" w:color="D9D9D9" w:sz="4"/>
+              <w:right w:val="single" w:color="D9D9D9" w:sz="4"/>
+            </w:tcBorders>
+            <w:shd w:fill="F2F7FB" w:val="clear"/>
+            <w:tcMar>
+              <w:top w:type="dxa" w:w="80"/>
+              <w:left w:type="dxa" w:w="120"/>
+              <w:bottom w:type="dxa" w:w="80"/>
+              <w:right w:type="dxa" w:w="120"/>
+            </w:tcMar>
+          </w:tcPr>
+          <w:p>
+            <w:r>
+              <w:rPr>
+                <w:rFonts w:ascii="Arial" w:cs="Arial" w:eastAsia="Arial" w:hAnsi="Arial"/>
+                <w:b/>
+                <w:bCs/>
+                <w:color w:val="2B2B2B"/>
+                <w:sz w:val="21"/>
+                <w:szCs w:val="21"/>
+              </w:rPr>
+              <w:t xml:space="preserve">Working geodatabase</w:t>
+            </w:r>
+          </w:p>
+        </w:tc>
+        <w:tc>
+          <w:tcPr>
+            <w:tcW w:type="pct" w:w="40%"/>
+            <w:tcBorders>
+              <w:top w:val="single" w:color="D9D9D9" w:sz="4"/>
+              <w:left w:val="single" w:color="D9D9D9" w:sz="4"/>
+              <w:bottom w:val="single" w:color="D9D9D9" w:sz="4"/>
+              <w:right w:val="single" w:color="D9D9D9" w:sz="4"/>
+            </w:tcBorders>
+            <w:shd w:fill="F2F7FB" w:val="clear"/>
+            <w:tcMar>
+              <w:top w:type="dxa" w:w="80"/>
+              <w:left w:type="dxa" w:w="120"/>
+              <w:bottom w:type="dxa" w:w="80"/>
+              <w:right w:type="dxa" w:w="120"/>
+            </w:tcMar>
+          </w:tcPr>
+          <w:p>
+            <w:r>
+              <w:rPr>
+                <w:rFonts w:ascii="Consolas" w:cs="Consolas" w:eastAsia="Consolas" w:hAnsi="Consolas"/>
+                <w:color w:val="2B2B2B"/>
+                <w:sz w:val="19"/>
+                <w:szCs w:val="19"/>
+              </w:rPr>
+              <w:t xml:space="preserve">X:\GISC\Community\LaGrange\Project\20240829_ParkingPermitMaps\APRX\Parking_Permit_Restructure\ParkingPermits.gdb</w:t>
+            </w:r>
+          </w:p>
+        </w:tc>
+        <w:tc>
+          <w:tcPr>
+            <w:tcW w:type="pct" w:w="40%"/>
+            <w:tcBorders>
+              <w:top w:val="single" w:color="D9D9D9" w:sz="4"/>
+              <w:left w:val="single" w:color="D9D9D9" w:sz="4"/>
+              <w:bottom w:val="single" w:color="D9D9D9" w:sz="4"/>
+              <w:right w:val="single" w:color="D9D9D9" w:sz="4"/>
+            </w:tcBorders>
+            <w:shd w:fill="F2F7FB" w:val="clear"/>
+            <w:tcMar>
+              <w:top w:type="dxa" w:w="80"/>
+              <w:left w:type="dxa" w:w="120"/>
+              <w:bottom w:type="dxa" w:w="80"/>
+              <w:right w:type="dxa" w:w="120"/>
+            </w:tcMar>
+          </w:tcPr>
+          <w:p>
+            <w:r>
+              <w:rPr>
+                <w:rFonts w:ascii="Arial" w:cs="Arial" w:eastAsia="Arial" w:hAnsi="Arial"/>
+                <w:color w:val="2B2B2B"/>
+                <w:sz w:val="20"/>
+                <w:szCs w:val="20"/>
+              </w:rPr>
+              <w:t xml:space="preserve">Holds ParkingArea, ParkingRule, OvernightResidentSubzones, PermitEligibleAddress, StudyZone and the domains. Rebuilt from the LGDM by lagrange_build_fgdb.py.</w:t>
+            </w:r>
+          </w:p>
+        </w:tc>
+      </w:tr>
+      <w:tr>
+        <w:tc>
+          <w:tcPr>
+            <w:tcW w:type="pct" w:w="20%"/>
+            <w:tcBorders>
+              <w:top w:val="single" w:color="D9D9D9" w:sz="4"/>
+              <w:left w:val="single" w:color="D9D9D9" w:sz="4"/>
+              <w:bottom w:val="single" w:color="D9D9D9" w:sz="4"/>
+              <w:right w:val="single" w:color="D9D9D9" w:sz="4"/>
+            </w:tcBorders>
+            <w:tcMar>
+              <w:top w:type="dxa" w:w="80"/>
+              <w:left w:type="dxa" w:w="120"/>
+              <w:bottom w:type="dxa" w:w="80"/>
+              <w:right w:type="dxa" w:w="120"/>
+            </w:tcMar>
+          </w:tcPr>
+          <w:p>
+            <w:r>
+              <w:rPr>
+                <w:rFonts w:ascii="Arial" w:cs="Arial" w:eastAsia="Arial" w:hAnsi="Arial"/>
+                <w:b/>
+                <w:bCs/>
+                <w:color w:val="2B2B2B"/>
+                <w:sz w:val="21"/>
+                <w:szCs w:val="21"/>
+              </w:rPr>
+              <w:t xml:space="preserve">ArcGIS Pro project and maps</w:t>
+            </w:r>
+          </w:p>
+        </w:tc>
+        <w:tc>
+          <w:tcPr>
+            <w:tcW w:type="pct" w:w="40%"/>
+            <w:tcBorders>
+              <w:top w:val="single" w:color="D9D9D9" w:sz="4"/>
+              <w:left w:val="single" w:color="D9D9D9" w:sz="4"/>
+              <w:bottom w:val="single" w:color="D9D9D9" w:sz="4"/>
+              <w:right w:val="single" w:color="D9D9D9" w:sz="4"/>
+            </w:tcBorders>
+            <w:tcMar>
+              <w:top w:type="dxa" w:w="80"/>
+              <w:left w:type="dxa" w:w="120"/>
+              <w:bottom w:type="dxa" w:w="80"/>
+              <w:right w:type="dxa" w:w="120"/>
+            </w:tcMar>
+          </w:tcPr>
+          <w:p>
+            <w:r>
+              <w:rPr>
+                <w:rFonts w:ascii="Consolas" w:cs="Consolas" w:eastAsia="Consolas" w:hAnsi="Consolas"/>
+                <w:color w:val="2B2B2B"/>
+                <w:sz w:val="19"/>
+                <w:szCs w:val="19"/>
+              </w:rPr>
+              <w:t xml:space="preserve">X:\GISC\Community\LaGrange\Project\20240829_ParkingPermitMaps\APRX\Parking_Permit_Restructure\Parking_Permit_Restructure.aprx</w:t>
+            </w:r>
+          </w:p>
+        </w:tc>
+        <w:tc>
+          <w:tcPr>
+            <w:tcW w:type="pct" w:w="40%"/>
+            <w:tcBorders>
+              <w:top w:val="single" w:color="D9D9D9" w:sz="4"/>
+              <w:left w:val="single" w:color="D9D9D9" w:sz="4"/>
+              <w:bottom w:val="single" w:color="D9D9D9" w:sz="4"/>
+              <w:right w:val="single" w:color="D9D9D9" w:sz="4"/>
+            </w:tcBorders>
+            <w:tcMar>
+              <w:top w:type="dxa" w:w="80"/>
+              <w:left w:type="dxa" w:w="120"/>
+              <w:bottom w:type="dxa" w:w="80"/>
+              <w:right w:type="dxa" w:w="120"/>
+            </w:tcMar>
+          </w:tcPr>
+          <w:p>
+            <w:r>
+              <w:rPr>
+                <w:rFonts w:ascii="Arial" w:cs="Arial" w:eastAsia="Arial" w:hAnsi="Arial"/>
+                <w:color w:val="2B2B2B"/>
+                <w:sz w:val="20"/>
+                <w:szCs w:val="20"/>
+              </w:rPr>
+              <w:t xml:space="preserve">The current ArcGIS Pro project and its maps (Permit Parking, Visitor Parking, Permit-Eligible Addresses). Used for editing and QA; the apps do not read it. The superseded original project is in the adjacent "Parking Decal Maps" folder.</w:t>
+            </w:r>
+          </w:p>
+        </w:tc>
+      </w:tr>
+      <w:tr>
+        <w:tc>
+          <w:tcPr>
+            <w:tcW w:type="pct" w:w="20%"/>
+            <w:tcBorders>
+              <w:top w:val="single" w:color="D9D9D9" w:sz="4"/>
+              <w:left w:val="single" w:color="D9D9D9" w:sz="4"/>
+              <w:bottom w:val="single" w:color="D9D9D9" w:sz="4"/>
+              <w:right w:val="single" w:color="D9D9D9" w:sz="4"/>
+            </w:tcBorders>
+            <w:shd w:fill="F2F7FB" w:val="clear"/>
+            <w:tcMar>
+              <w:top w:type="dxa" w:w="80"/>
+              <w:left w:type="dxa" w:w="120"/>
+              <w:bottom w:type="dxa" w:w="80"/>
+              <w:right w:type="dxa" w:w="120"/>
+            </w:tcMar>
+          </w:tcPr>
+          <w:p>
+            <w:r>
+              <w:rPr>
+                <w:rFonts w:ascii="Arial" w:cs="Arial" w:eastAsia="Arial" w:hAnsi="Arial"/>
+                <w:b/>
+                <w:bCs/>
+                <w:color w:val="2B2B2B"/>
+                <w:sz w:val="21"/>
+                <w:szCs w:val="21"/>
+              </w:rPr>
+              <w:t xml:space="preserve">Live service the apps read</w:t>
+            </w:r>
+          </w:p>
+        </w:tc>
+        <w:tc>
+          <w:tcPr>
+            <w:tcW w:type="pct" w:w="40%"/>
+            <w:tcBorders>
+              <w:top w:val="single" w:color="D9D9D9" w:sz="4"/>
+              <w:left w:val="single" w:color="D9D9D9" w:sz="4"/>
+              <w:bottom w:val="single" w:color="D9D9D9" w:sz="4"/>
+              <w:right w:val="single" w:color="D9D9D9" w:sz="4"/>
+            </w:tcBorders>
+            <w:shd w:fill="F2F7FB" w:val="clear"/>
+            <w:tcMar>
+              <w:top w:type="dxa" w:w="80"/>
+              <w:left w:type="dxa" w:w="120"/>
+              <w:bottom w:type="dxa" w:w="80"/>
+              <w:right w:type="dxa" w:w="120"/>
+            </w:tcMar>
+          </w:tcPr>
+          <w:p>
+            <w:r>
+              <w:rPr>
+                <w:rFonts w:ascii="Consolas" w:cs="Consolas" w:eastAsia="Consolas" w:hAnsi="Consolas"/>
+                <w:color w:val="2B2B2B"/>
+                <w:sz w:val="19"/>
+                <w:szCs w:val="19"/>
+              </w:rPr>
+              <w:t xml:space="preserve">LaGrange_Parking_Permits</w:t>
+            </w:r>
+            <w:r>
+              <w:rPr>
+                <w:rFonts w:ascii="Arial" w:cs="Arial" w:eastAsia="Arial" w:hAnsi="Arial"/>
+                <w:color w:val="2B2B2B"/>
+                <w:sz w:val="21"/>
+                <w:szCs w:val="21"/>
+              </w:rPr>
+              <w:t xml:space="preserve"> on https://lagrangeil.maps.arcgis.com, item </w:t>
+            </w:r>
+            <w:r>
+              <w:rPr>
+                <w:rFonts w:ascii="Consolas" w:cs="Consolas" w:eastAsia="Consolas" w:hAnsi="Consolas"/>
+                <w:color w:val="2B2B2B"/>
+                <w:sz w:val="19"/>
+                <w:szCs w:val="19"/>
+              </w:rPr>
+              <w:t xml:space="preserve">f13e7fa3199141a2be6c2eea816de8d4</w:t>
+            </w:r>
+          </w:p>
+        </w:tc>
+        <w:tc>
+          <w:tcPr>
+            <w:tcW w:type="pct" w:w="40%"/>
+            <w:tcBorders>
+              <w:top w:val="single" w:color="D9D9D9" w:sz="4"/>
+              <w:left w:val="single" w:color="D9D9D9" w:sz="4"/>
+              <w:bottom w:val="single" w:color="D9D9D9" w:sz="4"/>
+              <w:right w:val="single" w:color="D9D9D9" w:sz="4"/>
+            </w:tcBorders>
+            <w:shd w:fill="F2F7FB" w:val="clear"/>
+            <w:tcMar>
+              <w:top w:type="dxa" w:w="80"/>
+              <w:left w:type="dxa" w:w="120"/>
+              <w:bottom w:type="dxa" w:w="80"/>
+              <w:right w:type="dxa" w:w="120"/>
+            </w:tcMar>
+          </w:tcPr>
+          <w:p>
+            <w:r>
+              <w:rPr>
+                <w:rFonts w:ascii="Arial" w:cs="Arial" w:eastAsia="Arial" w:hAnsi="Arial"/>
+                <w:color w:val="2B2B2B"/>
+                <w:sz w:val="20"/>
+                <w:szCs w:val="20"/>
+              </w:rPr>
+              <w:t xml:space="preserve">Sublayer /2 ParkingArea (144 polygons) and /3 ParkingRule (173 rows, related 1:many on AREAID) are what both apps query. Shared publicly.</w:t>
+            </w:r>
+          </w:p>
+        </w:tc>
+      </w:tr>
+      <w:tr>
+        <w:tc>
+          <w:tcPr>
+            <w:tcW w:type="pct" w:w="20%"/>
+            <w:tcBorders>
+              <w:top w:val="single" w:color="D9D9D9" w:sz="4"/>
+              <w:left w:val="single" w:color="D9D9D9" w:sz="4"/>
+              <w:bottom w:val="single" w:color="D9D9D9" w:sz="4"/>
+              <w:right w:val="single" w:color="D9D9D9" w:sz="4"/>
+            </w:tcBorders>
+            <w:tcMar>
+              <w:top w:type="dxa" w:w="80"/>
+              <w:left w:type="dxa" w:w="120"/>
+              <w:bottom w:type="dxa" w:w="80"/>
+              <w:right w:type="dxa" w:w="120"/>
+            </w:tcMar>
+          </w:tcPr>
+          <w:p>
+            <w:r>
+              <w:rPr>
+                <w:rFonts w:ascii="Arial" w:cs="Arial" w:eastAsia="Arial" w:hAnsi="Arial"/>
+                <w:b/>
+                <w:bCs/>
+                <w:color w:val="2B2B2B"/>
+                <w:sz w:val="21"/>
+                <w:szCs w:val="21"/>
+              </w:rPr>
+              <w:t xml:space="preserve">Designated overnight areas</w:t>
+            </w:r>
+          </w:p>
+        </w:tc>
+        <w:tc>
+          <w:tcPr>
+            <w:tcW w:type="pct" w:w="40%"/>
+            <w:tcBorders>
+              <w:top w:val="single" w:color="D9D9D9" w:sz="4"/>
+              <w:left w:val="single" w:color="D9D9D9" w:sz="4"/>
+              <w:bottom w:val="single" w:color="D9D9D9" w:sz="4"/>
+              <w:right w:val="single" w:color="D9D9D9" w:sz="4"/>
+            </w:tcBorders>
+            <w:tcMar>
+              <w:top w:type="dxa" w:w="80"/>
+              <w:left w:type="dxa" w:w="120"/>
+              <w:bottom w:type="dxa" w:w="80"/>
+              <w:right w:type="dxa" w:w="120"/>
+            </w:tcMar>
+          </w:tcPr>
+          <w:p>
+            <w:r>
+              <w:rPr>
+                <w:rFonts w:ascii="Consolas" w:cs="Consolas" w:eastAsia="Consolas" w:hAnsi="Consolas"/>
+                <w:color w:val="2B2B2B"/>
+                <w:sz w:val="19"/>
+                <w:szCs w:val="19"/>
+              </w:rPr>
+              <w:t xml:space="preserve">LaGrange_Overnight_Resident_Subzones</w:t>
+            </w:r>
+          </w:p>
+        </w:tc>
+        <w:tc>
+          <w:tcPr>
+            <w:tcW w:type="pct" w:w="40%"/>
+            <w:tcBorders>
+              <w:top w:val="single" w:color="D9D9D9" w:sz="4"/>
+              <w:left w:val="single" w:color="D9D9D9" w:sz="4"/>
+              <w:bottom w:val="single" w:color="D9D9D9" w:sz="4"/>
+              <w:right w:val="single" w:color="D9D9D9" w:sz="4"/>
+            </w:tcBorders>
+            <w:tcMar>
+              <w:top w:type="dxa" w:w="80"/>
+              <w:left w:type="dxa" w:w="120"/>
+              <w:bottom w:type="dxa" w:w="80"/>
+              <w:right w:type="dxa" w:w="120"/>
+            </w:tcMar>
+          </w:tcPr>
+          <w:p>
+            <w:r>
+              <w:rPr>
+                <w:rFonts w:ascii="Arial" w:cs="Arial" w:eastAsia="Arial" w:hAnsi="Arial"/>
+                <w:color w:val="2B2B2B"/>
+                <w:sz w:val="20"/>
+                <w:szCs w:val="20"/>
+              </w:rPr>
+              <w:t xml:space="preserve">8 polygons over Lots 2, 5, 11, 12 and 13, digitized from Heuer and Associates engineering drawings dated 12/30/2016. Deliberately its own service, not a sublayer of the above.</w:t>
+            </w:r>
+          </w:p>
+        </w:tc>
+      </w:tr>
+      <w:tr>
+        <w:tc>
+          <w:tcPr>
+            <w:tcW w:type="pct" w:w="20%"/>
+            <w:tcBorders>
+              <w:top w:val="single" w:color="D9D9D9" w:sz="4"/>
+              <w:left w:val="single" w:color="D9D9D9" w:sz="4"/>
+              <w:bottom w:val="single" w:color="D9D9D9" w:sz="4"/>
+              <w:right w:val="single" w:color="D9D9D9" w:sz="4"/>
+            </w:tcBorders>
+            <w:shd w:fill="F2F7FB" w:val="clear"/>
+            <w:tcMar>
+              <w:top w:type="dxa" w:w="80"/>
+              <w:left w:type="dxa" w:w="120"/>
+              <w:bottom w:type="dxa" w:w="80"/>
+              <w:right w:type="dxa" w:w="120"/>
+            </w:tcMar>
+          </w:tcPr>
+          <w:p>
+            <w:r>
+              <w:rPr>
+                <w:rFonts w:ascii="Arial" w:cs="Arial" w:eastAsia="Arial" w:hAnsi="Arial"/>
+                <w:b/>
+                <w:bCs/>
+                <w:color w:val="2B2B2B"/>
+                <w:sz w:val="21"/>
+                <w:szCs w:val="21"/>
+              </w:rPr>
+              <w:t xml:space="preserve">Context layer</w:t>
+            </w:r>
+          </w:p>
+        </w:tc>
+        <w:tc>
+          <w:tcPr>
+            <w:tcW w:type="pct" w:w="40%"/>
+            <w:tcBorders>
+              <w:top w:val="single" w:color="D9D9D9" w:sz="4"/>
+              <w:left w:val="single" w:color="D9D9D9" w:sz="4"/>
+              <w:bottom w:val="single" w:color="D9D9D9" w:sz="4"/>
+              <w:right w:val="single" w:color="D9D9D9" w:sz="4"/>
+            </w:tcBorders>
+            <w:shd w:fill="F2F7FB" w:val="clear"/>
+            <w:tcMar>
+              <w:top w:type="dxa" w:w="80"/>
+              <w:left w:type="dxa" w:w="120"/>
+              <w:bottom w:type="dxa" w:w="80"/>
+              <w:right w:type="dxa" w:w="120"/>
+            </w:tcMar>
+          </w:tcPr>
+          <w:p>
+            <w:r>
+              <w:rPr>
+                <w:rFonts w:ascii="Consolas" w:cs="Consolas" w:eastAsia="Consolas" w:hAnsi="Consolas"/>
+                <w:color w:val="2B2B2B"/>
+                <w:sz w:val="19"/>
+                <w:szCs w:val="19"/>
+              </w:rPr>
+              <w:t xml:space="preserve">LaGrangeImportantPlaces_ParkingContext_</w:t>
+            </w:r>
+          </w:p>
+        </w:tc>
+        <w:tc>
+          <w:tcPr>
+            <w:tcW w:type="pct" w:w="40%"/>
+            <w:tcBorders>
+              <w:top w:val="single" w:color="D9D9D9" w:sz="4"/>
+              <w:left w:val="single" w:color="D9D9D9" w:sz="4"/>
+              <w:bottom w:val="single" w:color="D9D9D9" w:sz="4"/>
+              <w:right w:val="single" w:color="D9D9D9" w:sz="4"/>
+            </w:tcBorders>
+            <w:shd w:fill="F2F7FB" w:val="clear"/>
+            <w:tcMar>
+              <w:top w:type="dxa" w:w="80"/>
+              <w:left w:type="dxa" w:w="120"/>
+              <w:bottom w:type="dxa" w:w="80"/>
+              <w:right w:type="dxa" w:w="120"/>
+            </w:tcMar>
+          </w:tcPr>
+          <w:p>
+            <w:r>
+              <w:rPr>
+                <w:rFonts w:ascii="Arial" w:cs="Arial" w:eastAsia="Arial" w:hAnsi="Arial"/>
+                <w:color w:val="2B2B2B"/>
+                <w:sz w:val="20"/>
+                <w:szCs w:val="20"/>
+              </w:rPr>
+              <w:t xml:space="preserve">23 civic, park, landmark and Metra features curated from X:\GISC\Publish\GeoDB\GISC_PUBLISH_FGDB.gdb\Base\ImportantPlace_POLY. Map context only.</w:t>
+            </w:r>
+          </w:p>
+        </w:tc>
+      </w:tr>
+      <w:tr>
+        <w:tc>
+          <w:tcPr>
+            <w:tcW w:type="pct" w:w="20%"/>
+            <w:tcBorders>
+              <w:top w:val="single" w:color="D9D9D9" w:sz="4"/>
+              <w:left w:val="single" w:color="D9D9D9" w:sz="4"/>
+              <w:bottom w:val="single" w:color="D9D9D9" w:sz="4"/>
+              <w:right w:val="single" w:color="D9D9D9" w:sz="4"/>
+            </w:tcBorders>
+            <w:tcMar>
+              <w:top w:type="dxa" w:w="80"/>
+              <w:left w:type="dxa" w:w="120"/>
+              <w:bottom w:type="dxa" w:w="80"/>
+              <w:right w:type="dxa" w:w="120"/>
+            </w:tcMar>
+          </w:tcPr>
+          <w:p>
+            <w:r>
+              <w:rPr>
+                <w:rFonts w:ascii="Arial" w:cs="Arial" w:eastAsia="Arial" w:hAnsi="Arial"/>
+                <w:b/>
+                <w:bCs/>
+                <w:color w:val="2B2B2B"/>
+                <w:sz w:val="21"/>
+                <w:szCs w:val="21"/>
+              </w:rPr>
+              <w:t xml:space="preserve">Eligibility addresses</w:t>
+            </w:r>
+          </w:p>
+        </w:tc>
+        <w:tc>
+          <w:tcPr>
+            <w:tcW w:type="pct" w:w="40%"/>
+            <w:tcBorders>
+              <w:top w:val="single" w:color="D9D9D9" w:sz="4"/>
+              <w:left w:val="single" w:color="D9D9D9" w:sz="4"/>
+              <w:bottom w:val="single" w:color="D9D9D9" w:sz="4"/>
+              <w:right w:val="single" w:color="D9D9D9" w:sz="4"/>
+            </w:tcBorders>
+            <w:tcMar>
+              <w:top w:type="dxa" w:w="80"/>
+              <w:left w:type="dxa" w:w="120"/>
+              <w:bottom w:type="dxa" w:w="80"/>
+              <w:right w:type="dxa" w:w="120"/>
+            </w:tcMar>
+          </w:tcPr>
+          <w:p>
+            <w:r>
+              <w:rPr>
+                <w:rFonts w:ascii="Consolas" w:cs="Consolas" w:eastAsia="Consolas" w:hAnsi="Consolas"/>
+                <w:color w:val="2B2B2B"/>
+                <w:sz w:val="19"/>
+                <w:szCs w:val="19"/>
+              </w:rPr>
+              <w:t xml:space="preserve">X:\GISC\Community\LaGrange\Project\20240829_ParkingPermitMaps\Data\</w:t>
+            </w:r>
+          </w:p>
+        </w:tc>
+        <w:tc>
+          <w:tcPr>
+            <w:tcW w:type="pct" w:w="40%"/>
+            <w:tcBorders>
+              <w:top w:val="single" w:color="D9D9D9" w:sz="4"/>
+              <w:left w:val="single" w:color="D9D9D9" w:sz="4"/>
+              <w:bottom w:val="single" w:color="D9D9D9" w:sz="4"/>
+              <w:right w:val="single" w:color="D9D9D9" w:sz="4"/>
+            </w:tcBorders>
+            <w:tcMar>
+              <w:top w:type="dxa" w:w="80"/>
+              <w:left w:type="dxa" w:w="120"/>
+              <w:bottom w:type="dxa" w:w="80"/>
+              <w:right w:type="dxa" w:w="120"/>
+            </w:tcMar>
+          </w:tcPr>
+          <w:p>
+            <w:r>
+              <w:rPr>
+                <w:rFonts w:ascii="Arial" w:cs="Arial" w:eastAsia="Arial" w:hAnsi="Arial"/>
+                <w:color w:val="2B2B2B"/>
+                <w:sz w:val="20"/>
+                <w:szCs w:val="20"/>
+              </w:rPr>
+              <w:t xml:space="preserve">The Passport v2 permit-holder list ("Residential parking - address list for geocode.xlsx") and the geocode outputs derived from it. Geocoded against X:\GISC\Publish\Geocoder with Esri’s World geocoder as fallback.</w:t>
+            </w:r>
+          </w:p>
+        </w:tc>
+      </w:tr>
+      <w:tr>
+        <w:tc>
+          <w:tcPr>
+            <w:tcW w:type="pct" w:w="20%"/>
+            <w:tcBorders>
+              <w:top w:val="single" w:color="D9D9D9" w:sz="4"/>
+              <w:left w:val="single" w:color="D9D9D9" w:sz="4"/>
+              <w:bottom w:val="single" w:color="D9D9D9" w:sz="4"/>
+              <w:right w:val="single" w:color="D9D9D9" w:sz="4"/>
+            </w:tcBorders>
+            <w:shd w:fill="F2F7FB" w:val="clear"/>
+            <w:tcMar>
+              <w:top w:type="dxa" w:w="80"/>
+              <w:left w:type="dxa" w:w="120"/>
+              <w:bottom w:type="dxa" w:w="80"/>
+              <w:right w:type="dxa" w:w="120"/>
+            </w:tcMar>
+          </w:tcPr>
+          <w:p>
+            <w:r>
+              <w:rPr>
+                <w:rFonts w:ascii="Arial" w:cs="Arial" w:eastAsia="Arial" w:hAnsi="Arial"/>
+                <w:b/>
+                <w:bCs/>
+                <w:color w:val="2B2B2B"/>
+                <w:sz w:val="21"/>
+                <w:szCs w:val="21"/>
+              </w:rPr>
+              <w:t xml:space="preserve">Village policy documents</w:t>
+            </w:r>
+          </w:p>
+        </w:tc>
+        <w:tc>
+          <w:tcPr>
+            <w:tcW w:type="pct" w:w="40%"/>
+            <w:tcBorders>
+              <w:top w:val="single" w:color="D9D9D9" w:sz="4"/>
+              <w:left w:val="single" w:color="D9D9D9" w:sz="4"/>
+              <w:bottom w:val="single" w:color="D9D9D9" w:sz="4"/>
+              <w:right w:val="single" w:color="D9D9D9" w:sz="4"/>
+            </w:tcBorders>
+            <w:shd w:fill="F2F7FB" w:val="clear"/>
+            <w:tcMar>
+              <w:top w:type="dxa" w:w="80"/>
+              <w:left w:type="dxa" w:w="120"/>
+              <w:bottom w:type="dxa" w:w="80"/>
+              <w:right w:type="dxa" w:w="120"/>
+            </w:tcMar>
+          </w:tcPr>
+          <w:p>
+            <w:r>
+              <w:rPr>
+                <w:rFonts w:ascii="Consolas" w:cs="Consolas" w:eastAsia="Consolas" w:hAnsi="Consolas"/>
+                <w:color w:val="2B2B2B"/>
+                <w:sz w:val="19"/>
+                <w:szCs w:val="19"/>
+              </w:rPr>
+              <w:t xml:space="preserve">X:\GISC\Community\LaGrange\Project\20240829_ParkingPermitMaps\Village Policies and Documentation\</w:t>
+            </w:r>
+          </w:p>
+        </w:tc>
+        <w:tc>
+          <w:tcPr>
+            <w:tcW w:type="pct" w:w="40%"/>
+            <w:tcBorders>
+              <w:top w:val="single" w:color="D9D9D9" w:sz="4"/>
+              <w:left w:val="single" w:color="D9D9D9" w:sz="4"/>
+              <w:bottom w:val="single" w:color="D9D9D9" w:sz="4"/>
+              <w:right w:val="single" w:color="D9D9D9" w:sz="4"/>
+            </w:tcBorders>
+            <w:shd w:fill="F2F7FB" w:val="clear"/>
+            <w:tcMar>
+              <w:top w:type="dxa" w:w="80"/>
+              <w:left w:type="dxa" w:w="120"/>
+              <w:bottom w:type="dxa" w:w="80"/>
+              <w:right w:type="dxa" w:w="120"/>
+            </w:tcMar>
+          </w:tcPr>
+          <w:p>
+            <w:r>
+              <w:rPr>
+                <w:rFonts w:ascii="Arial" w:cs="Arial" w:eastAsia="Arial" w:hAnsi="Arial"/>
+                <w:color w:val="2B2B2B"/>
+                <w:sz w:val="20"/>
+                <w:szCs w:val="20"/>
+              </w:rPr>
+              <w:t xml:space="preserve">The Village’s permit policy PDFs, which supply the rule text absent from the GIS data. Finished exhibits are in the adjacent Deliverables folder.</w:t>
+            </w:r>
+          </w:p>
+        </w:tc>
+      </w:tr>
+    </w:tbl>
+    <w:p>
+      <w:r>
+        <w:br w:type="page"/>
+      </w:r>
+    </w:p>
+    <w:p>
+      <w:pPr>
+        <w:pStyle w:val="Heading2"/>
+        <w:spacing w:after="100" w:before="280"/>
+      </w:pPr>
+      <w:r>
+        <w:rPr>
+          <w:rFonts w:ascii="Arial" w:cs="Arial" w:eastAsia="Arial" w:hAnsi="Arial"/>
+          <w:b/>
+          <w:bCs/>
+          <w:color w:val="0E7C66"/>
+          <w:sz w:val="23"/>
+          <w:szCs w:val="23"/>
+        </w:rPr>
+        <w:t xml:space="preserve">8.5 — Other resources</w:t>
+      </w:r>
+    </w:p>
+    <w:tbl>
+      <w:tblPr>
+        <w:tblW w:type="pct" w:w="100%"/>
+        <w:tblBorders>
+          <w:top w:val="single" w:color="auto" w:sz="4"/>
+          <w:left w:val="single" w:color="auto" w:sz="4"/>
+          <w:bottom w:val="single" w:color="auto" w:sz="4"/>
+          <w:right w:val="single" w:color="auto" w:sz="4"/>
+          <w:insideH w:val="single" w:color="auto" w:sz="4"/>
+          <w:insideV w:val="single" w:color="auto" w:sz="4"/>
+        </w:tblBorders>
+      </w:tblPr>
+      <w:tblGrid>
+        <w:gridCol w:w="100"/>
+        <w:gridCol w:w="100"/>
+      </w:tblGrid>
+      <w:tr>
+        <w:tc>
+          <w:tcPr>
+            <w:tcW w:type="pct" w:w="24%"/>
+            <w:tcBorders>
+              <w:top w:val="single" w:color="D9D9D9" w:sz="4"/>
+              <w:left w:val="single" w:color="D9D9D9" w:sz="4"/>
+              <w:bottom w:val="single" w:color="D9D9D9" w:sz="4"/>
+              <w:right w:val="single" w:color="D9D9D9" w:sz="4"/>
+            </w:tcBorders>
+            <w:shd w:fill="0E7C66" w:val="clear"/>
+            <w:tcMar>
+              <w:top w:type="dxa" w:w="80"/>
+              <w:left w:type="dxa" w:w="120"/>
+              <w:bottom w:type="dxa" w:w="80"/>
+              <w:right w:type="dxa" w:w="120"/>
+            </w:tcMar>
+          </w:tcPr>
+          <w:p>
+            <w:r>
+              <w:rPr>
+                <w:rFonts w:ascii="Arial" w:cs="Arial" w:eastAsia="Arial" w:hAnsi="Arial"/>
+                <w:b/>
+                <w:bCs/>
+                <w:color w:val="FFFFFF"/>
+                <w:sz w:val="20"/>
+                <w:szCs w:val="20"/>
+              </w:rPr>
+              <w:t xml:space="preserve">Resource</w:t>
+            </w:r>
+          </w:p>
+        </w:tc>
+        <w:tc>
+          <w:tcPr>
+            <w:tcW w:type="pct" w:w="76%"/>
+            <w:tcBorders>
+              <w:top w:val="single" w:color="D9D9D9" w:sz="4"/>
+              <w:left w:val="single" w:color="D9D9D9" w:sz="4"/>
+              <w:bottom w:val="single" w:color="D9D9D9" w:sz="4"/>
+              <w:right w:val="single" w:color="D9D9D9" w:sz="4"/>
+            </w:tcBorders>
+            <w:shd w:fill="0E7C66" w:val="clear"/>
+            <w:tcMar>
+              <w:top w:type="dxa" w:w="80"/>
+              <w:left w:type="dxa" w:w="120"/>
+              <w:bottom w:type="dxa" w:w="80"/>
+              <w:right w:type="dxa" w:w="120"/>
+            </w:tcMar>
+          </w:tcPr>
+          <w:p>
+            <w:r>
+              <w:rPr>
+                <w:rFonts w:ascii="Arial" w:cs="Arial" w:eastAsia="Arial" w:hAnsi="Arial"/>
+                <w:b/>
+                <w:bCs/>
+                <w:color w:val="FFFFFF"/>
+                <w:sz w:val="20"/>
+                <w:szCs w:val="20"/>
+              </w:rPr>
+              <w:t xml:space="preserve">Location / detail</w:t>
+            </w:r>
+          </w:p>
+        </w:tc>
+      </w:tr>
+      <w:tr>
+        <w:tc>
+          <w:tcPr>
+            <w:tcW w:type="pct" w:w="24%"/>
+            <w:tcBorders>
+              <w:top w:val="single" w:color="D9D9D9" w:sz="4"/>
+              <w:left w:val="single" w:color="D9D9D9" w:sz="4"/>
+              <w:bottom w:val="single" w:color="D9D9D9" w:sz="4"/>
+              <w:right w:val="single" w:color="D9D9D9" w:sz="4"/>
+            </w:tcBorders>
+            <w:tcMar>
+              <w:top w:type="dxa" w:w="80"/>
+              <w:left w:type="dxa" w:w="120"/>
+              <w:bottom w:type="dxa" w:w="80"/>
+              <w:right w:type="dxa" w:w="120"/>
+            </w:tcMar>
+          </w:tcPr>
+          <w:p>
+            <w:r>
+              <w:rPr>
+                <w:rFonts w:ascii="Arial" w:cs="Arial" w:eastAsia="Arial" w:hAnsi="Arial"/>
+                <w:b/>
+                <w:bCs/>
+                <w:color w:val="2B2B2B"/>
+                <w:sz w:val="21"/>
+                <w:szCs w:val="21"/>
+              </w:rPr>
+              <w:t xml:space="preserve">Application repository</w:t>
+            </w:r>
+          </w:p>
+        </w:tc>
+        <w:tc>
+          <w:tcPr>
+            <w:tcW w:type="pct" w:w="76%"/>
+            <w:tcBorders>
+              <w:top w:val="single" w:color="D9D9D9" w:sz="4"/>
+              <w:left w:val="single" w:color="D9D9D9" w:sz="4"/>
+              <w:bottom w:val="single" w:color="D9D9D9" w:sz="4"/>
+              <w:right w:val="single" w:color="D9D9D9" w:sz="4"/>
+            </w:tcBorders>
+            <w:tcMar>
+              <w:top w:type="dxa" w:w="80"/>
+              <w:left w:type="dxa" w:w="120"/>
+              <w:bottom w:type="dxa" w:w="80"/>
+              <w:right w:type="dxa" w:w="120"/>
+            </w:tcMar>
+          </w:tcPr>
+          <w:p>
+            <w:hyperlink w:history="1" r:id="rIdmkx1iyoadm3myte5rocwv">
+              <w:r>
+                <w:rPr>
+                  <w:rFonts w:ascii="Arial" w:cs="Arial" w:eastAsia="Arial" w:hAnsi="Arial"/>
+                  <w:color w:val="2E74B5"/>
+                  <w:sz w:val="20"/>
+                  <w:szCs w:val="20"/>
+                  <w:u w:val="single"/>
+                </w:rPr>
+                <w:t xml:space="preserve">https://github.com/mgp-inc/lagrange-parking</w:t>
+              </w:r>
+            </w:hyperlink>
+            <w:r>
+              <w:rPr>
+                <w:rFonts w:ascii="Arial" w:cs="Arial" w:eastAsia="Arial" w:hAnsi="Arial"/>
+                <w:color w:val="2B2B2B"/>
+                <w:sz w:val="21"/>
+                <w:szCs w:val="21"/>
+              </w:rPr>
+              <w:t xml:space="preserve"> — the application source, self-contained and portable. Its docs folder carries the app-side context, data notes and open-item backlog. Working copy on the project lead’s machine at </w:t>
+            </w:r>
+            <w:r>
+              <w:rPr>
+                <w:rFonts w:ascii="Consolas" w:cs="Consolas" w:eastAsia="Consolas" w:hAnsi="Consolas"/>
+                <w:color w:val="2B2B2B"/>
+                <w:sz w:val="19"/>
+                <w:szCs w:val="19"/>
+              </w:rPr>
+              <w:t xml:space="preserve">E:\lagrange-parking</w:t>
+            </w:r>
+            <w:r>
+              <w:rPr>
+                <w:rFonts w:ascii="Arial" w:cs="Arial" w:eastAsia="Arial" w:hAnsi="Arial"/>
+                <w:color w:val="2B2B2B"/>
+                <w:sz w:val="21"/>
+                <w:szCs w:val="21"/>
+              </w:rPr>
+              <w:t xml:space="preserve">.</w:t>
+            </w:r>
+          </w:p>
+        </w:tc>
+      </w:tr>
+      <w:tr>
+        <w:tc>
+          <w:tcPr>
+            <w:tcW w:type="pct" w:w="24%"/>
+            <w:tcBorders>
+              <w:top w:val="single" w:color="D9D9D9" w:sz="4"/>
+              <w:left w:val="single" w:color="D9D9D9" w:sz="4"/>
+              <w:bottom w:val="single" w:color="D9D9D9" w:sz="4"/>
+              <w:right w:val="single" w:color="D9D9D9" w:sz="4"/>
+            </w:tcBorders>
+            <w:shd w:fill="F2F7FB" w:val="clear"/>
+            <w:tcMar>
+              <w:top w:type="dxa" w:w="80"/>
+              <w:left w:type="dxa" w:w="120"/>
+              <w:bottom w:type="dxa" w:w="80"/>
+              <w:right w:type="dxa" w:w="120"/>
+            </w:tcMar>
+          </w:tcPr>
+          <w:p>
+            <w:r>
+              <w:rPr>
+                <w:rFonts w:ascii="Arial" w:cs="Arial" w:eastAsia="Arial" w:hAnsi="Arial"/>
+                <w:b/>
+                <w:bCs/>
+                <w:color w:val="2B2B2B"/>
+                <w:sz w:val="21"/>
+                <w:szCs w:val="21"/>
+              </w:rPr>
+              <w:t xml:space="preserve">Running project log</w:t>
+            </w:r>
+          </w:p>
+        </w:tc>
+        <w:tc>
+          <w:tcPr>
+            <w:tcW w:type="pct" w:w="76%"/>
+            <w:tcBorders>
+              <w:top w:val="single" w:color="D9D9D9" w:sz="4"/>
+              <w:left w:val="single" w:color="D9D9D9" w:sz="4"/>
+              <w:bottom w:val="single" w:color="D9D9D9" w:sz="4"/>
+              <w:right w:val="single" w:color="D9D9D9" w:sz="4"/>
+            </w:tcBorders>
+            <w:shd w:fill="F2F7FB" w:val="clear"/>
+            <w:tcMar>
+              <w:top w:type="dxa" w:w="80"/>
+              <w:left w:type="dxa" w:w="120"/>
+              <w:bottom w:type="dxa" w:w="80"/>
+              <w:right w:type="dxa" w:w="120"/>
+            </w:tcMar>
+          </w:tcPr>
+          <w:p>
+            <w:r>
+              <w:rPr>
+                <w:rFonts w:ascii="Consolas" w:cs="Consolas" w:eastAsia="Consolas" w:hAnsi="Consolas"/>
+                <w:color w:val="2B2B2B"/>
+                <w:sz w:val="19"/>
+                <w:szCs w:val="19"/>
+              </w:rPr>
+              <w:t xml:space="preserve">X:\GISC\Community\LaGrange\Project\20240829_ParkingPermitMaps\PROJECTDOCUMENTATION.md</w:t>
+            </w:r>
+            <w:r>
+              <w:rPr>
+                <w:rFonts w:ascii="Arial" w:cs="Arial" w:eastAsia="Arial" w:hAnsi="Arial"/>
+                <w:color w:val="2B2B2B"/>
+                <w:sz w:val="21"/>
+                <w:szCs w:val="21"/>
+              </w:rPr>
+              <w:t xml:space="preserve"> — the internal running log; full decision and progress history for the GIS side.</w:t>
+            </w:r>
+          </w:p>
+        </w:tc>
+      </w:tr>
+      <w:tr>
+        <w:tc>
+          <w:tcPr>
+            <w:tcW w:type="pct" w:w="24%"/>
+            <w:tcBorders>
+              <w:top w:val="single" w:color="D9D9D9" w:sz="4"/>
+              <w:left w:val="single" w:color="D9D9D9" w:sz="4"/>
+              <w:bottom w:val="single" w:color="D9D9D9" w:sz="4"/>
+              <w:right w:val="single" w:color="D9D9D9" w:sz="4"/>
+            </w:tcBorders>
+            <w:tcMar>
+              <w:top w:type="dxa" w:w="80"/>
+              <w:left w:type="dxa" w:w="120"/>
+              <w:bottom w:type="dxa" w:w="80"/>
+              <w:right w:type="dxa" w:w="120"/>
+            </w:tcMar>
+          </w:tcPr>
+          <w:p>
+            <w:r>
+              <w:rPr>
+                <w:rFonts w:ascii="Arial" w:cs="Arial" w:eastAsia="Arial" w:hAnsi="Arial"/>
+                <w:b/>
+                <w:bCs/>
+                <w:color w:val="2B2B2B"/>
+                <w:sz w:val="21"/>
+                <w:szCs w:val="21"/>
+              </w:rPr>
+              <w:t xml:space="preserve">Hosting</w:t>
+            </w:r>
+          </w:p>
+        </w:tc>
+        <w:tc>
+          <w:tcPr>
+            <w:tcW w:type="pct" w:w="76%"/>
+            <w:tcBorders>
+              <w:top w:val="single" w:color="D9D9D9" w:sz="4"/>
+              <w:left w:val="single" w:color="D9D9D9" w:sz="4"/>
+              <w:bottom w:val="single" w:color="D9D9D9" w:sz="4"/>
+              <w:right w:val="single" w:color="D9D9D9" w:sz="4"/>
+            </w:tcBorders>
+            <w:tcMar>
+              <w:top w:type="dxa" w:w="80"/>
+              <w:left w:type="dxa" w:w="120"/>
+              <w:bottom w:type="dxa" w:w="80"/>
+              <w:right w:type="dxa" w:w="120"/>
+            </w:tcMar>
+          </w:tcPr>
+          <w:p>
+            <w:r>
+              <w:rPr>
+                <w:rFonts w:ascii="Arial" w:cs="Arial" w:eastAsia="Arial" w:hAnsi="Arial"/>
+                <w:color w:val="2B2B2B"/>
+                <w:sz w:val="21"/>
+                <w:szCs w:val="21"/>
+              </w:rPr>
+              <w:t xml:space="preserve">Azure tenant Community-Essentials.com, resource group rg-lagrange-parking (centralus), two Static Web Apps on the Free plan. Deployment steps are in the repository’s </w:t>
+            </w:r>
+            <w:r>
+              <w:rPr>
+                <w:rFonts w:ascii="Consolas" w:cs="Consolas" w:eastAsia="Consolas" w:hAnsi="Consolas"/>
+                <w:color w:val="2B2B2B"/>
+                <w:sz w:val="19"/>
+                <w:szCs w:val="19"/>
+              </w:rPr>
+              <w:t xml:space="preserve">DEPLOY.md</w:t>
+            </w:r>
+            <w:r>
+              <w:rPr>
+                <w:rFonts w:ascii="Arial" w:cs="Arial" w:eastAsia="Arial" w:hAnsi="Arial"/>
+                <w:color w:val="2B2B2B"/>
+                <w:sz w:val="21"/>
+                <w:szCs w:val="21"/>
+              </w:rPr>
+              <w:t xml:space="preserve">.</w:t>
+            </w:r>
+          </w:p>
+        </w:tc>
+      </w:tr>
+      <w:tr>
+        <w:tc>
+          <w:tcPr>
+            <w:tcW w:type="pct" w:w="24%"/>
+            <w:tcBorders>
+              <w:top w:val="single" w:color="D9D9D9" w:sz="4"/>
+              <w:left w:val="single" w:color="D9D9D9" w:sz="4"/>
+              <w:bottom w:val="single" w:color="D9D9D9" w:sz="4"/>
+              <w:right w:val="single" w:color="D9D9D9" w:sz="4"/>
+            </w:tcBorders>
+            <w:shd w:fill="F2F7FB" w:val="clear"/>
+            <w:tcMar>
+              <w:top w:type="dxa" w:w="80"/>
+              <w:left w:type="dxa" w:w="120"/>
+              <w:bottom w:type="dxa" w:w="80"/>
+              <w:right w:type="dxa" w:w="120"/>
+            </w:tcMar>
+          </w:tcPr>
+          <w:p>
+            <w:r>
+              <w:rPr>
+                <w:rFonts w:ascii="Arial" w:cs="Arial" w:eastAsia="Arial" w:hAnsi="Arial"/>
+                <w:b/>
+                <w:bCs/>
+                <w:color w:val="2B2B2B"/>
+                <w:sz w:val="21"/>
+                <w:szCs w:val="21"/>
+              </w:rPr>
+              <w:t xml:space="preserve">Branding and basemap</w:t>
+            </w:r>
+          </w:p>
+        </w:tc>
+        <w:tc>
+          <w:tcPr>
+            <w:tcW w:type="pct" w:w="76%"/>
+            <w:tcBorders>
+              <w:top w:val="single" w:color="D9D9D9" w:sz="4"/>
+              <w:left w:val="single" w:color="D9D9D9" w:sz="4"/>
+              <w:bottom w:val="single" w:color="D9D9D9" w:sz="4"/>
+              <w:right w:val="single" w:color="D9D9D9" w:sz="4"/>
+            </w:tcBorders>
+            <w:shd w:fill="F2F7FB" w:val="clear"/>
+            <w:tcMar>
+              <w:top w:type="dxa" w:w="80"/>
+              <w:left w:type="dxa" w:w="120"/>
+              <w:bottom w:type="dxa" w:w="80"/>
+              <w:right w:type="dxa" w:w="120"/>
+            </w:tcMar>
+          </w:tcPr>
+          <w:p>
+            <w:r>
+              <w:rPr>
+                <w:rFonts w:ascii="Arial" w:cs="Arial" w:eastAsia="Arial" w:hAnsi="Arial"/>
+                <w:color w:val="2B2B2B"/>
+                <w:sz w:val="20"/>
+                <w:szCs w:val="20"/>
+              </w:rPr>
+              <w:t xml:space="preserve">Village of La Grange Brand Guidelines (0719) — Dark Blue #00306C, La Grange Blue #126BB5, Green #43B749; Nunito Sans and Oswald. GISC Light Canvas is the basemap in both the apps and the ArcGIS Pro maps.</w:t>
+            </w:r>
+          </w:p>
+        </w:tc>
+      </w:tr>
+    </w:tbl>
+    <w:p>
+      <w:pPr>
+        <w:spacing w:after="120"/>
+      </w:pPr>
+    </w:p>
+    <w:p>
+      <w:pPr>
+        <w:pStyle w:val="Heading2"/>
+        <w:spacing w:after="100" w:before="280"/>
+      </w:pPr>
+      <w:r>
+        <w:rPr>
+          <w:rFonts w:ascii="Arial" w:cs="Arial" w:eastAsia="Arial" w:hAnsi="Arial"/>
+          <w:b/>
+          <w:bCs/>
+          <w:color w:val="0E7C66"/>
+          <w:sz w:val="23"/>
+          <w:szCs w:val="23"/>
+        </w:rPr>
+        <w:t xml:space="preserve">8.6 — Decisions that shaped the deliverable</w:t>
+      </w:r>
+    </w:p>
+    <w:tbl>
+      <w:tblPr>
+        <w:tblW w:type="pct" w:w="100%"/>
+        <w:tblBorders>
+          <w:top w:val="single" w:color="auto" w:sz="4"/>
+          <w:left w:val="single" w:color="auto" w:sz="4"/>
+          <w:bottom w:val="single" w:color="auto" w:sz="4"/>
+          <w:right w:val="single" w:color="auto" w:sz="4"/>
+          <w:insideH w:val="single" w:color="auto" w:sz="4"/>
+          <w:insideV w:val="single" w:color="auto" w:sz="4"/>
+        </w:tblBorders>
+      </w:tblPr>
+      <w:tblGrid>
+        <w:gridCol w:w="100"/>
+        <w:gridCol w:w="100"/>
+      </w:tblGrid>
+      <w:tr>
+        <w:tc>
+          <w:tcPr>
+            <w:tcW w:type="pct" w:w="30%"/>
+            <w:tcBorders>
+              <w:top w:val="single" w:color="D9D9D9" w:sz="4"/>
+              <w:left w:val="single" w:color="D9D9D9" w:sz="4"/>
+              <w:bottom w:val="single" w:color="D9D9D9" w:sz="4"/>
+              <w:right w:val="single" w:color="D9D9D9" w:sz="4"/>
+            </w:tcBorders>
+            <w:shd w:fill="0E7C66" w:val="clear"/>
+            <w:tcMar>
+              <w:top w:type="dxa" w:w="80"/>
+              <w:left w:type="dxa" w:w="120"/>
+              <w:bottom w:type="dxa" w:w="80"/>
+              <w:right w:type="dxa" w:w="120"/>
+            </w:tcMar>
+          </w:tcPr>
+          <w:p>
+            <w:r>
+              <w:rPr>
+                <w:rFonts w:ascii="Arial" w:cs="Arial" w:eastAsia="Arial" w:hAnsi="Arial"/>
+                <w:b/>
+                <w:bCs/>
+                <w:color w:val="FFFFFF"/>
+                <w:sz w:val="20"/>
+                <w:szCs w:val="20"/>
+              </w:rPr>
+              <w:t xml:space="preserve">Decision</w:t>
+            </w:r>
+          </w:p>
+        </w:tc>
+        <w:tc>
+          <w:tcPr>
+            <w:tcW w:type="pct" w:w="70%"/>
+            <w:tcBorders>
+              <w:top w:val="single" w:color="D9D9D9" w:sz="4"/>
+              <w:left w:val="single" w:color="D9D9D9" w:sz="4"/>
+              <w:bottom w:val="single" w:color="D9D9D9" w:sz="4"/>
+              <w:right w:val="single" w:color="D9D9D9" w:sz="4"/>
+            </w:tcBorders>
+            <w:shd w:fill="0E7C66" w:val="clear"/>
+            <w:tcMar>
+              <w:top w:type="dxa" w:w="80"/>
+              <w:left w:type="dxa" w:w="120"/>
+              <w:bottom w:type="dxa" w:w="80"/>
+              <w:right w:type="dxa" w:w="120"/>
+            </w:tcMar>
+          </w:tcPr>
+          <w:p>
+            <w:r>
+              <w:rPr>
+                <w:rFonts w:ascii="Arial" w:cs="Arial" w:eastAsia="Arial" w:hAnsi="Arial"/>
+                <w:b/>
+                <w:bCs/>
+                <w:color w:val="FFFFFF"/>
+                <w:sz w:val="20"/>
+                <w:szCs w:val="20"/>
+              </w:rPr>
+              <w:t xml:space="preserve">Detail</w:t>
+            </w:r>
+          </w:p>
+        </w:tc>
+      </w:tr>
+      <w:tr>
+        <w:tc>
+          <w:tcPr>
+            <w:tcW w:type="pct" w:w="30%"/>
+            <w:tcBorders>
+              <w:top w:val="single" w:color="D9D9D9" w:sz="4"/>
+              <w:left w:val="single" w:color="D9D9D9" w:sz="4"/>
+              <w:bottom w:val="single" w:color="D9D9D9" w:sz="4"/>
+              <w:right w:val="single" w:color="D9D9D9" w:sz="4"/>
+            </w:tcBorders>
+            <w:tcMar>
+              <w:top w:type="dxa" w:w="80"/>
+              <w:left w:type="dxa" w:w="120"/>
+              <w:bottom w:type="dxa" w:w="80"/>
+              <w:right w:type="dxa" w:w="120"/>
+            </w:tcMar>
+          </w:tcPr>
+          <w:p>
+            <w:r>
+              <w:rPr>
+                <w:rFonts w:ascii="Arial" w:cs="Arial" w:eastAsia="Arial" w:hAnsi="Arial"/>
+                <w:b/>
+                <w:bCs/>
+                <w:color w:val="2B2B2B"/>
+                <w:sz w:val="21"/>
+                <w:szCs w:val="21"/>
+              </w:rPr>
+              <w:t xml:space="preserve">Two apps, not StoryMaps.</w:t>
+            </w:r>
+          </w:p>
+        </w:tc>
+        <w:tc>
+          <w:tcPr>
+            <w:tcW w:type="pct" w:w="70%"/>
+            <w:tcBorders>
+              <w:top w:val="single" w:color="D9D9D9" w:sz="4"/>
+              <w:left w:val="single" w:color="D9D9D9" w:sz="4"/>
+              <w:bottom w:val="single" w:color="D9D9D9" w:sz="4"/>
+              <w:right w:val="single" w:color="D9D9D9" w:sz="4"/>
+            </w:tcBorders>
+            <w:tcMar>
+              <w:top w:type="dxa" w:w="80"/>
+              <w:left w:type="dxa" w:w="120"/>
+              <w:bottom w:type="dxa" w:w="80"/>
+              <w:right w:type="dxa" w:w="120"/>
+            </w:tcMar>
+          </w:tcPr>
+          <w:p>
+            <w:r>
+              <w:rPr>
+                <w:rFonts w:ascii="Arial" w:cs="Arial" w:eastAsia="Arial" w:hAnsi="Arial"/>
+                <w:color w:val="2B2B2B"/>
+                <w:sz w:val="20"/>
+                <w:szCs w:val="20"/>
+              </w:rPr>
+              <w:t xml:space="preserve">Charity ended the single all-in-one map on 2026-06-18. The deliverable became two separate audience-targeted apps, and the ArcGIS StoryMaps in the original scope were dropped. The AGOL web maps built in June still exist but are QA aids only.</w:t>
+            </w:r>
+          </w:p>
+        </w:tc>
+      </w:tr>
+      <w:tr>
+        <w:tc>
+          <w:tcPr>
+            <w:tcW w:type="pct" w:w="30%"/>
+            <w:tcBorders>
+              <w:top w:val="single" w:color="D9D9D9" w:sz="4"/>
+              <w:left w:val="single" w:color="D9D9D9" w:sz="4"/>
+              <w:bottom w:val="single" w:color="D9D9D9" w:sz="4"/>
+              <w:right w:val="single" w:color="D9D9D9" w:sz="4"/>
+            </w:tcBorders>
+            <w:shd w:fill="F2F7FB" w:val="clear"/>
+            <w:tcMar>
+              <w:top w:type="dxa" w:w="80"/>
+              <w:left w:type="dxa" w:w="120"/>
+              <w:bottom w:type="dxa" w:w="80"/>
+              <w:right w:type="dxa" w:w="120"/>
+            </w:tcMar>
+          </w:tcPr>
+          <w:p>
+            <w:r>
+              <w:rPr>
+                <w:rFonts w:ascii="Arial" w:cs="Arial" w:eastAsia="Arial" w:hAnsi="Arial"/>
+                <w:b/>
+                <w:bCs/>
+                <w:color w:val="2B2B2B"/>
+                <w:sz w:val="21"/>
+                <w:szCs w:val="21"/>
+              </w:rPr>
+              <w:t xml:space="preserve">The parking data was de-fragmented.</w:t>
+            </w:r>
+          </w:p>
+        </w:tc>
+        <w:tc>
+          <w:tcPr>
+            <w:tcW w:type="pct" w:w="70%"/>
+            <w:tcBorders>
+              <w:top w:val="single" w:color="D9D9D9" w:sz="4"/>
+              <w:left w:val="single" w:color="D9D9D9" w:sz="4"/>
+              <w:bottom w:val="single" w:color="D9D9D9" w:sz="4"/>
+              <w:right w:val="single" w:color="D9D9D9" w:sz="4"/>
+            </w:tcBorders>
+            <w:shd w:fill="F2F7FB" w:val="clear"/>
+            <w:tcMar>
+              <w:top w:type="dxa" w:w="80"/>
+              <w:left w:type="dxa" w:w="120"/>
+              <w:bottom w:type="dxa" w:w="80"/>
+              <w:right w:type="dxa" w:w="120"/>
+            </w:tcMar>
+          </w:tcPr>
+          <w:p>
+            <w:r>
+              <w:rPr>
+                <w:rFonts w:ascii="Arial" w:cs="Arial" w:eastAsia="Arial" w:hAnsi="Arial"/>
+                <w:color w:val="2B2B2B"/>
+                <w:sz w:val="20"/>
+                <w:szCs w:val="20"/>
+              </w:rPr>
+              <w:t xml:space="preserve">One physical lot arrived as several overlapping polygons, one per restriction type. These were dissolved into one area per lot carrying its rules in a related table, which is what makes the data answerable.</w:t>
+            </w:r>
+          </w:p>
+        </w:tc>
+      </w:tr>
+      <w:tr>
+        <w:tc>
+          <w:tcPr>
+            <w:tcW w:type="pct" w:w="30%"/>
+            <w:tcBorders>
+              <w:top w:val="single" w:color="D9D9D9" w:sz="4"/>
+              <w:left w:val="single" w:color="D9D9D9" w:sz="4"/>
+              <w:bottom w:val="single" w:color="D9D9D9" w:sz="4"/>
+              <w:right w:val="single" w:color="D9D9D9" w:sz="4"/>
+            </w:tcBorders>
+            <w:tcMar>
+              <w:top w:type="dxa" w:w="80"/>
+              <w:left w:type="dxa" w:w="120"/>
+              <w:bottom w:type="dxa" w:w="80"/>
+              <w:right w:type="dxa" w:w="120"/>
+            </w:tcMar>
+          </w:tcPr>
+          <w:p>
+            <w:r>
+              <w:rPr>
+                <w:rFonts w:ascii="Arial" w:cs="Arial" w:eastAsia="Arial" w:hAnsi="Arial"/>
+                <w:b/>
+                <w:bCs/>
+                <w:color w:val="2B2B2B"/>
+                <w:sz w:val="21"/>
+                <w:szCs w:val="21"/>
+              </w:rPr>
+              <w:t xml:space="preserve">Lot lists and content are the Village’s, not inferred.</w:t>
+            </w:r>
+          </w:p>
+        </w:tc>
+        <w:tc>
+          <w:tcPr>
+            <w:tcW w:type="pct" w:w="70%"/>
+            <w:tcBorders>
+              <w:top w:val="single" w:color="D9D9D9" w:sz="4"/>
+              <w:left w:val="single" w:color="D9D9D9" w:sz="4"/>
+              <w:bottom w:val="single" w:color="D9D9D9" w:sz="4"/>
+              <w:right w:val="single" w:color="D9D9D9" w:sz="4"/>
+            </w:tcBorders>
+            <w:tcMar>
+              <w:top w:type="dxa" w:w="80"/>
+              <w:left w:type="dxa" w:w="120"/>
+              <w:bottom w:type="dxa" w:w="80"/>
+              <w:right w:type="dxa" w:w="120"/>
+            </w:tcMar>
+          </w:tcPr>
+          <w:p>
+            <w:r>
+              <w:rPr>
+                <w:rFonts w:ascii="Arial" w:cs="Arial" w:eastAsia="Arial" w:hAnsi="Arial"/>
+                <w:color w:val="2B2B2B"/>
+                <w:sz w:val="20"/>
+                <w:szCs w:val="20"/>
+              </w:rPr>
+              <w:t xml:space="preserve">The lots shown on each permit page come from the Village’s own verbatim list, not from a data-derived guess. Rates exist in the data but are never displayed, and the word "decal" does not appear in any public text.</w:t>
+            </w:r>
+          </w:p>
+        </w:tc>
+      </w:tr>
+      <w:tr>
+        <w:tc>
+          <w:tcPr>
+            <w:tcW w:type="pct" w:w="30%"/>
+            <w:tcBorders>
+              <w:top w:val="single" w:color="D9D9D9" w:sz="4"/>
+              <w:left w:val="single" w:color="D9D9D9" w:sz="4"/>
+              <w:bottom w:val="single" w:color="D9D9D9" w:sz="4"/>
+              <w:right w:val="single" w:color="D9D9D9" w:sz="4"/>
+            </w:tcBorders>
+            <w:shd w:fill="F2F7FB" w:val="clear"/>
+            <w:tcMar>
+              <w:top w:type="dxa" w:w="80"/>
+              <w:left w:type="dxa" w:w="120"/>
+              <w:bottom w:type="dxa" w:w="80"/>
+              <w:right w:type="dxa" w:w="120"/>
+            </w:tcMar>
+          </w:tcPr>
+          <w:p>
+            <w:r>
+              <w:rPr>
+                <w:rFonts w:ascii="Arial" w:cs="Arial" w:eastAsia="Arial" w:hAnsi="Arial"/>
+                <w:b/>
+                <w:bCs/>
+                <w:color w:val="2B2B2B"/>
+                <w:sz w:val="21"/>
+                <w:szCs w:val="21"/>
+              </w:rPr>
+              <w:t xml:space="preserve">Designated overnight areas are drawn as GIS features.</w:t>
+            </w:r>
+          </w:p>
+        </w:tc>
+        <w:tc>
+          <w:tcPr>
+            <w:tcW w:type="pct" w:w="70%"/>
+            <w:tcBorders>
+              <w:top w:val="single" w:color="D9D9D9" w:sz="4"/>
+              <w:left w:val="single" w:color="D9D9D9" w:sz="4"/>
+              <w:bottom w:val="single" w:color="D9D9D9" w:sz="4"/>
+              <w:right w:val="single" w:color="D9D9D9" w:sz="4"/>
+            </w:tcBorders>
+            <w:shd w:fill="F2F7FB" w:val="clear"/>
+            <w:tcMar>
+              <w:top w:type="dxa" w:w="80"/>
+              <w:left w:type="dxa" w:w="120"/>
+              <w:bottom w:type="dxa" w:w="80"/>
+              <w:right w:type="dxa" w:w="120"/>
+            </w:tcMar>
+          </w:tcPr>
+          <w:p>
+            <w:r>
+              <w:rPr>
+                <w:rFonts w:ascii="Arial" w:cs="Arial" w:eastAsia="Arial" w:hAnsi="Arial"/>
+                <w:color w:val="2B2B2B"/>
+                <w:sz w:val="20"/>
+                <w:szCs w:val="20"/>
+              </w:rPr>
+              <w:t xml:space="preserve">Only the permitted areas inside each lot were drawn, not the prohibited remainder, so the apps must state the rule in words. Scanned drawings were rejected in favor of real map features.</w:t>
+            </w:r>
+          </w:p>
+        </w:tc>
+      </w:tr>
+    </w:tbl>
+    <w:p>
+      <w:pPr>
+        <w:spacing w:after="120"/>
+      </w:pPr>
+    </w:p>
+    <w:tbl>
+      <w:tblPr>
+        <w:tblW w:type="pct" w:w="100%"/>
+        <w:tblBorders>
+          <w:top w:val="single" w:color="auto" w:sz="4"/>
+          <w:left w:val="single" w:color="auto" w:sz="4"/>
+          <w:bottom w:val="single" w:color="auto" w:sz="4"/>
+          <w:right w:val="single" w:color="auto" w:sz="4"/>
+          <w:insideH w:val="single" w:color="auto" w:sz="4"/>
+          <w:insideV w:val="single" w:color="auto" w:sz="4"/>
+        </w:tblBorders>
+      </w:tblPr>
+      <w:tblGrid>
+        <w:gridCol w:w="100"/>
+      </w:tblGrid>
+      <w:tr>
+        <w:tc>
+          <w:tcPr>
+            <w:tcBorders>
+              <w:top w:val="single" w:color="C00000" w:sz="6"/>
+              <w:left w:val="single" w:color="C00000" w:sz="24"/>
+              <w:bottom w:val="single" w:color="C00000" w:sz="6"/>
+              <w:right w:val="single" w:color="C00000" w:sz="6"/>
+            </w:tcBorders>
+            <w:shd w:fill="FBE4E4" w:val="clear"/>
+            <w:tcMar>
+              <w:top w:type="dxa" w:w="140"/>
+              <w:left w:type="dxa" w:w="240"/>
+              <w:bottom w:type="dxa" w:w="140"/>
+              <w:right w:type="dxa" w:w="240"/>
+            </w:tcMar>
+          </w:tcPr>
+          <w:p>
+            <w:pPr>
+              <w:spacing w:after="80"/>
+            </w:pPr>
+            <w:r>
+              <w:rPr>
+                <w:rFonts w:ascii="Arial" w:cs="Arial" w:eastAsia="Arial" w:hAnsi="Arial"/>
+                <w:b/>
+                <w:bCs/>
+                <w:color w:val="C00000"/>
+                <w:sz w:val="21"/>
+                <w:szCs w:val="21"/>
+              </w:rPr>
+              <w:t xml:space="preserve">⛔  The one that will bite you</w:t>
+            </w:r>
+          </w:p>
+          <w:p>
+            <w:pPr>
+              <w:spacing w:after="120"/>
+            </w:pPr>
+            <w:r>
+              <w:rPr>
+                <w:rFonts w:ascii="Arial" w:cs="Arial" w:eastAsia="Arial" w:hAnsi="Arial"/>
+                <w:color w:val="2B2B2B"/>
+                <w:sz w:val="21"/>
+                <w:szCs w:val="21"/>
+              </w:rPr>
+              <w:t xml:space="preserve">Republishing </w:t>
+            </w:r>
+            <w:r>
+              <w:rPr>
+                <w:rFonts w:ascii="Consolas" w:cs="Consolas" w:eastAsia="Consolas" w:hAnsi="Consolas"/>
+                <w:color w:val="2B2B2B"/>
+                <w:sz w:val="19"/>
+                <w:szCs w:val="19"/>
+              </w:rPr>
+              <w:t xml:space="preserve">LaGrange_Parking_Permits</w:t>
+            </w:r>
+            <w:r>
+              <w:rPr>
+                <w:rFonts w:ascii="Arial" w:cs="Arial" w:eastAsia="Arial" w:hAnsi="Arial"/>
+                <w:color w:val="2B2B2B"/>
+                <w:sz w:val="21"/>
+                <w:szCs w:val="21"/>
+              </w:rPr>
+              <w:t xml:space="preserve"> resets its sharing to organization-only, and both public apps immediately fail with "Token Required." Re-share it publicly and re-test anonymous access after every republish.</w:t>
+            </w:r>
+          </w:p>
+        </w:tc>
+      </w:tr>
+    </w:tbl>
+    <w:p>
+      <w:pPr>
+        <w:spacing w:after="60"/>
+      </w:pPr>
+    </w:p>
+    <w:tbl>
+      <w:tblPr>
+        <w:tblW w:type="pct" w:w="100%"/>
+        <w:tblBorders>
+          <w:top w:val="single" w:color="auto" w:sz="4"/>
+          <w:left w:val="single" w:color="auto" w:sz="4"/>
+          <w:bottom w:val="single" w:color="auto" w:sz="4"/>
+          <w:right w:val="single" w:color="auto" w:sz="4"/>
+          <w:insideH w:val="single" w:color="auto" w:sz="4"/>
+          <w:insideV w:val="single" w:color="auto" w:sz="4"/>
+        </w:tblBorders>
+      </w:tblPr>
+      <w:tblGrid>
+        <w:gridCol w:w="100"/>
+      </w:tblGrid>
+      <w:tr>
+        <w:tc>
+          <w:tcPr>
+            <w:tcBorders>
+              <w:top w:val="single" w:color="B45309" w:sz="6"/>
+              <w:left w:val="single" w:color="B45309" w:sz="24"/>
+              <w:bottom w:val="single" w:color="B45309" w:sz="6"/>
+              <w:right w:val="single" w:color="B45309" w:sz="6"/>
+            </w:tcBorders>
+            <w:shd w:fill="FFF3DC" w:val="clear"/>
+            <w:tcMar>
+              <w:top w:type="dxa" w:w="140"/>
+              <w:left w:type="dxa" w:w="240"/>
+              <w:bottom w:type="dxa" w:w="140"/>
+              <w:right w:type="dxa" w:w="240"/>
+            </w:tcMar>
+          </w:tcPr>
+          <w:p>
+            <w:pPr>
+              <w:spacing w:after="80"/>
+            </w:pPr>
+            <w:r>
+              <w:rPr>
+                <w:rFonts w:ascii="Arial" w:cs="Arial" w:eastAsia="Arial" w:hAnsi="Arial"/>
+                <w:b/>
+                <w:bCs/>
+                <w:color w:val="B45309"/>
+                <w:sz w:val="21"/>
+                <w:szCs w:val="21"/>
+              </w:rPr>
+              <w:t xml:space="preserve">⚠  AREAID is the join key between the data and the apps</w:t>
+            </w:r>
+          </w:p>
+          <w:p>
+            <w:pPr>
+              <w:spacing w:after="120"/>
+            </w:pPr>
+            <w:r>
+              <w:rPr>
+                <w:rFonts w:ascii="Arial" w:cs="Arial" w:eastAsia="Arial" w:hAnsi="Arial"/>
+                <w:color w:val="2B2B2B"/>
+                <w:sz w:val="21"/>
+                <w:szCs w:val="21"/>
+              </w:rPr>
+              <w:t xml:space="preserve">It is the lot name uppercased with non-alphanumerics stripped, so "Lot 15" becomes "LOT15"; any other spelling silently drops the lot from its page.</w:t>
+            </w:r>
+          </w:p>
+          <w:p>
+            <w:pPr>
+              <w:spacing w:after="120"/>
+            </w:pPr>
+            <w:r>
+              <w:rPr>
+                <w:rFonts w:ascii="Arial" w:cs="Arial" w:eastAsia="Arial" w:hAnsi="Arial"/>
+                <w:color w:val="2B2B2B"/>
+                <w:sz w:val="21"/>
+                <w:szCs w:val="21"/>
+              </w:rPr>
+              <w:t xml:space="preserve">Verify against the live services rather than trusting the configuration: </w:t>
+            </w:r>
+            <w:r>
+              <w:rPr>
+                <w:rFonts w:ascii="Consolas" w:cs="Consolas" w:eastAsia="Consolas" w:hAnsi="Consolas"/>
+                <w:color w:val="2B2B2B"/>
+                <w:sz w:val="19"/>
+                <w:szCs w:val="19"/>
+              </w:rPr>
+              <w:t xml:space="preserve">node scripts/verify-permit-pages.mjs</w:t>
+            </w:r>
+            <w:r>
+              <w:rPr>
+                <w:rFonts w:ascii="Arial" w:cs="Arial" w:eastAsia="Arial" w:hAnsi="Arial"/>
+                <w:color w:val="2B2B2B"/>
+                <w:sz w:val="21"/>
+                <w:szCs w:val="21"/>
+              </w:rPr>
+              <w:t xml:space="preserve"> confirms every listed lot resolves and returns rules.</w:t>
+            </w:r>
+          </w:p>
+        </w:tc>
+      </w:tr>
+    </w:tbl>
+    <w:p>
+      <w:pPr>
+        <w:spacing w:after="120"/>
+      </w:pPr>
+    </w:p>
+    <w:p>
+      <w:pPr>
+        <w:pStyle w:val="Heading2"/>
+        <w:spacing w:after="100" w:before="280"/>
+      </w:pPr>
+      <w:r>
+        <w:rPr>
+          <w:rFonts w:ascii="Arial" w:cs="Arial" w:eastAsia="Arial" w:hAnsi="Arial"/>
+          <w:b/>
+          <w:bCs/>
+          <w:color w:val="0E7C66"/>
+          <w:sz w:val="23"/>
+          <w:szCs w:val="23"/>
+        </w:rPr>
+        <w:t xml:space="preserve">8.7 — Publish / republish log</w:t>
       </w:r>
     </w:p>
     <w:p>

</xml_diff>